<commit_message>
Actualización de formato y tabla de referencias
Se modifico el formato, se agrego un ejemplo de referencia en la primera tabla. se agregó al final la tabla de referencia.
</commit_message>
<xml_diff>
--- a/C055_UNIR_Prototipado UX con inteligencia artificial.docx
+++ b/C055_UNIR_Prototipado UX con inteligencia artificial.docx
@@ -1,6 +1,6 @@
 
 <file path=word/document.xml><?xml version="1.0" encoding="utf-8"?>
-<w:document xmlns:wpc="http://schemas.microsoft.com/office/word/2010/wordprocessingCanvas" xmlns:mc="http://schemas.openxmlformats.org/markup-compatibility/2006" xmlns:o="urn:schemas-microsoft-com:office:office" xmlns:r="http://schemas.openxmlformats.org/officeDocument/2006/relationships" xmlns:m="http://schemas.openxmlformats.org/officeDocument/2006/math" xmlns:v="urn:schemas-microsoft-com:vml" xmlns:wp14="http://schemas.microsoft.com/office/word/2010/wordprocessingDrawing" xmlns:wp="http://schemas.openxmlformats.org/drawingml/2006/wordprocessingDrawing" xmlns:w10="urn:schemas-microsoft-com:office:word" xmlns:w="http://schemas.openxmlformats.org/wordprocessingml/2006/main" xmlns:w14="http://schemas.microsoft.com/office/word/2010/wordml" xmlns:w15="http://schemas.microsoft.com/office/word/2012/wordml" xmlns:wpg="http://schemas.microsoft.com/office/word/2010/wordprocessingGroup" xmlns:wpi="http://schemas.microsoft.com/office/word/2010/wordprocessingInk" xmlns:wne="http://schemas.microsoft.com/office/word/2006/wordml" xmlns:wps="http://schemas.microsoft.com/office/word/2010/wordprocessingShape" mc:Ignorable="w14 w15 wp14">
+<w:document xmlns:wpc="http://schemas.microsoft.com/office/word/2010/wordprocessingCanvas" xmlns:cx="http://schemas.microsoft.com/office/drawing/2014/chartex" xmlns:cx1="http://schemas.microsoft.com/office/drawing/2015/9/8/chartex" xmlns:cx2="http://schemas.microsoft.com/office/drawing/2015/10/21/chartex" xmlns:cx3="http://schemas.microsoft.com/office/drawing/2016/5/9/chartex" xmlns:cx4="http://schemas.microsoft.com/office/drawing/2016/5/10/chartex" xmlns:cx5="http://schemas.microsoft.com/office/drawing/2016/5/11/chartex" xmlns:cx6="http://schemas.microsoft.com/office/drawing/2016/5/12/chartex" xmlns:cx7="http://schemas.microsoft.com/office/drawing/2016/5/13/chartex" xmlns:cx8="http://schemas.microsoft.com/office/drawing/2016/5/14/chartex" xmlns:mc="http://schemas.openxmlformats.org/markup-compatibility/2006" xmlns:aink="http://schemas.microsoft.com/office/drawing/2016/ink" xmlns:am3d="http://schemas.microsoft.com/office/drawing/2017/model3d" xmlns:o="urn:schemas-microsoft-com:office:office" xmlns:r="http://schemas.openxmlformats.org/officeDocument/2006/relationships" xmlns:m="http://schemas.openxmlformats.org/officeDocument/2006/math" xmlns:v="urn:schemas-microsoft-com:vml" xmlns:wp14="http://schemas.microsoft.com/office/word/2010/wordprocessingDrawing" xmlns:wp="http://schemas.openxmlformats.org/drawingml/2006/wordprocessingDrawing" xmlns:w10="urn:schemas-microsoft-com:office:word" xmlns:w="http://schemas.openxmlformats.org/wordprocessingml/2006/main" xmlns:w14="http://schemas.microsoft.com/office/word/2010/wordml" xmlns:w15="http://schemas.microsoft.com/office/word/2012/wordml" xmlns:w16cex="http://schemas.microsoft.com/office/word/2018/wordml/cex" xmlns:w16cid="http://schemas.microsoft.com/office/word/2016/wordml/cid" xmlns:w16="http://schemas.microsoft.com/office/word/2018/wordml" xmlns:w16sdtdh="http://schemas.microsoft.com/office/word/2020/wordml/sdtdatahash" xmlns:w16se="http://schemas.microsoft.com/office/word/2015/wordml/symex" xmlns:wpg="http://schemas.microsoft.com/office/word/2010/wordprocessingGroup" xmlns:wpi="http://schemas.microsoft.com/office/word/2010/wordprocessingInk" xmlns:wne="http://schemas.microsoft.com/office/word/2006/wordml" xmlns:wps="http://schemas.microsoft.com/office/word/2010/wordprocessingShape" mc:Ignorable="w14 w15 w16se w16cid w16 w16cex w16sdtdh wp14">
   <w:body>
     <w:p/>
     <w:p/>
@@ -67,7 +67,21 @@
       </w:r>
       <w:r>
         <w:br/>
-        <w:t>Integrante 1: UX Researcher (</w:t>
+        <w:t>Integrante 1:</w:t>
+      </w:r>
+      <w:ins w:id="0" w:author="francisco javier gonzalez  garcia" w:date="2026-09-22T22:42:00Z">
+        <w:r>
+          <w:t xml:space="preserve"> </w:t>
+        </w:r>
+        <w:r>
+          <w:t>Daniel Cinto Conde</w:t>
+        </w:r>
+        <w:r>
+          <w:t>,</w:t>
+        </w:r>
+      </w:ins>
+      <w:r>
+        <w:t xml:space="preserve"> UX Researcher (</w:t>
       </w:r>
       <w:r>
         <w:t>Líder</w:t>
@@ -77,7 +91,29 @@
       </w:r>
       <w:r>
         <w:br/>
-        <w:t>Integrante 2: UX Strategist &amp; AI Lead (</w:t>
+        <w:t xml:space="preserve">Integrante 2: </w:t>
+      </w:r>
+      <w:ins w:id="1" w:author="francisco javier gonzalez  garcia" w:date="2026-09-22T22:42:00Z">
+        <w:r>
+          <w:t>Daniel Gabriel González</w:t>
+        </w:r>
+        <w:r>
+          <w:t>,</w:t>
+        </w:r>
+        <w:r>
+          <w:t xml:space="preserve"> </w:t>
+        </w:r>
+      </w:ins>
+      <w:r>
+        <w:t xml:space="preserve">UX </w:t>
+      </w:r>
+      <w:proofErr w:type="spellStart"/>
+      <w:r>
+        <w:t>Strategist</w:t>
+      </w:r>
+      <w:proofErr w:type="spellEnd"/>
+      <w:r>
+        <w:t xml:space="preserve"> &amp; AI Lead (</w:t>
       </w:r>
       <w:r>
         <w:t>Líder</w:t>
@@ -87,7 +123,39 @@
       </w:r>
       <w:r>
         <w:br/>
-        <w:t>Integrante 3: Information Architect (</w:t>
+        <w:t>Integrante 3:</w:t>
+      </w:r>
+      <w:ins w:id="2" w:author="francisco javier gonzalez  garcia" w:date="2026-09-22T22:42:00Z">
+        <w:r>
+          <w:t xml:space="preserve"> </w:t>
+        </w:r>
+      </w:ins>
+      <w:ins w:id="3" w:author="francisco javier gonzalez  garcia" w:date="2026-09-22T22:43:00Z">
+        <w:r>
+          <w:t>Francisco Javier González García</w:t>
+        </w:r>
+        <w:r>
+          <w:t>,</w:t>
+        </w:r>
+      </w:ins>
+      <w:r>
+        <w:t xml:space="preserve"> I</w:t>
+      </w:r>
+      <w:proofErr w:type="spellStart"/>
+      <w:r>
+        <w:t>nformation</w:t>
+      </w:r>
+      <w:proofErr w:type="spellEnd"/>
+      <w:r>
+        <w:t xml:space="preserve"> </w:t>
+      </w:r>
+      <w:proofErr w:type="spellStart"/>
+      <w:r>
+        <w:t>Architect</w:t>
+      </w:r>
+      <w:proofErr w:type="spellEnd"/>
+      <w:r>
+        <w:t xml:space="preserve"> (</w:t>
       </w:r>
       <w:r>
         <w:t>Líder</w:t>
@@ -97,7 +165,26 @@
       </w:r>
       <w:r>
         <w:br/>
-        <w:t>Integrante 4: UI/UX Designer (</w:t>
+        <w:t xml:space="preserve">Integrante 4: </w:t>
+      </w:r>
+      <w:ins w:id="4" w:author="francisco javier gonzalez  garcia" w:date="2026-09-22T22:43:00Z">
+        <w:r>
+          <w:t>Cristian Yamir Jiménez Rebollar</w:t>
+        </w:r>
+        <w:r>
+          <w:t xml:space="preserve">, </w:t>
+        </w:r>
+      </w:ins>
+      <w:r>
+        <w:t xml:space="preserve">UI/UX </w:t>
+      </w:r>
+      <w:proofErr w:type="spellStart"/>
+      <w:r>
+        <w:t>Designer</w:t>
+      </w:r>
+      <w:proofErr w:type="spellEnd"/>
+      <w:r>
+        <w:t xml:space="preserve"> (</w:t>
       </w:r>
       <w:r>
         <w:t>Líder</w:t>
@@ -107,10 +194,23 @@
       </w:r>
       <w:r>
         <w:br/>
-        <w:t xml:space="preserve">Integrante 5: Interaction QA &amp; </w:t>
-      </w:r>
-      <w:r>
-        <w:t>Editor (</w:t>
+        <w:t xml:space="preserve">Integrante 5: </w:t>
+      </w:r>
+      <w:ins w:id="5" w:author="francisco javier gonzalez  garcia" w:date="2026-09-22T22:43:00Z">
+        <w:r>
+          <w:t xml:space="preserve">Miguel Ángel Sánchez </w:t>
+        </w:r>
+        <w:proofErr w:type="spellStart"/>
+        <w:r>
+          <w:t>Martínez</w:t>
+        </w:r>
+      </w:ins>
+      <w:r>
+        <w:t>Interaction</w:t>
+      </w:r>
+      <w:proofErr w:type="spellEnd"/>
+      <w:r>
+        <w:t xml:space="preserve"> QA &amp; Editor (</w:t>
       </w:r>
       <w:r>
         <w:t>Líder</w:t>
@@ -176,6 +276,12 @@
       </w:r>
     </w:p>
     <w:p>
+      <w:pPr>
+        <w:jc w:val="both"/>
+        <w:pPrChange w:id="6" w:author="francisco javier gonzalez  garcia" w:date="2026-09-22T22:08:00Z">
+          <w:pPr/>
+        </w:pPrChange>
+      </w:pPr>
       <w:r>
         <w:t xml:space="preserve">La presente actividad </w:t>
       </w:r>
@@ -201,10 +307,7 @@
         <w:t>teórico</w:t>
       </w:r>
       <w:r>
-        <w:t xml:space="preserve"> y p</w:t>
-      </w:r>
-      <w:r>
-        <w:t xml:space="preserve">ractico sobre el </w:t>
+        <w:t xml:space="preserve"> y practico sobre el </w:t>
       </w:r>
       <w:r>
         <w:t>diseño</w:t>
@@ -274,6 +377,12 @@
       </w:r>
     </w:p>
     <w:p>
+      <w:pPr>
+        <w:jc w:val="both"/>
+        <w:pPrChange w:id="7" w:author="francisco javier gonzalez  garcia" w:date="2026-09-22T22:08:00Z">
+          <w:pPr/>
+        </w:pPrChange>
+      </w:pPr>
       <w:r>
         <w:t xml:space="preserve">El documento se estructura en once secciones que recorren el ciclo de vida completo de un proyecto de UX/UI: la </w:t>
       </w:r>
@@ -281,10 +390,7 @@
         <w:t>investigación</w:t>
       </w:r>
       <w:r>
-        <w:t xml:space="preserve"> conce</w:t>
-      </w:r>
-      <w:r>
-        <w:t xml:space="preserve">ptual, la </w:t>
+        <w:t xml:space="preserve"> conceptual, la </w:t>
       </w:r>
       <w:r>
         <w:t>definición</w:t>
@@ -320,10 +426,7 @@
         <w:t>reflexión</w:t>
       </w:r>
       <w:r>
-        <w:t xml:space="preserve"> critica sobre el uso de inteligencia artif</w:t>
-      </w:r>
-      <w:r>
-        <w:t xml:space="preserve">icial en el </w:t>
+        <w:t xml:space="preserve"> critica sobre el uso de inteligencia artificial en el </w:t>
       </w:r>
       <w:r>
         <w:t>diseño</w:t>
@@ -359,10 +462,7 @@
         <w:t>hipótesis</w:t>
       </w:r>
       <w:r>
-        <w:t xml:space="preserve"> en cada una de las etapas del proceso, asi como a </w:t>
-      </w:r>
-      <w:r>
-        <w:t xml:space="preserve">los principios de </w:t>
+        <w:t xml:space="preserve"> en cada una de las etapas del proceso, asi como a los principios de </w:t>
       </w:r>
       <w:r>
         <w:t>diseño</w:t>
@@ -391,11 +491,46 @@
     <w:p>
       <w:pPr>
         <w:pStyle w:val="Ttulo1"/>
+        <w:rPr>
+          <w:ins w:id="8" w:author="francisco javier gonzalez  garcia" w:date="2026-09-22T22:09:00Z"/>
+        </w:rPr>
       </w:pPr>
-      <w:r>
-        <w:lastRenderedPageBreak/>
+      <w:ins w:id="9" w:author="Francisco Javier" w:date="2026-09-22T22:01:00Z">
+        <w:r>
+          <w:lastRenderedPageBreak/>
+          <w:t xml:space="preserve">Fase </w:t>
+        </w:r>
+      </w:ins>
+      <w:r>
         <w:t xml:space="preserve">1. </w:t>
       </w:r>
+      <w:ins w:id="10" w:author="Francisco Javier" w:date="2026-09-22T22:01:00Z">
+        <w:r>
+          <w:t>In</w:t>
+        </w:r>
+      </w:ins>
+      <w:ins w:id="11" w:author="Francisco Javier" w:date="2026-09-22T22:02:00Z">
+        <w:r>
+          <w:t>vestigación Conceptual</w:t>
+        </w:r>
+      </w:ins>
+    </w:p>
+    <w:p>
+      <w:pPr>
+        <w:pStyle w:val="Ttulo2"/>
+        <w:pPrChange w:id="12" w:author="francisco javier gonzalez  garcia" w:date="2026-09-22T22:09:00Z">
+          <w:pPr>
+            <w:pStyle w:val="Ttulo1"/>
+          </w:pPr>
+        </w:pPrChange>
+      </w:pPr>
+      <w:ins w:id="13" w:author="Francisco Javier" w:date="2026-09-22T22:02:00Z">
+        <w:del w:id="14" w:author="francisco javier gonzalez  garcia" w:date="2026-09-22T22:09:00Z">
+          <w:r>
+            <w:delText xml:space="preserve"> </w:delText>
+          </w:r>
+        </w:del>
+      </w:ins>
       <w:r>
         <w:t>Matriz Comparativa</w:t>
       </w:r>
@@ -403,32 +538,69 @@
     <w:p>
       <w:pPr>
         <w:spacing w:after="40"/>
+        <w:rPr>
+          <w:del w:id="15" w:author="francisco javier gonzalez  garcia" w:date="2026-09-22T22:09:00Z"/>
+        </w:rPr>
       </w:pPr>
     </w:p>
     <w:tbl>
       <w:tblPr>
-        <w:tblW w:w="0" w:type="auto"/>
-        <w:jc w:val="center"/>
+        <w:tblW w:w="10031" w:type="dxa"/>
         <w:tblLook w:val="04A0" w:firstRow="1" w:lastRow="0" w:firstColumn="1" w:lastColumn="0" w:noHBand="0" w:noVBand="1"/>
+        <w:tblPrChange w:id="16" w:author="francisco javier gonzalez  garcia" w:date="2026-09-22T22:06:00Z">
+          <w:tblPr>
+            <w:tblW w:w="0" w:type="auto"/>
+            <w:jc w:val="center"/>
+            <w:tblLook w:val="04A0" w:firstRow="1" w:lastRow="0" w:firstColumn="1" w:lastColumn="0" w:noHBand="0" w:noVBand="1"/>
+          </w:tblPr>
+        </w:tblPrChange>
       </w:tblPr>
       <w:tblGrid>
         <w:gridCol w:w="1134"/>
         <w:gridCol w:w="2551"/>
         <w:gridCol w:w="2268"/>
-        <w:gridCol w:w="1020"/>
-        <w:gridCol w:w="1531"/>
+        <w:gridCol w:w="1385"/>
+        <w:gridCol w:w="2693"/>
+        <w:tblGridChange w:id="17">
+          <w:tblGrid>
+            <w:gridCol w:w="1134"/>
+            <w:gridCol w:w="2551"/>
+            <w:gridCol w:w="2268"/>
+            <w:gridCol w:w="1020"/>
+            <w:gridCol w:w="1531"/>
+          </w:tblGrid>
+        </w:tblGridChange>
       </w:tblGrid>
       <w:tr>
         <w:trPr>
-          <w:jc w:val="center"/>
+          <w:trPrChange w:id="18" w:author="francisco javier gonzalez  garcia" w:date="2026-09-22T22:06:00Z">
+            <w:trPr>
+              <w:jc w:val="center"/>
+            </w:trPr>
+          </w:trPrChange>
         </w:trPr>
         <w:tc>
           <w:tcPr>
             <w:tcW w:w="1134" w:type="dxa"/>
+            <w:tcBorders>
+              <w:bottom w:val="single" w:sz="4" w:space="0" w:color="auto"/>
+            </w:tcBorders>
+            <w:shd w:val="clear" w:color="auto" w:fill="DDD9C3" w:themeFill="background2" w:themeFillShade="E6"/>
+            <w:tcPrChange w:id="19" w:author="francisco javier gonzalez  garcia" w:date="2026-09-22T22:06:00Z">
+              <w:tcPr>
+                <w:tcW w:w="1134" w:type="dxa"/>
+              </w:tcPr>
+            </w:tcPrChange>
           </w:tcPr>
           <w:p>
             <w:pPr>
               <w:spacing w:before="20" w:after="20"/>
+              <w:jc w:val="center"/>
+              <w:pPrChange w:id="20" w:author="francisco javier gonzalez  garcia" w:date="2026-09-22T22:06:00Z">
+                <w:pPr>
+                  <w:spacing w:before="20" w:after="20"/>
+                </w:pPr>
+              </w:pPrChange>
             </w:pPr>
             <w:r>
               <w:rPr>
@@ -442,10 +614,25 @@
         <w:tc>
           <w:tcPr>
             <w:tcW w:w="2551" w:type="dxa"/>
+            <w:tcBorders>
+              <w:bottom w:val="single" w:sz="4" w:space="0" w:color="auto"/>
+            </w:tcBorders>
+            <w:shd w:val="clear" w:color="auto" w:fill="DDD9C3" w:themeFill="background2" w:themeFillShade="E6"/>
+            <w:tcPrChange w:id="21" w:author="francisco javier gonzalez  garcia" w:date="2026-09-22T22:06:00Z">
+              <w:tcPr>
+                <w:tcW w:w="2551" w:type="dxa"/>
+              </w:tcPr>
+            </w:tcPrChange>
           </w:tcPr>
           <w:p>
             <w:pPr>
               <w:spacing w:before="20" w:after="20"/>
+              <w:jc w:val="center"/>
+              <w:pPrChange w:id="22" w:author="francisco javier gonzalez  garcia" w:date="2026-09-22T22:06:00Z">
+                <w:pPr>
+                  <w:spacing w:before="20" w:after="20"/>
+                </w:pPr>
+              </w:pPrChange>
             </w:pPr>
             <w:r>
               <w:rPr>
@@ -459,10 +646,25 @@
         <w:tc>
           <w:tcPr>
             <w:tcW w:w="2268" w:type="dxa"/>
+            <w:tcBorders>
+              <w:bottom w:val="single" w:sz="4" w:space="0" w:color="auto"/>
+            </w:tcBorders>
+            <w:shd w:val="clear" w:color="auto" w:fill="DDD9C3" w:themeFill="background2" w:themeFillShade="E6"/>
+            <w:tcPrChange w:id="23" w:author="francisco javier gonzalez  garcia" w:date="2026-09-22T22:06:00Z">
+              <w:tcPr>
+                <w:tcW w:w="2268" w:type="dxa"/>
+              </w:tcPr>
+            </w:tcPrChange>
           </w:tcPr>
           <w:p>
             <w:pPr>
               <w:spacing w:before="20" w:after="20"/>
+              <w:jc w:val="center"/>
+              <w:pPrChange w:id="24" w:author="francisco javier gonzalez  garcia" w:date="2026-09-22T22:06:00Z">
+                <w:pPr>
+                  <w:spacing w:before="20" w:after="20"/>
+                </w:pPr>
+              </w:pPrChange>
             </w:pPr>
             <w:r>
               <w:rPr>
@@ -475,11 +677,26 @@
         </w:tc>
         <w:tc>
           <w:tcPr>
-            <w:tcW w:w="1020" w:type="dxa"/>
+            <w:tcW w:w="1385" w:type="dxa"/>
+            <w:tcBorders>
+              <w:bottom w:val="single" w:sz="4" w:space="0" w:color="auto"/>
+            </w:tcBorders>
+            <w:shd w:val="clear" w:color="auto" w:fill="DDD9C3" w:themeFill="background2" w:themeFillShade="E6"/>
+            <w:tcPrChange w:id="25" w:author="francisco javier gonzalez  garcia" w:date="2026-09-22T22:06:00Z">
+              <w:tcPr>
+                <w:tcW w:w="1020" w:type="dxa"/>
+              </w:tcPr>
+            </w:tcPrChange>
           </w:tcPr>
           <w:p>
             <w:pPr>
               <w:spacing w:before="20" w:after="20"/>
+              <w:jc w:val="center"/>
+              <w:pPrChange w:id="26" w:author="francisco javier gonzalez  garcia" w:date="2026-09-22T22:06:00Z">
+                <w:pPr>
+                  <w:spacing w:before="20" w:after="20"/>
+                </w:pPr>
+              </w:pPrChange>
             </w:pPr>
             <w:r>
               <w:rPr>
@@ -492,11 +709,26 @@
         </w:tc>
         <w:tc>
           <w:tcPr>
-            <w:tcW w:w="1531" w:type="dxa"/>
+            <w:tcW w:w="2693" w:type="dxa"/>
+            <w:tcBorders>
+              <w:bottom w:val="single" w:sz="4" w:space="0" w:color="auto"/>
+            </w:tcBorders>
+            <w:shd w:val="clear" w:color="auto" w:fill="DDD9C3" w:themeFill="background2" w:themeFillShade="E6"/>
+            <w:tcPrChange w:id="27" w:author="francisco javier gonzalez  garcia" w:date="2026-09-22T22:06:00Z">
+              <w:tcPr>
+                <w:tcW w:w="1531" w:type="dxa"/>
+              </w:tcPr>
+            </w:tcPrChange>
           </w:tcPr>
           <w:p>
             <w:pPr>
               <w:spacing w:before="20" w:after="20"/>
+              <w:jc w:val="center"/>
+              <w:pPrChange w:id="28" w:author="francisco javier gonzalez  garcia" w:date="2026-09-22T22:06:00Z">
+                <w:pPr>
+                  <w:spacing w:before="20" w:after="20"/>
+                </w:pPr>
+              </w:pPrChange>
             </w:pPr>
             <w:r>
               <w:rPr>
@@ -510,11 +742,26 @@
       </w:tr>
       <w:tr>
         <w:trPr>
-          <w:jc w:val="center"/>
+          <w:trPrChange w:id="29" w:author="francisco javier gonzalez  garcia" w:date="2026-09-22T22:06:00Z">
+            <w:trPr>
+              <w:jc w:val="center"/>
+            </w:trPr>
+          </w:trPrChange>
         </w:trPr>
         <w:tc>
           <w:tcPr>
             <w:tcW w:w="1134" w:type="dxa"/>
+            <w:tcBorders>
+              <w:top w:val="single" w:sz="4" w:space="0" w:color="auto"/>
+              <w:left w:val="single" w:sz="4" w:space="0" w:color="auto"/>
+              <w:bottom w:val="single" w:sz="4" w:space="0" w:color="auto"/>
+              <w:right w:val="single" w:sz="4" w:space="0" w:color="auto"/>
+            </w:tcBorders>
+            <w:tcPrChange w:id="30" w:author="francisco javier gonzalez  garcia" w:date="2026-09-22T22:06:00Z">
+              <w:tcPr>
+                <w:tcW w:w="1134" w:type="dxa"/>
+              </w:tcPr>
+            </w:tcPrChange>
           </w:tcPr>
           <w:p>
             <w:pPr>
@@ -538,28 +785,157 @@
         <w:tc>
           <w:tcPr>
             <w:tcW w:w="2551" w:type="dxa"/>
+            <w:tcBorders>
+              <w:top w:val="single" w:sz="4" w:space="0" w:color="auto"/>
+              <w:left w:val="single" w:sz="4" w:space="0" w:color="auto"/>
+              <w:bottom w:val="single" w:sz="4" w:space="0" w:color="auto"/>
+              <w:right w:val="single" w:sz="4" w:space="0" w:color="auto"/>
+            </w:tcBorders>
+            <w:tcPrChange w:id="31" w:author="francisco javier gonzalez  garcia" w:date="2026-09-22T22:06:00Z">
+              <w:tcPr>
+                <w:tcW w:w="2551" w:type="dxa"/>
+              </w:tcPr>
+            </w:tcPrChange>
           </w:tcPr>
           <w:p>
             <w:pPr>
               <w:spacing w:before="20" w:after="20"/>
+              <w:rPr>
+                <w:ins w:id="32" w:author="francisco javier gonzalez  garcia" w:date="2026-09-22T22:27:00Z"/>
+                <w:sz w:val="16"/>
+              </w:rPr>
             </w:pPr>
             <w:r>
               <w:rPr>
                 <w:sz w:val="16"/>
               </w:rPr>
-              <w:t xml:space="preserve">Representación esquemática de baja </w:t>
+              <w:t>Representación esquemática de baja fidelidad en escala de grises. Cajas, placeholders y jerarquía sin estilo visual.</w:t>
             </w:r>
-            <w:r>
-              <w:rPr>
-                <w:sz w:val="16"/>
-              </w:rPr>
-              <w:t>fidelidad en escala de grises. Cajas, placeholders y jerarquía sin estilo visual.</w:t>
-            </w:r>
+          </w:p>
+          <w:p>
+            <w:pPr>
+              <w:spacing w:before="20" w:after="20"/>
+            </w:pPr>
+            <w:ins w:id="33" w:author="francisco javier gonzalez  garcia" w:date="2026-09-22T22:27:00Z">
+              <w:r>
+                <w:rPr>
+                  <w:sz w:val="16"/>
+                  <w:rPrChange w:id="34" w:author="francisco javier gonzalez  garcia" w:date="2026-09-22T22:27:00Z">
+                    <w:rPr/>
+                  </w:rPrChange>
+                </w:rPr>
+                <w:t>“es</w:t>
+              </w:r>
+              <w:r>
+                <w:rPr>
+                  <w:sz w:val="16"/>
+                </w:rPr>
+                <w:t xml:space="preserve"> el esqueleto de</w:t>
+              </w:r>
+            </w:ins>
+            <w:ins w:id="35" w:author="francisco javier gonzalez  garcia" w:date="2026-09-22T22:28:00Z">
+              <w:r>
+                <w:rPr>
+                  <w:sz w:val="16"/>
+                </w:rPr>
+                <w:t xml:space="preserve"> su proyecto digital,… Se centra en el diseño y la ubicación del contenido, no en los</w:t>
+              </w:r>
+            </w:ins>
+            <w:ins w:id="36" w:author="francisco javier gonzalez  garcia" w:date="2026-09-22T22:29:00Z">
+              <w:r>
+                <w:rPr>
+                  <w:sz w:val="16"/>
+                </w:rPr>
+                <w:t xml:space="preserve"> colores, las fuentes o cualquier pulido visual</w:t>
+              </w:r>
+            </w:ins>
+            <w:ins w:id="37" w:author="francisco javier gonzalez  garcia" w:date="2026-09-22T22:27:00Z">
+              <w:r>
+                <w:rPr>
+                  <w:sz w:val="16"/>
+                  <w:rPrChange w:id="38" w:author="francisco javier gonzalez  garcia" w:date="2026-09-22T22:27:00Z">
+                    <w:rPr/>
+                  </w:rPrChange>
+                </w:rPr>
+                <w:t>”</w:t>
+              </w:r>
+            </w:ins>
+            <w:customXmlInsRangeStart w:id="39" w:author="francisco javier gonzalez  garcia" w:date="2026-09-22T22:31:00Z"/>
+            <w:sdt>
+              <w:sdtPr>
+                <w:rPr>
+                  <w:sz w:val="16"/>
+                </w:rPr>
+                <w:id w:val="1978257167"/>
+                <w:citation/>
+              </w:sdtPr>
+              <w:sdtContent>
+                <w:customXmlInsRangeEnd w:id="39"/>
+                <w:ins w:id="40" w:author="francisco javier gonzalez  garcia" w:date="2026-09-22T22:31:00Z">
+                  <w:r>
+                    <w:rPr>
+                      <w:sz w:val="16"/>
+                    </w:rPr>
+                    <w:fldChar w:fldCharType="begin"/>
+                  </w:r>
+                  <w:r>
+                    <w:rPr>
+                      <w:sz w:val="16"/>
+                    </w:rPr>
+                    <w:instrText xml:space="preserve"> CITATION PelGuil \l 2058 </w:instrText>
+                  </w:r>
+                </w:ins>
+                <w:r>
+                  <w:rPr>
+                    <w:sz w:val="16"/>
+                  </w:rPr>
+                  <w:fldChar w:fldCharType="separate"/>
+                </w:r>
+                <w:ins w:id="41" w:author="francisco javier gonzalez  garcia" w:date="2026-09-22T22:31:00Z">
+                  <w:r>
+                    <w:rPr>
+                      <w:noProof/>
+                      <w:sz w:val="16"/>
+                    </w:rPr>
+                    <w:t xml:space="preserve"> </w:t>
+                  </w:r>
+                  <w:r>
+                    <w:rPr>
+                      <w:noProof/>
+                      <w:sz w:val="16"/>
+                      <w:rPrChange w:id="42" w:author="francisco javier gonzalez  garcia" w:date="2026-09-22T22:31:00Z">
+                        <w:rPr/>
+                      </w:rPrChange>
+                    </w:rPr>
+                    <w:t>(Guilizzoni, 2025)</w:t>
+                  </w:r>
+                  <w:r>
+                    <w:rPr>
+                      <w:sz w:val="16"/>
+                    </w:rPr>
+                    <w:fldChar w:fldCharType="end"/>
+                  </w:r>
+                </w:ins>
+                <w:customXmlInsRangeStart w:id="43" w:author="francisco javier gonzalez  garcia" w:date="2026-09-22T22:31:00Z"/>
+              </w:sdtContent>
+            </w:sdt>
+            <w:customXmlInsRangeEnd w:id="43"/>
           </w:p>
         </w:tc>
         <w:tc>
           <w:tcPr>
             <w:tcW w:w="2268" w:type="dxa"/>
+            <w:tcBorders>
+              <w:top w:val="single" w:sz="4" w:space="0" w:color="auto"/>
+              <w:left w:val="single" w:sz="4" w:space="0" w:color="auto"/>
+              <w:bottom w:val="single" w:sz="4" w:space="0" w:color="auto"/>
+              <w:right w:val="single" w:sz="4" w:space="0" w:color="auto"/>
+            </w:tcBorders>
+            <w:tcPrChange w:id="44" w:author="francisco javier gonzalez  garcia" w:date="2026-09-22T22:06:00Z">
+              <w:tcPr>
+                <w:tcW w:w="2268" w:type="dxa"/>
+              </w:tcPr>
+            </w:tcPrChange>
           </w:tcPr>
           <w:p>
             <w:pPr>
@@ -575,7 +951,18 @@
         </w:tc>
         <w:tc>
           <w:tcPr>
-            <w:tcW w:w="1020" w:type="dxa"/>
+            <w:tcW w:w="1385" w:type="dxa"/>
+            <w:tcBorders>
+              <w:top w:val="single" w:sz="4" w:space="0" w:color="auto"/>
+              <w:left w:val="single" w:sz="4" w:space="0" w:color="auto"/>
+              <w:bottom w:val="single" w:sz="4" w:space="0" w:color="auto"/>
+              <w:right w:val="single" w:sz="4" w:space="0" w:color="auto"/>
+            </w:tcBorders>
+            <w:tcPrChange w:id="45" w:author="francisco javier gonzalez  garcia" w:date="2026-09-22T22:06:00Z">
+              <w:tcPr>
+                <w:tcW w:w="1020" w:type="dxa"/>
+              </w:tcPr>
+            </w:tcPrChange>
           </w:tcPr>
           <w:p>
             <w:pPr>
@@ -591,7 +978,18 @@
         </w:tc>
         <w:tc>
           <w:tcPr>
-            <w:tcW w:w="1531" w:type="dxa"/>
+            <w:tcW w:w="2693" w:type="dxa"/>
+            <w:tcBorders>
+              <w:top w:val="single" w:sz="4" w:space="0" w:color="auto"/>
+              <w:left w:val="single" w:sz="4" w:space="0" w:color="auto"/>
+              <w:bottom w:val="single" w:sz="4" w:space="0" w:color="auto"/>
+              <w:right w:val="single" w:sz="4" w:space="0" w:color="auto"/>
+            </w:tcBorders>
+            <w:tcPrChange w:id="46" w:author="francisco javier gonzalez  garcia" w:date="2026-09-22T22:06:00Z">
+              <w:tcPr>
+                <w:tcW w:w="1531" w:type="dxa"/>
+              </w:tcPr>
+            </w:tcPrChange>
           </w:tcPr>
           <w:p>
             <w:pPr>
@@ -608,11 +1006,26 @@
       </w:tr>
       <w:tr>
         <w:trPr>
-          <w:jc w:val="center"/>
+          <w:trPrChange w:id="47" w:author="francisco javier gonzalez  garcia" w:date="2026-09-22T22:06:00Z">
+            <w:trPr>
+              <w:jc w:val="center"/>
+            </w:trPr>
+          </w:trPrChange>
         </w:trPr>
         <w:tc>
           <w:tcPr>
             <w:tcW w:w="1134" w:type="dxa"/>
+            <w:tcBorders>
+              <w:top w:val="single" w:sz="4" w:space="0" w:color="auto"/>
+              <w:left w:val="single" w:sz="4" w:space="0" w:color="auto"/>
+              <w:bottom w:val="single" w:sz="4" w:space="0" w:color="auto"/>
+              <w:right w:val="single" w:sz="4" w:space="0" w:color="auto"/>
+            </w:tcBorders>
+            <w:tcPrChange w:id="48" w:author="francisco javier gonzalez  garcia" w:date="2026-09-22T22:06:00Z">
+              <w:tcPr>
+                <w:tcW w:w="1134" w:type="dxa"/>
+              </w:tcPr>
+            </w:tcPrChange>
           </w:tcPr>
           <w:p>
             <w:pPr>
@@ -622,13 +1035,7 @@
               <w:rPr>
                 <w:sz w:val="16"/>
               </w:rPr>
-              <w:t>Mocku</w:t>
-            </w:r>
-            <w:r>
-              <w:rPr>
-                <w:sz w:val="16"/>
-              </w:rPr>
-              <w:t>p</w:t>
+              <w:t>Mockup</w:t>
             </w:r>
             <w:r>
               <w:rPr>
@@ -642,6 +1049,17 @@
         <w:tc>
           <w:tcPr>
             <w:tcW w:w="2551" w:type="dxa"/>
+            <w:tcBorders>
+              <w:top w:val="single" w:sz="4" w:space="0" w:color="auto"/>
+              <w:left w:val="single" w:sz="4" w:space="0" w:color="auto"/>
+              <w:bottom w:val="single" w:sz="4" w:space="0" w:color="auto"/>
+              <w:right w:val="single" w:sz="4" w:space="0" w:color="auto"/>
+            </w:tcBorders>
+            <w:tcPrChange w:id="49" w:author="francisco javier gonzalez  garcia" w:date="2026-09-22T22:06:00Z">
+              <w:tcPr>
+                <w:tcW w:w="2551" w:type="dxa"/>
+              </w:tcPr>
+            </w:tcPrChange>
           </w:tcPr>
           <w:p>
             <w:pPr>
@@ -658,6 +1076,17 @@
         <w:tc>
           <w:tcPr>
             <w:tcW w:w="2268" w:type="dxa"/>
+            <w:tcBorders>
+              <w:top w:val="single" w:sz="4" w:space="0" w:color="auto"/>
+              <w:left w:val="single" w:sz="4" w:space="0" w:color="auto"/>
+              <w:bottom w:val="single" w:sz="4" w:space="0" w:color="auto"/>
+              <w:right w:val="single" w:sz="4" w:space="0" w:color="auto"/>
+            </w:tcBorders>
+            <w:tcPrChange w:id="50" w:author="francisco javier gonzalez  garcia" w:date="2026-09-22T22:06:00Z">
+              <w:tcPr>
+                <w:tcW w:w="2268" w:type="dxa"/>
+              </w:tcPr>
+            </w:tcPrChange>
           </w:tcPr>
           <w:p>
             <w:pPr>
@@ -673,7 +1102,18 @@
         </w:tc>
         <w:tc>
           <w:tcPr>
-            <w:tcW w:w="1020" w:type="dxa"/>
+            <w:tcW w:w="1385" w:type="dxa"/>
+            <w:tcBorders>
+              <w:top w:val="single" w:sz="4" w:space="0" w:color="auto"/>
+              <w:left w:val="single" w:sz="4" w:space="0" w:color="auto"/>
+              <w:bottom w:val="single" w:sz="4" w:space="0" w:color="auto"/>
+              <w:right w:val="single" w:sz="4" w:space="0" w:color="auto"/>
+            </w:tcBorders>
+            <w:tcPrChange w:id="51" w:author="francisco javier gonzalez  garcia" w:date="2026-09-22T22:06:00Z">
+              <w:tcPr>
+                <w:tcW w:w="1020" w:type="dxa"/>
+              </w:tcPr>
+            </w:tcPrChange>
           </w:tcPr>
           <w:p>
             <w:pPr>
@@ -689,7 +1129,18 @@
         </w:tc>
         <w:tc>
           <w:tcPr>
-            <w:tcW w:w="1531" w:type="dxa"/>
+            <w:tcW w:w="2693" w:type="dxa"/>
+            <w:tcBorders>
+              <w:top w:val="single" w:sz="4" w:space="0" w:color="auto"/>
+              <w:left w:val="single" w:sz="4" w:space="0" w:color="auto"/>
+              <w:bottom w:val="single" w:sz="4" w:space="0" w:color="auto"/>
+              <w:right w:val="single" w:sz="4" w:space="0" w:color="auto"/>
+            </w:tcBorders>
+            <w:tcPrChange w:id="52" w:author="francisco javier gonzalez  garcia" w:date="2026-09-22T22:06:00Z">
+              <w:tcPr>
+                <w:tcW w:w="1531" w:type="dxa"/>
+              </w:tcPr>
+            </w:tcPrChange>
           </w:tcPr>
           <w:p>
             <w:pPr>
@@ -699,24 +1150,33 @@
               <w:rPr>
                 <w:sz w:val="16"/>
               </w:rPr>
-              <w:t xml:space="preserve">Mitad: Diseño Visual UI. Tras </w:t>
-            </w:r>
-            <w:r>
-              <w:rPr>
-                <w:sz w:val="16"/>
-              </w:rPr>
-              <w:t>aprobación de wireframes. Handoff a dev.</w:t>
+              <w:t>Mitad: Diseño Visual UI. Tras aprobación de wireframes. Handoff a dev.</w:t>
             </w:r>
           </w:p>
         </w:tc>
       </w:tr>
       <w:tr>
         <w:trPr>
-          <w:jc w:val="center"/>
+          <w:trPrChange w:id="53" w:author="francisco javier gonzalez  garcia" w:date="2026-09-22T22:06:00Z">
+            <w:trPr>
+              <w:jc w:val="center"/>
+            </w:trPr>
+          </w:trPrChange>
         </w:trPr>
         <w:tc>
           <w:tcPr>
             <w:tcW w:w="1134" w:type="dxa"/>
+            <w:tcBorders>
+              <w:top w:val="single" w:sz="4" w:space="0" w:color="auto"/>
+              <w:left w:val="single" w:sz="4" w:space="0" w:color="auto"/>
+              <w:bottom w:val="single" w:sz="4" w:space="0" w:color="auto"/>
+              <w:right w:val="single" w:sz="4" w:space="0" w:color="auto"/>
+            </w:tcBorders>
+            <w:tcPrChange w:id="54" w:author="francisco javier gonzalez  garcia" w:date="2026-09-22T22:06:00Z">
+              <w:tcPr>
+                <w:tcW w:w="1134" w:type="dxa"/>
+              </w:tcPr>
+            </w:tcPrChange>
           </w:tcPr>
           <w:p>
             <w:pPr>
@@ -740,6 +1200,17 @@
         <w:tc>
           <w:tcPr>
             <w:tcW w:w="2551" w:type="dxa"/>
+            <w:tcBorders>
+              <w:top w:val="single" w:sz="4" w:space="0" w:color="auto"/>
+              <w:left w:val="single" w:sz="4" w:space="0" w:color="auto"/>
+              <w:bottom w:val="single" w:sz="4" w:space="0" w:color="auto"/>
+              <w:right w:val="single" w:sz="4" w:space="0" w:color="auto"/>
+            </w:tcBorders>
+            <w:tcPrChange w:id="55" w:author="francisco javier gonzalez  garcia" w:date="2026-09-22T22:06:00Z">
+              <w:tcPr>
+                <w:tcW w:w="2551" w:type="dxa"/>
+              </w:tcPr>
+            </w:tcPrChange>
           </w:tcPr>
           <w:p>
             <w:pPr>
@@ -756,6 +1227,17 @@
         <w:tc>
           <w:tcPr>
             <w:tcW w:w="2268" w:type="dxa"/>
+            <w:tcBorders>
+              <w:top w:val="single" w:sz="4" w:space="0" w:color="auto"/>
+              <w:left w:val="single" w:sz="4" w:space="0" w:color="auto"/>
+              <w:bottom w:val="single" w:sz="4" w:space="0" w:color="auto"/>
+              <w:right w:val="single" w:sz="4" w:space="0" w:color="auto"/>
+            </w:tcBorders>
+            <w:tcPrChange w:id="56" w:author="francisco javier gonzalez  garcia" w:date="2026-09-22T22:06:00Z">
+              <w:tcPr>
+                <w:tcW w:w="2268" w:type="dxa"/>
+              </w:tcPr>
+            </w:tcPrChange>
           </w:tcPr>
           <w:p>
             <w:pPr>
@@ -765,19 +1247,24 @@
               <w:rPr>
                 <w:sz w:val="16"/>
               </w:rPr>
-              <w:t>Validar interacción, usabilidad, flujo completo y viabilidad. Test con us</w:t>
-            </w:r>
-            <w:r>
-              <w:rPr>
-                <w:sz w:val="16"/>
-              </w:rPr>
-              <w:t>uarios reales.</w:t>
+              <w:t>Validar interacción, usabilidad, flujo completo y viabilidad. Test con usuarios reales.</w:t>
             </w:r>
           </w:p>
         </w:tc>
         <w:tc>
           <w:tcPr>
-            <w:tcW w:w="1020" w:type="dxa"/>
+            <w:tcW w:w="1385" w:type="dxa"/>
+            <w:tcBorders>
+              <w:top w:val="single" w:sz="4" w:space="0" w:color="auto"/>
+              <w:left w:val="single" w:sz="4" w:space="0" w:color="auto"/>
+              <w:bottom w:val="single" w:sz="4" w:space="0" w:color="auto"/>
+              <w:right w:val="single" w:sz="4" w:space="0" w:color="auto"/>
+            </w:tcBorders>
+            <w:tcPrChange w:id="57" w:author="francisco javier gonzalez  garcia" w:date="2026-09-22T22:06:00Z">
+              <w:tcPr>
+                <w:tcW w:w="1020" w:type="dxa"/>
+              </w:tcPr>
+            </w:tcPrChange>
           </w:tcPr>
           <w:p>
             <w:pPr>
@@ -793,7 +1280,18 @@
         </w:tc>
         <w:tc>
           <w:tcPr>
-            <w:tcW w:w="1531" w:type="dxa"/>
+            <w:tcW w:w="2693" w:type="dxa"/>
+            <w:tcBorders>
+              <w:top w:val="single" w:sz="4" w:space="0" w:color="auto"/>
+              <w:left w:val="single" w:sz="4" w:space="0" w:color="auto"/>
+              <w:bottom w:val="single" w:sz="4" w:space="0" w:color="auto"/>
+              <w:right w:val="single" w:sz="4" w:space="0" w:color="auto"/>
+            </w:tcBorders>
+            <w:tcPrChange w:id="58" w:author="francisco javier gonzalez  garcia" w:date="2026-09-22T22:06:00Z">
+              <w:tcPr>
+                <w:tcW w:w="1531" w:type="dxa"/>
+              </w:tcPr>
+            </w:tcPrChange>
           </w:tcPr>
           <w:p>
             <w:pPr>
@@ -812,10 +1310,20 @@
     <w:p/>
     <w:p>
       <w:pPr>
-        <w:pStyle w:val="Ttulo1"/>
+        <w:pStyle w:val="Ttulo2"/>
+        <w:pPrChange w:id="59" w:author="francisco javier gonzalez  garcia" w:date="2026-09-22T22:09:00Z">
+          <w:pPr>
+            <w:pStyle w:val="Ttulo1"/>
+          </w:pPr>
+        </w:pPrChange>
       </w:pPr>
-      <w:r>
-        <w:t xml:space="preserve">2. Ventajas y Limitaciones </w:t>
+      <w:del w:id="60" w:author="francisco javier gonzalez  garcia" w:date="2026-09-22T22:07:00Z">
+        <w:r>
+          <w:delText xml:space="preserve">2. </w:delText>
+        </w:r>
+      </w:del>
+      <w:r>
+        <w:t xml:space="preserve">Ventajas y Limitaciones </w:t>
       </w:r>
       <w:r>
         <w:t>Críticas</w:t>
@@ -825,11 +1333,19 @@
       <w:pPr>
         <w:spacing w:after="40"/>
       </w:pPr>
+      <w:proofErr w:type="spellStart"/>
       <w:r>
         <w:rPr>
           <w:b/>
         </w:rPr>
-        <w:t xml:space="preserve">Wireframe: </w:t>
+        <w:t>Wireframe</w:t>
+      </w:r>
+      <w:proofErr w:type="spellEnd"/>
+      <w:r>
+        <w:rPr>
+          <w:b/>
+        </w:rPr>
+        <w:t xml:space="preserve">: </w:t>
       </w:r>
       <w:r>
         <w:t>+ Rapidez y bajo costo; foco en funcionalidad sin distracciones estéticas. - No transmite experiencia real; no sirve para validación emocional ni test con usuarios.</w:t>
@@ -846,10 +1362,7 @@
         <w:t xml:space="preserve">Mockup: </w:t>
       </w:r>
       <w:r>
-        <w:t>+ Valida estética, Design System y marca; entregable preciso para desarrollo. - Est</w:t>
-      </w:r>
-      <w:r>
-        <w:t>ático; oculta errores de flujo e interacción; un diseño bonito puede esconder mala UX.</w:t>
+        <w:t>+ Valida estética, Design System y marca; entregable preciso para desarrollo. - Estático; oculta errores de flujo e interacción; un diseño bonito puede esconder mala UX.</w:t>
       </w:r>
     </w:p>
     <w:p>
@@ -869,10 +1382,135 @@
         <w:t>re trabajo</w:t>
       </w:r>
       <w:r>
-        <w:t>. - Mayor tiempo de producción; requiere herramientas; riesgo de</w:t>
-      </w:r>
-      <w:r>
-        <w:t xml:space="preserve"> falsa sensación de producto terminado.</w:t>
+        <w:t>. - Mayor tiempo de producción; requiere herramientas; riesgo de falsa sensación de producto terminado.</w:t>
+      </w:r>
+    </w:p>
+    <w:p>
+      <w:pPr>
+        <w:pStyle w:val="Ttulo2"/>
+        <w:pPrChange w:id="61" w:author="francisco javier gonzalez  garcia" w:date="2026-09-22T22:09:00Z">
+          <w:pPr>
+            <w:pStyle w:val="Ttulo1"/>
+          </w:pPr>
+        </w:pPrChange>
+      </w:pPr>
+      <w:del w:id="62" w:author="francisco javier gonzalez  garcia" w:date="2026-09-22T22:08:00Z">
+        <w:r>
+          <w:delText xml:space="preserve">3. </w:delText>
+        </w:r>
+      </w:del>
+      <w:r>
+        <w:t>Ejemplo Práctico Unificado</w:t>
+      </w:r>
+    </w:p>
+    <w:p>
+      <w:pPr>
+        <w:spacing w:after="40"/>
+      </w:pPr>
+      <w:r>
+        <w:t>App móvil FinTech "Capital" - Dashboard de Gastos Mensuales. Misma pantalla, tres evoluciones:</w:t>
+      </w:r>
+    </w:p>
+    <w:p>
+      <w:pPr>
+        <w:spacing w:after="40"/>
+      </w:pPr>
+      <w:r>
+        <w:rPr>
+          <w:b/>
+        </w:rPr>
+        <w:t xml:space="preserve">Wireframe: </w:t>
+      </w:r>
+      <w:r>
+        <w:t>[Header] [Balance: $XXXX] [Gráfico barras grises] [Lista transacciones] [FAB: +]. Sin color. Valida prioridad de contenido.</w:t>
+      </w:r>
+    </w:p>
+    <w:p>
+      <w:pPr>
+        <w:spacing w:after="40"/>
+      </w:pPr>
+      <w:r>
+        <w:rPr>
+          <w:b/>
+        </w:rPr>
+        <w:t xml:space="preserve">Mockup: </w:t>
+      </w:r>
+      <w:r>
+        <w:t>Fondo #0A0A0B, glassmorphism, gráfico azul #4D7FC1, tipografía Manrope Bold. Valida identidad visual, contraste y coherencia de marca.</w:t>
+      </w:r>
+    </w:p>
+    <w:p>
+      <w:pPr>
+        <w:spacing w:after="40"/>
+      </w:pPr>
+      <w:r>
+        <w:rPr>
+          <w:b/>
+        </w:rPr>
+        <w:t xml:space="preserve">Prototipo (Figma High-Fi): </w:t>
+      </w:r>
+      <w:r>
+        <w:t>Interacciones: tap en gráfico filtra lista; swipe acciones Editar/Eliminar; tap en + bottom sheet animado; estado vacío con Lottie. Valida con test de usabilidad (n=5).</w:t>
+      </w:r>
+    </w:p>
+    <w:p>
+      <w:pPr>
+        <w:pStyle w:val="Ttulo2"/>
+        <w:pPrChange w:id="63" w:author="francisco javier gonzalez  garcia" w:date="2026-09-22T22:09:00Z">
+          <w:pPr>
+            <w:pStyle w:val="Ttulo1"/>
+          </w:pPr>
+        </w:pPrChange>
+      </w:pPr>
+      <w:del w:id="64" w:author="francisco javier gonzalez  garcia" w:date="2026-09-22T22:09:00Z">
+        <w:r>
+          <w:lastRenderedPageBreak/>
+          <w:delText xml:space="preserve">4. </w:delText>
+        </w:r>
+      </w:del>
+      <w:r>
+        <w:t>Conclusión Estratégica - Regla de Decisión</w:t>
+      </w:r>
+    </w:p>
+    <w:p>
+      <w:pPr>
+        <w:spacing w:after="40"/>
+      </w:pPr>
+      <w:r>
+        <w:t>Si validas QUÉ se construye -&gt; Wireframe. Si validas CÓMO SE VE -&gt; Mockup. Si validas CÓMO SE SIENTE Y FLUYE -&gt; Prototipo.</w:t>
+      </w:r>
+    </w:p>
+    <w:p>
+      <w:pPr>
+        <w:spacing w:after="40"/>
+      </w:pPr>
+      <w:r>
+        <w:rPr>
+          <w:b/>
+        </w:rPr>
+        <w:t xml:space="preserve">Error crítico que genera costo: </w:t>
+      </w:r>
+      <w:r>
+        <w:t>Saltar del wireframe directo a desarrollo sin mockup ni prototipo. Resultado: producto funcionalmente correcto pero visualmente pobre e inusable. El costo de corrección en código es 10x superior al costo en fase de diseño (Principio de Boehm).</w:t>
+      </w:r>
+    </w:p>
+    <w:p>
+      <w:pPr>
+        <w:spacing w:after="40"/>
+      </w:pPr>
+      <w:r>
+        <w:rPr>
+          <w:b/>
+        </w:rPr>
+        <w:t xml:space="preserve">Estándar académico recomendado: </w:t>
+      </w:r>
+      <w:r>
+        <w:t>Wireframe -&gt; Test de estructura -&gt; Mockup + Design System -&gt; Prototipo High-Fi -&gt; Test de usabilidad (n=5) -&gt; Handoff a desarrollo.</w:t>
+      </w:r>
+    </w:p>
+    <w:p>
+      <w:r>
+        <w:br w:type="page"/>
       </w:r>
     </w:p>
     <w:p>
@@ -880,128 +1518,6 @@
         <w:pStyle w:val="Ttulo1"/>
       </w:pPr>
       <w:r>
-        <w:t>3. Ejemplo Práctico Unificado</w:t>
-      </w:r>
-    </w:p>
-    <w:p>
-      <w:pPr>
-        <w:spacing w:after="40"/>
-      </w:pPr>
-      <w:r>
-        <w:t>App móvil FinTech "Capital" - Dashboard de Gastos Mensuales. Misma pantalla, tres evoluciones:</w:t>
-      </w:r>
-    </w:p>
-    <w:p>
-      <w:pPr>
-        <w:spacing w:after="40"/>
-      </w:pPr>
-      <w:r>
-        <w:rPr>
-          <w:b/>
-        </w:rPr>
-        <w:t xml:space="preserve">Wireframe: </w:t>
-      </w:r>
-      <w:r>
-        <w:t>[Header] [Balance: $XXXX] [Gráfico barras grises] [Lista transacciones] [FAB: +]</w:t>
-      </w:r>
-      <w:r>
-        <w:t>. Sin color. Valida prioridad de contenido.</w:t>
-      </w:r>
-    </w:p>
-    <w:p>
-      <w:pPr>
-        <w:spacing w:after="40"/>
-      </w:pPr>
-      <w:r>
-        <w:rPr>
-          <w:b/>
-        </w:rPr>
-        <w:t xml:space="preserve">Mockup: </w:t>
-      </w:r>
-      <w:r>
-        <w:t>Fondo #0A0A0B, glassmorphism, gráfico azul #4D7FC1, tipografía Manrope Bold. Valida identidad visual, contraste y coherencia de marca.</w:t>
-      </w:r>
-    </w:p>
-    <w:p>
-      <w:pPr>
-        <w:spacing w:after="40"/>
-      </w:pPr>
-      <w:r>
-        <w:rPr>
-          <w:b/>
-        </w:rPr>
-        <w:t xml:space="preserve">Prototipo (Figma High-Fi): </w:t>
-      </w:r>
-      <w:r>
-        <w:t>Interacciones: tap en gráfico filtra lista</w:t>
-      </w:r>
-      <w:r>
-        <w:t>; swipe acciones Editar/Eliminar; tap en + bottom sheet animado; estado vacío con Lottie. Valida con test de usabilidad (n=5).</w:t>
-      </w:r>
-    </w:p>
-    <w:p>
-      <w:pPr>
-        <w:pStyle w:val="Ttulo1"/>
-      </w:pPr>
-      <w:r>
-        <w:lastRenderedPageBreak/>
-        <w:t>4. Conclusión Estratégica - Regla de Decisión</w:t>
-      </w:r>
-    </w:p>
-    <w:p>
-      <w:pPr>
-        <w:spacing w:after="40"/>
-      </w:pPr>
-      <w:r>
-        <w:t>Si validas QUÉ se construye -&gt; Wireframe. Si validas CÓMO SE VE -&gt; Mockup. Si valid</w:t>
-      </w:r>
-      <w:r>
-        <w:t>as CÓMO SE SIENTE Y FLUYE -&gt; Prototipo.</w:t>
-      </w:r>
-    </w:p>
-    <w:p>
-      <w:pPr>
-        <w:spacing w:after="40"/>
-      </w:pPr>
-      <w:r>
-        <w:rPr>
-          <w:b/>
-        </w:rPr>
-        <w:t xml:space="preserve">Error crítico que genera costo: </w:t>
-      </w:r>
-      <w:r>
-        <w:t xml:space="preserve">Saltar del wireframe directo a desarrollo sin mockup ni prototipo. Resultado: producto funcionalmente correcto pero visualmente pobre e inusable. El costo de corrección en código es </w:t>
-      </w:r>
-      <w:r>
-        <w:t>10x superior al costo en fase de diseño (Principio de Boehm).</w:t>
-      </w:r>
-    </w:p>
-    <w:p>
-      <w:pPr>
-        <w:spacing w:after="40"/>
-      </w:pPr>
-      <w:r>
-        <w:rPr>
-          <w:b/>
-        </w:rPr>
-        <w:t xml:space="preserve">Estándar académico recomendado: </w:t>
-      </w:r>
-      <w:r>
-        <w:t>Wireframe -&gt; Test de estructura -&gt; Mockup + Design System -&gt; Prototipo High-Fi -&gt; Test de usabilidad (n=5) -&gt; Handoff a desarrollo.</w:t>
-      </w:r>
-      <w:bookmarkStart w:id="0" w:name="_GoBack"/>
-      <w:bookmarkEnd w:id="0"/>
-    </w:p>
-    <w:p>
-      <w:r>
-        <w:br w:type="page"/>
-      </w:r>
-    </w:p>
-    <w:p>
-      <w:pPr>
-        <w:pStyle w:val="Ttulo1"/>
-      </w:pPr>
-      <w:r>
         <w:lastRenderedPageBreak/>
         <w:t>11. Referencias</w:t>
       </w:r>
@@ -1011,10 +1527,7 @@
         <w:spacing w:after="80"/>
       </w:pPr>
       <w:r>
-        <w:t>ISO. (2010). ISO 9241-210: Ergonomía de la interacción persona-sistema - Parte 210: Diseño centrado en el usuario. Organización Internacional para la Estandari</w:t>
-      </w:r>
-      <w:r>
-        <w:t>zación.</w:t>
+        <w:t>ISO. (2010). ISO 9241-210: Ergonomía de la interacción persona-sistema - Parte 210: Diseño centrado en el usuario. Organización Internacional para la Estandarización.</w:t>
       </w:r>
     </w:p>
     <w:p>
@@ -1030,10 +1543,7 @@
         <w:spacing w:after="80"/>
       </w:pPr>
       <w:r>
-        <w:t>Garrett, J. J. (2002). The Elements of User Experience: User-Centered Design for the Web and Beyond. New Rider</w:t>
-      </w:r>
-      <w:r>
-        <w:t>s.</w:t>
+        <w:t>Garrett, J. J. (2002). The Elements of User Experience: User-Centered Design for the Web and Beyond. New Riders.</w:t>
       </w:r>
     </w:p>
     <w:p>
@@ -1055,13 +1565,145 @@
     <w:p>
       <w:pPr>
         <w:spacing w:after="80"/>
+        <w:rPr>
+          <w:ins w:id="65" w:author="francisco javier gonzalez  garcia" w:date="2026-09-22T22:31:00Z"/>
+        </w:rPr>
       </w:pPr>
       <w:r>
-        <w:t>Löwgren, J., &amp; Stolterman, E. (2004). Thoughtful Interacti</w:t>
-      </w:r>
-      <w:r>
-        <w:t>on Design: A Design Perspective on Research-Based Design. Morgan Kaufmann.</w:t>
-      </w:r>
+        <w:t>Löwgren, J., &amp; Stolterman, E. (2004). Thoughtful Interaction Design: A Design Perspective on Research-Based Design. Morgan Kaufmann.</w:t>
+      </w:r>
+    </w:p>
+    <w:p>
+      <w:pPr>
+        <w:spacing w:after="80"/>
+        <w:rPr>
+          <w:ins w:id="66" w:author="francisco javier gonzalez  garcia" w:date="2026-09-22T22:31:00Z"/>
+        </w:rPr>
+      </w:pPr>
+    </w:p>
+    <w:customXmlInsRangeStart w:id="67" w:author="francisco javier gonzalez  garcia" w:date="2026-09-22T22:32:00Z"/>
+    <w:sdt>
+      <w:sdtPr>
+        <w:rPr>
+          <w:lang w:val="es-ES"/>
+        </w:rPr>
+        <w:id w:val="682404742"/>
+        <w:docPartObj>
+          <w:docPartGallery w:val="Bibliographies"/>
+          <w:docPartUnique/>
+        </w:docPartObj>
+      </w:sdtPr>
+      <w:sdtEndPr>
+        <w:rPr>
+          <w:rFonts w:ascii="Calibri" w:eastAsiaTheme="minorEastAsia" w:hAnsi="Calibri" w:cstheme="minorBidi"/>
+          <w:b w:val="0"/>
+          <w:bCs w:val="0"/>
+          <w:color w:val="auto"/>
+          <w:sz w:val="22"/>
+          <w:szCs w:val="22"/>
+          <w:lang w:val="es-MX"/>
+        </w:rPr>
+      </w:sdtEndPr>
+      <w:sdtContent>
+        <w:customXmlInsRangeEnd w:id="67"/>
+        <w:p>
+          <w:pPr>
+            <w:pStyle w:val="Ttulo1"/>
+            <w:rPr>
+              <w:ins w:id="68" w:author="francisco javier gonzalez  garcia" w:date="2026-09-22T22:32:00Z"/>
+            </w:rPr>
+          </w:pPr>
+          <w:ins w:id="69" w:author="francisco javier gonzalez  garcia" w:date="2026-09-22T22:32:00Z">
+            <w:r>
+              <w:rPr>
+                <w:lang w:val="es-ES"/>
+              </w:rPr>
+              <w:t>Referencias</w:t>
+            </w:r>
+          </w:ins>
+        </w:p>
+        <w:customXmlInsRangeStart w:id="70" w:author="francisco javier gonzalez  garcia" w:date="2026-09-22T22:32:00Z"/>
+        <w:sdt>
+          <w:sdtPr>
+            <w:id w:val="-573587230"/>
+            <w:bibliography/>
+          </w:sdtPr>
+          <w:sdtContent>
+            <w:customXmlInsRangeEnd w:id="70"/>
+            <w:p>
+              <w:pPr>
+                <w:pStyle w:val="Bibliografa"/>
+                <w:ind w:left="720" w:hanging="720"/>
+                <w:rPr>
+                  <w:noProof/>
+                  <w:sz w:val="24"/>
+                  <w:szCs w:val="24"/>
+                  <w:lang w:val="es-ES"/>
+                </w:rPr>
+              </w:pPr>
+              <w:ins w:id="71" w:author="francisco javier gonzalez  garcia" w:date="2026-09-22T22:32:00Z">
+                <w:r>
+                  <w:fldChar w:fldCharType="begin"/>
+                </w:r>
+                <w:r>
+                  <w:instrText>BIBLIOGRAPHY</w:instrText>
+                </w:r>
+                <w:r>
+                  <w:fldChar w:fldCharType="separate"/>
+                </w:r>
+              </w:ins>
+              <w:r>
+                <w:rPr>
+                  <w:noProof/>
+                  <w:lang w:val="es-ES"/>
+                </w:rPr>
+                <w:t xml:space="preserve">Guilizzoni, P. (8 de mayo de 2025). </w:t>
+              </w:r>
+              <w:r>
+                <w:rPr>
+                  <w:i/>
+                  <w:iCs/>
+                  <w:noProof/>
+                  <w:lang w:val="es-ES"/>
+                </w:rPr>
+                <w:t>balsamiq.com</w:t>
+              </w:r>
+              <w:r>
+                <w:rPr>
+                  <w:noProof/>
+                  <w:lang w:val="es-ES"/>
+                </w:rPr>
+                <w:t>. Obtenido de balsamiq.com: https://balsamiq.com/blog/what-are-wireframes/</w:t>
+              </w:r>
+            </w:p>
+            <w:p>
+              <w:pPr>
+                <w:rPr>
+                  <w:ins w:id="72" w:author="francisco javier gonzalez  garcia" w:date="2026-09-22T22:32:00Z"/>
+                </w:rPr>
+              </w:pPr>
+              <w:ins w:id="73" w:author="francisco javier gonzalez  garcia" w:date="2026-09-22T22:32:00Z">
+                <w:r>
+                  <w:rPr>
+                    <w:b/>
+                    <w:bCs/>
+                  </w:rPr>
+                  <w:fldChar w:fldCharType="end"/>
+                </w:r>
+              </w:ins>
+            </w:p>
+            <w:customXmlInsRangeStart w:id="74" w:author="francisco javier gonzalez  garcia" w:date="2026-09-22T22:32:00Z"/>
+          </w:sdtContent>
+        </w:sdt>
+        <w:customXmlInsRangeEnd w:id="74"/>
+        <w:customXmlInsRangeStart w:id="75" w:author="francisco javier gonzalez  garcia" w:date="2026-09-22T22:32:00Z"/>
+      </w:sdtContent>
+    </w:sdt>
+    <w:customXmlInsRangeEnd w:id="75"/>
+    <w:p>
+      <w:pPr>
+        <w:spacing w:after="80"/>
+      </w:pPr>
     </w:p>
     <w:sectPr>
       <w:pgSz w:w="12240" w:h="15840"/>
@@ -1074,8 +1716,8 @@
 </file>
 
 <file path=word/numbering.xml><?xml version="1.0" encoding="utf-8"?>
-<w:numbering xmlns:wpc="http://schemas.microsoft.com/office/word/2010/wordprocessingCanvas" xmlns:mc="http://schemas.openxmlformats.org/markup-compatibility/2006" xmlns:o="urn:schemas-microsoft-com:office:office" xmlns:r="http://schemas.openxmlformats.org/officeDocument/2006/relationships" xmlns:m="http://schemas.openxmlformats.org/officeDocument/2006/math" xmlns:v="urn:schemas-microsoft-com:vml" xmlns:wp14="http://schemas.microsoft.com/office/word/2010/wordprocessingDrawing" xmlns:wp="http://schemas.openxmlformats.org/drawingml/2006/wordprocessingDrawing" xmlns:w10="urn:schemas-microsoft-com:office:word" xmlns:w="http://schemas.openxmlformats.org/wordprocessingml/2006/main" xmlns:w14="http://schemas.microsoft.com/office/word/2010/wordml" xmlns:w15="http://schemas.microsoft.com/office/word/2012/wordml" xmlns:wpg="http://schemas.microsoft.com/office/word/2010/wordprocessingGroup" xmlns:wpi="http://schemas.microsoft.com/office/word/2010/wordprocessingInk" xmlns:wne="http://schemas.microsoft.com/office/word/2006/wordml" xmlns:wps="http://schemas.microsoft.com/office/word/2010/wordprocessingShape" mc:Ignorable="w14 w15 wp14">
-  <w:abstractNum w:abstractNumId="0">
+<w:numbering xmlns:wpc="http://schemas.microsoft.com/office/word/2010/wordprocessingCanvas" xmlns:cx="http://schemas.microsoft.com/office/drawing/2014/chartex" xmlns:cx1="http://schemas.microsoft.com/office/drawing/2015/9/8/chartex" xmlns:cx2="http://schemas.microsoft.com/office/drawing/2015/10/21/chartex" xmlns:cx3="http://schemas.microsoft.com/office/drawing/2016/5/9/chartex" xmlns:cx4="http://schemas.microsoft.com/office/drawing/2016/5/10/chartex" xmlns:cx5="http://schemas.microsoft.com/office/drawing/2016/5/11/chartex" xmlns:cx6="http://schemas.microsoft.com/office/drawing/2016/5/12/chartex" xmlns:cx7="http://schemas.microsoft.com/office/drawing/2016/5/13/chartex" xmlns:cx8="http://schemas.microsoft.com/office/drawing/2016/5/14/chartex" xmlns:mc="http://schemas.openxmlformats.org/markup-compatibility/2006" xmlns:aink="http://schemas.microsoft.com/office/drawing/2016/ink" xmlns:am3d="http://schemas.microsoft.com/office/drawing/2017/model3d" xmlns:o="urn:schemas-microsoft-com:office:office" xmlns:r="http://schemas.openxmlformats.org/officeDocument/2006/relationships" xmlns:m="http://schemas.openxmlformats.org/officeDocument/2006/math" xmlns:v="urn:schemas-microsoft-com:vml" xmlns:wp14="http://schemas.microsoft.com/office/word/2010/wordprocessingDrawing" xmlns:wp="http://schemas.openxmlformats.org/drawingml/2006/wordprocessingDrawing" xmlns:w10="urn:schemas-microsoft-com:office:word" xmlns:w="http://schemas.openxmlformats.org/wordprocessingml/2006/main" xmlns:w14="http://schemas.microsoft.com/office/word/2010/wordml" xmlns:w15="http://schemas.microsoft.com/office/word/2012/wordml" xmlns:w16cex="http://schemas.microsoft.com/office/word/2018/wordml/cex" xmlns:w16cid="http://schemas.microsoft.com/office/word/2016/wordml/cid" xmlns:w16="http://schemas.microsoft.com/office/word/2018/wordml" xmlns:w16sdtdh="http://schemas.microsoft.com/office/word/2020/wordml/sdtdatahash" xmlns:w16se="http://schemas.microsoft.com/office/word/2015/wordml/symex" xmlns:wpg="http://schemas.microsoft.com/office/word/2010/wordprocessingGroup" xmlns:wpi="http://schemas.microsoft.com/office/word/2010/wordprocessingInk" xmlns:wne="http://schemas.microsoft.com/office/word/2006/wordml" xmlns:wps="http://schemas.microsoft.com/office/word/2010/wordprocessingShape" mc:Ignorable="w14 w15 w16se w16cid w16 w16cex w16sdtdh wp14">
+  <w:abstractNum w:abstractNumId="0" w15:restartNumberingAfterBreak="0">
     <w:nsid w:val="FFFFFF7C"/>
     <w:multiLevelType w:val="singleLevel"/>
     <w:tmpl w:val="C310EC42"/>
@@ -1092,7 +1734,7 @@
       </w:pPr>
     </w:lvl>
   </w:abstractNum>
-  <w:abstractNum w:abstractNumId="1">
+  <w:abstractNum w:abstractNumId="1" w15:restartNumberingAfterBreak="0">
     <w:nsid w:val="FFFFFF7D"/>
     <w:multiLevelType w:val="singleLevel"/>
     <w:tmpl w:val="E4089024"/>
@@ -1109,7 +1751,7 @@
       </w:pPr>
     </w:lvl>
   </w:abstractNum>
-  <w:abstractNum w:abstractNumId="2">
+  <w:abstractNum w:abstractNumId="2" w15:restartNumberingAfterBreak="0">
     <w:nsid w:val="FFFFFF7E"/>
     <w:multiLevelType w:val="singleLevel"/>
     <w:tmpl w:val="FB12693A"/>
@@ -1127,7 +1769,7 @@
       </w:pPr>
     </w:lvl>
   </w:abstractNum>
-  <w:abstractNum w:abstractNumId="3">
+  <w:abstractNum w:abstractNumId="3" w15:restartNumberingAfterBreak="0">
     <w:nsid w:val="FFFFFF7F"/>
     <w:multiLevelType w:val="singleLevel"/>
     <w:tmpl w:val="38441652"/>
@@ -1145,7 +1787,7 @@
       </w:pPr>
     </w:lvl>
   </w:abstractNum>
-  <w:abstractNum w:abstractNumId="4">
+  <w:abstractNum w:abstractNumId="4" w15:restartNumberingAfterBreak="0">
     <w:nsid w:val="FFFFFF81"/>
     <w:multiLevelType w:val="singleLevel"/>
     <w:tmpl w:val="171AC3A4"/>
@@ -1165,7 +1807,7 @@
       </w:rPr>
     </w:lvl>
   </w:abstractNum>
-  <w:abstractNum w:abstractNumId="5">
+  <w:abstractNum w:abstractNumId="5" w15:restartNumberingAfterBreak="0">
     <w:nsid w:val="FFFFFF82"/>
     <w:multiLevelType w:val="singleLevel"/>
     <w:tmpl w:val="F3EAFDEC"/>
@@ -1186,7 +1828,7 @@
       </w:rPr>
     </w:lvl>
   </w:abstractNum>
-  <w:abstractNum w:abstractNumId="6">
+  <w:abstractNum w:abstractNumId="6" w15:restartNumberingAfterBreak="0">
     <w:nsid w:val="FFFFFF83"/>
     <w:multiLevelType w:val="singleLevel"/>
     <w:tmpl w:val="3D1EFFD4"/>
@@ -1207,7 +1849,7 @@
       </w:rPr>
     </w:lvl>
   </w:abstractNum>
-  <w:abstractNum w:abstractNumId="7">
+  <w:abstractNum w:abstractNumId="7" w15:restartNumberingAfterBreak="0">
     <w:nsid w:val="FFFFFF88"/>
     <w:multiLevelType w:val="singleLevel"/>
     <w:tmpl w:val="D0A62B40"/>
@@ -1225,7 +1867,7 @@
       </w:pPr>
     </w:lvl>
   </w:abstractNum>
-  <w:abstractNum w:abstractNumId="8">
+  <w:abstractNum w:abstractNumId="8" w15:restartNumberingAfterBreak="0">
     <w:nsid w:val="FFFFFF89"/>
     <w:multiLevelType w:val="singleLevel"/>
     <w:tmpl w:val="29761A62"/>
@@ -1276,8 +1918,19 @@
 </w:numbering>
 </file>
 
+<file path=word/people.xml><?xml version="1.0" encoding="utf-8"?>
+<w15:people xmlns:wpc="http://schemas.microsoft.com/office/word/2010/wordprocessingCanvas" xmlns:cx="http://schemas.microsoft.com/office/drawing/2014/chartex" xmlns:cx1="http://schemas.microsoft.com/office/drawing/2015/9/8/chartex" xmlns:cx2="http://schemas.microsoft.com/office/drawing/2015/10/21/chartex" xmlns:cx3="http://schemas.microsoft.com/office/drawing/2016/5/9/chartex" xmlns:cx4="http://schemas.microsoft.com/office/drawing/2016/5/10/chartex" xmlns:cx5="http://schemas.microsoft.com/office/drawing/2016/5/11/chartex" xmlns:cx6="http://schemas.microsoft.com/office/drawing/2016/5/12/chartex" xmlns:cx7="http://schemas.microsoft.com/office/drawing/2016/5/13/chartex" xmlns:cx8="http://schemas.microsoft.com/office/drawing/2016/5/14/chartex" xmlns:mc="http://schemas.openxmlformats.org/markup-compatibility/2006" xmlns:aink="http://schemas.microsoft.com/office/drawing/2016/ink" xmlns:am3d="http://schemas.microsoft.com/office/drawing/2017/model3d" xmlns:o="urn:schemas-microsoft-com:office:office" xmlns:r="http://schemas.openxmlformats.org/officeDocument/2006/relationships" xmlns:m="http://schemas.openxmlformats.org/officeDocument/2006/math" xmlns:v="urn:schemas-microsoft-com:vml" xmlns:wp14="http://schemas.microsoft.com/office/word/2010/wordprocessingDrawing" xmlns:wp="http://schemas.openxmlformats.org/drawingml/2006/wordprocessingDrawing" xmlns:w10="urn:schemas-microsoft-com:office:word" xmlns:w="http://schemas.openxmlformats.org/wordprocessingml/2006/main" xmlns:w14="http://schemas.microsoft.com/office/word/2010/wordml" xmlns:w15="http://schemas.microsoft.com/office/word/2012/wordml" xmlns:w16cex="http://schemas.microsoft.com/office/word/2018/wordml/cex" xmlns:w16cid="http://schemas.microsoft.com/office/word/2016/wordml/cid" xmlns:w16="http://schemas.microsoft.com/office/word/2018/wordml" xmlns:w16sdtdh="http://schemas.microsoft.com/office/word/2020/wordml/sdtdatahash" xmlns:w16se="http://schemas.microsoft.com/office/word/2015/wordml/symex" xmlns:wpg="http://schemas.microsoft.com/office/word/2010/wordprocessingGroup" xmlns:wpi="http://schemas.microsoft.com/office/word/2010/wordprocessingInk" xmlns:wne="http://schemas.microsoft.com/office/word/2006/wordml" xmlns:wps="http://schemas.microsoft.com/office/word/2010/wordprocessingShape" mc:Ignorable="w14 w15 w16se w16cid w16 w16cex w16sdtdh wp14">
+  <w15:person w15:author="francisco javier gonzalez  garcia">
+    <w15:presenceInfo w15:providerId="None" w15:userId="francisco javier gonzalez  garcia"/>
+  </w15:person>
+  <w15:person w15:author="Francisco Javier">
+    <w15:presenceInfo w15:providerId="None" w15:userId="Francisco Javier"/>
+  </w15:person>
+</w15:people>
+</file>
+
 <file path=word/styles.xml><?xml version="1.0" encoding="utf-8"?>
-<w:styles xmlns:mc="http://schemas.openxmlformats.org/markup-compatibility/2006" xmlns:r="http://schemas.openxmlformats.org/officeDocument/2006/relationships" xmlns:w="http://schemas.openxmlformats.org/wordprocessingml/2006/main" xmlns:w14="http://schemas.microsoft.com/office/word/2010/wordml" xmlns:w15="http://schemas.microsoft.com/office/word/2012/wordml" mc:Ignorable="w14 w15">
+<w:styles xmlns:mc="http://schemas.openxmlformats.org/markup-compatibility/2006" xmlns:r="http://schemas.openxmlformats.org/officeDocument/2006/relationships" xmlns:w="http://schemas.openxmlformats.org/wordprocessingml/2006/main" xmlns:w14="http://schemas.microsoft.com/office/word/2010/wordml" xmlns:w15="http://schemas.microsoft.com/office/word/2012/wordml" xmlns:w16cex="http://schemas.microsoft.com/office/word/2018/wordml/cex" xmlns:w16cid="http://schemas.microsoft.com/office/word/2016/wordml/cid" xmlns:w16="http://schemas.microsoft.com/office/word/2018/wordml" xmlns:w16sdtdh="http://schemas.microsoft.com/office/word/2020/wordml/sdtdatahash" xmlns:w16se="http://schemas.microsoft.com/office/word/2015/wordml/symex" mc:Ignorable="w14 w15 w16se w16cid w16 w16cex w16sdtdh">
   <w:docDefaults>
     <w:rPrDefault>
       <w:rPr>
@@ -1293,7 +1946,7 @@
       </w:pPr>
     </w:pPrDefault>
   </w:docDefaults>
-  <w:latentStyles w:defLockedState="0" w:defUIPriority="99" w:defSemiHidden="0" w:defUnhideWhenUsed="0" w:defQFormat="0" w:count="371">
+  <w:latentStyles w:defLockedState="0" w:defUIPriority="99" w:defSemiHidden="0" w:defUnhideWhenUsed="0" w:defQFormat="0" w:count="376">
     <w:lsdException w:name="Normal" w:uiPriority="0" w:qFormat="1"/>
     <w:lsdException w:name="heading 1" w:uiPriority="9" w:qFormat="1"/>
     <w:lsdException w:name="heading 2" w:semiHidden="1" w:uiPriority="9" w:unhideWhenUsed="1" w:qFormat="1"/>
@@ -1399,7 +2052,6 @@
     <w:lsdException w:name="HTML Sample" w:semiHidden="1" w:unhideWhenUsed="1"/>
     <w:lsdException w:name="HTML Typewriter" w:semiHidden="1" w:unhideWhenUsed="1"/>
     <w:lsdException w:name="HTML Variable" w:semiHidden="1" w:unhideWhenUsed="1"/>
-    <w:lsdException w:name="Normal Table" w:semiHidden="1" w:unhideWhenUsed="1"/>
     <w:lsdException w:name="annotation subject" w:semiHidden="1" w:unhideWhenUsed="1"/>
     <w:lsdException w:name="No List" w:semiHidden="1" w:unhideWhenUsed="1"/>
     <w:lsdException w:name="Outline List 1" w:semiHidden="1" w:unhideWhenUsed="1"/>
@@ -1442,11 +2094,8 @@
     <w:lsdException w:name="Table Contemporary" w:semiHidden="1" w:unhideWhenUsed="1"/>
     <w:lsdException w:name="Table Elegant" w:semiHidden="1" w:unhideWhenUsed="1"/>
     <w:lsdException w:name="Table Professional" w:semiHidden="1" w:unhideWhenUsed="1"/>
-    <w:lsdException w:name="Table Subtle 1" w:semiHidden="1" w:unhideWhenUsed="1"/>
     <w:lsdException w:name="Table Subtle 2" w:semiHidden="1" w:unhideWhenUsed="1"/>
     <w:lsdException w:name="Table Web 1" w:semiHidden="1" w:unhideWhenUsed="1"/>
-    <w:lsdException w:name="Table Web 2" w:semiHidden="1" w:unhideWhenUsed="1"/>
-    <w:lsdException w:name="Table Web 3" w:semiHidden="1" w:unhideWhenUsed="1"/>
     <w:lsdException w:name="Balloon Text" w:semiHidden="1" w:unhideWhenUsed="1"/>
     <w:lsdException w:name="Table Grid" w:uiPriority="59"/>
     <w:lsdException w:name="Table Theme" w:semiHidden="1" w:unhideWhenUsed="1"/>
@@ -1656,6 +2305,11 @@
     <w:lsdException w:name="List Table 5 Dark Accent 6" w:uiPriority="50"/>
     <w:lsdException w:name="List Table 6 Colorful Accent 6" w:uiPriority="51"/>
     <w:lsdException w:name="List Table 7 Colorful Accent 6" w:uiPriority="52"/>
+    <w:lsdException w:name="Mention" w:semiHidden="1" w:unhideWhenUsed="1"/>
+    <w:lsdException w:name="Smart Hyperlink" w:semiHidden="1" w:unhideWhenUsed="1"/>
+    <w:lsdException w:name="Hashtag" w:semiHidden="1" w:unhideWhenUsed="1"/>
+    <w:lsdException w:name="Unresolved Mention" w:semiHidden="1" w:unhideWhenUsed="1"/>
+    <w:lsdException w:name="Smart Link" w:semiHidden="1" w:unhideWhenUsed="1"/>
   </w:latentStyles>
   <w:style w:type="paragraph" w:default="1" w:styleId="Normal">
     <w:name w:val="Normal"/>
@@ -2001,11 +2655,11 @@
       <w:color w:val="4F81BD" w:themeColor="accent1"/>
     </w:rPr>
   </w:style>
-  <w:style w:type="paragraph" w:styleId="Puesto">
+  <w:style w:type="paragraph" w:styleId="Ttulo">
     <w:name w:val="Title"/>
     <w:basedOn w:val="Normal"/>
     <w:next w:val="Normal"/>
-    <w:link w:val="PuestoCar"/>
+    <w:link w:val="TtuloCar"/>
     <w:uiPriority w:val="10"/>
     <w:qFormat/>
     <w:rsid w:val="00FC693F"/>
@@ -2025,10 +2679,10 @@
       <w:szCs w:val="52"/>
     </w:rPr>
   </w:style>
-  <w:style w:type="character" w:customStyle="1" w:styleId="PuestoCar">
-    <w:name w:val="Puesto Car"/>
+  <w:style w:type="character" w:customStyle="1" w:styleId="TtuloCar">
+    <w:name w:val="Título Car"/>
     <w:basedOn w:val="Fuentedeprrafopredeter"/>
-    <w:link w:val="Puesto"/>
+    <w:link w:val="Ttulo"/>
     <w:uiPriority w:val="10"/>
     <w:rsid w:val="00FC693F"/>
     <w:rPr>
@@ -2591,7 +3245,7 @@
       <w:spacing w:val="5"/>
     </w:rPr>
   </w:style>
-  <w:style w:type="paragraph" w:styleId="TtulodeTDC">
+  <w:style w:type="paragraph" w:styleId="TtuloTDC">
     <w:name w:val="TOC Heading"/>
     <w:basedOn w:val="Ttulo1"/>
     <w:next w:val="Normal"/>
@@ -2613,7 +3267,6 @@
       <w:spacing w:after="0" w:line="240" w:lineRule="auto"/>
     </w:pPr>
     <w:tblPr>
-      <w:tblInd w:w="0" w:type="dxa"/>
       <w:tblBorders>
         <w:top w:val="single" w:sz="4" w:space="0" w:color="auto"/>
         <w:left w:val="single" w:sz="4" w:space="0" w:color="auto"/>
@@ -2622,12 +3275,6 @@
         <w:insideH w:val="single" w:sz="4" w:space="0" w:color="auto"/>
         <w:insideV w:val="single" w:sz="4" w:space="0" w:color="auto"/>
       </w:tblBorders>
-      <w:tblCellMar>
-        <w:top w:w="0" w:type="dxa"/>
-        <w:left w:w="108" w:type="dxa"/>
-        <w:bottom w:w="0" w:type="dxa"/>
-        <w:right w:w="108" w:type="dxa"/>
-      </w:tblCellMar>
     </w:tblPr>
   </w:style>
   <w:style w:type="table" w:styleId="Sombreadoclaro">
@@ -2644,17 +3291,10 @@
     <w:tblPr>
       <w:tblStyleRowBandSize w:val="1"/>
       <w:tblStyleColBandSize w:val="1"/>
-      <w:tblInd w:w="0" w:type="dxa"/>
       <w:tblBorders>
         <w:top w:val="single" w:sz="8" w:space="0" w:color="000000" w:themeColor="text1"/>
         <w:bottom w:val="single" w:sz="8" w:space="0" w:color="000000" w:themeColor="text1"/>
       </w:tblBorders>
-      <w:tblCellMar>
-        <w:top w:w="0" w:type="dxa"/>
-        <w:left w:w="108" w:type="dxa"/>
-        <w:bottom w:w="0" w:type="dxa"/>
-        <w:right w:w="108" w:type="dxa"/>
-      </w:tblCellMar>
     </w:tblPr>
     <w:tblStylePr w:type="firstRow">
       <w:pPr>
@@ -2747,17 +3387,10 @@
     <w:tblPr>
       <w:tblStyleRowBandSize w:val="1"/>
       <w:tblStyleColBandSize w:val="1"/>
-      <w:tblInd w:w="0" w:type="dxa"/>
       <w:tblBorders>
         <w:top w:val="single" w:sz="8" w:space="0" w:color="4F81BD" w:themeColor="accent1"/>
         <w:bottom w:val="single" w:sz="8" w:space="0" w:color="4F81BD" w:themeColor="accent1"/>
       </w:tblBorders>
-      <w:tblCellMar>
-        <w:top w:w="0" w:type="dxa"/>
-        <w:left w:w="108" w:type="dxa"/>
-        <w:bottom w:w="0" w:type="dxa"/>
-        <w:right w:w="108" w:type="dxa"/>
-      </w:tblCellMar>
     </w:tblPr>
     <w:tblStylePr w:type="firstRow">
       <w:pPr>
@@ -2850,17 +3483,10 @@
     <w:tblPr>
       <w:tblStyleRowBandSize w:val="1"/>
       <w:tblStyleColBandSize w:val="1"/>
-      <w:tblInd w:w="0" w:type="dxa"/>
       <w:tblBorders>
         <w:top w:val="single" w:sz="8" w:space="0" w:color="C0504D" w:themeColor="accent2"/>
         <w:bottom w:val="single" w:sz="8" w:space="0" w:color="C0504D" w:themeColor="accent2"/>
       </w:tblBorders>
-      <w:tblCellMar>
-        <w:top w:w="0" w:type="dxa"/>
-        <w:left w:w="108" w:type="dxa"/>
-        <w:bottom w:w="0" w:type="dxa"/>
-        <w:right w:w="108" w:type="dxa"/>
-      </w:tblCellMar>
     </w:tblPr>
     <w:tblStylePr w:type="firstRow">
       <w:pPr>
@@ -2953,17 +3579,10 @@
     <w:tblPr>
       <w:tblStyleRowBandSize w:val="1"/>
       <w:tblStyleColBandSize w:val="1"/>
-      <w:tblInd w:w="0" w:type="dxa"/>
       <w:tblBorders>
         <w:top w:val="single" w:sz="8" w:space="0" w:color="9BBB59" w:themeColor="accent3"/>
         <w:bottom w:val="single" w:sz="8" w:space="0" w:color="9BBB59" w:themeColor="accent3"/>
       </w:tblBorders>
-      <w:tblCellMar>
-        <w:top w:w="0" w:type="dxa"/>
-        <w:left w:w="108" w:type="dxa"/>
-        <w:bottom w:w="0" w:type="dxa"/>
-        <w:right w:w="108" w:type="dxa"/>
-      </w:tblCellMar>
     </w:tblPr>
     <w:tblStylePr w:type="firstRow">
       <w:pPr>
@@ -3056,17 +3675,10 @@
     <w:tblPr>
       <w:tblStyleRowBandSize w:val="1"/>
       <w:tblStyleColBandSize w:val="1"/>
-      <w:tblInd w:w="0" w:type="dxa"/>
       <w:tblBorders>
         <w:top w:val="single" w:sz="8" w:space="0" w:color="8064A2" w:themeColor="accent4"/>
         <w:bottom w:val="single" w:sz="8" w:space="0" w:color="8064A2" w:themeColor="accent4"/>
       </w:tblBorders>
-      <w:tblCellMar>
-        <w:top w:w="0" w:type="dxa"/>
-        <w:left w:w="108" w:type="dxa"/>
-        <w:bottom w:w="0" w:type="dxa"/>
-        <w:right w:w="108" w:type="dxa"/>
-      </w:tblCellMar>
     </w:tblPr>
     <w:tblStylePr w:type="firstRow">
       <w:pPr>
@@ -3159,17 +3771,10 @@
     <w:tblPr>
       <w:tblStyleRowBandSize w:val="1"/>
       <w:tblStyleColBandSize w:val="1"/>
-      <w:tblInd w:w="0" w:type="dxa"/>
       <w:tblBorders>
         <w:top w:val="single" w:sz="8" w:space="0" w:color="4BACC6" w:themeColor="accent5"/>
         <w:bottom w:val="single" w:sz="8" w:space="0" w:color="4BACC6" w:themeColor="accent5"/>
       </w:tblBorders>
-      <w:tblCellMar>
-        <w:top w:w="0" w:type="dxa"/>
-        <w:left w:w="108" w:type="dxa"/>
-        <w:bottom w:w="0" w:type="dxa"/>
-        <w:right w:w="108" w:type="dxa"/>
-      </w:tblCellMar>
     </w:tblPr>
     <w:tblStylePr w:type="firstRow">
       <w:pPr>
@@ -3262,17 +3867,10 @@
     <w:tblPr>
       <w:tblStyleRowBandSize w:val="1"/>
       <w:tblStyleColBandSize w:val="1"/>
-      <w:tblInd w:w="0" w:type="dxa"/>
       <w:tblBorders>
         <w:top w:val="single" w:sz="8" w:space="0" w:color="F79646" w:themeColor="accent6"/>
         <w:bottom w:val="single" w:sz="8" w:space="0" w:color="F79646" w:themeColor="accent6"/>
       </w:tblBorders>
-      <w:tblCellMar>
-        <w:top w:w="0" w:type="dxa"/>
-        <w:left w:w="108" w:type="dxa"/>
-        <w:bottom w:w="0" w:type="dxa"/>
-        <w:right w:w="108" w:type="dxa"/>
-      </w:tblCellMar>
     </w:tblPr>
     <w:tblStylePr w:type="firstRow">
       <w:pPr>
@@ -3362,19 +3960,12 @@
     <w:tblPr>
       <w:tblStyleRowBandSize w:val="1"/>
       <w:tblStyleColBandSize w:val="1"/>
-      <w:tblInd w:w="0" w:type="dxa"/>
       <w:tblBorders>
         <w:top w:val="single" w:sz="8" w:space="0" w:color="000000" w:themeColor="text1"/>
         <w:left w:val="single" w:sz="8" w:space="0" w:color="000000" w:themeColor="text1"/>
         <w:bottom w:val="single" w:sz="8" w:space="0" w:color="000000" w:themeColor="text1"/>
         <w:right w:val="single" w:sz="8" w:space="0" w:color="000000" w:themeColor="text1"/>
       </w:tblBorders>
-      <w:tblCellMar>
-        <w:top w:w="0" w:type="dxa"/>
-        <w:left w:w="108" w:type="dxa"/>
-        <w:bottom w:w="0" w:type="dxa"/>
-        <w:right w:w="108" w:type="dxa"/>
-      </w:tblCellMar>
     </w:tblPr>
     <w:tblStylePr w:type="firstRow">
       <w:pPr>
@@ -3454,19 +4045,12 @@
     <w:tblPr>
       <w:tblStyleRowBandSize w:val="1"/>
       <w:tblStyleColBandSize w:val="1"/>
-      <w:tblInd w:w="0" w:type="dxa"/>
       <w:tblBorders>
         <w:top w:val="single" w:sz="8" w:space="0" w:color="4F81BD" w:themeColor="accent1"/>
         <w:left w:val="single" w:sz="8" w:space="0" w:color="4F81BD" w:themeColor="accent1"/>
         <w:bottom w:val="single" w:sz="8" w:space="0" w:color="4F81BD" w:themeColor="accent1"/>
         <w:right w:val="single" w:sz="8" w:space="0" w:color="4F81BD" w:themeColor="accent1"/>
       </w:tblBorders>
-      <w:tblCellMar>
-        <w:top w:w="0" w:type="dxa"/>
-        <w:left w:w="108" w:type="dxa"/>
-        <w:bottom w:w="0" w:type="dxa"/>
-        <w:right w:w="108" w:type="dxa"/>
-      </w:tblCellMar>
     </w:tblPr>
     <w:tblStylePr w:type="firstRow">
       <w:pPr>
@@ -3546,19 +4130,12 @@
     <w:tblPr>
       <w:tblStyleRowBandSize w:val="1"/>
       <w:tblStyleColBandSize w:val="1"/>
-      <w:tblInd w:w="0" w:type="dxa"/>
       <w:tblBorders>
         <w:top w:val="single" w:sz="8" w:space="0" w:color="C0504D" w:themeColor="accent2"/>
         <w:left w:val="single" w:sz="8" w:space="0" w:color="C0504D" w:themeColor="accent2"/>
         <w:bottom w:val="single" w:sz="8" w:space="0" w:color="C0504D" w:themeColor="accent2"/>
         <w:right w:val="single" w:sz="8" w:space="0" w:color="C0504D" w:themeColor="accent2"/>
       </w:tblBorders>
-      <w:tblCellMar>
-        <w:top w:w="0" w:type="dxa"/>
-        <w:left w:w="108" w:type="dxa"/>
-        <w:bottom w:w="0" w:type="dxa"/>
-        <w:right w:w="108" w:type="dxa"/>
-      </w:tblCellMar>
     </w:tblPr>
     <w:tblStylePr w:type="firstRow">
       <w:pPr>
@@ -3638,19 +4215,12 @@
     <w:tblPr>
       <w:tblStyleRowBandSize w:val="1"/>
       <w:tblStyleColBandSize w:val="1"/>
-      <w:tblInd w:w="0" w:type="dxa"/>
       <w:tblBorders>
         <w:top w:val="single" w:sz="8" w:space="0" w:color="9BBB59" w:themeColor="accent3"/>
         <w:left w:val="single" w:sz="8" w:space="0" w:color="9BBB59" w:themeColor="accent3"/>
         <w:bottom w:val="single" w:sz="8" w:space="0" w:color="9BBB59" w:themeColor="accent3"/>
         <w:right w:val="single" w:sz="8" w:space="0" w:color="9BBB59" w:themeColor="accent3"/>
       </w:tblBorders>
-      <w:tblCellMar>
-        <w:top w:w="0" w:type="dxa"/>
-        <w:left w:w="108" w:type="dxa"/>
-        <w:bottom w:w="0" w:type="dxa"/>
-        <w:right w:w="108" w:type="dxa"/>
-      </w:tblCellMar>
     </w:tblPr>
     <w:tblStylePr w:type="firstRow">
       <w:pPr>
@@ -3730,19 +4300,12 @@
     <w:tblPr>
       <w:tblStyleRowBandSize w:val="1"/>
       <w:tblStyleColBandSize w:val="1"/>
-      <w:tblInd w:w="0" w:type="dxa"/>
       <w:tblBorders>
         <w:top w:val="single" w:sz="8" w:space="0" w:color="8064A2" w:themeColor="accent4"/>
         <w:left w:val="single" w:sz="8" w:space="0" w:color="8064A2" w:themeColor="accent4"/>
         <w:bottom w:val="single" w:sz="8" w:space="0" w:color="8064A2" w:themeColor="accent4"/>
         <w:right w:val="single" w:sz="8" w:space="0" w:color="8064A2" w:themeColor="accent4"/>
       </w:tblBorders>
-      <w:tblCellMar>
-        <w:top w:w="0" w:type="dxa"/>
-        <w:left w:w="108" w:type="dxa"/>
-        <w:bottom w:w="0" w:type="dxa"/>
-        <w:right w:w="108" w:type="dxa"/>
-      </w:tblCellMar>
     </w:tblPr>
     <w:tblStylePr w:type="firstRow">
       <w:pPr>
@@ -3822,19 +4385,12 @@
     <w:tblPr>
       <w:tblStyleRowBandSize w:val="1"/>
       <w:tblStyleColBandSize w:val="1"/>
-      <w:tblInd w:w="0" w:type="dxa"/>
       <w:tblBorders>
         <w:top w:val="single" w:sz="8" w:space="0" w:color="4BACC6" w:themeColor="accent5"/>
         <w:left w:val="single" w:sz="8" w:space="0" w:color="4BACC6" w:themeColor="accent5"/>
         <w:bottom w:val="single" w:sz="8" w:space="0" w:color="4BACC6" w:themeColor="accent5"/>
         <w:right w:val="single" w:sz="8" w:space="0" w:color="4BACC6" w:themeColor="accent5"/>
       </w:tblBorders>
-      <w:tblCellMar>
-        <w:top w:w="0" w:type="dxa"/>
-        <w:left w:w="108" w:type="dxa"/>
-        <w:bottom w:w="0" w:type="dxa"/>
-        <w:right w:w="108" w:type="dxa"/>
-      </w:tblCellMar>
     </w:tblPr>
     <w:tblStylePr w:type="firstRow">
       <w:pPr>
@@ -3914,19 +4470,12 @@
     <w:tblPr>
       <w:tblStyleRowBandSize w:val="1"/>
       <w:tblStyleColBandSize w:val="1"/>
-      <w:tblInd w:w="0" w:type="dxa"/>
       <w:tblBorders>
         <w:top w:val="single" w:sz="8" w:space="0" w:color="F79646" w:themeColor="accent6"/>
         <w:left w:val="single" w:sz="8" w:space="0" w:color="F79646" w:themeColor="accent6"/>
         <w:bottom w:val="single" w:sz="8" w:space="0" w:color="F79646" w:themeColor="accent6"/>
         <w:right w:val="single" w:sz="8" w:space="0" w:color="F79646" w:themeColor="accent6"/>
       </w:tblBorders>
-      <w:tblCellMar>
-        <w:top w:w="0" w:type="dxa"/>
-        <w:left w:w="108" w:type="dxa"/>
-        <w:bottom w:w="0" w:type="dxa"/>
-        <w:right w:w="108" w:type="dxa"/>
-      </w:tblCellMar>
     </w:tblPr>
     <w:tblStylePr w:type="firstRow">
       <w:pPr>
@@ -4006,7 +4555,6 @@
     <w:tblPr>
       <w:tblStyleRowBandSize w:val="1"/>
       <w:tblStyleColBandSize w:val="1"/>
-      <w:tblInd w:w="0" w:type="dxa"/>
       <w:tblBorders>
         <w:top w:val="single" w:sz="8" w:space="0" w:color="000000" w:themeColor="text1"/>
         <w:left w:val="single" w:sz="8" w:space="0" w:color="000000" w:themeColor="text1"/>
@@ -4015,12 +4563,6 @@
         <w:insideH w:val="single" w:sz="8" w:space="0" w:color="000000" w:themeColor="text1"/>
         <w:insideV w:val="single" w:sz="8" w:space="0" w:color="000000" w:themeColor="text1"/>
       </w:tblBorders>
-      <w:tblCellMar>
-        <w:top w:w="0" w:type="dxa"/>
-        <w:left w:w="108" w:type="dxa"/>
-        <w:bottom w:w="0" w:type="dxa"/>
-        <w:right w:w="108" w:type="dxa"/>
-      </w:tblCellMar>
     </w:tblPr>
     <w:tblStylePr w:type="firstRow">
       <w:pPr>
@@ -4136,7 +4678,6 @@
     <w:tblPr>
       <w:tblStyleRowBandSize w:val="1"/>
       <w:tblStyleColBandSize w:val="1"/>
-      <w:tblInd w:w="0" w:type="dxa"/>
       <w:tblBorders>
         <w:top w:val="single" w:sz="8" w:space="0" w:color="4F81BD" w:themeColor="accent1"/>
         <w:left w:val="single" w:sz="8" w:space="0" w:color="4F81BD" w:themeColor="accent1"/>
@@ -4145,12 +4686,6 @@
         <w:insideH w:val="single" w:sz="8" w:space="0" w:color="4F81BD" w:themeColor="accent1"/>
         <w:insideV w:val="single" w:sz="8" w:space="0" w:color="4F81BD" w:themeColor="accent1"/>
       </w:tblBorders>
-      <w:tblCellMar>
-        <w:top w:w="0" w:type="dxa"/>
-        <w:left w:w="108" w:type="dxa"/>
-        <w:bottom w:w="0" w:type="dxa"/>
-        <w:right w:w="108" w:type="dxa"/>
-      </w:tblCellMar>
     </w:tblPr>
     <w:tblStylePr w:type="firstRow">
       <w:pPr>
@@ -4266,7 +4801,6 @@
     <w:tblPr>
       <w:tblStyleRowBandSize w:val="1"/>
       <w:tblStyleColBandSize w:val="1"/>
-      <w:tblInd w:w="0" w:type="dxa"/>
       <w:tblBorders>
         <w:top w:val="single" w:sz="8" w:space="0" w:color="C0504D" w:themeColor="accent2"/>
         <w:left w:val="single" w:sz="8" w:space="0" w:color="C0504D" w:themeColor="accent2"/>
@@ -4275,12 +4809,6 @@
         <w:insideH w:val="single" w:sz="8" w:space="0" w:color="C0504D" w:themeColor="accent2"/>
         <w:insideV w:val="single" w:sz="8" w:space="0" w:color="C0504D" w:themeColor="accent2"/>
       </w:tblBorders>
-      <w:tblCellMar>
-        <w:top w:w="0" w:type="dxa"/>
-        <w:left w:w="108" w:type="dxa"/>
-        <w:bottom w:w="0" w:type="dxa"/>
-        <w:right w:w="108" w:type="dxa"/>
-      </w:tblCellMar>
     </w:tblPr>
     <w:tblStylePr w:type="firstRow">
       <w:pPr>
@@ -4396,7 +4924,6 @@
     <w:tblPr>
       <w:tblStyleRowBandSize w:val="1"/>
       <w:tblStyleColBandSize w:val="1"/>
-      <w:tblInd w:w="0" w:type="dxa"/>
       <w:tblBorders>
         <w:top w:val="single" w:sz="8" w:space="0" w:color="9BBB59" w:themeColor="accent3"/>
         <w:left w:val="single" w:sz="8" w:space="0" w:color="9BBB59" w:themeColor="accent3"/>
@@ -4405,12 +4932,6 @@
         <w:insideH w:val="single" w:sz="8" w:space="0" w:color="9BBB59" w:themeColor="accent3"/>
         <w:insideV w:val="single" w:sz="8" w:space="0" w:color="9BBB59" w:themeColor="accent3"/>
       </w:tblBorders>
-      <w:tblCellMar>
-        <w:top w:w="0" w:type="dxa"/>
-        <w:left w:w="108" w:type="dxa"/>
-        <w:bottom w:w="0" w:type="dxa"/>
-        <w:right w:w="108" w:type="dxa"/>
-      </w:tblCellMar>
     </w:tblPr>
     <w:tblStylePr w:type="firstRow">
       <w:pPr>
@@ -4526,7 +5047,6 @@
     <w:tblPr>
       <w:tblStyleRowBandSize w:val="1"/>
       <w:tblStyleColBandSize w:val="1"/>
-      <w:tblInd w:w="0" w:type="dxa"/>
       <w:tblBorders>
         <w:top w:val="single" w:sz="8" w:space="0" w:color="8064A2" w:themeColor="accent4"/>
         <w:left w:val="single" w:sz="8" w:space="0" w:color="8064A2" w:themeColor="accent4"/>
@@ -4535,12 +5055,6 @@
         <w:insideH w:val="single" w:sz="8" w:space="0" w:color="8064A2" w:themeColor="accent4"/>
         <w:insideV w:val="single" w:sz="8" w:space="0" w:color="8064A2" w:themeColor="accent4"/>
       </w:tblBorders>
-      <w:tblCellMar>
-        <w:top w:w="0" w:type="dxa"/>
-        <w:left w:w="108" w:type="dxa"/>
-        <w:bottom w:w="0" w:type="dxa"/>
-        <w:right w:w="108" w:type="dxa"/>
-      </w:tblCellMar>
     </w:tblPr>
     <w:tblStylePr w:type="firstRow">
       <w:pPr>
@@ -4656,7 +5170,6 @@
     <w:tblPr>
       <w:tblStyleRowBandSize w:val="1"/>
       <w:tblStyleColBandSize w:val="1"/>
-      <w:tblInd w:w="0" w:type="dxa"/>
       <w:tblBorders>
         <w:top w:val="single" w:sz="8" w:space="0" w:color="4BACC6" w:themeColor="accent5"/>
         <w:left w:val="single" w:sz="8" w:space="0" w:color="4BACC6" w:themeColor="accent5"/>
@@ -4665,12 +5178,6 @@
         <w:insideH w:val="single" w:sz="8" w:space="0" w:color="4BACC6" w:themeColor="accent5"/>
         <w:insideV w:val="single" w:sz="8" w:space="0" w:color="4BACC6" w:themeColor="accent5"/>
       </w:tblBorders>
-      <w:tblCellMar>
-        <w:top w:w="0" w:type="dxa"/>
-        <w:left w:w="108" w:type="dxa"/>
-        <w:bottom w:w="0" w:type="dxa"/>
-        <w:right w:w="108" w:type="dxa"/>
-      </w:tblCellMar>
     </w:tblPr>
     <w:tblStylePr w:type="firstRow">
       <w:pPr>
@@ -4786,7 +5293,6 @@
     <w:tblPr>
       <w:tblStyleRowBandSize w:val="1"/>
       <w:tblStyleColBandSize w:val="1"/>
-      <w:tblInd w:w="0" w:type="dxa"/>
       <w:tblBorders>
         <w:top w:val="single" w:sz="8" w:space="0" w:color="F79646" w:themeColor="accent6"/>
         <w:left w:val="single" w:sz="8" w:space="0" w:color="F79646" w:themeColor="accent6"/>
@@ -4795,12 +5301,6 @@
         <w:insideH w:val="single" w:sz="8" w:space="0" w:color="F79646" w:themeColor="accent6"/>
         <w:insideV w:val="single" w:sz="8" w:space="0" w:color="F79646" w:themeColor="accent6"/>
       </w:tblBorders>
-      <w:tblCellMar>
-        <w:top w:w="0" w:type="dxa"/>
-        <w:left w:w="108" w:type="dxa"/>
-        <w:bottom w:w="0" w:type="dxa"/>
-        <w:right w:w="108" w:type="dxa"/>
-      </w:tblCellMar>
     </w:tblPr>
     <w:tblStylePr w:type="firstRow">
       <w:pPr>
@@ -4916,7 +5416,6 @@
     <w:tblPr>
       <w:tblStyleRowBandSize w:val="1"/>
       <w:tblStyleColBandSize w:val="1"/>
-      <w:tblInd w:w="0" w:type="dxa"/>
       <w:tblBorders>
         <w:top w:val="single" w:sz="8" w:space="0" w:color="404040" w:themeColor="text1" w:themeTint="BF"/>
         <w:left w:val="single" w:sz="8" w:space="0" w:color="404040" w:themeColor="text1" w:themeTint="BF"/>
@@ -4924,12 +5423,6 @@
         <w:right w:val="single" w:sz="8" w:space="0" w:color="404040" w:themeColor="text1" w:themeTint="BF"/>
         <w:insideH w:val="single" w:sz="8" w:space="0" w:color="404040" w:themeColor="text1" w:themeTint="BF"/>
       </w:tblBorders>
-      <w:tblCellMar>
-        <w:top w:w="0" w:type="dxa"/>
-        <w:left w:w="108" w:type="dxa"/>
-        <w:bottom w:w="0" w:type="dxa"/>
-        <w:right w:w="108" w:type="dxa"/>
-      </w:tblCellMar>
     </w:tblPr>
     <w:tblStylePr w:type="firstRow">
       <w:pPr>
@@ -5022,7 +5515,6 @@
     <w:tblPr>
       <w:tblStyleRowBandSize w:val="1"/>
       <w:tblStyleColBandSize w:val="1"/>
-      <w:tblInd w:w="0" w:type="dxa"/>
       <w:tblBorders>
         <w:top w:val="single" w:sz="8" w:space="0" w:color="7BA0CD" w:themeColor="accent1" w:themeTint="BF"/>
         <w:left w:val="single" w:sz="8" w:space="0" w:color="7BA0CD" w:themeColor="accent1" w:themeTint="BF"/>
@@ -5030,12 +5522,6 @@
         <w:right w:val="single" w:sz="8" w:space="0" w:color="7BA0CD" w:themeColor="accent1" w:themeTint="BF"/>
         <w:insideH w:val="single" w:sz="8" w:space="0" w:color="7BA0CD" w:themeColor="accent1" w:themeTint="BF"/>
       </w:tblBorders>
-      <w:tblCellMar>
-        <w:top w:w="0" w:type="dxa"/>
-        <w:left w:w="108" w:type="dxa"/>
-        <w:bottom w:w="0" w:type="dxa"/>
-        <w:right w:w="108" w:type="dxa"/>
-      </w:tblCellMar>
     </w:tblPr>
     <w:tblStylePr w:type="firstRow">
       <w:pPr>
@@ -5128,7 +5614,6 @@
     <w:tblPr>
       <w:tblStyleRowBandSize w:val="1"/>
       <w:tblStyleColBandSize w:val="1"/>
-      <w:tblInd w:w="0" w:type="dxa"/>
       <w:tblBorders>
         <w:top w:val="single" w:sz="8" w:space="0" w:color="CF7B79" w:themeColor="accent2" w:themeTint="BF"/>
         <w:left w:val="single" w:sz="8" w:space="0" w:color="CF7B79" w:themeColor="accent2" w:themeTint="BF"/>
@@ -5136,12 +5621,6 @@
         <w:right w:val="single" w:sz="8" w:space="0" w:color="CF7B79" w:themeColor="accent2" w:themeTint="BF"/>
         <w:insideH w:val="single" w:sz="8" w:space="0" w:color="CF7B79" w:themeColor="accent2" w:themeTint="BF"/>
       </w:tblBorders>
-      <w:tblCellMar>
-        <w:top w:w="0" w:type="dxa"/>
-        <w:left w:w="108" w:type="dxa"/>
-        <w:bottom w:w="0" w:type="dxa"/>
-        <w:right w:w="108" w:type="dxa"/>
-      </w:tblCellMar>
     </w:tblPr>
     <w:tblStylePr w:type="firstRow">
       <w:pPr>
@@ -5234,7 +5713,6 @@
     <w:tblPr>
       <w:tblStyleRowBandSize w:val="1"/>
       <w:tblStyleColBandSize w:val="1"/>
-      <w:tblInd w:w="0" w:type="dxa"/>
       <w:tblBorders>
         <w:top w:val="single" w:sz="8" w:space="0" w:color="B3CC82" w:themeColor="accent3" w:themeTint="BF"/>
         <w:left w:val="single" w:sz="8" w:space="0" w:color="B3CC82" w:themeColor="accent3" w:themeTint="BF"/>
@@ -5242,12 +5720,6 @@
         <w:right w:val="single" w:sz="8" w:space="0" w:color="B3CC82" w:themeColor="accent3" w:themeTint="BF"/>
         <w:insideH w:val="single" w:sz="8" w:space="0" w:color="B3CC82" w:themeColor="accent3" w:themeTint="BF"/>
       </w:tblBorders>
-      <w:tblCellMar>
-        <w:top w:w="0" w:type="dxa"/>
-        <w:left w:w="108" w:type="dxa"/>
-        <w:bottom w:w="0" w:type="dxa"/>
-        <w:right w:w="108" w:type="dxa"/>
-      </w:tblCellMar>
     </w:tblPr>
     <w:tblStylePr w:type="firstRow">
       <w:pPr>
@@ -5340,7 +5812,6 @@
     <w:tblPr>
       <w:tblStyleRowBandSize w:val="1"/>
       <w:tblStyleColBandSize w:val="1"/>
-      <w:tblInd w:w="0" w:type="dxa"/>
       <w:tblBorders>
         <w:top w:val="single" w:sz="8" w:space="0" w:color="9F8AB9" w:themeColor="accent4" w:themeTint="BF"/>
         <w:left w:val="single" w:sz="8" w:space="0" w:color="9F8AB9" w:themeColor="accent4" w:themeTint="BF"/>
@@ -5348,12 +5819,6 @@
         <w:right w:val="single" w:sz="8" w:space="0" w:color="9F8AB9" w:themeColor="accent4" w:themeTint="BF"/>
         <w:insideH w:val="single" w:sz="8" w:space="0" w:color="9F8AB9" w:themeColor="accent4" w:themeTint="BF"/>
       </w:tblBorders>
-      <w:tblCellMar>
-        <w:top w:w="0" w:type="dxa"/>
-        <w:left w:w="108" w:type="dxa"/>
-        <w:bottom w:w="0" w:type="dxa"/>
-        <w:right w:w="108" w:type="dxa"/>
-      </w:tblCellMar>
     </w:tblPr>
     <w:tblStylePr w:type="firstRow">
       <w:pPr>
@@ -5446,7 +5911,6 @@
     <w:tblPr>
       <w:tblStyleRowBandSize w:val="1"/>
       <w:tblStyleColBandSize w:val="1"/>
-      <w:tblInd w:w="0" w:type="dxa"/>
       <w:tblBorders>
         <w:top w:val="single" w:sz="8" w:space="0" w:color="78C0D4" w:themeColor="accent5" w:themeTint="BF"/>
         <w:left w:val="single" w:sz="8" w:space="0" w:color="78C0D4" w:themeColor="accent5" w:themeTint="BF"/>
@@ -5454,12 +5918,6 @@
         <w:right w:val="single" w:sz="8" w:space="0" w:color="78C0D4" w:themeColor="accent5" w:themeTint="BF"/>
         <w:insideH w:val="single" w:sz="8" w:space="0" w:color="78C0D4" w:themeColor="accent5" w:themeTint="BF"/>
       </w:tblBorders>
-      <w:tblCellMar>
-        <w:top w:w="0" w:type="dxa"/>
-        <w:left w:w="108" w:type="dxa"/>
-        <w:bottom w:w="0" w:type="dxa"/>
-        <w:right w:w="108" w:type="dxa"/>
-      </w:tblCellMar>
     </w:tblPr>
     <w:tblStylePr w:type="firstRow">
       <w:pPr>
@@ -5552,7 +6010,6 @@
     <w:tblPr>
       <w:tblStyleRowBandSize w:val="1"/>
       <w:tblStyleColBandSize w:val="1"/>
-      <w:tblInd w:w="0" w:type="dxa"/>
       <w:tblBorders>
         <w:top w:val="single" w:sz="8" w:space="0" w:color="F9B074" w:themeColor="accent6" w:themeTint="BF"/>
         <w:left w:val="single" w:sz="8" w:space="0" w:color="F9B074" w:themeColor="accent6" w:themeTint="BF"/>
@@ -5560,12 +6017,6 @@
         <w:right w:val="single" w:sz="8" w:space="0" w:color="F9B074" w:themeColor="accent6" w:themeTint="BF"/>
         <w:insideH w:val="single" w:sz="8" w:space="0" w:color="F9B074" w:themeColor="accent6" w:themeTint="BF"/>
       </w:tblBorders>
-      <w:tblCellMar>
-        <w:top w:w="0" w:type="dxa"/>
-        <w:left w:w="108" w:type="dxa"/>
-        <w:bottom w:w="0" w:type="dxa"/>
-        <w:right w:w="108" w:type="dxa"/>
-      </w:tblCellMar>
     </w:tblPr>
     <w:tblStylePr w:type="firstRow">
       <w:pPr>
@@ -5658,17 +6109,10 @@
     <w:tblPr>
       <w:tblStyleRowBandSize w:val="1"/>
       <w:tblStyleColBandSize w:val="1"/>
-      <w:tblInd w:w="0" w:type="dxa"/>
       <w:tblBorders>
         <w:top w:val="single" w:sz="18" w:space="0" w:color="auto"/>
         <w:bottom w:val="single" w:sz="18" w:space="0" w:color="auto"/>
       </w:tblBorders>
-      <w:tblCellMar>
-        <w:top w:w="0" w:type="dxa"/>
-        <w:left w:w="108" w:type="dxa"/>
-        <w:bottom w:w="0" w:type="dxa"/>
-        <w:right w:w="108" w:type="dxa"/>
-      </w:tblCellMar>
     </w:tblPr>
     <w:tblStylePr w:type="firstRow">
       <w:pPr>
@@ -5807,17 +6251,10 @@
     <w:tblPr>
       <w:tblStyleRowBandSize w:val="1"/>
       <w:tblStyleColBandSize w:val="1"/>
-      <w:tblInd w:w="0" w:type="dxa"/>
       <w:tblBorders>
         <w:top w:val="single" w:sz="18" w:space="0" w:color="auto"/>
         <w:bottom w:val="single" w:sz="18" w:space="0" w:color="auto"/>
       </w:tblBorders>
-      <w:tblCellMar>
-        <w:top w:w="0" w:type="dxa"/>
-        <w:left w:w="108" w:type="dxa"/>
-        <w:bottom w:w="0" w:type="dxa"/>
-        <w:right w:w="108" w:type="dxa"/>
-      </w:tblCellMar>
     </w:tblPr>
     <w:tblStylePr w:type="firstRow">
       <w:pPr>
@@ -5956,17 +6393,10 @@
     <w:tblPr>
       <w:tblStyleRowBandSize w:val="1"/>
       <w:tblStyleColBandSize w:val="1"/>
-      <w:tblInd w:w="0" w:type="dxa"/>
       <w:tblBorders>
         <w:top w:val="single" w:sz="18" w:space="0" w:color="auto"/>
         <w:bottom w:val="single" w:sz="18" w:space="0" w:color="auto"/>
       </w:tblBorders>
-      <w:tblCellMar>
-        <w:top w:w="0" w:type="dxa"/>
-        <w:left w:w="108" w:type="dxa"/>
-        <w:bottom w:w="0" w:type="dxa"/>
-        <w:right w:w="108" w:type="dxa"/>
-      </w:tblCellMar>
     </w:tblPr>
     <w:tblStylePr w:type="firstRow">
       <w:pPr>
@@ -6105,17 +6535,10 @@
     <w:tblPr>
       <w:tblStyleRowBandSize w:val="1"/>
       <w:tblStyleColBandSize w:val="1"/>
-      <w:tblInd w:w="0" w:type="dxa"/>
       <w:tblBorders>
         <w:top w:val="single" w:sz="18" w:space="0" w:color="auto"/>
         <w:bottom w:val="single" w:sz="18" w:space="0" w:color="auto"/>
       </w:tblBorders>
-      <w:tblCellMar>
-        <w:top w:w="0" w:type="dxa"/>
-        <w:left w:w="108" w:type="dxa"/>
-        <w:bottom w:w="0" w:type="dxa"/>
-        <w:right w:w="108" w:type="dxa"/>
-      </w:tblCellMar>
     </w:tblPr>
     <w:tblStylePr w:type="firstRow">
       <w:pPr>
@@ -6254,17 +6677,10 @@
     <w:tblPr>
       <w:tblStyleRowBandSize w:val="1"/>
       <w:tblStyleColBandSize w:val="1"/>
-      <w:tblInd w:w="0" w:type="dxa"/>
       <w:tblBorders>
         <w:top w:val="single" w:sz="18" w:space="0" w:color="auto"/>
         <w:bottom w:val="single" w:sz="18" w:space="0" w:color="auto"/>
       </w:tblBorders>
-      <w:tblCellMar>
-        <w:top w:w="0" w:type="dxa"/>
-        <w:left w:w="108" w:type="dxa"/>
-        <w:bottom w:w="0" w:type="dxa"/>
-        <w:right w:w="108" w:type="dxa"/>
-      </w:tblCellMar>
     </w:tblPr>
     <w:tblStylePr w:type="firstRow">
       <w:pPr>
@@ -6403,17 +6819,10 @@
     <w:tblPr>
       <w:tblStyleRowBandSize w:val="1"/>
       <w:tblStyleColBandSize w:val="1"/>
-      <w:tblInd w:w="0" w:type="dxa"/>
       <w:tblBorders>
         <w:top w:val="single" w:sz="18" w:space="0" w:color="auto"/>
         <w:bottom w:val="single" w:sz="18" w:space="0" w:color="auto"/>
       </w:tblBorders>
-      <w:tblCellMar>
-        <w:top w:w="0" w:type="dxa"/>
-        <w:left w:w="108" w:type="dxa"/>
-        <w:bottom w:w="0" w:type="dxa"/>
-        <w:right w:w="108" w:type="dxa"/>
-      </w:tblCellMar>
     </w:tblPr>
     <w:tblStylePr w:type="firstRow">
       <w:pPr>
@@ -6552,17 +6961,10 @@
     <w:tblPr>
       <w:tblStyleRowBandSize w:val="1"/>
       <w:tblStyleColBandSize w:val="1"/>
-      <w:tblInd w:w="0" w:type="dxa"/>
       <w:tblBorders>
         <w:top w:val="single" w:sz="18" w:space="0" w:color="auto"/>
         <w:bottom w:val="single" w:sz="18" w:space="0" w:color="auto"/>
       </w:tblBorders>
-      <w:tblCellMar>
-        <w:top w:w="0" w:type="dxa"/>
-        <w:left w:w="108" w:type="dxa"/>
-        <w:bottom w:w="0" w:type="dxa"/>
-        <w:right w:w="108" w:type="dxa"/>
-      </w:tblCellMar>
     </w:tblPr>
     <w:tblStylePr w:type="firstRow">
       <w:pPr>
@@ -6704,17 +7106,10 @@
     <w:tblPr>
       <w:tblStyleRowBandSize w:val="1"/>
       <w:tblStyleColBandSize w:val="1"/>
-      <w:tblInd w:w="0" w:type="dxa"/>
       <w:tblBorders>
         <w:top w:val="single" w:sz="8" w:space="0" w:color="000000" w:themeColor="text1"/>
         <w:bottom w:val="single" w:sz="8" w:space="0" w:color="000000" w:themeColor="text1"/>
       </w:tblBorders>
-      <w:tblCellMar>
-        <w:top w:w="0" w:type="dxa"/>
-        <w:left w:w="108" w:type="dxa"/>
-        <w:bottom w:w="0" w:type="dxa"/>
-        <w:right w:w="108" w:type="dxa"/>
-      </w:tblCellMar>
     </w:tblPr>
     <w:tblStylePr w:type="firstRow">
       <w:rPr>
@@ -6788,17 +7183,10 @@
     <w:tblPr>
       <w:tblStyleRowBandSize w:val="1"/>
       <w:tblStyleColBandSize w:val="1"/>
-      <w:tblInd w:w="0" w:type="dxa"/>
       <w:tblBorders>
         <w:top w:val="single" w:sz="8" w:space="0" w:color="4F81BD" w:themeColor="accent1"/>
         <w:bottom w:val="single" w:sz="8" w:space="0" w:color="4F81BD" w:themeColor="accent1"/>
       </w:tblBorders>
-      <w:tblCellMar>
-        <w:top w:w="0" w:type="dxa"/>
-        <w:left w:w="108" w:type="dxa"/>
-        <w:bottom w:w="0" w:type="dxa"/>
-        <w:right w:w="108" w:type="dxa"/>
-      </w:tblCellMar>
     </w:tblPr>
     <w:tblStylePr w:type="firstRow">
       <w:rPr>
@@ -6872,17 +7260,10 @@
     <w:tblPr>
       <w:tblStyleRowBandSize w:val="1"/>
       <w:tblStyleColBandSize w:val="1"/>
-      <w:tblInd w:w="0" w:type="dxa"/>
       <w:tblBorders>
         <w:top w:val="single" w:sz="8" w:space="0" w:color="C0504D" w:themeColor="accent2"/>
         <w:bottom w:val="single" w:sz="8" w:space="0" w:color="C0504D" w:themeColor="accent2"/>
       </w:tblBorders>
-      <w:tblCellMar>
-        <w:top w:w="0" w:type="dxa"/>
-        <w:left w:w="108" w:type="dxa"/>
-        <w:bottom w:w="0" w:type="dxa"/>
-        <w:right w:w="108" w:type="dxa"/>
-      </w:tblCellMar>
     </w:tblPr>
     <w:tblStylePr w:type="firstRow">
       <w:rPr>
@@ -6956,17 +7337,10 @@
     <w:tblPr>
       <w:tblStyleRowBandSize w:val="1"/>
       <w:tblStyleColBandSize w:val="1"/>
-      <w:tblInd w:w="0" w:type="dxa"/>
       <w:tblBorders>
         <w:top w:val="single" w:sz="8" w:space="0" w:color="9BBB59" w:themeColor="accent3"/>
         <w:bottom w:val="single" w:sz="8" w:space="0" w:color="9BBB59" w:themeColor="accent3"/>
       </w:tblBorders>
-      <w:tblCellMar>
-        <w:top w:w="0" w:type="dxa"/>
-        <w:left w:w="108" w:type="dxa"/>
-        <w:bottom w:w="0" w:type="dxa"/>
-        <w:right w:w="108" w:type="dxa"/>
-      </w:tblCellMar>
     </w:tblPr>
     <w:tblStylePr w:type="firstRow">
       <w:rPr>
@@ -7040,17 +7414,10 @@
     <w:tblPr>
       <w:tblStyleRowBandSize w:val="1"/>
       <w:tblStyleColBandSize w:val="1"/>
-      <w:tblInd w:w="0" w:type="dxa"/>
       <w:tblBorders>
         <w:top w:val="single" w:sz="8" w:space="0" w:color="8064A2" w:themeColor="accent4"/>
         <w:bottom w:val="single" w:sz="8" w:space="0" w:color="8064A2" w:themeColor="accent4"/>
       </w:tblBorders>
-      <w:tblCellMar>
-        <w:top w:w="0" w:type="dxa"/>
-        <w:left w:w="108" w:type="dxa"/>
-        <w:bottom w:w="0" w:type="dxa"/>
-        <w:right w:w="108" w:type="dxa"/>
-      </w:tblCellMar>
     </w:tblPr>
     <w:tblStylePr w:type="firstRow">
       <w:rPr>
@@ -7124,17 +7491,10 @@
     <w:tblPr>
       <w:tblStyleRowBandSize w:val="1"/>
       <w:tblStyleColBandSize w:val="1"/>
-      <w:tblInd w:w="0" w:type="dxa"/>
       <w:tblBorders>
         <w:top w:val="single" w:sz="8" w:space="0" w:color="4BACC6" w:themeColor="accent5"/>
         <w:bottom w:val="single" w:sz="8" w:space="0" w:color="4BACC6" w:themeColor="accent5"/>
       </w:tblBorders>
-      <w:tblCellMar>
-        <w:top w:w="0" w:type="dxa"/>
-        <w:left w:w="108" w:type="dxa"/>
-        <w:bottom w:w="0" w:type="dxa"/>
-        <w:right w:w="108" w:type="dxa"/>
-      </w:tblCellMar>
     </w:tblPr>
     <w:tblStylePr w:type="firstRow">
       <w:rPr>
@@ -7208,17 +7568,10 @@
     <w:tblPr>
       <w:tblStyleRowBandSize w:val="1"/>
       <w:tblStyleColBandSize w:val="1"/>
-      <w:tblInd w:w="0" w:type="dxa"/>
       <w:tblBorders>
         <w:top w:val="single" w:sz="8" w:space="0" w:color="F79646" w:themeColor="accent6"/>
         <w:bottom w:val="single" w:sz="8" w:space="0" w:color="F79646" w:themeColor="accent6"/>
       </w:tblBorders>
-      <w:tblCellMar>
-        <w:top w:w="0" w:type="dxa"/>
-        <w:left w:w="108" w:type="dxa"/>
-        <w:bottom w:w="0" w:type="dxa"/>
-        <w:right w:w="108" w:type="dxa"/>
-      </w:tblCellMar>
     </w:tblPr>
     <w:tblStylePr w:type="firstRow">
       <w:rPr>
@@ -7293,19 +7646,12 @@
     <w:tblPr>
       <w:tblStyleRowBandSize w:val="1"/>
       <w:tblStyleColBandSize w:val="1"/>
-      <w:tblInd w:w="0" w:type="dxa"/>
       <w:tblBorders>
         <w:top w:val="single" w:sz="8" w:space="0" w:color="000000" w:themeColor="text1"/>
         <w:left w:val="single" w:sz="8" w:space="0" w:color="000000" w:themeColor="text1"/>
         <w:bottom w:val="single" w:sz="8" w:space="0" w:color="000000" w:themeColor="text1"/>
         <w:right w:val="single" w:sz="8" w:space="0" w:color="000000" w:themeColor="text1"/>
       </w:tblBorders>
-      <w:tblCellMar>
-        <w:top w:w="0" w:type="dxa"/>
-        <w:left w:w="108" w:type="dxa"/>
-        <w:bottom w:w="0" w:type="dxa"/>
-        <w:right w:w="108" w:type="dxa"/>
-      </w:tblCellMar>
     </w:tblPr>
     <w:tblStylePr w:type="firstRow">
       <w:rPr>
@@ -7421,19 +7767,12 @@
     <w:tblPr>
       <w:tblStyleRowBandSize w:val="1"/>
       <w:tblStyleColBandSize w:val="1"/>
-      <w:tblInd w:w="0" w:type="dxa"/>
       <w:tblBorders>
         <w:top w:val="single" w:sz="8" w:space="0" w:color="4F81BD" w:themeColor="accent1"/>
         <w:left w:val="single" w:sz="8" w:space="0" w:color="4F81BD" w:themeColor="accent1"/>
         <w:bottom w:val="single" w:sz="8" w:space="0" w:color="4F81BD" w:themeColor="accent1"/>
         <w:right w:val="single" w:sz="8" w:space="0" w:color="4F81BD" w:themeColor="accent1"/>
       </w:tblBorders>
-      <w:tblCellMar>
-        <w:top w:w="0" w:type="dxa"/>
-        <w:left w:w="108" w:type="dxa"/>
-        <w:bottom w:w="0" w:type="dxa"/>
-        <w:right w:w="108" w:type="dxa"/>
-      </w:tblCellMar>
     </w:tblPr>
     <w:tblStylePr w:type="firstRow">
       <w:rPr>
@@ -7549,19 +7888,12 @@
     <w:tblPr>
       <w:tblStyleRowBandSize w:val="1"/>
       <w:tblStyleColBandSize w:val="1"/>
-      <w:tblInd w:w="0" w:type="dxa"/>
       <w:tblBorders>
         <w:top w:val="single" w:sz="8" w:space="0" w:color="C0504D" w:themeColor="accent2"/>
         <w:left w:val="single" w:sz="8" w:space="0" w:color="C0504D" w:themeColor="accent2"/>
         <w:bottom w:val="single" w:sz="8" w:space="0" w:color="C0504D" w:themeColor="accent2"/>
         <w:right w:val="single" w:sz="8" w:space="0" w:color="C0504D" w:themeColor="accent2"/>
       </w:tblBorders>
-      <w:tblCellMar>
-        <w:top w:w="0" w:type="dxa"/>
-        <w:left w:w="108" w:type="dxa"/>
-        <w:bottom w:w="0" w:type="dxa"/>
-        <w:right w:w="108" w:type="dxa"/>
-      </w:tblCellMar>
     </w:tblPr>
     <w:tblStylePr w:type="firstRow">
       <w:rPr>
@@ -7677,19 +8009,12 @@
     <w:tblPr>
       <w:tblStyleRowBandSize w:val="1"/>
       <w:tblStyleColBandSize w:val="1"/>
-      <w:tblInd w:w="0" w:type="dxa"/>
       <w:tblBorders>
         <w:top w:val="single" w:sz="8" w:space="0" w:color="9BBB59" w:themeColor="accent3"/>
         <w:left w:val="single" w:sz="8" w:space="0" w:color="9BBB59" w:themeColor="accent3"/>
         <w:bottom w:val="single" w:sz="8" w:space="0" w:color="9BBB59" w:themeColor="accent3"/>
         <w:right w:val="single" w:sz="8" w:space="0" w:color="9BBB59" w:themeColor="accent3"/>
       </w:tblBorders>
-      <w:tblCellMar>
-        <w:top w:w="0" w:type="dxa"/>
-        <w:left w:w="108" w:type="dxa"/>
-        <w:bottom w:w="0" w:type="dxa"/>
-        <w:right w:w="108" w:type="dxa"/>
-      </w:tblCellMar>
     </w:tblPr>
     <w:tblStylePr w:type="firstRow">
       <w:rPr>
@@ -7805,19 +8130,12 @@
     <w:tblPr>
       <w:tblStyleRowBandSize w:val="1"/>
       <w:tblStyleColBandSize w:val="1"/>
-      <w:tblInd w:w="0" w:type="dxa"/>
       <w:tblBorders>
         <w:top w:val="single" w:sz="8" w:space="0" w:color="8064A2" w:themeColor="accent4"/>
         <w:left w:val="single" w:sz="8" w:space="0" w:color="8064A2" w:themeColor="accent4"/>
         <w:bottom w:val="single" w:sz="8" w:space="0" w:color="8064A2" w:themeColor="accent4"/>
         <w:right w:val="single" w:sz="8" w:space="0" w:color="8064A2" w:themeColor="accent4"/>
       </w:tblBorders>
-      <w:tblCellMar>
-        <w:top w:w="0" w:type="dxa"/>
-        <w:left w:w="108" w:type="dxa"/>
-        <w:bottom w:w="0" w:type="dxa"/>
-        <w:right w:w="108" w:type="dxa"/>
-      </w:tblCellMar>
     </w:tblPr>
     <w:tblStylePr w:type="firstRow">
       <w:rPr>
@@ -7933,19 +8251,12 @@
     <w:tblPr>
       <w:tblStyleRowBandSize w:val="1"/>
       <w:tblStyleColBandSize w:val="1"/>
-      <w:tblInd w:w="0" w:type="dxa"/>
       <w:tblBorders>
         <w:top w:val="single" w:sz="8" w:space="0" w:color="4BACC6" w:themeColor="accent5"/>
         <w:left w:val="single" w:sz="8" w:space="0" w:color="4BACC6" w:themeColor="accent5"/>
         <w:bottom w:val="single" w:sz="8" w:space="0" w:color="4BACC6" w:themeColor="accent5"/>
         <w:right w:val="single" w:sz="8" w:space="0" w:color="4BACC6" w:themeColor="accent5"/>
       </w:tblBorders>
-      <w:tblCellMar>
-        <w:top w:w="0" w:type="dxa"/>
-        <w:left w:w="108" w:type="dxa"/>
-        <w:bottom w:w="0" w:type="dxa"/>
-        <w:right w:w="108" w:type="dxa"/>
-      </w:tblCellMar>
     </w:tblPr>
     <w:tblStylePr w:type="firstRow">
       <w:rPr>
@@ -8061,19 +8372,12 @@
     <w:tblPr>
       <w:tblStyleRowBandSize w:val="1"/>
       <w:tblStyleColBandSize w:val="1"/>
-      <w:tblInd w:w="0" w:type="dxa"/>
       <w:tblBorders>
         <w:top w:val="single" w:sz="8" w:space="0" w:color="F79646" w:themeColor="accent6"/>
         <w:left w:val="single" w:sz="8" w:space="0" w:color="F79646" w:themeColor="accent6"/>
         <w:bottom w:val="single" w:sz="8" w:space="0" w:color="F79646" w:themeColor="accent6"/>
         <w:right w:val="single" w:sz="8" w:space="0" w:color="F79646" w:themeColor="accent6"/>
       </w:tblBorders>
-      <w:tblCellMar>
-        <w:top w:w="0" w:type="dxa"/>
-        <w:left w:w="108" w:type="dxa"/>
-        <w:bottom w:w="0" w:type="dxa"/>
-        <w:right w:w="108" w:type="dxa"/>
-      </w:tblCellMar>
     </w:tblPr>
     <w:tblStylePr w:type="firstRow">
       <w:rPr>
@@ -8185,7 +8489,6 @@
     <w:tblPr>
       <w:tblStyleRowBandSize w:val="1"/>
       <w:tblStyleColBandSize w:val="1"/>
-      <w:tblInd w:w="0" w:type="dxa"/>
       <w:tblBorders>
         <w:top w:val="single" w:sz="8" w:space="0" w:color="404040" w:themeColor="text1" w:themeTint="BF"/>
         <w:left w:val="single" w:sz="8" w:space="0" w:color="404040" w:themeColor="text1" w:themeTint="BF"/>
@@ -8194,12 +8497,6 @@
         <w:insideH w:val="single" w:sz="8" w:space="0" w:color="404040" w:themeColor="text1" w:themeTint="BF"/>
         <w:insideV w:val="single" w:sz="8" w:space="0" w:color="404040" w:themeColor="text1" w:themeTint="BF"/>
       </w:tblBorders>
-      <w:tblCellMar>
-        <w:top w:w="0" w:type="dxa"/>
-        <w:left w:w="108" w:type="dxa"/>
-        <w:bottom w:w="0" w:type="dxa"/>
-        <w:right w:w="108" w:type="dxa"/>
-      </w:tblCellMar>
     </w:tblPr>
     <w:tcPr>
       <w:shd w:val="clear" w:color="auto" w:fill="C0C0C0" w:themeFill="text1" w:themeFillTint="3F"/>
@@ -8258,7 +8555,6 @@
     <w:tblPr>
       <w:tblStyleRowBandSize w:val="1"/>
       <w:tblStyleColBandSize w:val="1"/>
-      <w:tblInd w:w="0" w:type="dxa"/>
       <w:tblBorders>
         <w:top w:val="single" w:sz="8" w:space="0" w:color="7BA0CD" w:themeColor="accent1" w:themeTint="BF"/>
         <w:left w:val="single" w:sz="8" w:space="0" w:color="7BA0CD" w:themeColor="accent1" w:themeTint="BF"/>
@@ -8267,12 +8563,6 @@
         <w:insideH w:val="single" w:sz="8" w:space="0" w:color="7BA0CD" w:themeColor="accent1" w:themeTint="BF"/>
         <w:insideV w:val="single" w:sz="8" w:space="0" w:color="7BA0CD" w:themeColor="accent1" w:themeTint="BF"/>
       </w:tblBorders>
-      <w:tblCellMar>
-        <w:top w:w="0" w:type="dxa"/>
-        <w:left w:w="108" w:type="dxa"/>
-        <w:bottom w:w="0" w:type="dxa"/>
-        <w:right w:w="108" w:type="dxa"/>
-      </w:tblCellMar>
     </w:tblPr>
     <w:tcPr>
       <w:shd w:val="clear" w:color="auto" w:fill="D3DFEE" w:themeFill="accent1" w:themeFillTint="3F"/>
@@ -8331,7 +8621,6 @@
     <w:tblPr>
       <w:tblStyleRowBandSize w:val="1"/>
       <w:tblStyleColBandSize w:val="1"/>
-      <w:tblInd w:w="0" w:type="dxa"/>
       <w:tblBorders>
         <w:top w:val="single" w:sz="8" w:space="0" w:color="CF7B79" w:themeColor="accent2" w:themeTint="BF"/>
         <w:left w:val="single" w:sz="8" w:space="0" w:color="CF7B79" w:themeColor="accent2" w:themeTint="BF"/>
@@ -8340,12 +8629,6 @@
         <w:insideH w:val="single" w:sz="8" w:space="0" w:color="CF7B79" w:themeColor="accent2" w:themeTint="BF"/>
         <w:insideV w:val="single" w:sz="8" w:space="0" w:color="CF7B79" w:themeColor="accent2" w:themeTint="BF"/>
       </w:tblBorders>
-      <w:tblCellMar>
-        <w:top w:w="0" w:type="dxa"/>
-        <w:left w:w="108" w:type="dxa"/>
-        <w:bottom w:w="0" w:type="dxa"/>
-        <w:right w:w="108" w:type="dxa"/>
-      </w:tblCellMar>
     </w:tblPr>
     <w:tcPr>
       <w:shd w:val="clear" w:color="auto" w:fill="EFD3D2" w:themeFill="accent2" w:themeFillTint="3F"/>
@@ -8404,7 +8687,6 @@
     <w:tblPr>
       <w:tblStyleRowBandSize w:val="1"/>
       <w:tblStyleColBandSize w:val="1"/>
-      <w:tblInd w:w="0" w:type="dxa"/>
       <w:tblBorders>
         <w:top w:val="single" w:sz="8" w:space="0" w:color="B3CC82" w:themeColor="accent3" w:themeTint="BF"/>
         <w:left w:val="single" w:sz="8" w:space="0" w:color="B3CC82" w:themeColor="accent3" w:themeTint="BF"/>
@@ -8413,12 +8695,6 @@
         <w:insideH w:val="single" w:sz="8" w:space="0" w:color="B3CC82" w:themeColor="accent3" w:themeTint="BF"/>
         <w:insideV w:val="single" w:sz="8" w:space="0" w:color="B3CC82" w:themeColor="accent3" w:themeTint="BF"/>
       </w:tblBorders>
-      <w:tblCellMar>
-        <w:top w:w="0" w:type="dxa"/>
-        <w:left w:w="108" w:type="dxa"/>
-        <w:bottom w:w="0" w:type="dxa"/>
-        <w:right w:w="108" w:type="dxa"/>
-      </w:tblCellMar>
     </w:tblPr>
     <w:tcPr>
       <w:shd w:val="clear" w:color="auto" w:fill="E6EED5" w:themeFill="accent3" w:themeFillTint="3F"/>
@@ -8477,7 +8753,6 @@
     <w:tblPr>
       <w:tblStyleRowBandSize w:val="1"/>
       <w:tblStyleColBandSize w:val="1"/>
-      <w:tblInd w:w="0" w:type="dxa"/>
       <w:tblBorders>
         <w:top w:val="single" w:sz="8" w:space="0" w:color="9F8AB9" w:themeColor="accent4" w:themeTint="BF"/>
         <w:left w:val="single" w:sz="8" w:space="0" w:color="9F8AB9" w:themeColor="accent4" w:themeTint="BF"/>
@@ -8486,12 +8761,6 @@
         <w:insideH w:val="single" w:sz="8" w:space="0" w:color="9F8AB9" w:themeColor="accent4" w:themeTint="BF"/>
         <w:insideV w:val="single" w:sz="8" w:space="0" w:color="9F8AB9" w:themeColor="accent4" w:themeTint="BF"/>
       </w:tblBorders>
-      <w:tblCellMar>
-        <w:top w:w="0" w:type="dxa"/>
-        <w:left w:w="108" w:type="dxa"/>
-        <w:bottom w:w="0" w:type="dxa"/>
-        <w:right w:w="108" w:type="dxa"/>
-      </w:tblCellMar>
     </w:tblPr>
     <w:tcPr>
       <w:shd w:val="clear" w:color="auto" w:fill="DFD8E8" w:themeFill="accent4" w:themeFillTint="3F"/>
@@ -8550,7 +8819,6 @@
     <w:tblPr>
       <w:tblStyleRowBandSize w:val="1"/>
       <w:tblStyleColBandSize w:val="1"/>
-      <w:tblInd w:w="0" w:type="dxa"/>
       <w:tblBorders>
         <w:top w:val="single" w:sz="8" w:space="0" w:color="78C0D4" w:themeColor="accent5" w:themeTint="BF"/>
         <w:left w:val="single" w:sz="8" w:space="0" w:color="78C0D4" w:themeColor="accent5" w:themeTint="BF"/>
@@ -8559,12 +8827,6 @@
         <w:insideH w:val="single" w:sz="8" w:space="0" w:color="78C0D4" w:themeColor="accent5" w:themeTint="BF"/>
         <w:insideV w:val="single" w:sz="8" w:space="0" w:color="78C0D4" w:themeColor="accent5" w:themeTint="BF"/>
       </w:tblBorders>
-      <w:tblCellMar>
-        <w:top w:w="0" w:type="dxa"/>
-        <w:left w:w="108" w:type="dxa"/>
-        <w:bottom w:w="0" w:type="dxa"/>
-        <w:right w:w="108" w:type="dxa"/>
-      </w:tblCellMar>
     </w:tblPr>
     <w:tcPr>
       <w:shd w:val="clear" w:color="auto" w:fill="D2EAF1" w:themeFill="accent5" w:themeFillTint="3F"/>
@@ -8623,7 +8885,6 @@
     <w:tblPr>
       <w:tblStyleRowBandSize w:val="1"/>
       <w:tblStyleColBandSize w:val="1"/>
-      <w:tblInd w:w="0" w:type="dxa"/>
       <w:tblBorders>
         <w:top w:val="single" w:sz="8" w:space="0" w:color="F9B074" w:themeColor="accent6" w:themeTint="BF"/>
         <w:left w:val="single" w:sz="8" w:space="0" w:color="F9B074" w:themeColor="accent6" w:themeTint="BF"/>
@@ -8632,12 +8893,6 @@
         <w:insideH w:val="single" w:sz="8" w:space="0" w:color="F9B074" w:themeColor="accent6" w:themeTint="BF"/>
         <w:insideV w:val="single" w:sz="8" w:space="0" w:color="F9B074" w:themeColor="accent6" w:themeTint="BF"/>
       </w:tblBorders>
-      <w:tblCellMar>
-        <w:top w:w="0" w:type="dxa"/>
-        <w:left w:w="108" w:type="dxa"/>
-        <w:bottom w:w="0" w:type="dxa"/>
-        <w:right w:w="108" w:type="dxa"/>
-      </w:tblCellMar>
     </w:tblPr>
     <w:tcPr>
       <w:shd w:val="clear" w:color="auto" w:fill="FDE4D0" w:themeFill="accent6" w:themeFillTint="3F"/>
@@ -8700,7 +8955,6 @@
     <w:tblPr>
       <w:tblStyleRowBandSize w:val="1"/>
       <w:tblStyleColBandSize w:val="1"/>
-      <w:tblInd w:w="0" w:type="dxa"/>
       <w:tblBorders>
         <w:top w:val="single" w:sz="8" w:space="0" w:color="000000" w:themeColor="text1"/>
         <w:left w:val="single" w:sz="8" w:space="0" w:color="000000" w:themeColor="text1"/>
@@ -8709,12 +8963,6 @@
         <w:insideH w:val="single" w:sz="8" w:space="0" w:color="000000" w:themeColor="text1"/>
         <w:insideV w:val="single" w:sz="8" w:space="0" w:color="000000" w:themeColor="text1"/>
       </w:tblBorders>
-      <w:tblCellMar>
-        <w:top w:w="0" w:type="dxa"/>
-        <w:left w:w="108" w:type="dxa"/>
-        <w:bottom w:w="0" w:type="dxa"/>
-        <w:right w:w="108" w:type="dxa"/>
-      </w:tblCellMar>
     </w:tblPr>
     <w:tcPr>
       <w:shd w:val="clear" w:color="auto" w:fill="C0C0C0" w:themeFill="text1" w:themeFillTint="3F"/>
@@ -8825,7 +9073,6 @@
     <w:tblPr>
       <w:tblStyleRowBandSize w:val="1"/>
       <w:tblStyleColBandSize w:val="1"/>
-      <w:tblInd w:w="0" w:type="dxa"/>
       <w:tblBorders>
         <w:top w:val="single" w:sz="8" w:space="0" w:color="4F81BD" w:themeColor="accent1"/>
         <w:left w:val="single" w:sz="8" w:space="0" w:color="4F81BD" w:themeColor="accent1"/>
@@ -8834,12 +9081,6 @@
         <w:insideH w:val="single" w:sz="8" w:space="0" w:color="4F81BD" w:themeColor="accent1"/>
         <w:insideV w:val="single" w:sz="8" w:space="0" w:color="4F81BD" w:themeColor="accent1"/>
       </w:tblBorders>
-      <w:tblCellMar>
-        <w:top w:w="0" w:type="dxa"/>
-        <w:left w:w="108" w:type="dxa"/>
-        <w:bottom w:w="0" w:type="dxa"/>
-        <w:right w:w="108" w:type="dxa"/>
-      </w:tblCellMar>
     </w:tblPr>
     <w:tcPr>
       <w:shd w:val="clear" w:color="auto" w:fill="D3DFEE" w:themeFill="accent1" w:themeFillTint="3F"/>
@@ -8950,7 +9191,6 @@
     <w:tblPr>
       <w:tblStyleRowBandSize w:val="1"/>
       <w:tblStyleColBandSize w:val="1"/>
-      <w:tblInd w:w="0" w:type="dxa"/>
       <w:tblBorders>
         <w:top w:val="single" w:sz="8" w:space="0" w:color="C0504D" w:themeColor="accent2"/>
         <w:left w:val="single" w:sz="8" w:space="0" w:color="C0504D" w:themeColor="accent2"/>
@@ -8959,12 +9199,6 @@
         <w:insideH w:val="single" w:sz="8" w:space="0" w:color="C0504D" w:themeColor="accent2"/>
         <w:insideV w:val="single" w:sz="8" w:space="0" w:color="C0504D" w:themeColor="accent2"/>
       </w:tblBorders>
-      <w:tblCellMar>
-        <w:top w:w="0" w:type="dxa"/>
-        <w:left w:w="108" w:type="dxa"/>
-        <w:bottom w:w="0" w:type="dxa"/>
-        <w:right w:w="108" w:type="dxa"/>
-      </w:tblCellMar>
     </w:tblPr>
     <w:tcPr>
       <w:shd w:val="clear" w:color="auto" w:fill="EFD3D2" w:themeFill="accent2" w:themeFillTint="3F"/>
@@ -9075,7 +9309,6 @@
     <w:tblPr>
       <w:tblStyleRowBandSize w:val="1"/>
       <w:tblStyleColBandSize w:val="1"/>
-      <w:tblInd w:w="0" w:type="dxa"/>
       <w:tblBorders>
         <w:top w:val="single" w:sz="8" w:space="0" w:color="9BBB59" w:themeColor="accent3"/>
         <w:left w:val="single" w:sz="8" w:space="0" w:color="9BBB59" w:themeColor="accent3"/>
@@ -9084,12 +9317,6 @@
         <w:insideH w:val="single" w:sz="8" w:space="0" w:color="9BBB59" w:themeColor="accent3"/>
         <w:insideV w:val="single" w:sz="8" w:space="0" w:color="9BBB59" w:themeColor="accent3"/>
       </w:tblBorders>
-      <w:tblCellMar>
-        <w:top w:w="0" w:type="dxa"/>
-        <w:left w:w="108" w:type="dxa"/>
-        <w:bottom w:w="0" w:type="dxa"/>
-        <w:right w:w="108" w:type="dxa"/>
-      </w:tblCellMar>
     </w:tblPr>
     <w:tcPr>
       <w:shd w:val="clear" w:color="auto" w:fill="E6EED5" w:themeFill="accent3" w:themeFillTint="3F"/>
@@ -9200,7 +9427,6 @@
     <w:tblPr>
       <w:tblStyleRowBandSize w:val="1"/>
       <w:tblStyleColBandSize w:val="1"/>
-      <w:tblInd w:w="0" w:type="dxa"/>
       <w:tblBorders>
         <w:top w:val="single" w:sz="8" w:space="0" w:color="8064A2" w:themeColor="accent4"/>
         <w:left w:val="single" w:sz="8" w:space="0" w:color="8064A2" w:themeColor="accent4"/>
@@ -9209,12 +9435,6 @@
         <w:insideH w:val="single" w:sz="8" w:space="0" w:color="8064A2" w:themeColor="accent4"/>
         <w:insideV w:val="single" w:sz="8" w:space="0" w:color="8064A2" w:themeColor="accent4"/>
       </w:tblBorders>
-      <w:tblCellMar>
-        <w:top w:w="0" w:type="dxa"/>
-        <w:left w:w="108" w:type="dxa"/>
-        <w:bottom w:w="0" w:type="dxa"/>
-        <w:right w:w="108" w:type="dxa"/>
-      </w:tblCellMar>
     </w:tblPr>
     <w:tcPr>
       <w:shd w:val="clear" w:color="auto" w:fill="DFD8E8" w:themeFill="accent4" w:themeFillTint="3F"/>
@@ -9325,7 +9545,6 @@
     <w:tblPr>
       <w:tblStyleRowBandSize w:val="1"/>
       <w:tblStyleColBandSize w:val="1"/>
-      <w:tblInd w:w="0" w:type="dxa"/>
       <w:tblBorders>
         <w:top w:val="single" w:sz="8" w:space="0" w:color="4BACC6" w:themeColor="accent5"/>
         <w:left w:val="single" w:sz="8" w:space="0" w:color="4BACC6" w:themeColor="accent5"/>
@@ -9334,12 +9553,6 @@
         <w:insideH w:val="single" w:sz="8" w:space="0" w:color="4BACC6" w:themeColor="accent5"/>
         <w:insideV w:val="single" w:sz="8" w:space="0" w:color="4BACC6" w:themeColor="accent5"/>
       </w:tblBorders>
-      <w:tblCellMar>
-        <w:top w:w="0" w:type="dxa"/>
-        <w:left w:w="108" w:type="dxa"/>
-        <w:bottom w:w="0" w:type="dxa"/>
-        <w:right w:w="108" w:type="dxa"/>
-      </w:tblCellMar>
     </w:tblPr>
     <w:tcPr>
       <w:shd w:val="clear" w:color="auto" w:fill="D2EAF1" w:themeFill="accent5" w:themeFillTint="3F"/>
@@ -9450,7 +9663,6 @@
     <w:tblPr>
       <w:tblStyleRowBandSize w:val="1"/>
       <w:tblStyleColBandSize w:val="1"/>
-      <w:tblInd w:w="0" w:type="dxa"/>
       <w:tblBorders>
         <w:top w:val="single" w:sz="8" w:space="0" w:color="F79646" w:themeColor="accent6"/>
         <w:left w:val="single" w:sz="8" w:space="0" w:color="F79646" w:themeColor="accent6"/>
@@ -9459,12 +9671,6 @@
         <w:insideH w:val="single" w:sz="8" w:space="0" w:color="F79646" w:themeColor="accent6"/>
         <w:insideV w:val="single" w:sz="8" w:space="0" w:color="F79646" w:themeColor="accent6"/>
       </w:tblBorders>
-      <w:tblCellMar>
-        <w:top w:w="0" w:type="dxa"/>
-        <w:left w:w="108" w:type="dxa"/>
-        <w:bottom w:w="0" w:type="dxa"/>
-        <w:right w:w="108" w:type="dxa"/>
-      </w:tblCellMar>
     </w:tblPr>
     <w:tcPr>
       <w:shd w:val="clear" w:color="auto" w:fill="FDE4D0" w:themeFill="accent6" w:themeFillTint="3F"/>
@@ -9571,7 +9777,6 @@
     <w:tblPr>
       <w:tblStyleRowBandSize w:val="1"/>
       <w:tblStyleColBandSize w:val="1"/>
-      <w:tblInd w:w="0" w:type="dxa"/>
       <w:tblBorders>
         <w:top w:val="single" w:sz="8" w:space="0" w:color="FFFFFF" w:themeColor="background1"/>
         <w:left w:val="single" w:sz="8" w:space="0" w:color="FFFFFF" w:themeColor="background1"/>
@@ -9580,12 +9785,6 @@
         <w:insideH w:val="single" w:sz="6" w:space="0" w:color="FFFFFF" w:themeColor="background1"/>
         <w:insideV w:val="single" w:sz="6" w:space="0" w:color="FFFFFF" w:themeColor="background1"/>
       </w:tblBorders>
-      <w:tblCellMar>
-        <w:top w:w="0" w:type="dxa"/>
-        <w:left w:w="108" w:type="dxa"/>
-        <w:bottom w:w="0" w:type="dxa"/>
-        <w:right w:w="108" w:type="dxa"/>
-      </w:tblCellMar>
     </w:tblPr>
     <w:tcPr>
       <w:shd w:val="clear" w:color="auto" w:fill="C0C0C0" w:themeFill="text1" w:themeFillTint="3F"/>
@@ -9712,7 +9911,6 @@
     <w:tblPr>
       <w:tblStyleRowBandSize w:val="1"/>
       <w:tblStyleColBandSize w:val="1"/>
-      <w:tblInd w:w="0" w:type="dxa"/>
       <w:tblBorders>
         <w:top w:val="single" w:sz="8" w:space="0" w:color="FFFFFF" w:themeColor="background1"/>
         <w:left w:val="single" w:sz="8" w:space="0" w:color="FFFFFF" w:themeColor="background1"/>
@@ -9721,12 +9919,6 @@
         <w:insideH w:val="single" w:sz="6" w:space="0" w:color="FFFFFF" w:themeColor="background1"/>
         <w:insideV w:val="single" w:sz="6" w:space="0" w:color="FFFFFF" w:themeColor="background1"/>
       </w:tblBorders>
-      <w:tblCellMar>
-        <w:top w:w="0" w:type="dxa"/>
-        <w:left w:w="108" w:type="dxa"/>
-        <w:bottom w:w="0" w:type="dxa"/>
-        <w:right w:w="108" w:type="dxa"/>
-      </w:tblCellMar>
     </w:tblPr>
     <w:tcPr>
       <w:shd w:val="clear" w:color="auto" w:fill="D3DFEE" w:themeFill="accent1" w:themeFillTint="3F"/>
@@ -9853,7 +10045,6 @@
     <w:tblPr>
       <w:tblStyleRowBandSize w:val="1"/>
       <w:tblStyleColBandSize w:val="1"/>
-      <w:tblInd w:w="0" w:type="dxa"/>
       <w:tblBorders>
         <w:top w:val="single" w:sz="8" w:space="0" w:color="FFFFFF" w:themeColor="background1"/>
         <w:left w:val="single" w:sz="8" w:space="0" w:color="FFFFFF" w:themeColor="background1"/>
@@ -9862,12 +10053,6 @@
         <w:insideH w:val="single" w:sz="6" w:space="0" w:color="FFFFFF" w:themeColor="background1"/>
         <w:insideV w:val="single" w:sz="6" w:space="0" w:color="FFFFFF" w:themeColor="background1"/>
       </w:tblBorders>
-      <w:tblCellMar>
-        <w:top w:w="0" w:type="dxa"/>
-        <w:left w:w="108" w:type="dxa"/>
-        <w:bottom w:w="0" w:type="dxa"/>
-        <w:right w:w="108" w:type="dxa"/>
-      </w:tblCellMar>
     </w:tblPr>
     <w:tcPr>
       <w:shd w:val="clear" w:color="auto" w:fill="EFD3D2" w:themeFill="accent2" w:themeFillTint="3F"/>
@@ -9994,7 +10179,6 @@
     <w:tblPr>
       <w:tblStyleRowBandSize w:val="1"/>
       <w:tblStyleColBandSize w:val="1"/>
-      <w:tblInd w:w="0" w:type="dxa"/>
       <w:tblBorders>
         <w:top w:val="single" w:sz="8" w:space="0" w:color="FFFFFF" w:themeColor="background1"/>
         <w:left w:val="single" w:sz="8" w:space="0" w:color="FFFFFF" w:themeColor="background1"/>
@@ -10003,12 +10187,6 @@
         <w:insideH w:val="single" w:sz="6" w:space="0" w:color="FFFFFF" w:themeColor="background1"/>
         <w:insideV w:val="single" w:sz="6" w:space="0" w:color="FFFFFF" w:themeColor="background1"/>
       </w:tblBorders>
-      <w:tblCellMar>
-        <w:top w:w="0" w:type="dxa"/>
-        <w:left w:w="108" w:type="dxa"/>
-        <w:bottom w:w="0" w:type="dxa"/>
-        <w:right w:w="108" w:type="dxa"/>
-      </w:tblCellMar>
     </w:tblPr>
     <w:tcPr>
       <w:shd w:val="clear" w:color="auto" w:fill="E6EED5" w:themeFill="accent3" w:themeFillTint="3F"/>
@@ -10135,7 +10313,6 @@
     <w:tblPr>
       <w:tblStyleRowBandSize w:val="1"/>
       <w:tblStyleColBandSize w:val="1"/>
-      <w:tblInd w:w="0" w:type="dxa"/>
       <w:tblBorders>
         <w:top w:val="single" w:sz="8" w:space="0" w:color="FFFFFF" w:themeColor="background1"/>
         <w:left w:val="single" w:sz="8" w:space="0" w:color="FFFFFF" w:themeColor="background1"/>
@@ -10144,12 +10321,6 @@
         <w:insideH w:val="single" w:sz="6" w:space="0" w:color="FFFFFF" w:themeColor="background1"/>
         <w:insideV w:val="single" w:sz="6" w:space="0" w:color="FFFFFF" w:themeColor="background1"/>
       </w:tblBorders>
-      <w:tblCellMar>
-        <w:top w:w="0" w:type="dxa"/>
-        <w:left w:w="108" w:type="dxa"/>
-        <w:bottom w:w="0" w:type="dxa"/>
-        <w:right w:w="108" w:type="dxa"/>
-      </w:tblCellMar>
     </w:tblPr>
     <w:tcPr>
       <w:shd w:val="clear" w:color="auto" w:fill="DFD8E8" w:themeFill="accent4" w:themeFillTint="3F"/>
@@ -10276,7 +10447,6 @@
     <w:tblPr>
       <w:tblStyleRowBandSize w:val="1"/>
       <w:tblStyleColBandSize w:val="1"/>
-      <w:tblInd w:w="0" w:type="dxa"/>
       <w:tblBorders>
         <w:top w:val="single" w:sz="8" w:space="0" w:color="FFFFFF" w:themeColor="background1"/>
         <w:left w:val="single" w:sz="8" w:space="0" w:color="FFFFFF" w:themeColor="background1"/>
@@ -10285,12 +10455,6 @@
         <w:insideH w:val="single" w:sz="6" w:space="0" w:color="FFFFFF" w:themeColor="background1"/>
         <w:insideV w:val="single" w:sz="6" w:space="0" w:color="FFFFFF" w:themeColor="background1"/>
       </w:tblBorders>
-      <w:tblCellMar>
-        <w:top w:w="0" w:type="dxa"/>
-        <w:left w:w="108" w:type="dxa"/>
-        <w:bottom w:w="0" w:type="dxa"/>
-        <w:right w:w="108" w:type="dxa"/>
-      </w:tblCellMar>
     </w:tblPr>
     <w:tcPr>
       <w:shd w:val="clear" w:color="auto" w:fill="D2EAF1" w:themeFill="accent5" w:themeFillTint="3F"/>
@@ -10417,7 +10581,6 @@
     <w:tblPr>
       <w:tblStyleRowBandSize w:val="1"/>
       <w:tblStyleColBandSize w:val="1"/>
-      <w:tblInd w:w="0" w:type="dxa"/>
       <w:tblBorders>
         <w:top w:val="single" w:sz="8" w:space="0" w:color="FFFFFF" w:themeColor="background1"/>
         <w:left w:val="single" w:sz="8" w:space="0" w:color="FFFFFF" w:themeColor="background1"/>
@@ -10426,12 +10589,6 @@
         <w:insideH w:val="single" w:sz="6" w:space="0" w:color="FFFFFF" w:themeColor="background1"/>
         <w:insideV w:val="single" w:sz="6" w:space="0" w:color="FFFFFF" w:themeColor="background1"/>
       </w:tblBorders>
-      <w:tblCellMar>
-        <w:top w:w="0" w:type="dxa"/>
-        <w:left w:w="108" w:type="dxa"/>
-        <w:bottom w:w="0" w:type="dxa"/>
-        <w:right w:w="108" w:type="dxa"/>
-      </w:tblCellMar>
     </w:tblPr>
     <w:tcPr>
       <w:shd w:val="clear" w:color="auto" w:fill="FDE4D0" w:themeFill="accent6" w:themeFillTint="3F"/>
@@ -10561,13 +10718,6 @@
     <w:tblPr>
       <w:tblStyleRowBandSize w:val="1"/>
       <w:tblStyleColBandSize w:val="1"/>
-      <w:tblInd w:w="0" w:type="dxa"/>
-      <w:tblCellMar>
-        <w:top w:w="0" w:type="dxa"/>
-        <w:left w:w="108" w:type="dxa"/>
-        <w:bottom w:w="0" w:type="dxa"/>
-        <w:right w:w="108" w:type="dxa"/>
-      </w:tblCellMar>
     </w:tblPr>
     <w:tcPr>
       <w:shd w:val="clear" w:color="auto" w:fill="000000" w:themeFill="text1"/>
@@ -10675,13 +10825,6 @@
     <w:tblPr>
       <w:tblStyleRowBandSize w:val="1"/>
       <w:tblStyleColBandSize w:val="1"/>
-      <w:tblInd w:w="0" w:type="dxa"/>
-      <w:tblCellMar>
-        <w:top w:w="0" w:type="dxa"/>
-        <w:left w:w="108" w:type="dxa"/>
-        <w:bottom w:w="0" w:type="dxa"/>
-        <w:right w:w="108" w:type="dxa"/>
-      </w:tblCellMar>
     </w:tblPr>
     <w:tcPr>
       <w:shd w:val="clear" w:color="auto" w:fill="4F81BD" w:themeFill="accent1"/>
@@ -10789,13 +10932,6 @@
     <w:tblPr>
       <w:tblStyleRowBandSize w:val="1"/>
       <w:tblStyleColBandSize w:val="1"/>
-      <w:tblInd w:w="0" w:type="dxa"/>
-      <w:tblCellMar>
-        <w:top w:w="0" w:type="dxa"/>
-        <w:left w:w="108" w:type="dxa"/>
-        <w:bottom w:w="0" w:type="dxa"/>
-        <w:right w:w="108" w:type="dxa"/>
-      </w:tblCellMar>
     </w:tblPr>
     <w:tcPr>
       <w:shd w:val="clear" w:color="auto" w:fill="C0504D" w:themeFill="accent2"/>
@@ -10903,13 +11039,6 @@
     <w:tblPr>
       <w:tblStyleRowBandSize w:val="1"/>
       <w:tblStyleColBandSize w:val="1"/>
-      <w:tblInd w:w="0" w:type="dxa"/>
-      <w:tblCellMar>
-        <w:top w:w="0" w:type="dxa"/>
-        <w:left w:w="108" w:type="dxa"/>
-        <w:bottom w:w="0" w:type="dxa"/>
-        <w:right w:w="108" w:type="dxa"/>
-      </w:tblCellMar>
     </w:tblPr>
     <w:tcPr>
       <w:shd w:val="clear" w:color="auto" w:fill="9BBB59" w:themeFill="accent3"/>
@@ -11017,13 +11146,6 @@
     <w:tblPr>
       <w:tblStyleRowBandSize w:val="1"/>
       <w:tblStyleColBandSize w:val="1"/>
-      <w:tblInd w:w="0" w:type="dxa"/>
-      <w:tblCellMar>
-        <w:top w:w="0" w:type="dxa"/>
-        <w:left w:w="108" w:type="dxa"/>
-        <w:bottom w:w="0" w:type="dxa"/>
-        <w:right w:w="108" w:type="dxa"/>
-      </w:tblCellMar>
     </w:tblPr>
     <w:tcPr>
       <w:shd w:val="clear" w:color="auto" w:fill="8064A2" w:themeFill="accent4"/>
@@ -11131,13 +11253,6 @@
     <w:tblPr>
       <w:tblStyleRowBandSize w:val="1"/>
       <w:tblStyleColBandSize w:val="1"/>
-      <w:tblInd w:w="0" w:type="dxa"/>
-      <w:tblCellMar>
-        <w:top w:w="0" w:type="dxa"/>
-        <w:left w:w="108" w:type="dxa"/>
-        <w:bottom w:w="0" w:type="dxa"/>
-        <w:right w:w="108" w:type="dxa"/>
-      </w:tblCellMar>
     </w:tblPr>
     <w:tcPr>
       <w:shd w:val="clear" w:color="auto" w:fill="4BACC6" w:themeFill="accent5"/>
@@ -11245,13 +11360,6 @@
     <w:tblPr>
       <w:tblStyleRowBandSize w:val="1"/>
       <w:tblStyleColBandSize w:val="1"/>
-      <w:tblInd w:w="0" w:type="dxa"/>
-      <w:tblCellMar>
-        <w:top w:w="0" w:type="dxa"/>
-        <w:left w:w="108" w:type="dxa"/>
-        <w:bottom w:w="0" w:type="dxa"/>
-        <w:right w:w="108" w:type="dxa"/>
-      </w:tblCellMar>
     </w:tblPr>
     <w:tcPr>
       <w:shd w:val="clear" w:color="auto" w:fill="F79646" w:themeFill="accent6"/>
@@ -11359,7 +11467,6 @@
     <w:tblPr>
       <w:tblStyleRowBandSize w:val="1"/>
       <w:tblStyleColBandSize w:val="1"/>
-      <w:tblInd w:w="0" w:type="dxa"/>
       <w:tblBorders>
         <w:top w:val="single" w:sz="24" w:space="0" w:color="C0504D" w:themeColor="accent2"/>
         <w:left w:val="single" w:sz="4" w:space="0" w:color="000000" w:themeColor="text1"/>
@@ -11368,12 +11475,6 @@
         <w:insideH w:val="single" w:sz="4" w:space="0" w:color="FFFFFF" w:themeColor="background1"/>
         <w:insideV w:val="single" w:sz="4" w:space="0" w:color="FFFFFF" w:themeColor="background1"/>
       </w:tblBorders>
-      <w:tblCellMar>
-        <w:top w:w="0" w:type="dxa"/>
-        <w:left w:w="108" w:type="dxa"/>
-        <w:bottom w:w="0" w:type="dxa"/>
-        <w:right w:w="108" w:type="dxa"/>
-      </w:tblCellMar>
     </w:tblPr>
     <w:tcPr>
       <w:shd w:val="clear" w:color="auto" w:fill="E6E6E6" w:themeFill="text1" w:themeFillTint="19"/>
@@ -11481,7 +11582,6 @@
     <w:tblPr>
       <w:tblStyleRowBandSize w:val="1"/>
       <w:tblStyleColBandSize w:val="1"/>
-      <w:tblInd w:w="0" w:type="dxa"/>
       <w:tblBorders>
         <w:top w:val="single" w:sz="24" w:space="0" w:color="C0504D" w:themeColor="accent2"/>
         <w:left w:val="single" w:sz="4" w:space="0" w:color="4F81BD" w:themeColor="accent1"/>
@@ -11490,12 +11590,6 @@
         <w:insideH w:val="single" w:sz="4" w:space="0" w:color="FFFFFF" w:themeColor="background1"/>
         <w:insideV w:val="single" w:sz="4" w:space="0" w:color="FFFFFF" w:themeColor="background1"/>
       </w:tblBorders>
-      <w:tblCellMar>
-        <w:top w:w="0" w:type="dxa"/>
-        <w:left w:w="108" w:type="dxa"/>
-        <w:bottom w:w="0" w:type="dxa"/>
-        <w:right w:w="108" w:type="dxa"/>
-      </w:tblCellMar>
     </w:tblPr>
     <w:tcPr>
       <w:shd w:val="clear" w:color="auto" w:fill="EDF2F8" w:themeFill="accent1" w:themeFillTint="19"/>
@@ -11603,7 +11697,6 @@
     <w:tblPr>
       <w:tblStyleRowBandSize w:val="1"/>
       <w:tblStyleColBandSize w:val="1"/>
-      <w:tblInd w:w="0" w:type="dxa"/>
       <w:tblBorders>
         <w:top w:val="single" w:sz="24" w:space="0" w:color="C0504D" w:themeColor="accent2"/>
         <w:left w:val="single" w:sz="4" w:space="0" w:color="C0504D" w:themeColor="accent2"/>
@@ -11612,12 +11705,6 @@
         <w:insideH w:val="single" w:sz="4" w:space="0" w:color="FFFFFF" w:themeColor="background1"/>
         <w:insideV w:val="single" w:sz="4" w:space="0" w:color="FFFFFF" w:themeColor="background1"/>
       </w:tblBorders>
-      <w:tblCellMar>
-        <w:top w:w="0" w:type="dxa"/>
-        <w:left w:w="108" w:type="dxa"/>
-        <w:bottom w:w="0" w:type="dxa"/>
-        <w:right w:w="108" w:type="dxa"/>
-      </w:tblCellMar>
     </w:tblPr>
     <w:tcPr>
       <w:shd w:val="clear" w:color="auto" w:fill="F8EDED" w:themeFill="accent2" w:themeFillTint="19"/>
@@ -11725,7 +11812,6 @@
     <w:tblPr>
       <w:tblStyleRowBandSize w:val="1"/>
       <w:tblStyleColBandSize w:val="1"/>
-      <w:tblInd w:w="0" w:type="dxa"/>
       <w:tblBorders>
         <w:top w:val="single" w:sz="24" w:space="0" w:color="8064A2" w:themeColor="accent4"/>
         <w:left w:val="single" w:sz="4" w:space="0" w:color="9BBB59" w:themeColor="accent3"/>
@@ -11734,12 +11820,6 @@
         <w:insideH w:val="single" w:sz="4" w:space="0" w:color="FFFFFF" w:themeColor="background1"/>
         <w:insideV w:val="single" w:sz="4" w:space="0" w:color="FFFFFF" w:themeColor="background1"/>
       </w:tblBorders>
-      <w:tblCellMar>
-        <w:top w:w="0" w:type="dxa"/>
-        <w:left w:w="108" w:type="dxa"/>
-        <w:bottom w:w="0" w:type="dxa"/>
-        <w:right w:w="108" w:type="dxa"/>
-      </w:tblCellMar>
     </w:tblPr>
     <w:tcPr>
       <w:shd w:val="clear" w:color="auto" w:fill="F5F8EE" w:themeFill="accent3" w:themeFillTint="19"/>
@@ -11837,7 +11917,6 @@
     <w:tblPr>
       <w:tblStyleRowBandSize w:val="1"/>
       <w:tblStyleColBandSize w:val="1"/>
-      <w:tblInd w:w="0" w:type="dxa"/>
       <w:tblBorders>
         <w:top w:val="single" w:sz="24" w:space="0" w:color="9BBB59" w:themeColor="accent3"/>
         <w:left w:val="single" w:sz="4" w:space="0" w:color="8064A2" w:themeColor="accent4"/>
@@ -11846,12 +11925,6 @@
         <w:insideH w:val="single" w:sz="4" w:space="0" w:color="FFFFFF" w:themeColor="background1"/>
         <w:insideV w:val="single" w:sz="4" w:space="0" w:color="FFFFFF" w:themeColor="background1"/>
       </w:tblBorders>
-      <w:tblCellMar>
-        <w:top w:w="0" w:type="dxa"/>
-        <w:left w:w="108" w:type="dxa"/>
-        <w:bottom w:w="0" w:type="dxa"/>
-        <w:right w:w="108" w:type="dxa"/>
-      </w:tblCellMar>
     </w:tblPr>
     <w:tcPr>
       <w:shd w:val="clear" w:color="auto" w:fill="F2EFF6" w:themeFill="accent4" w:themeFillTint="19"/>
@@ -11959,7 +12032,6 @@
     <w:tblPr>
       <w:tblStyleRowBandSize w:val="1"/>
       <w:tblStyleColBandSize w:val="1"/>
-      <w:tblInd w:w="0" w:type="dxa"/>
       <w:tblBorders>
         <w:top w:val="single" w:sz="24" w:space="0" w:color="F79646" w:themeColor="accent6"/>
         <w:left w:val="single" w:sz="4" w:space="0" w:color="4BACC6" w:themeColor="accent5"/>
@@ -11968,12 +12040,6 @@
         <w:insideH w:val="single" w:sz="4" w:space="0" w:color="FFFFFF" w:themeColor="background1"/>
         <w:insideV w:val="single" w:sz="4" w:space="0" w:color="FFFFFF" w:themeColor="background1"/>
       </w:tblBorders>
-      <w:tblCellMar>
-        <w:top w:w="0" w:type="dxa"/>
-        <w:left w:w="108" w:type="dxa"/>
-        <w:bottom w:w="0" w:type="dxa"/>
-        <w:right w:w="108" w:type="dxa"/>
-      </w:tblCellMar>
     </w:tblPr>
     <w:tcPr>
       <w:shd w:val="clear" w:color="auto" w:fill="EDF6F9" w:themeFill="accent5" w:themeFillTint="19"/>
@@ -12081,7 +12147,6 @@
     <w:tblPr>
       <w:tblStyleRowBandSize w:val="1"/>
       <w:tblStyleColBandSize w:val="1"/>
-      <w:tblInd w:w="0" w:type="dxa"/>
       <w:tblBorders>
         <w:top w:val="single" w:sz="24" w:space="0" w:color="4BACC6" w:themeColor="accent5"/>
         <w:left w:val="single" w:sz="4" w:space="0" w:color="F79646" w:themeColor="accent6"/>
@@ -12090,12 +12155,6 @@
         <w:insideH w:val="single" w:sz="4" w:space="0" w:color="FFFFFF" w:themeColor="background1"/>
         <w:insideV w:val="single" w:sz="4" w:space="0" w:color="FFFFFF" w:themeColor="background1"/>
       </w:tblBorders>
-      <w:tblCellMar>
-        <w:top w:w="0" w:type="dxa"/>
-        <w:left w:w="108" w:type="dxa"/>
-        <w:bottom w:w="0" w:type="dxa"/>
-        <w:right w:w="108" w:type="dxa"/>
-      </w:tblCellMar>
     </w:tblPr>
     <w:tcPr>
       <w:shd w:val="clear" w:color="auto" w:fill="FEF4EC" w:themeFill="accent6" w:themeFillTint="19"/>
@@ -12203,13 +12262,6 @@
     <w:tblPr>
       <w:tblStyleRowBandSize w:val="1"/>
       <w:tblStyleColBandSize w:val="1"/>
-      <w:tblInd w:w="0" w:type="dxa"/>
-      <w:tblCellMar>
-        <w:top w:w="0" w:type="dxa"/>
-        <w:left w:w="108" w:type="dxa"/>
-        <w:bottom w:w="0" w:type="dxa"/>
-        <w:right w:w="108" w:type="dxa"/>
-      </w:tblCellMar>
     </w:tblPr>
     <w:tcPr>
       <w:shd w:val="clear" w:color="auto" w:fill="E6E6E6" w:themeFill="text1" w:themeFillTint="19"/>
@@ -12289,13 +12341,6 @@
     <w:tblPr>
       <w:tblStyleRowBandSize w:val="1"/>
       <w:tblStyleColBandSize w:val="1"/>
-      <w:tblInd w:w="0" w:type="dxa"/>
-      <w:tblCellMar>
-        <w:top w:w="0" w:type="dxa"/>
-        <w:left w:w="108" w:type="dxa"/>
-        <w:bottom w:w="0" w:type="dxa"/>
-        <w:right w:w="108" w:type="dxa"/>
-      </w:tblCellMar>
     </w:tblPr>
     <w:tcPr>
       <w:shd w:val="clear" w:color="auto" w:fill="EDF2F8" w:themeFill="accent1" w:themeFillTint="19"/>
@@ -12375,13 +12420,6 @@
     <w:tblPr>
       <w:tblStyleRowBandSize w:val="1"/>
       <w:tblStyleColBandSize w:val="1"/>
-      <w:tblInd w:w="0" w:type="dxa"/>
-      <w:tblCellMar>
-        <w:top w:w="0" w:type="dxa"/>
-        <w:left w:w="108" w:type="dxa"/>
-        <w:bottom w:w="0" w:type="dxa"/>
-        <w:right w:w="108" w:type="dxa"/>
-      </w:tblCellMar>
     </w:tblPr>
     <w:tcPr>
       <w:shd w:val="clear" w:color="auto" w:fill="F8EDED" w:themeFill="accent2" w:themeFillTint="19"/>
@@ -12461,13 +12499,6 @@
     <w:tblPr>
       <w:tblStyleRowBandSize w:val="1"/>
       <w:tblStyleColBandSize w:val="1"/>
-      <w:tblInd w:w="0" w:type="dxa"/>
-      <w:tblCellMar>
-        <w:top w:w="0" w:type="dxa"/>
-        <w:left w:w="108" w:type="dxa"/>
-        <w:bottom w:w="0" w:type="dxa"/>
-        <w:right w:w="108" w:type="dxa"/>
-      </w:tblCellMar>
     </w:tblPr>
     <w:tcPr>
       <w:shd w:val="clear" w:color="auto" w:fill="F5F8EE" w:themeFill="accent3" w:themeFillTint="19"/>
@@ -12547,13 +12578,6 @@
     <w:tblPr>
       <w:tblStyleRowBandSize w:val="1"/>
       <w:tblStyleColBandSize w:val="1"/>
-      <w:tblInd w:w="0" w:type="dxa"/>
-      <w:tblCellMar>
-        <w:top w:w="0" w:type="dxa"/>
-        <w:left w:w="108" w:type="dxa"/>
-        <w:bottom w:w="0" w:type="dxa"/>
-        <w:right w:w="108" w:type="dxa"/>
-      </w:tblCellMar>
     </w:tblPr>
     <w:tcPr>
       <w:shd w:val="clear" w:color="auto" w:fill="F2EFF6" w:themeFill="accent4" w:themeFillTint="19"/>
@@ -12633,13 +12657,6 @@
     <w:tblPr>
       <w:tblStyleRowBandSize w:val="1"/>
       <w:tblStyleColBandSize w:val="1"/>
-      <w:tblInd w:w="0" w:type="dxa"/>
-      <w:tblCellMar>
-        <w:top w:w="0" w:type="dxa"/>
-        <w:left w:w="108" w:type="dxa"/>
-        <w:bottom w:w="0" w:type="dxa"/>
-        <w:right w:w="108" w:type="dxa"/>
-      </w:tblCellMar>
     </w:tblPr>
     <w:tcPr>
       <w:shd w:val="clear" w:color="auto" w:fill="EDF6F9" w:themeFill="accent5" w:themeFillTint="19"/>
@@ -12719,13 +12736,6 @@
     <w:tblPr>
       <w:tblStyleRowBandSize w:val="1"/>
       <w:tblStyleColBandSize w:val="1"/>
-      <w:tblInd w:w="0" w:type="dxa"/>
-      <w:tblCellMar>
-        <w:top w:w="0" w:type="dxa"/>
-        <w:left w:w="108" w:type="dxa"/>
-        <w:bottom w:w="0" w:type="dxa"/>
-        <w:right w:w="108" w:type="dxa"/>
-      </w:tblCellMar>
     </w:tblPr>
     <w:tcPr>
       <w:shd w:val="clear" w:color="auto" w:fill="FEF4EC" w:themeFill="accent6" w:themeFillTint="19"/>
@@ -12805,16 +12815,9 @@
     <w:tblPr>
       <w:tblStyleRowBandSize w:val="1"/>
       <w:tblStyleColBandSize w:val="1"/>
-      <w:tblInd w:w="0" w:type="dxa"/>
       <w:tblBorders>
         <w:insideH w:val="single" w:sz="4" w:space="0" w:color="FFFFFF" w:themeColor="background1"/>
       </w:tblBorders>
-      <w:tblCellMar>
-        <w:top w:w="0" w:type="dxa"/>
-        <w:left w:w="108" w:type="dxa"/>
-        <w:bottom w:w="0" w:type="dxa"/>
-        <w:right w:w="108" w:type="dxa"/>
-      </w:tblCellMar>
     </w:tblPr>
     <w:tcPr>
       <w:shd w:val="clear" w:color="auto" w:fill="CCCCCC" w:themeFill="text1" w:themeFillTint="33"/>
@@ -12885,16 +12888,9 @@
     <w:tblPr>
       <w:tblStyleRowBandSize w:val="1"/>
       <w:tblStyleColBandSize w:val="1"/>
-      <w:tblInd w:w="0" w:type="dxa"/>
       <w:tblBorders>
         <w:insideH w:val="single" w:sz="4" w:space="0" w:color="FFFFFF" w:themeColor="background1"/>
       </w:tblBorders>
-      <w:tblCellMar>
-        <w:top w:w="0" w:type="dxa"/>
-        <w:left w:w="108" w:type="dxa"/>
-        <w:bottom w:w="0" w:type="dxa"/>
-        <w:right w:w="108" w:type="dxa"/>
-      </w:tblCellMar>
     </w:tblPr>
     <w:tcPr>
       <w:shd w:val="clear" w:color="auto" w:fill="DBE5F1" w:themeFill="accent1" w:themeFillTint="33"/>
@@ -12965,16 +12961,9 @@
     <w:tblPr>
       <w:tblStyleRowBandSize w:val="1"/>
       <w:tblStyleColBandSize w:val="1"/>
-      <w:tblInd w:w="0" w:type="dxa"/>
       <w:tblBorders>
         <w:insideH w:val="single" w:sz="4" w:space="0" w:color="FFFFFF" w:themeColor="background1"/>
       </w:tblBorders>
-      <w:tblCellMar>
-        <w:top w:w="0" w:type="dxa"/>
-        <w:left w:w="108" w:type="dxa"/>
-        <w:bottom w:w="0" w:type="dxa"/>
-        <w:right w:w="108" w:type="dxa"/>
-      </w:tblCellMar>
     </w:tblPr>
     <w:tcPr>
       <w:shd w:val="clear" w:color="auto" w:fill="F2DBDB" w:themeFill="accent2" w:themeFillTint="33"/>
@@ -13045,16 +13034,9 @@
     <w:tblPr>
       <w:tblStyleRowBandSize w:val="1"/>
       <w:tblStyleColBandSize w:val="1"/>
-      <w:tblInd w:w="0" w:type="dxa"/>
       <w:tblBorders>
         <w:insideH w:val="single" w:sz="4" w:space="0" w:color="FFFFFF" w:themeColor="background1"/>
       </w:tblBorders>
-      <w:tblCellMar>
-        <w:top w:w="0" w:type="dxa"/>
-        <w:left w:w="108" w:type="dxa"/>
-        <w:bottom w:w="0" w:type="dxa"/>
-        <w:right w:w="108" w:type="dxa"/>
-      </w:tblCellMar>
     </w:tblPr>
     <w:tcPr>
       <w:shd w:val="clear" w:color="auto" w:fill="EAF1DD" w:themeFill="accent3" w:themeFillTint="33"/>
@@ -13125,16 +13107,9 @@
     <w:tblPr>
       <w:tblStyleRowBandSize w:val="1"/>
       <w:tblStyleColBandSize w:val="1"/>
-      <w:tblInd w:w="0" w:type="dxa"/>
       <w:tblBorders>
         <w:insideH w:val="single" w:sz="4" w:space="0" w:color="FFFFFF" w:themeColor="background1"/>
       </w:tblBorders>
-      <w:tblCellMar>
-        <w:top w:w="0" w:type="dxa"/>
-        <w:left w:w="108" w:type="dxa"/>
-        <w:bottom w:w="0" w:type="dxa"/>
-        <w:right w:w="108" w:type="dxa"/>
-      </w:tblCellMar>
     </w:tblPr>
     <w:tcPr>
       <w:shd w:val="clear" w:color="auto" w:fill="E5DFEC" w:themeFill="accent4" w:themeFillTint="33"/>
@@ -13205,16 +13180,9 @@
     <w:tblPr>
       <w:tblStyleRowBandSize w:val="1"/>
       <w:tblStyleColBandSize w:val="1"/>
-      <w:tblInd w:w="0" w:type="dxa"/>
       <w:tblBorders>
         <w:insideH w:val="single" w:sz="4" w:space="0" w:color="FFFFFF" w:themeColor="background1"/>
       </w:tblBorders>
-      <w:tblCellMar>
-        <w:top w:w="0" w:type="dxa"/>
-        <w:left w:w="108" w:type="dxa"/>
-        <w:bottom w:w="0" w:type="dxa"/>
-        <w:right w:w="108" w:type="dxa"/>
-      </w:tblCellMar>
     </w:tblPr>
     <w:tcPr>
       <w:shd w:val="clear" w:color="auto" w:fill="DAEEF3" w:themeFill="accent5" w:themeFillTint="33"/>
@@ -13285,16 +13253,9 @@
     <w:tblPr>
       <w:tblStyleRowBandSize w:val="1"/>
       <w:tblStyleColBandSize w:val="1"/>
-      <w:tblInd w:w="0" w:type="dxa"/>
       <w:tblBorders>
         <w:insideH w:val="single" w:sz="4" w:space="0" w:color="FFFFFF" w:themeColor="background1"/>
       </w:tblBorders>
-      <w:tblCellMar>
-        <w:top w:w="0" w:type="dxa"/>
-        <w:left w:w="108" w:type="dxa"/>
-        <w:bottom w:w="0" w:type="dxa"/>
-        <w:right w:w="108" w:type="dxa"/>
-      </w:tblCellMar>
     </w:tblPr>
     <w:tcPr>
       <w:shd w:val="clear" w:color="auto" w:fill="FDE9D9" w:themeFill="accent6" w:themeFillTint="33"/>
@@ -13350,6 +13311,14 @@
         <w:shd w:val="clear" w:color="auto" w:fill="FBCAA2" w:themeFill="accent6" w:themeFillTint="7F"/>
       </w:tcPr>
     </w:tblStylePr>
+  </w:style>
+  <w:style w:type="paragraph" w:styleId="Bibliografa">
+    <w:name w:val="Bibliography"/>
+    <w:basedOn w:val="Normal"/>
+    <w:next w:val="Normal"/>
+    <w:uiPriority w:val="37"/>
+    <w:unhideWhenUsed/>
+    <w:rsid w:val="00421E83"/>
   </w:style>
 </w:styles>
 </file>
@@ -13675,11 +13644,53 @@
 </file>
 
 <file path=customXml/item1.xml><?xml version="1.0" encoding="utf-8"?>
-<b:Sources xmlns:b="http://schemas.openxmlformats.org/officeDocument/2006/bibliography" xmlns="http://schemas.openxmlformats.org/officeDocument/2006/bibliography" SelectedStyle="/APA.XSL" StyleName="APA"/>
+<b:Sources xmlns:b="http://schemas.openxmlformats.org/officeDocument/2006/bibliography" xmlns="http://schemas.openxmlformats.org/officeDocument/2006/bibliography" SelectedStyle="\APASixthEditionOfficeOnline.xsl" StyleName="APA" Version="6">
+  <b:Source>
+    <b:Tag>PelGuil</b:Tag>
+    <b:SourceType>InternetSite</b:SourceType>
+    <b:Guid>{CAC68F8E-AEB1-459F-A5C2-F294185C14AA}</b:Guid>
+    <b:Author>
+      <b:Author>
+        <b:NameList>
+          <b:Person>
+            <b:Last>Guilizzoni</b:Last>
+            <b:First>Peldi</b:First>
+          </b:Person>
+        </b:NameList>
+      </b:Author>
+    </b:Author>
+    <b:Title>balsamiq.com</b:Title>
+    <b:InternetSiteTitle>balsamiq.com</b:InternetSiteTitle>
+    <b:Year>2025</b:Year>
+    <b:Month>mayo</b:Month>
+    <b:Day>8</b:Day>
+    <b:URL>https://balsamiq.com/blog/what-are-wireframes/</b:URL>
+    <b:RefOrder>1</b:RefOrder>
+  </b:Source>
+  <b:Source>
+    <b:Tag>Org10</b:Tag>
+    <b:SourceType>ElectronicSource</b:SourceType>
+    <b:Guid>{AA9F94E6-7001-4A47-ACAB-E99017595420}</b:Guid>
+    <b:Author>
+      <b:Author>
+        <b:NameList>
+          <b:Person>
+            <b:Last>(2019)</b:Last>
+            <b:First>Organización</b:First>
+            <b:Middle>Internacional de Normalización.</b:Middle>
+          </b:Person>
+        </b:NameList>
+      </b:Author>
+    </b:Author>
+    <b:Title>Ergonomía de la interacción persona-sistema - Parte 210: Diseño centrado en el humano para los sistemas interactivos</b:Title>
+    <b:Year>2010</b:Year>
+    <b:RefOrder>2</b:RefOrder>
+  </b:Source>
+</b:Sources>
 </file>
 
 <file path=customXml/itemProps1.xml><?xml version="1.0" encoding="utf-8"?>
-<ds:datastoreItem xmlns:ds="http://schemas.openxmlformats.org/officeDocument/2006/customXml" ds:itemID="{514CE5D1-55B2-4836-95D4-2BA789E698F2}">
+<ds:datastoreItem xmlns:ds="http://schemas.openxmlformats.org/officeDocument/2006/customXml" ds:itemID="{F9AAB008-62ED-4073-9113-F5F9BD9086B3}">
   <ds:schemaRefs>
     <ds:schemaRef ds:uri="http://schemas.openxmlformats.org/officeDocument/2006/bibliography"/>
   </ds:schemaRefs>

</xml_diff>

<commit_message>
Update C055_UNIR_Prototipado UX con inteligencia artificial.docx
Documento con la fase 2 Arquetipos de Usuario, Entrenador y Encargado del gimnasio
</commit_message>
<xml_diff>
--- a/C055_UNIR_Prototipado UX con inteligencia artificial.docx
+++ b/C055_UNIR_Prototipado UX con inteligencia artificial.docx
@@ -71,10 +71,7 @@
       </w:r>
       <w:ins w:id="0" w:author="francisco javier gonzalez  garcia" w:date="2026-09-22T22:42:00Z">
         <w:r>
-          <w:t xml:space="preserve"> </w:t>
-        </w:r>
-        <w:r>
-          <w:t>Daniel Cinto Conde</w:t>
+          <w:t xml:space="preserve"> Daniel Cinto Conde</w:t>
         </w:r>
         <w:r>
           <w:t>,</w:t>
@@ -105,15 +102,7 @@
         </w:r>
       </w:ins>
       <w:r>
-        <w:t xml:space="preserve">UX </w:t>
-      </w:r>
-      <w:proofErr w:type="spellStart"/>
-      <w:r>
-        <w:t>Strategist</w:t>
-      </w:r>
-      <w:proofErr w:type="spellEnd"/>
-      <w:r>
-        <w:t xml:space="preserve"> &amp; AI Lead (</w:t>
+        <w:t>UX Strategist &amp; AI Lead (</w:t>
       </w:r>
       <w:r>
         <w:t>Líder</w:t>
@@ -139,23 +128,7 @@
         </w:r>
       </w:ins>
       <w:r>
-        <w:t xml:space="preserve"> I</w:t>
-      </w:r>
-      <w:proofErr w:type="spellStart"/>
-      <w:r>
-        <w:t>nformation</w:t>
-      </w:r>
-      <w:proofErr w:type="spellEnd"/>
-      <w:r>
-        <w:t xml:space="preserve"> </w:t>
-      </w:r>
-      <w:proofErr w:type="spellStart"/>
-      <w:r>
-        <w:t>Architect</w:t>
-      </w:r>
-      <w:proofErr w:type="spellEnd"/>
-      <w:r>
-        <w:t xml:space="preserve"> (</w:t>
+        <w:t xml:space="preserve"> Information Architect (</w:t>
       </w:r>
       <w:r>
         <w:t>Líder</w:t>
@@ -176,15 +149,7 @@
         </w:r>
       </w:ins>
       <w:r>
-        <w:t xml:space="preserve">UI/UX </w:t>
-      </w:r>
-      <w:proofErr w:type="spellStart"/>
-      <w:r>
-        <w:t>Designer</w:t>
-      </w:r>
-      <w:proofErr w:type="spellEnd"/>
-      <w:r>
-        <w:t xml:space="preserve"> (</w:t>
+        <w:t>UI/UX Designer (</w:t>
       </w:r>
       <w:r>
         <w:t>Líder</w:t>
@@ -198,19 +163,11 @@
       </w:r>
       <w:ins w:id="5" w:author="francisco javier gonzalez  garcia" w:date="2026-09-22T22:43:00Z">
         <w:r>
-          <w:t xml:space="preserve">Miguel Ángel Sánchez </w:t>
-        </w:r>
-        <w:proofErr w:type="spellStart"/>
-        <w:r>
-          <w:t>Martínez</w:t>
+          <w:t>Miguel Ángel Sánchez Martínez</w:t>
         </w:r>
       </w:ins>
       <w:r>
-        <w:t>Interaction</w:t>
-      </w:r>
-      <w:proofErr w:type="spellEnd"/>
-      <w:r>
-        <w:t xml:space="preserve"> QA &amp; Editor (</w:t>
+        <w:t>Interaction QA &amp; Editor (</w:t>
       </w:r>
       <w:r>
         <w:t>Líder</w:t>
@@ -379,7 +336,10 @@
     <w:p>
       <w:pPr>
         <w:jc w:val="both"/>
-        <w:pPrChange w:id="7" w:author="francisco javier gonzalez  garcia" w:date="2026-09-22T22:08:00Z">
+        <w:rPr>
+          <w:del w:id="7" w:author="francisco javier gonzalez  garcia" w:date="2026-09-24T22:54:00Z"/>
+        </w:rPr>
+        <w:pPrChange w:id="8" w:author="francisco javier gonzalez  garcia" w:date="2026-09-22T22:08:00Z">
           <w:pPr/>
         </w:pPrChange>
       </w:pPr>
@@ -484,32 +444,39 @@
       </w:r>
     </w:p>
     <w:p>
-      <w:r>
-        <w:br w:type="page"/>
-      </w:r>
+      <w:pPr>
+        <w:jc w:val="both"/>
+        <w:pPrChange w:id="9" w:author="francisco javier gonzalez  garcia" w:date="2026-09-24T22:54:00Z">
+          <w:pPr/>
+        </w:pPrChange>
+      </w:pPr>
+      <w:del w:id="10" w:author="francisco javier gonzalez  garcia" w:date="2026-09-24T22:54:00Z">
+        <w:r>
+          <w:br w:type="page"/>
+        </w:r>
+      </w:del>
     </w:p>
     <w:p>
       <w:pPr>
         <w:pStyle w:val="Ttulo1"/>
         <w:rPr>
-          <w:ins w:id="8" w:author="francisco javier gonzalez  garcia" w:date="2026-09-22T22:09:00Z"/>
+          <w:ins w:id="11" w:author="francisco javier gonzalez  garcia" w:date="2026-09-22T22:09:00Z"/>
         </w:rPr>
       </w:pPr>
-      <w:ins w:id="9" w:author="Francisco Javier" w:date="2026-09-22T22:01:00Z">
+      <w:ins w:id="12" w:author="Francisco Javier" w:date="2026-09-22T22:01:00Z">
         <w:r>
-          <w:lastRenderedPageBreak/>
           <w:t xml:space="preserve">Fase </w:t>
         </w:r>
       </w:ins>
       <w:r>
         <w:t xml:space="preserve">1. </w:t>
       </w:r>
-      <w:ins w:id="10" w:author="Francisco Javier" w:date="2026-09-22T22:01:00Z">
+      <w:ins w:id="13" w:author="Francisco Javier" w:date="2026-09-22T22:01:00Z">
         <w:r>
           <w:t>In</w:t>
         </w:r>
       </w:ins>
-      <w:ins w:id="11" w:author="Francisco Javier" w:date="2026-09-22T22:02:00Z">
+      <w:ins w:id="14" w:author="Francisco Javier" w:date="2026-09-22T22:02:00Z">
         <w:r>
           <w:t>vestigación Conceptual</w:t>
         </w:r>
@@ -518,14 +485,14 @@
     <w:p>
       <w:pPr>
         <w:pStyle w:val="Ttulo2"/>
-        <w:pPrChange w:id="12" w:author="francisco javier gonzalez  garcia" w:date="2026-09-22T22:09:00Z">
+        <w:pPrChange w:id="15" w:author="francisco javier gonzalez  garcia" w:date="2026-09-22T22:09:00Z">
           <w:pPr>
             <w:pStyle w:val="Ttulo1"/>
           </w:pPr>
         </w:pPrChange>
       </w:pPr>
-      <w:ins w:id="13" w:author="Francisco Javier" w:date="2026-09-22T22:02:00Z">
-        <w:del w:id="14" w:author="francisco javier gonzalez  garcia" w:date="2026-09-22T22:09:00Z">
+      <w:ins w:id="16" w:author="Francisco Javier" w:date="2026-09-22T22:02:00Z">
+        <w:del w:id="17" w:author="francisco javier gonzalez  garcia" w:date="2026-09-22T22:09:00Z">
           <w:r>
             <w:delText xml:space="preserve"> </w:delText>
           </w:r>
@@ -539,7 +506,7 @@
       <w:pPr>
         <w:spacing w:after="40"/>
         <w:rPr>
-          <w:del w:id="15" w:author="francisco javier gonzalez  garcia" w:date="2026-09-22T22:09:00Z"/>
+          <w:del w:id="18" w:author="francisco javier gonzalez  garcia" w:date="2026-09-22T22:09:00Z"/>
         </w:rPr>
       </w:pPr>
     </w:p>
@@ -547,7 +514,7 @@
       <w:tblPr>
         <w:tblW w:w="10031" w:type="dxa"/>
         <w:tblLook w:val="04A0" w:firstRow="1" w:lastRow="0" w:firstColumn="1" w:lastColumn="0" w:noHBand="0" w:noVBand="1"/>
-        <w:tblPrChange w:id="16" w:author="francisco javier gonzalez  garcia" w:date="2026-09-22T22:06:00Z">
+        <w:tblPrChange w:id="19" w:author="francisco javier gonzalez  garcia" w:date="2026-09-22T22:06:00Z">
           <w:tblPr>
             <w:tblW w:w="0" w:type="auto"/>
             <w:jc w:val="center"/>
@@ -561,7 +528,7 @@
         <w:gridCol w:w="2268"/>
         <w:gridCol w:w="1385"/>
         <w:gridCol w:w="2693"/>
-        <w:tblGridChange w:id="17">
+        <w:tblGridChange w:id="20">
           <w:tblGrid>
             <w:gridCol w:w="1134"/>
             <w:gridCol w:w="2551"/>
@@ -573,7 +540,7 @@
       </w:tblGrid>
       <w:tr>
         <w:trPr>
-          <w:trPrChange w:id="18" w:author="francisco javier gonzalez  garcia" w:date="2026-09-22T22:06:00Z">
+          <w:trPrChange w:id="21" w:author="francisco javier gonzalez  garcia" w:date="2026-09-22T22:06:00Z">
             <w:trPr>
               <w:jc w:val="center"/>
             </w:trPr>
@@ -586,7 +553,7 @@
               <w:bottom w:val="single" w:sz="4" w:space="0" w:color="auto"/>
             </w:tcBorders>
             <w:shd w:val="clear" w:color="auto" w:fill="DDD9C3" w:themeFill="background2" w:themeFillShade="E6"/>
-            <w:tcPrChange w:id="19" w:author="francisco javier gonzalez  garcia" w:date="2026-09-22T22:06:00Z">
+            <w:tcPrChange w:id="22" w:author="francisco javier gonzalez  garcia" w:date="2026-09-22T22:06:00Z">
               <w:tcPr>
                 <w:tcW w:w="1134" w:type="dxa"/>
               </w:tcPr>
@@ -596,7 +563,7 @@
             <w:pPr>
               <w:spacing w:before="20" w:after="20"/>
               <w:jc w:val="center"/>
-              <w:pPrChange w:id="20" w:author="francisco javier gonzalez  garcia" w:date="2026-09-22T22:06:00Z">
+              <w:pPrChange w:id="23" w:author="francisco javier gonzalez  garcia" w:date="2026-09-22T22:06:00Z">
                 <w:pPr>
                   <w:spacing w:before="20" w:after="20"/>
                 </w:pPr>
@@ -618,7 +585,7 @@
               <w:bottom w:val="single" w:sz="4" w:space="0" w:color="auto"/>
             </w:tcBorders>
             <w:shd w:val="clear" w:color="auto" w:fill="DDD9C3" w:themeFill="background2" w:themeFillShade="E6"/>
-            <w:tcPrChange w:id="21" w:author="francisco javier gonzalez  garcia" w:date="2026-09-22T22:06:00Z">
+            <w:tcPrChange w:id="24" w:author="francisco javier gonzalez  garcia" w:date="2026-09-22T22:06:00Z">
               <w:tcPr>
                 <w:tcW w:w="2551" w:type="dxa"/>
               </w:tcPr>
@@ -628,7 +595,7 @@
             <w:pPr>
               <w:spacing w:before="20" w:after="20"/>
               <w:jc w:val="center"/>
-              <w:pPrChange w:id="22" w:author="francisco javier gonzalez  garcia" w:date="2026-09-22T22:06:00Z">
+              <w:pPrChange w:id="25" w:author="francisco javier gonzalez  garcia" w:date="2026-09-22T22:06:00Z">
                 <w:pPr>
                   <w:spacing w:before="20" w:after="20"/>
                 </w:pPr>
@@ -650,7 +617,7 @@
               <w:bottom w:val="single" w:sz="4" w:space="0" w:color="auto"/>
             </w:tcBorders>
             <w:shd w:val="clear" w:color="auto" w:fill="DDD9C3" w:themeFill="background2" w:themeFillShade="E6"/>
-            <w:tcPrChange w:id="23" w:author="francisco javier gonzalez  garcia" w:date="2026-09-22T22:06:00Z">
+            <w:tcPrChange w:id="26" w:author="francisco javier gonzalez  garcia" w:date="2026-09-22T22:06:00Z">
               <w:tcPr>
                 <w:tcW w:w="2268" w:type="dxa"/>
               </w:tcPr>
@@ -660,7 +627,7 @@
             <w:pPr>
               <w:spacing w:before="20" w:after="20"/>
               <w:jc w:val="center"/>
-              <w:pPrChange w:id="24" w:author="francisco javier gonzalez  garcia" w:date="2026-09-22T22:06:00Z">
+              <w:pPrChange w:id="27" w:author="francisco javier gonzalez  garcia" w:date="2026-09-22T22:06:00Z">
                 <w:pPr>
                   <w:spacing w:before="20" w:after="20"/>
                 </w:pPr>
@@ -682,7 +649,7 @@
               <w:bottom w:val="single" w:sz="4" w:space="0" w:color="auto"/>
             </w:tcBorders>
             <w:shd w:val="clear" w:color="auto" w:fill="DDD9C3" w:themeFill="background2" w:themeFillShade="E6"/>
-            <w:tcPrChange w:id="25" w:author="francisco javier gonzalez  garcia" w:date="2026-09-22T22:06:00Z">
+            <w:tcPrChange w:id="28" w:author="francisco javier gonzalez  garcia" w:date="2026-09-22T22:06:00Z">
               <w:tcPr>
                 <w:tcW w:w="1020" w:type="dxa"/>
               </w:tcPr>
@@ -692,7 +659,7 @@
             <w:pPr>
               <w:spacing w:before="20" w:after="20"/>
               <w:jc w:val="center"/>
-              <w:pPrChange w:id="26" w:author="francisco javier gonzalez  garcia" w:date="2026-09-22T22:06:00Z">
+              <w:pPrChange w:id="29" w:author="francisco javier gonzalez  garcia" w:date="2026-09-22T22:06:00Z">
                 <w:pPr>
                   <w:spacing w:before="20" w:after="20"/>
                 </w:pPr>
@@ -714,7 +681,7 @@
               <w:bottom w:val="single" w:sz="4" w:space="0" w:color="auto"/>
             </w:tcBorders>
             <w:shd w:val="clear" w:color="auto" w:fill="DDD9C3" w:themeFill="background2" w:themeFillShade="E6"/>
-            <w:tcPrChange w:id="27" w:author="francisco javier gonzalez  garcia" w:date="2026-09-22T22:06:00Z">
+            <w:tcPrChange w:id="30" w:author="francisco javier gonzalez  garcia" w:date="2026-09-22T22:06:00Z">
               <w:tcPr>
                 <w:tcW w:w="1531" w:type="dxa"/>
               </w:tcPr>
@@ -724,7 +691,7 @@
             <w:pPr>
               <w:spacing w:before="20" w:after="20"/>
               <w:jc w:val="center"/>
-              <w:pPrChange w:id="28" w:author="francisco javier gonzalez  garcia" w:date="2026-09-22T22:06:00Z">
+              <w:pPrChange w:id="31" w:author="francisco javier gonzalez  garcia" w:date="2026-09-22T22:06:00Z">
                 <w:pPr>
                   <w:spacing w:before="20" w:after="20"/>
                 </w:pPr>
@@ -742,7 +709,7 @@
       </w:tr>
       <w:tr>
         <w:trPr>
-          <w:trPrChange w:id="29" w:author="francisco javier gonzalez  garcia" w:date="2026-09-22T22:06:00Z">
+          <w:trPrChange w:id="32" w:author="francisco javier gonzalez  garcia" w:date="2026-09-22T22:06:00Z">
             <w:trPr>
               <w:jc w:val="center"/>
             </w:trPr>
@@ -757,7 +724,7 @@
               <w:bottom w:val="single" w:sz="4" w:space="0" w:color="auto"/>
               <w:right w:val="single" w:sz="4" w:space="0" w:color="auto"/>
             </w:tcBorders>
-            <w:tcPrChange w:id="30" w:author="francisco javier gonzalez  garcia" w:date="2026-09-22T22:06:00Z">
+            <w:tcPrChange w:id="33" w:author="francisco javier gonzalez  garcia" w:date="2026-09-22T22:06:00Z">
               <w:tcPr>
                 <w:tcW w:w="1134" w:type="dxa"/>
               </w:tcPr>
@@ -791,7 +758,7 @@
               <w:bottom w:val="single" w:sz="4" w:space="0" w:color="auto"/>
               <w:right w:val="single" w:sz="4" w:space="0" w:color="auto"/>
             </w:tcBorders>
-            <w:tcPrChange w:id="31" w:author="francisco javier gonzalez  garcia" w:date="2026-09-22T22:06:00Z">
+            <w:tcPrChange w:id="34" w:author="francisco javier gonzalez  garcia" w:date="2026-09-22T22:06:00Z">
               <w:tcPr>
                 <w:tcW w:w="2551" w:type="dxa"/>
               </w:tcPr>
@@ -801,7 +768,7 @@
             <w:pPr>
               <w:spacing w:before="20" w:after="20"/>
               <w:rPr>
-                <w:ins w:id="32" w:author="francisco javier gonzalez  garcia" w:date="2026-09-22T22:27:00Z"/>
+                <w:ins w:id="35" w:author="francisco javier gonzalez  garcia" w:date="2026-09-22T22:27:00Z"/>
                 <w:sz w:val="16"/>
               </w:rPr>
             </w:pPr>
@@ -816,11 +783,11 @@
             <w:pPr>
               <w:spacing w:before="20" w:after="20"/>
             </w:pPr>
-            <w:ins w:id="33" w:author="francisco javier gonzalez  garcia" w:date="2026-09-22T22:27:00Z">
+            <w:ins w:id="36" w:author="francisco javier gonzalez  garcia" w:date="2026-09-22T22:27:00Z">
               <w:r>
                 <w:rPr>
                   <w:sz w:val="16"/>
-                  <w:rPrChange w:id="34" w:author="francisco javier gonzalez  garcia" w:date="2026-09-22T22:27:00Z">
+                  <w:rPrChange w:id="37" w:author="francisco javier gonzalez  garcia" w:date="2026-09-22T22:27:00Z">
                     <w:rPr/>
                   </w:rPrChange>
                 </w:rPr>
@@ -833,7 +800,7 @@
                 <w:t xml:space="preserve"> el esqueleto de</w:t>
               </w:r>
             </w:ins>
-            <w:ins w:id="35" w:author="francisco javier gonzalez  garcia" w:date="2026-09-22T22:28:00Z">
+            <w:ins w:id="38" w:author="francisco javier gonzalez  garcia" w:date="2026-09-22T22:28:00Z">
               <w:r>
                 <w:rPr>
                   <w:sz w:val="16"/>
@@ -841,7 +808,7 @@
                 <w:t xml:space="preserve"> su proyecto digital,… Se centra en el diseño y la ubicación del contenido, no en los</w:t>
               </w:r>
             </w:ins>
-            <w:ins w:id="36" w:author="francisco javier gonzalez  garcia" w:date="2026-09-22T22:29:00Z">
+            <w:ins w:id="39" w:author="francisco javier gonzalez  garcia" w:date="2026-09-22T22:29:00Z">
               <w:r>
                 <w:rPr>
                   <w:sz w:val="16"/>
@@ -849,18 +816,18 @@
                 <w:t xml:space="preserve"> colores, las fuentes o cualquier pulido visual</w:t>
               </w:r>
             </w:ins>
-            <w:ins w:id="37" w:author="francisco javier gonzalez  garcia" w:date="2026-09-22T22:27:00Z">
+            <w:ins w:id="40" w:author="francisco javier gonzalez  garcia" w:date="2026-09-22T22:27:00Z">
               <w:r>
                 <w:rPr>
                   <w:sz w:val="16"/>
-                  <w:rPrChange w:id="38" w:author="francisco javier gonzalez  garcia" w:date="2026-09-22T22:27:00Z">
+                  <w:rPrChange w:id="41" w:author="francisco javier gonzalez  garcia" w:date="2026-09-22T22:27:00Z">
                     <w:rPr/>
                   </w:rPrChange>
                 </w:rPr>
                 <w:t>”</w:t>
               </w:r>
             </w:ins>
-            <w:customXmlInsRangeStart w:id="39" w:author="francisco javier gonzalez  garcia" w:date="2026-09-22T22:31:00Z"/>
+            <w:customXmlInsRangeStart w:id="42" w:author="francisco javier gonzalez  garcia" w:date="2026-09-22T22:31:00Z"/>
             <w:sdt>
               <w:sdtPr>
                 <w:rPr>
@@ -869,9 +836,10 @@
                 <w:id w:val="1978257167"/>
                 <w:citation/>
               </w:sdtPr>
+              <w:sdtEndPr/>
               <w:sdtContent>
-                <w:customXmlInsRangeEnd w:id="39"/>
-                <w:ins w:id="40" w:author="francisco javier gonzalez  garcia" w:date="2026-09-22T22:31:00Z">
+                <w:customXmlInsRangeEnd w:id="42"/>
+                <w:ins w:id="43" w:author="francisco javier gonzalez  garcia" w:date="2026-09-22T22:31:00Z">
                   <w:r>
                     <w:rPr>
                       <w:sz w:val="16"/>
@@ -891,7 +859,7 @@
                   </w:rPr>
                   <w:fldChar w:fldCharType="separate"/>
                 </w:r>
-                <w:ins w:id="41" w:author="francisco javier gonzalez  garcia" w:date="2026-09-22T22:31:00Z">
+                <w:ins w:id="44" w:author="francisco javier gonzalez  garcia" w:date="2026-09-22T22:31:00Z">
                   <w:r>
                     <w:rPr>
                       <w:noProof/>
@@ -903,7 +871,7 @@
                     <w:rPr>
                       <w:noProof/>
                       <w:sz w:val="16"/>
-                      <w:rPrChange w:id="42" w:author="francisco javier gonzalez  garcia" w:date="2026-09-22T22:31:00Z">
+                      <w:rPrChange w:id="45" w:author="francisco javier gonzalez  garcia" w:date="2026-09-22T22:31:00Z">
                         <w:rPr/>
                       </w:rPrChange>
                     </w:rPr>
@@ -916,10 +884,10 @@
                     <w:fldChar w:fldCharType="end"/>
                   </w:r>
                 </w:ins>
-                <w:customXmlInsRangeStart w:id="43" w:author="francisco javier gonzalez  garcia" w:date="2026-09-22T22:31:00Z"/>
+                <w:customXmlInsRangeStart w:id="46" w:author="francisco javier gonzalez  garcia" w:date="2026-09-22T22:31:00Z"/>
               </w:sdtContent>
             </w:sdt>
-            <w:customXmlInsRangeEnd w:id="43"/>
+            <w:customXmlInsRangeEnd w:id="46"/>
           </w:p>
         </w:tc>
         <w:tc>
@@ -931,7 +899,7 @@
               <w:bottom w:val="single" w:sz="4" w:space="0" w:color="auto"/>
               <w:right w:val="single" w:sz="4" w:space="0" w:color="auto"/>
             </w:tcBorders>
-            <w:tcPrChange w:id="44" w:author="francisco javier gonzalez  garcia" w:date="2026-09-22T22:06:00Z">
+            <w:tcPrChange w:id="47" w:author="francisco javier gonzalez  garcia" w:date="2026-09-22T22:06:00Z">
               <w:tcPr>
                 <w:tcW w:w="2268" w:type="dxa"/>
               </w:tcPr>
@@ -958,7 +926,7 @@
               <w:bottom w:val="single" w:sz="4" w:space="0" w:color="auto"/>
               <w:right w:val="single" w:sz="4" w:space="0" w:color="auto"/>
             </w:tcBorders>
-            <w:tcPrChange w:id="45" w:author="francisco javier gonzalez  garcia" w:date="2026-09-22T22:06:00Z">
+            <w:tcPrChange w:id="48" w:author="francisco javier gonzalez  garcia" w:date="2026-09-22T22:06:00Z">
               <w:tcPr>
                 <w:tcW w:w="1020" w:type="dxa"/>
               </w:tcPr>
@@ -985,7 +953,7 @@
               <w:bottom w:val="single" w:sz="4" w:space="0" w:color="auto"/>
               <w:right w:val="single" w:sz="4" w:space="0" w:color="auto"/>
             </w:tcBorders>
-            <w:tcPrChange w:id="46" w:author="francisco javier gonzalez  garcia" w:date="2026-09-22T22:06:00Z">
+            <w:tcPrChange w:id="49" w:author="francisco javier gonzalez  garcia" w:date="2026-09-22T22:06:00Z">
               <w:tcPr>
                 <w:tcW w:w="1531" w:type="dxa"/>
               </w:tcPr>
@@ -1006,7 +974,7 @@
       </w:tr>
       <w:tr>
         <w:trPr>
-          <w:trPrChange w:id="47" w:author="francisco javier gonzalez  garcia" w:date="2026-09-22T22:06:00Z">
+          <w:trPrChange w:id="50" w:author="francisco javier gonzalez  garcia" w:date="2026-09-22T22:06:00Z">
             <w:trPr>
               <w:jc w:val="center"/>
             </w:trPr>
@@ -1021,7 +989,7 @@
               <w:bottom w:val="single" w:sz="4" w:space="0" w:color="auto"/>
               <w:right w:val="single" w:sz="4" w:space="0" w:color="auto"/>
             </w:tcBorders>
-            <w:tcPrChange w:id="48" w:author="francisco javier gonzalez  garcia" w:date="2026-09-22T22:06:00Z">
+            <w:tcPrChange w:id="51" w:author="francisco javier gonzalez  garcia" w:date="2026-09-22T22:06:00Z">
               <w:tcPr>
                 <w:tcW w:w="1134" w:type="dxa"/>
               </w:tcPr>
@@ -1055,7 +1023,7 @@
               <w:bottom w:val="single" w:sz="4" w:space="0" w:color="auto"/>
               <w:right w:val="single" w:sz="4" w:space="0" w:color="auto"/>
             </w:tcBorders>
-            <w:tcPrChange w:id="49" w:author="francisco javier gonzalez  garcia" w:date="2026-09-22T22:06:00Z">
+            <w:tcPrChange w:id="52" w:author="francisco javier gonzalez  garcia" w:date="2026-09-22T22:06:00Z">
               <w:tcPr>
                 <w:tcW w:w="2551" w:type="dxa"/>
               </w:tcPr>
@@ -1082,7 +1050,7 @@
               <w:bottom w:val="single" w:sz="4" w:space="0" w:color="auto"/>
               <w:right w:val="single" w:sz="4" w:space="0" w:color="auto"/>
             </w:tcBorders>
-            <w:tcPrChange w:id="50" w:author="francisco javier gonzalez  garcia" w:date="2026-09-22T22:06:00Z">
+            <w:tcPrChange w:id="53" w:author="francisco javier gonzalez  garcia" w:date="2026-09-22T22:06:00Z">
               <w:tcPr>
                 <w:tcW w:w="2268" w:type="dxa"/>
               </w:tcPr>
@@ -1109,7 +1077,7 @@
               <w:bottom w:val="single" w:sz="4" w:space="0" w:color="auto"/>
               <w:right w:val="single" w:sz="4" w:space="0" w:color="auto"/>
             </w:tcBorders>
-            <w:tcPrChange w:id="51" w:author="francisco javier gonzalez  garcia" w:date="2026-09-22T22:06:00Z">
+            <w:tcPrChange w:id="54" w:author="francisco javier gonzalez  garcia" w:date="2026-09-22T22:06:00Z">
               <w:tcPr>
                 <w:tcW w:w="1020" w:type="dxa"/>
               </w:tcPr>
@@ -1136,7 +1104,7 @@
               <w:bottom w:val="single" w:sz="4" w:space="0" w:color="auto"/>
               <w:right w:val="single" w:sz="4" w:space="0" w:color="auto"/>
             </w:tcBorders>
-            <w:tcPrChange w:id="52" w:author="francisco javier gonzalez  garcia" w:date="2026-09-22T22:06:00Z">
+            <w:tcPrChange w:id="55" w:author="francisco javier gonzalez  garcia" w:date="2026-09-22T22:06:00Z">
               <w:tcPr>
                 <w:tcW w:w="1531" w:type="dxa"/>
               </w:tcPr>
@@ -1157,7 +1125,7 @@
       </w:tr>
       <w:tr>
         <w:trPr>
-          <w:trPrChange w:id="53" w:author="francisco javier gonzalez  garcia" w:date="2026-09-22T22:06:00Z">
+          <w:trPrChange w:id="56" w:author="francisco javier gonzalez  garcia" w:date="2026-09-22T22:06:00Z">
             <w:trPr>
               <w:jc w:val="center"/>
             </w:trPr>
@@ -1172,7 +1140,7 @@
               <w:bottom w:val="single" w:sz="4" w:space="0" w:color="auto"/>
               <w:right w:val="single" w:sz="4" w:space="0" w:color="auto"/>
             </w:tcBorders>
-            <w:tcPrChange w:id="54" w:author="francisco javier gonzalez  garcia" w:date="2026-09-22T22:06:00Z">
+            <w:tcPrChange w:id="57" w:author="francisco javier gonzalez  garcia" w:date="2026-09-22T22:06:00Z">
               <w:tcPr>
                 <w:tcW w:w="1134" w:type="dxa"/>
               </w:tcPr>
@@ -1206,7 +1174,7 @@
               <w:bottom w:val="single" w:sz="4" w:space="0" w:color="auto"/>
               <w:right w:val="single" w:sz="4" w:space="0" w:color="auto"/>
             </w:tcBorders>
-            <w:tcPrChange w:id="55" w:author="francisco javier gonzalez  garcia" w:date="2026-09-22T22:06:00Z">
+            <w:tcPrChange w:id="58" w:author="francisco javier gonzalez  garcia" w:date="2026-09-22T22:06:00Z">
               <w:tcPr>
                 <w:tcW w:w="2551" w:type="dxa"/>
               </w:tcPr>
@@ -1233,7 +1201,7 @@
               <w:bottom w:val="single" w:sz="4" w:space="0" w:color="auto"/>
               <w:right w:val="single" w:sz="4" w:space="0" w:color="auto"/>
             </w:tcBorders>
-            <w:tcPrChange w:id="56" w:author="francisco javier gonzalez  garcia" w:date="2026-09-22T22:06:00Z">
+            <w:tcPrChange w:id="59" w:author="francisco javier gonzalez  garcia" w:date="2026-09-22T22:06:00Z">
               <w:tcPr>
                 <w:tcW w:w="2268" w:type="dxa"/>
               </w:tcPr>
@@ -1260,7 +1228,7 @@
               <w:bottom w:val="single" w:sz="4" w:space="0" w:color="auto"/>
               <w:right w:val="single" w:sz="4" w:space="0" w:color="auto"/>
             </w:tcBorders>
-            <w:tcPrChange w:id="57" w:author="francisco javier gonzalez  garcia" w:date="2026-09-22T22:06:00Z">
+            <w:tcPrChange w:id="60" w:author="francisco javier gonzalez  garcia" w:date="2026-09-22T22:06:00Z">
               <w:tcPr>
                 <w:tcW w:w="1020" w:type="dxa"/>
               </w:tcPr>
@@ -1287,7 +1255,7 @@
               <w:bottom w:val="single" w:sz="4" w:space="0" w:color="auto"/>
               <w:right w:val="single" w:sz="4" w:space="0" w:color="auto"/>
             </w:tcBorders>
-            <w:tcPrChange w:id="58" w:author="francisco javier gonzalez  garcia" w:date="2026-09-22T22:06:00Z">
+            <w:tcPrChange w:id="61" w:author="francisco javier gonzalez  garcia" w:date="2026-09-22T22:06:00Z">
               <w:tcPr>
                 <w:tcW w:w="1531" w:type="dxa"/>
               </w:tcPr>
@@ -1311,13 +1279,13 @@
     <w:p>
       <w:pPr>
         <w:pStyle w:val="Ttulo2"/>
-        <w:pPrChange w:id="59" w:author="francisco javier gonzalez  garcia" w:date="2026-09-22T22:09:00Z">
+        <w:pPrChange w:id="62" w:author="francisco javier gonzalez  garcia" w:date="2026-09-22T22:09:00Z">
           <w:pPr>
             <w:pStyle w:val="Ttulo1"/>
           </w:pPr>
         </w:pPrChange>
       </w:pPr>
-      <w:del w:id="60" w:author="francisco javier gonzalez  garcia" w:date="2026-09-22T22:07:00Z">
+      <w:del w:id="63" w:author="francisco javier gonzalez  garcia" w:date="2026-09-22T22:07:00Z">
         <w:r>
           <w:delText xml:space="preserve">2. </w:delText>
         </w:r>
@@ -1333,19 +1301,11 @@
       <w:pPr>
         <w:spacing w:after="40"/>
       </w:pPr>
-      <w:proofErr w:type="spellStart"/>
       <w:r>
         <w:rPr>
           <w:b/>
         </w:rPr>
-        <w:t>Wireframe</w:t>
-      </w:r>
-      <w:proofErr w:type="spellEnd"/>
-      <w:r>
-        <w:rPr>
-          <w:b/>
-        </w:rPr>
-        <w:t xml:space="preserve">: </w:t>
+        <w:t xml:space="preserve">Wireframe: </w:t>
       </w:r>
       <w:r>
         <w:t>+ Rapidez y bajo costo; foco en funcionalidad sin distracciones estéticas. - No transmite experiencia real; no sirve para validación emocional ni test con usuarios.</w:t>
@@ -1359,6 +1319,7 @@
         <w:rPr>
           <w:b/>
         </w:rPr>
+        <w:lastRenderedPageBreak/>
         <w:t xml:space="preserve">Mockup: </w:t>
       </w:r>
       <w:r>
@@ -1388,13 +1349,13 @@
     <w:p>
       <w:pPr>
         <w:pStyle w:val="Ttulo2"/>
-        <w:pPrChange w:id="61" w:author="francisco javier gonzalez  garcia" w:date="2026-09-22T22:09:00Z">
+        <w:pPrChange w:id="64" w:author="francisco javier gonzalez  garcia" w:date="2026-09-22T22:09:00Z">
           <w:pPr>
             <w:pStyle w:val="Ttulo1"/>
           </w:pPr>
         </w:pPrChange>
       </w:pPr>
-      <w:del w:id="62" w:author="francisco javier gonzalez  garcia" w:date="2026-09-22T22:08:00Z">
+      <w:del w:id="65" w:author="francisco javier gonzalez  garcia" w:date="2026-09-22T22:08:00Z">
         <w:r>
           <w:delText xml:space="preserve">3. </w:delText>
         </w:r>
@@ -1456,15 +1417,14 @@
     <w:p>
       <w:pPr>
         <w:pStyle w:val="Ttulo2"/>
-        <w:pPrChange w:id="63" w:author="francisco javier gonzalez  garcia" w:date="2026-09-22T22:09:00Z">
+        <w:pPrChange w:id="66" w:author="francisco javier gonzalez  garcia" w:date="2026-09-22T22:09:00Z">
           <w:pPr>
             <w:pStyle w:val="Ttulo1"/>
           </w:pPr>
         </w:pPrChange>
       </w:pPr>
-      <w:del w:id="64" w:author="francisco javier gonzalez  garcia" w:date="2026-09-22T22:09:00Z">
+      <w:del w:id="67" w:author="francisco javier gonzalez  garcia" w:date="2026-09-22T22:09:00Z">
         <w:r>
-          <w:lastRenderedPageBreak/>
           <w:delText xml:space="preserve">4. </w:delText>
         </w:r>
       </w:del>
@@ -1497,6 +1457,9 @@
     <w:p>
       <w:pPr>
         <w:spacing w:after="40"/>
+        <w:rPr>
+          <w:ins w:id="68" w:author="francisco javier gonzalez  garcia" w:date="2026-09-24T22:55:00Z"/>
+        </w:rPr>
       </w:pPr>
       <w:r>
         <w:rPr>
@@ -1509,16 +1472,2351 @@
       </w:r>
     </w:p>
     <w:p>
-      <w:r>
-        <w:br w:type="page"/>
-      </w:r>
+      <w:pPr>
+        <w:spacing w:after="40"/>
+        <w:rPr>
+          <w:del w:id="69" w:author="francisco javier gonzalez  garcia" w:date="2026-09-24T22:55:00Z"/>
+        </w:rPr>
+      </w:pPr>
     </w:p>
     <w:p>
       <w:pPr>
         <w:pStyle w:val="Ttulo1"/>
+        <w:rPr>
+          <w:ins w:id="70" w:author="francisco javier gonzalez  garcia" w:date="2026-09-24T21:55:00Z"/>
+        </w:rPr>
+      </w:pPr>
+      <w:ins w:id="71" w:author="francisco javier gonzalez  garcia" w:date="2026-09-24T21:52:00Z">
+        <w:r>
+          <w:t xml:space="preserve">Fase </w:t>
+        </w:r>
+        <w:r>
+          <w:t>2</w:t>
+        </w:r>
+        <w:r>
+          <w:t xml:space="preserve">. </w:t>
+        </w:r>
+      </w:ins>
+      <w:ins w:id="72" w:author="francisco javier gonzalez  garcia" w:date="2026-09-24T21:53:00Z">
+        <w:r>
+          <w:t>Definición del contexto UX</w:t>
+        </w:r>
+      </w:ins>
+    </w:p>
+    <w:p>
+      <w:pPr>
+        <w:pStyle w:val="Ttulo2"/>
+        <w:rPr>
+          <w:ins w:id="73" w:author="francisco javier gonzalez  garcia" w:date="2026-09-24T21:56:00Z"/>
+        </w:rPr>
+        <w:pPrChange w:id="74" w:author="francisco javier gonzalez  garcia" w:date="2026-09-24T22:40:00Z">
+          <w:pPr/>
+        </w:pPrChange>
+      </w:pPr>
+      <w:ins w:id="75" w:author="francisco javier gonzalez  garcia" w:date="2026-09-24T21:55:00Z">
+        <w:r>
+          <w:t>Personas</w:t>
+        </w:r>
+      </w:ins>
+    </w:p>
+    <w:tbl>
+      <w:tblPr>
+        <w:tblStyle w:val="Tablaconcuadrcula"/>
+        <w:tblW w:w="0" w:type="auto"/>
+        <w:tblLook w:val="04A0" w:firstRow="1" w:lastRow="0" w:firstColumn="1" w:lastColumn="0" w:noHBand="0" w:noVBand="1"/>
+        <w:tblPrChange w:id="76" w:author="francisco javier gonzalez  garcia" w:date="2026-09-24T22:55:00Z">
+          <w:tblPr>
+            <w:tblStyle w:val="Tablaconcuadrcula"/>
+            <w:tblW w:w="0" w:type="auto"/>
+            <w:tblLook w:val="04A0" w:firstRow="1" w:lastRow="0" w:firstColumn="1" w:lastColumn="0" w:noHBand="0" w:noVBand="1"/>
+          </w:tblPr>
+        </w:tblPrChange>
+      </w:tblPr>
+      <w:tblGrid>
+        <w:gridCol w:w="3166"/>
+        <w:gridCol w:w="3167"/>
+        <w:gridCol w:w="3167"/>
+        <w:tblGridChange w:id="77">
+          <w:tblGrid>
+            <w:gridCol w:w="3166"/>
+            <w:gridCol w:w="3167"/>
+            <w:gridCol w:w="3167"/>
+          </w:tblGrid>
+        </w:tblGridChange>
+      </w:tblGrid>
+      <w:tr>
+        <w:trPr>
+          <w:ins w:id="78" w:author="francisco javier gonzalez  garcia" w:date="2026-09-24T22:40:00Z"/>
+        </w:trPr>
+        <w:tc>
+          <w:tcPr>
+            <w:tcW w:w="3166" w:type="dxa"/>
+            <w:shd w:val="clear" w:color="auto" w:fill="DDD9C3" w:themeFill="background2" w:themeFillShade="E6"/>
+            <w:tcPrChange w:id="79" w:author="francisco javier gonzalez  garcia" w:date="2026-09-24T22:55:00Z">
+              <w:tcPr>
+                <w:tcW w:w="3166" w:type="dxa"/>
+              </w:tcPr>
+            </w:tcPrChange>
+          </w:tcPr>
+          <w:p>
+            <w:pPr>
+              <w:spacing w:line="40" w:lineRule="atLeast"/>
+              <w:rPr>
+                <w:ins w:id="80" w:author="francisco javier gonzalez  garcia" w:date="2026-09-24T22:40:00Z"/>
+                <w:b/>
+                <w:bCs/>
+                <w:sz w:val="16"/>
+                <w:szCs w:val="16"/>
+                <w:rPrChange w:id="81" w:author="francisco javier gonzalez  garcia" w:date="2026-09-24T22:42:00Z">
+                  <w:rPr>
+                    <w:ins w:id="82" w:author="francisco javier gonzalez  garcia" w:date="2026-09-24T22:40:00Z"/>
+                  </w:rPr>
+                </w:rPrChange>
+              </w:rPr>
+            </w:pPr>
+            <w:ins w:id="83" w:author="francisco javier gonzalez  garcia" w:date="2026-09-24T22:40:00Z">
+              <w:r>
+                <w:rPr>
+                  <w:b/>
+                  <w:bCs/>
+                  <w:sz w:val="16"/>
+                  <w:szCs w:val="16"/>
+                  <w:rPrChange w:id="84" w:author="francisco javier gonzalez  garcia" w:date="2026-09-24T22:42:00Z">
+                    <w:rPr/>
+                  </w:rPrChange>
+                </w:rPr>
+                <w:t>Arquetipo 1: USUARIO</w:t>
+              </w:r>
+            </w:ins>
+          </w:p>
+        </w:tc>
+        <w:tc>
+          <w:tcPr>
+            <w:tcW w:w="3167" w:type="dxa"/>
+            <w:shd w:val="clear" w:color="auto" w:fill="DDD9C3" w:themeFill="background2" w:themeFillShade="E6"/>
+            <w:tcPrChange w:id="85" w:author="francisco javier gonzalez  garcia" w:date="2026-09-24T22:55:00Z">
+              <w:tcPr>
+                <w:tcW w:w="3167" w:type="dxa"/>
+              </w:tcPr>
+            </w:tcPrChange>
+          </w:tcPr>
+          <w:p>
+            <w:pPr>
+              <w:spacing w:line="40" w:lineRule="atLeast"/>
+              <w:rPr>
+                <w:ins w:id="86" w:author="francisco javier gonzalez  garcia" w:date="2026-09-24T22:40:00Z"/>
+                <w:b/>
+                <w:bCs/>
+                <w:sz w:val="16"/>
+                <w:szCs w:val="16"/>
+                <w:rPrChange w:id="87" w:author="francisco javier gonzalez  garcia" w:date="2026-09-24T22:42:00Z">
+                  <w:rPr>
+                    <w:ins w:id="88" w:author="francisco javier gonzalez  garcia" w:date="2026-09-24T22:40:00Z"/>
+                  </w:rPr>
+                </w:rPrChange>
+              </w:rPr>
+            </w:pPr>
+            <w:ins w:id="89" w:author="francisco javier gonzalez  garcia" w:date="2026-09-24T22:42:00Z">
+              <w:r>
+                <w:rPr>
+                  <w:b/>
+                  <w:bCs/>
+                  <w:sz w:val="16"/>
+                  <w:szCs w:val="16"/>
+                  <w:rPrChange w:id="90" w:author="francisco javier gonzalez  garcia" w:date="2026-09-24T22:42:00Z">
+                    <w:rPr/>
+                  </w:rPrChange>
+                </w:rPr>
+                <w:t>Arquetipo 2: ENTRENADO</w:t>
+              </w:r>
+            </w:ins>
+          </w:p>
+        </w:tc>
+        <w:tc>
+          <w:tcPr>
+            <w:tcW w:w="3167" w:type="dxa"/>
+            <w:shd w:val="clear" w:color="auto" w:fill="DDD9C3" w:themeFill="background2" w:themeFillShade="E6"/>
+            <w:tcPrChange w:id="91" w:author="francisco javier gonzalez  garcia" w:date="2026-09-24T22:55:00Z">
+              <w:tcPr>
+                <w:tcW w:w="3167" w:type="dxa"/>
+              </w:tcPr>
+            </w:tcPrChange>
+          </w:tcPr>
+          <w:p>
+            <w:pPr>
+              <w:spacing w:line="40" w:lineRule="atLeast"/>
+              <w:rPr>
+                <w:ins w:id="92" w:author="francisco javier gonzalez  garcia" w:date="2026-09-24T22:40:00Z"/>
+                <w:b/>
+                <w:bCs/>
+                <w:sz w:val="16"/>
+                <w:szCs w:val="16"/>
+                <w:rPrChange w:id="93" w:author="francisco javier gonzalez  garcia" w:date="2026-09-24T22:42:00Z">
+                  <w:rPr>
+                    <w:ins w:id="94" w:author="francisco javier gonzalez  garcia" w:date="2026-09-24T22:40:00Z"/>
+                  </w:rPr>
+                </w:rPrChange>
+              </w:rPr>
+            </w:pPr>
+            <w:ins w:id="95" w:author="francisco javier gonzalez  garcia" w:date="2026-09-24T22:50:00Z">
+              <w:r>
+                <w:rPr>
+                  <w:b/>
+                  <w:bCs/>
+                  <w:sz w:val="16"/>
+                  <w:szCs w:val="16"/>
+                </w:rPr>
+                <w:t>Arquetipo 3: Encargado del  Gimnasio</w:t>
+              </w:r>
+            </w:ins>
+          </w:p>
+        </w:tc>
+      </w:tr>
+      <w:tr>
+        <w:trPr>
+          <w:trHeight w:val="5802"/>
+          <w:ins w:id="96" w:author="francisco javier gonzalez  garcia" w:date="2026-09-24T22:40:00Z"/>
+          <w:trPrChange w:id="97" w:author="francisco javier gonzalez  garcia" w:date="2026-09-24T22:41:00Z">
+            <w:trPr>
+              <w:trHeight w:val="16207"/>
+            </w:trPr>
+          </w:trPrChange>
+        </w:trPr>
+        <w:tc>
+          <w:tcPr>
+            <w:tcW w:w="3166" w:type="dxa"/>
+            <w:tcPrChange w:id="98" w:author="francisco javier gonzalez  garcia" w:date="2026-09-24T22:41:00Z">
+              <w:tcPr>
+                <w:tcW w:w="3166" w:type="dxa"/>
+              </w:tcPr>
+            </w:tcPrChange>
+          </w:tcPr>
+          <w:p>
+            <w:pPr>
+              <w:spacing w:line="40" w:lineRule="atLeast"/>
+              <w:rPr>
+                <w:ins w:id="99" w:author="francisco javier gonzalez  garcia" w:date="2026-09-24T22:41:00Z"/>
+                <w:sz w:val="16"/>
+                <w:szCs w:val="16"/>
+                <w:rPrChange w:id="100" w:author="francisco javier gonzalez  garcia" w:date="2026-09-24T22:42:00Z">
+                  <w:rPr>
+                    <w:ins w:id="101" w:author="francisco javier gonzalez  garcia" w:date="2026-09-24T22:41:00Z"/>
+                  </w:rPr>
+                </w:rPrChange>
+              </w:rPr>
+            </w:pPr>
+            <w:ins w:id="102" w:author="francisco javier gonzalez  garcia" w:date="2026-09-24T22:41:00Z">
+              <w:r>
+                <w:rPr>
+                  <w:sz w:val="16"/>
+                  <w:szCs w:val="16"/>
+                  <w:rPrChange w:id="103" w:author="francisco javier gonzalez  garcia" w:date="2026-09-24T22:42:00Z">
+                    <w:rPr/>
+                  </w:rPrChange>
+                </w:rPr>
+                <w:lastRenderedPageBreak/>
+                <w:t>Datos Demográficos y Perfil:</w:t>
+              </w:r>
+            </w:ins>
+          </w:p>
+          <w:p>
+            <w:pPr>
+              <w:spacing w:line="40" w:lineRule="atLeast"/>
+              <w:rPr>
+                <w:ins w:id="104" w:author="francisco javier gonzalez  garcia" w:date="2026-09-24T22:41:00Z"/>
+                <w:sz w:val="16"/>
+                <w:szCs w:val="16"/>
+                <w:rPrChange w:id="105" w:author="francisco javier gonzalez  garcia" w:date="2026-09-24T22:42:00Z">
+                  <w:rPr>
+                    <w:ins w:id="106" w:author="francisco javier gonzalez  garcia" w:date="2026-09-24T22:41:00Z"/>
+                  </w:rPr>
+                </w:rPrChange>
+              </w:rPr>
+            </w:pPr>
+            <w:ins w:id="107" w:author="francisco javier gonzalez  garcia" w:date="2026-09-24T22:41:00Z">
+              <w:r>
+                <w:rPr>
+                  <w:sz w:val="16"/>
+                  <w:szCs w:val="16"/>
+                  <w:rPrChange w:id="108" w:author="francisco javier gonzalez  garcia" w:date="2026-09-24T22:42:00Z">
+                    <w:rPr/>
+                  </w:rPrChange>
+                </w:rPr>
+                <w:t>Nombre ficticio: Valeria Mendoza</w:t>
+              </w:r>
+            </w:ins>
+          </w:p>
+          <w:p>
+            <w:pPr>
+              <w:spacing w:line="40" w:lineRule="atLeast"/>
+              <w:rPr>
+                <w:ins w:id="109" w:author="francisco javier gonzalez  garcia" w:date="2026-09-24T22:41:00Z"/>
+                <w:sz w:val="16"/>
+                <w:szCs w:val="16"/>
+                <w:rPrChange w:id="110" w:author="francisco javier gonzalez  garcia" w:date="2026-09-24T22:42:00Z">
+                  <w:rPr>
+                    <w:ins w:id="111" w:author="francisco javier gonzalez  garcia" w:date="2026-09-24T22:41:00Z"/>
+                  </w:rPr>
+                </w:rPrChange>
+              </w:rPr>
+            </w:pPr>
+            <w:ins w:id="112" w:author="francisco javier gonzalez  garcia" w:date="2026-09-24T22:41:00Z">
+              <w:r>
+                <w:rPr>
+                  <w:sz w:val="16"/>
+                  <w:szCs w:val="16"/>
+                  <w:rPrChange w:id="113" w:author="francisco javier gonzalez  garcia" w:date="2026-09-24T22:42:00Z">
+                    <w:rPr/>
+                  </w:rPrChange>
+                </w:rPr>
+                <w:t>Edad: 25 años</w:t>
+              </w:r>
+            </w:ins>
+          </w:p>
+          <w:p>
+            <w:pPr>
+              <w:spacing w:line="40" w:lineRule="atLeast"/>
+              <w:rPr>
+                <w:ins w:id="114" w:author="francisco javier gonzalez  garcia" w:date="2026-09-24T22:41:00Z"/>
+                <w:sz w:val="16"/>
+                <w:szCs w:val="16"/>
+                <w:rPrChange w:id="115" w:author="francisco javier gonzalez  garcia" w:date="2026-09-24T22:42:00Z">
+                  <w:rPr>
+                    <w:ins w:id="116" w:author="francisco javier gonzalez  garcia" w:date="2026-09-24T22:41:00Z"/>
+                  </w:rPr>
+                </w:rPrChange>
+              </w:rPr>
+            </w:pPr>
+            <w:ins w:id="117" w:author="francisco javier gonzalez  garcia" w:date="2026-09-24T22:41:00Z">
+              <w:r>
+                <w:rPr>
+                  <w:sz w:val="16"/>
+                  <w:szCs w:val="16"/>
+                  <w:rPrChange w:id="118" w:author="francisco javier gonzalez  garcia" w:date="2026-09-24T22:42:00Z">
+                    <w:rPr/>
+                  </w:rPrChange>
+                </w:rPr>
+                <w:t>Rol: Usuario del Gimnasio</w:t>
+              </w:r>
+            </w:ins>
+          </w:p>
+          <w:p>
+            <w:pPr>
+              <w:spacing w:line="40" w:lineRule="atLeast"/>
+              <w:rPr>
+                <w:ins w:id="119" w:author="francisco javier gonzalez  garcia" w:date="2026-09-24T22:41:00Z"/>
+                <w:sz w:val="16"/>
+                <w:szCs w:val="16"/>
+                <w:rPrChange w:id="120" w:author="francisco javier gonzalez  garcia" w:date="2026-09-24T22:42:00Z">
+                  <w:rPr>
+                    <w:ins w:id="121" w:author="francisco javier gonzalez  garcia" w:date="2026-09-24T22:41:00Z"/>
+                  </w:rPr>
+                </w:rPrChange>
+              </w:rPr>
+            </w:pPr>
+            <w:ins w:id="122" w:author="francisco javier gonzalez  garcia" w:date="2026-09-24T22:41:00Z">
+              <w:r>
+                <w:rPr>
+                  <w:sz w:val="16"/>
+                  <w:szCs w:val="16"/>
+                  <w:rPrChange w:id="123" w:author="francisco javier gonzalez  garcia" w:date="2026-09-24T22:42:00Z">
+                    <w:rPr/>
+                  </w:rPrChange>
+                </w:rPr>
+                <w:t xml:space="preserve">Nivel tecnológico: Alto / Experto; utilizas aplicaciones diariamente, manejas múltiples dispositivos inteligentes (smartwatch, smartphone) y </w:t>
+              </w:r>
+            </w:ins>
+            <w:ins w:id="124" w:author="francisco javier gonzalez  garcia" w:date="2026-09-24T22:58:00Z">
+              <w:r>
+                <w:rPr>
+                  <w:sz w:val="16"/>
+                  <w:szCs w:val="16"/>
+                </w:rPr>
+                <w:t>s</w:t>
+              </w:r>
+            </w:ins>
+            <w:ins w:id="125" w:author="francisco javier gonzalez  garcia" w:date="2026-09-24T22:41:00Z">
+              <w:r>
+                <w:rPr>
+                  <w:sz w:val="16"/>
+                  <w:szCs w:val="16"/>
+                  <w:rPrChange w:id="126" w:author="francisco javier gonzalez  garcia" w:date="2026-09-24T22:42:00Z">
+                    <w:rPr/>
+                  </w:rPrChange>
+                </w:rPr>
+                <w:t>e adaptas de inmediato a nuevas interfaces.</w:t>
+              </w:r>
+            </w:ins>
+          </w:p>
+          <w:p>
+            <w:pPr>
+              <w:spacing w:line="40" w:lineRule="atLeast"/>
+              <w:rPr>
+                <w:ins w:id="127" w:author="francisco javier gonzalez  garcia" w:date="2026-09-24T22:41:00Z"/>
+                <w:sz w:val="16"/>
+                <w:szCs w:val="16"/>
+                <w:rPrChange w:id="128" w:author="francisco javier gonzalez  garcia" w:date="2026-09-24T22:42:00Z">
+                  <w:rPr>
+                    <w:ins w:id="129" w:author="francisco javier gonzalez  garcia" w:date="2026-09-24T22:41:00Z"/>
+                  </w:rPr>
+                </w:rPrChange>
+              </w:rPr>
+            </w:pPr>
+            <w:ins w:id="130" w:author="francisco javier gonzalez  garcia" w:date="2026-09-24T22:41:00Z">
+              <w:r>
+                <w:rPr>
+                  <w:sz w:val="16"/>
+                  <w:szCs w:val="16"/>
+                  <w:rPrChange w:id="131" w:author="francisco javier gonzalez  garcia" w:date="2026-09-24T22:42:00Z">
+                    <w:rPr/>
+                  </w:rPrChange>
+                </w:rPr>
+                <w:t xml:space="preserve">Objetivo principal: </w:t>
+              </w:r>
+            </w:ins>
+          </w:p>
+          <w:p>
+            <w:pPr>
+              <w:pStyle w:val="Prrafodelista"/>
+              <w:numPr>
+                <w:ilvl w:val="0"/>
+                <w:numId w:val="16"/>
+              </w:numPr>
+              <w:spacing w:line="40" w:lineRule="atLeast"/>
+              <w:ind w:left="142" w:hanging="142"/>
+              <w:rPr>
+                <w:ins w:id="132" w:author="francisco javier gonzalez  garcia" w:date="2026-09-24T22:41:00Z"/>
+                <w:sz w:val="16"/>
+                <w:szCs w:val="16"/>
+                <w:rPrChange w:id="133" w:author="francisco javier gonzalez  garcia" w:date="2026-09-24T22:42:00Z">
+                  <w:rPr>
+                    <w:ins w:id="134" w:author="francisco javier gonzalez  garcia" w:date="2026-09-24T22:41:00Z"/>
+                  </w:rPr>
+                </w:rPrChange>
+              </w:rPr>
+              <w:pPrChange w:id="135" w:author="francisco javier gonzalez  garcia" w:date="2026-09-24T22:47:00Z">
+                <w:pPr>
+                  <w:pStyle w:val="Prrafodelista"/>
+                  <w:numPr>
+                    <w:numId w:val="11"/>
+                  </w:numPr>
+                  <w:spacing w:line="40" w:lineRule="atLeast"/>
+                  <w:ind w:left="360" w:hanging="360"/>
+                </w:pPr>
+              </w:pPrChange>
+            </w:pPr>
+            <w:ins w:id="136" w:author="francisco javier gonzalez  garcia" w:date="2026-09-24T22:41:00Z">
+              <w:r>
+                <w:rPr>
+                  <w:sz w:val="16"/>
+                  <w:szCs w:val="16"/>
+                  <w:rPrChange w:id="137" w:author="francisco javier gonzalez  garcia" w:date="2026-09-24T22:42:00Z">
+                    <w:rPr/>
+                  </w:rPrChange>
+                </w:rPr>
+                <w:t>Usar su tiempo libre para mantener tonificados sus músculos, canalizar el estrés del trabajo e integrar el ejercicio como un hábito diario constante.</w:t>
+              </w:r>
+            </w:ins>
+          </w:p>
+          <w:p>
+            <w:pPr>
+              <w:spacing w:line="40" w:lineRule="atLeast"/>
+              <w:rPr>
+                <w:ins w:id="138" w:author="francisco javier gonzalez  garcia" w:date="2026-09-24T22:41:00Z"/>
+                <w:sz w:val="16"/>
+                <w:szCs w:val="16"/>
+                <w:rPrChange w:id="139" w:author="francisco javier gonzalez  garcia" w:date="2026-09-24T22:42:00Z">
+                  <w:rPr>
+                    <w:ins w:id="140" w:author="francisco javier gonzalez  garcia" w:date="2026-09-24T22:41:00Z"/>
+                  </w:rPr>
+                </w:rPrChange>
+              </w:rPr>
+            </w:pPr>
+            <w:ins w:id="141" w:author="francisco javier gonzalez  garcia" w:date="2026-09-24T22:41:00Z">
+              <w:r>
+                <w:rPr>
+                  <w:sz w:val="16"/>
+                  <w:szCs w:val="16"/>
+                  <w:rPrChange w:id="142" w:author="francisco javier gonzalez  garcia" w:date="2026-09-24T22:42:00Z">
+                    <w:rPr/>
+                  </w:rPrChange>
+                </w:rPr>
+                <w:t xml:space="preserve">Frustraciones: </w:t>
+              </w:r>
+            </w:ins>
+          </w:p>
+          <w:p>
+            <w:pPr>
+              <w:pStyle w:val="Prrafodelista"/>
+              <w:numPr>
+                <w:ilvl w:val="0"/>
+                <w:numId w:val="10"/>
+              </w:numPr>
+              <w:spacing w:line="40" w:lineRule="atLeast"/>
+              <w:ind w:left="142" w:hanging="142"/>
+              <w:rPr>
+                <w:ins w:id="143" w:author="francisco javier gonzalez  garcia" w:date="2026-09-24T22:41:00Z"/>
+                <w:sz w:val="16"/>
+                <w:szCs w:val="16"/>
+                <w:rPrChange w:id="144" w:author="francisco javier gonzalez  garcia" w:date="2026-09-24T22:42:00Z">
+                  <w:rPr>
+                    <w:ins w:id="145" w:author="francisco javier gonzalez  garcia" w:date="2026-09-24T22:41:00Z"/>
+                  </w:rPr>
+                </w:rPrChange>
+              </w:rPr>
+              <w:pPrChange w:id="146" w:author="francisco javier gonzalez  garcia" w:date="2026-09-24T22:46:00Z">
+                <w:pPr>
+                  <w:pStyle w:val="Prrafodelista"/>
+                  <w:numPr>
+                    <w:numId w:val="10"/>
+                  </w:numPr>
+                  <w:spacing w:line="40" w:lineRule="atLeast"/>
+                  <w:ind w:left="360" w:hanging="360"/>
+                </w:pPr>
+              </w:pPrChange>
+            </w:pPr>
+            <w:ins w:id="147" w:author="francisco javier gonzalez  garcia" w:date="2026-09-24T22:41:00Z">
+              <w:r>
+                <w:rPr>
+                  <w:sz w:val="16"/>
+                  <w:szCs w:val="16"/>
+                  <w:rPrChange w:id="148" w:author="francisco javier gonzalez  garcia" w:date="2026-09-24T22:42:00Z">
+                    <w:rPr/>
+                  </w:rPrChange>
+                </w:rPr>
+                <w:t>No optimizar su tiempo cuando el gimnasio está lleno.</w:t>
+              </w:r>
+            </w:ins>
+          </w:p>
+          <w:p>
+            <w:pPr>
+              <w:pStyle w:val="Prrafodelista"/>
+              <w:numPr>
+                <w:ilvl w:val="0"/>
+                <w:numId w:val="10"/>
+              </w:numPr>
+              <w:spacing w:line="40" w:lineRule="atLeast"/>
+              <w:ind w:left="142" w:hanging="142"/>
+              <w:rPr>
+                <w:ins w:id="149" w:author="francisco javier gonzalez  garcia" w:date="2026-09-24T22:41:00Z"/>
+                <w:sz w:val="16"/>
+                <w:szCs w:val="16"/>
+                <w:rPrChange w:id="150" w:author="francisco javier gonzalez  garcia" w:date="2026-09-24T22:45:00Z">
+                  <w:rPr>
+                    <w:ins w:id="151" w:author="francisco javier gonzalez  garcia" w:date="2026-09-24T22:41:00Z"/>
+                  </w:rPr>
+                </w:rPrChange>
+              </w:rPr>
+              <w:pPrChange w:id="152" w:author="francisco javier gonzalez  garcia" w:date="2026-09-24T22:45:00Z">
+                <w:pPr>
+                  <w:pStyle w:val="Prrafodelista"/>
+                  <w:numPr>
+                    <w:numId w:val="10"/>
+                  </w:numPr>
+                  <w:spacing w:line="40" w:lineRule="atLeast"/>
+                  <w:ind w:left="360" w:hanging="360"/>
+                </w:pPr>
+              </w:pPrChange>
+            </w:pPr>
+            <w:ins w:id="153" w:author="francisco javier gonzalez  garcia" w:date="2026-09-24T22:41:00Z">
+              <w:r>
+                <w:rPr>
+                  <w:sz w:val="16"/>
+                  <w:szCs w:val="16"/>
+                  <w:rPrChange w:id="154" w:author="francisco javier gonzalez  garcia" w:date="2026-09-24T22:45:00Z">
+                    <w:rPr/>
+                  </w:rPrChange>
+                </w:rPr>
+                <w:t>Perder la continuidad por horarios laborales imprevistos y la falta de rutinas personalizadas que se adapten a su ritmo.</w:t>
+              </w:r>
+            </w:ins>
+          </w:p>
+          <w:p>
+            <w:pPr>
+              <w:spacing w:line="40" w:lineRule="atLeast"/>
+              <w:rPr>
+                <w:ins w:id="155" w:author="francisco javier gonzalez  garcia" w:date="2026-09-24T22:41:00Z"/>
+                <w:sz w:val="16"/>
+                <w:szCs w:val="16"/>
+                <w:rPrChange w:id="156" w:author="francisco javier gonzalez  garcia" w:date="2026-09-24T22:42:00Z">
+                  <w:rPr>
+                    <w:ins w:id="157" w:author="francisco javier gonzalez  garcia" w:date="2026-09-24T22:41:00Z"/>
+                  </w:rPr>
+                </w:rPrChange>
+              </w:rPr>
+            </w:pPr>
+            <w:ins w:id="158" w:author="francisco javier gonzalez  garcia" w:date="2026-09-24T22:41:00Z">
+              <w:r>
+                <w:rPr>
+                  <w:sz w:val="16"/>
+                  <w:szCs w:val="16"/>
+                  <w:rPrChange w:id="159" w:author="francisco javier gonzalez  garcia" w:date="2026-09-24T22:42:00Z">
+                    <w:rPr/>
+                  </w:rPrChange>
+                </w:rPr>
+                <w:t xml:space="preserve">Necesidades digitales: </w:t>
+              </w:r>
+            </w:ins>
+          </w:p>
+          <w:p>
+            <w:pPr>
+              <w:pStyle w:val="Prrafodelista"/>
+              <w:numPr>
+                <w:ilvl w:val="0"/>
+                <w:numId w:val="12"/>
+              </w:numPr>
+              <w:spacing w:line="40" w:lineRule="atLeast"/>
+              <w:ind w:left="142" w:hanging="142"/>
+              <w:rPr>
+                <w:ins w:id="160" w:author="francisco javier gonzalez  garcia" w:date="2026-09-24T22:41:00Z"/>
+                <w:sz w:val="16"/>
+                <w:szCs w:val="16"/>
+                <w:rPrChange w:id="161" w:author="francisco javier gonzalez  garcia" w:date="2026-09-24T22:42:00Z">
+                  <w:rPr>
+                    <w:ins w:id="162" w:author="francisco javier gonzalez  garcia" w:date="2026-09-24T22:41:00Z"/>
+                  </w:rPr>
+                </w:rPrChange>
+              </w:rPr>
+              <w:pPrChange w:id="163" w:author="francisco javier gonzalez  garcia" w:date="2026-09-24T22:47:00Z">
+                <w:pPr>
+                  <w:pStyle w:val="Prrafodelista"/>
+                  <w:numPr>
+                    <w:numId w:val="12"/>
+                  </w:numPr>
+                  <w:spacing w:line="40" w:lineRule="atLeast"/>
+                  <w:ind w:left="360" w:hanging="360"/>
+                </w:pPr>
+              </w:pPrChange>
+            </w:pPr>
+            <w:ins w:id="164" w:author="francisco javier gonzalez  garcia" w:date="2026-09-24T22:41:00Z">
+              <w:r>
+                <w:rPr>
+                  <w:sz w:val="16"/>
+                  <w:szCs w:val="16"/>
+                  <w:rPrChange w:id="165" w:author="francisco javier gonzalez  garcia" w:date="2026-09-24T22:42:00Z">
+                    <w:rPr/>
+                  </w:rPrChange>
+                </w:rPr>
+                <w:t>Selección de rutinas por nivel de dificultad.</w:t>
+              </w:r>
+            </w:ins>
+          </w:p>
+          <w:p>
+            <w:pPr>
+              <w:pStyle w:val="Prrafodelista"/>
+              <w:numPr>
+                <w:ilvl w:val="0"/>
+                <w:numId w:val="12"/>
+              </w:numPr>
+              <w:spacing w:line="40" w:lineRule="atLeast"/>
+              <w:ind w:left="142" w:hanging="142"/>
+              <w:rPr>
+                <w:ins w:id="166" w:author="francisco javier gonzalez  garcia" w:date="2026-09-24T22:41:00Z"/>
+                <w:sz w:val="16"/>
+                <w:szCs w:val="16"/>
+                <w:rPrChange w:id="167" w:author="francisco javier gonzalez  garcia" w:date="2026-09-24T22:42:00Z">
+                  <w:rPr>
+                    <w:ins w:id="168" w:author="francisco javier gonzalez  garcia" w:date="2026-09-24T22:41:00Z"/>
+                  </w:rPr>
+                </w:rPrChange>
+              </w:rPr>
+              <w:pPrChange w:id="169" w:author="francisco javier gonzalez  garcia" w:date="2026-09-24T22:47:00Z">
+                <w:pPr>
+                  <w:pStyle w:val="Prrafodelista"/>
+                  <w:numPr>
+                    <w:numId w:val="12"/>
+                  </w:numPr>
+                  <w:spacing w:line="40" w:lineRule="atLeast"/>
+                  <w:ind w:left="360" w:hanging="360"/>
+                </w:pPr>
+              </w:pPrChange>
+            </w:pPr>
+            <w:ins w:id="170" w:author="francisco javier gonzalez  garcia" w:date="2026-09-24T22:41:00Z">
+              <w:r>
+                <w:rPr>
+                  <w:sz w:val="16"/>
+                  <w:szCs w:val="16"/>
+                  <w:rPrChange w:id="171" w:author="francisco javier gonzalez  garcia" w:date="2026-09-24T22:42:00Z">
+                    <w:rPr/>
+                  </w:rPrChange>
+                </w:rPr>
+                <w:t>Notificaciones inteligentes y flexibles con recordatorios de entrenamiento.</w:t>
+              </w:r>
+            </w:ins>
+          </w:p>
+          <w:p>
+            <w:pPr>
+              <w:pStyle w:val="Prrafodelista"/>
+              <w:numPr>
+                <w:ilvl w:val="0"/>
+                <w:numId w:val="12"/>
+              </w:numPr>
+              <w:spacing w:line="40" w:lineRule="atLeast"/>
+              <w:ind w:left="142" w:hanging="142"/>
+              <w:rPr>
+                <w:ins w:id="172" w:author="francisco javier gonzalez  garcia" w:date="2026-09-24T22:41:00Z"/>
+                <w:sz w:val="16"/>
+                <w:szCs w:val="16"/>
+                <w:rPrChange w:id="173" w:author="francisco javier gonzalez  garcia" w:date="2026-09-24T22:42:00Z">
+                  <w:rPr>
+                    <w:ins w:id="174" w:author="francisco javier gonzalez  garcia" w:date="2026-09-24T22:41:00Z"/>
+                  </w:rPr>
+                </w:rPrChange>
+              </w:rPr>
+              <w:pPrChange w:id="175" w:author="francisco javier gonzalez  garcia" w:date="2026-09-24T22:47:00Z">
+                <w:pPr>
+                  <w:pStyle w:val="Prrafodelista"/>
+                  <w:numPr>
+                    <w:numId w:val="12"/>
+                  </w:numPr>
+                  <w:spacing w:line="40" w:lineRule="atLeast"/>
+                  <w:ind w:left="360" w:hanging="360"/>
+                </w:pPr>
+              </w:pPrChange>
+            </w:pPr>
+            <w:ins w:id="176" w:author="francisco javier gonzalez  garcia" w:date="2026-09-24T22:41:00Z">
+              <w:r>
+                <w:rPr>
+                  <w:sz w:val="16"/>
+                  <w:szCs w:val="16"/>
+                  <w:rPrChange w:id="177" w:author="francisco javier gonzalez  garcia" w:date="2026-09-24T22:42:00Z">
+                    <w:rPr/>
+                  </w:rPrChange>
+                </w:rPr>
+                <w:t>Métricas visuales para dar seguimiento rápido a tu progreso semanal.</w:t>
+              </w:r>
+            </w:ins>
+          </w:p>
+          <w:p>
+            <w:pPr>
+              <w:pStyle w:val="Prrafodelista"/>
+              <w:numPr>
+                <w:ilvl w:val="0"/>
+                <w:numId w:val="12"/>
+              </w:numPr>
+              <w:spacing w:line="40" w:lineRule="atLeast"/>
+              <w:ind w:left="142" w:hanging="142"/>
+              <w:rPr>
+                <w:ins w:id="178" w:author="francisco javier gonzalez  garcia" w:date="2026-09-24T22:41:00Z"/>
+                <w:sz w:val="16"/>
+                <w:szCs w:val="16"/>
+                <w:rPrChange w:id="179" w:author="francisco javier gonzalez  garcia" w:date="2026-09-24T22:42:00Z">
+                  <w:rPr>
+                    <w:ins w:id="180" w:author="francisco javier gonzalez  garcia" w:date="2026-09-24T22:41:00Z"/>
+                  </w:rPr>
+                </w:rPrChange>
+              </w:rPr>
+              <w:pPrChange w:id="181" w:author="francisco javier gonzalez  garcia" w:date="2026-09-24T22:47:00Z">
+                <w:pPr>
+                  <w:pStyle w:val="Prrafodelista"/>
+                  <w:numPr>
+                    <w:numId w:val="12"/>
+                  </w:numPr>
+                  <w:spacing w:line="40" w:lineRule="atLeast"/>
+                  <w:ind w:left="360" w:hanging="360"/>
+                </w:pPr>
+              </w:pPrChange>
+            </w:pPr>
+            <w:ins w:id="182" w:author="francisco javier gonzalez  garcia" w:date="2026-09-24T22:41:00Z">
+              <w:r>
+                <w:rPr>
+                  <w:sz w:val="16"/>
+                  <w:szCs w:val="16"/>
+                  <w:rPrChange w:id="183" w:author="francisco javier gonzalez  garcia" w:date="2026-09-24T22:42:00Z">
+                    <w:rPr/>
+                  </w:rPrChange>
+                </w:rPr>
+                <w:t>Calendario y agenda centralizada: Visibilidad clara de sus clases presenciales/online, estado de asistencia y cupos disponibles.</w:t>
+              </w:r>
+            </w:ins>
+          </w:p>
+          <w:p>
+            <w:pPr>
+              <w:pStyle w:val="Prrafodelista"/>
+              <w:numPr>
+                <w:ilvl w:val="0"/>
+                <w:numId w:val="12"/>
+              </w:numPr>
+              <w:spacing w:line="40" w:lineRule="atLeast"/>
+              <w:ind w:left="142" w:hanging="142"/>
+              <w:rPr>
+                <w:ins w:id="184" w:author="francisco javier gonzalez  garcia" w:date="2026-09-24T22:41:00Z"/>
+                <w:sz w:val="16"/>
+                <w:szCs w:val="16"/>
+                <w:rPrChange w:id="185" w:author="francisco javier gonzalez  garcia" w:date="2026-09-24T22:42:00Z">
+                  <w:rPr>
+                    <w:ins w:id="186" w:author="francisco javier gonzalez  garcia" w:date="2026-09-24T22:41:00Z"/>
+                  </w:rPr>
+                </w:rPrChange>
+              </w:rPr>
+              <w:pPrChange w:id="187" w:author="francisco javier gonzalez  garcia" w:date="2026-09-24T22:47:00Z">
+                <w:pPr>
+                  <w:pStyle w:val="Prrafodelista"/>
+                  <w:numPr>
+                    <w:numId w:val="12"/>
+                  </w:numPr>
+                  <w:spacing w:line="40" w:lineRule="atLeast"/>
+                  <w:ind w:left="360" w:hanging="360"/>
+                </w:pPr>
+              </w:pPrChange>
+            </w:pPr>
+            <w:ins w:id="188" w:author="francisco javier gonzalez  garcia" w:date="2026-09-24T22:41:00Z">
+              <w:r>
+                <w:rPr>
+                  <w:sz w:val="16"/>
+                  <w:szCs w:val="16"/>
+                  <w:rPrChange w:id="189" w:author="francisco javier gonzalez  garcia" w:date="2026-09-24T22:42:00Z">
+                    <w:rPr/>
+                  </w:rPrChange>
+                </w:rPr>
+                <w:t>Progreso del usuario: Visualización gráfica del rendimiento y evolución</w:t>
+              </w:r>
+            </w:ins>
+          </w:p>
+          <w:p>
+            <w:pPr>
+              <w:spacing w:line="40" w:lineRule="atLeast"/>
+              <w:rPr>
+                <w:ins w:id="190" w:author="francisco javier gonzalez  garcia" w:date="2026-09-24T22:41:00Z"/>
+                <w:sz w:val="16"/>
+                <w:szCs w:val="16"/>
+                <w:rPrChange w:id="191" w:author="francisco javier gonzalez  garcia" w:date="2026-09-24T22:42:00Z">
+                  <w:rPr>
+                    <w:ins w:id="192" w:author="francisco javier gonzalez  garcia" w:date="2026-09-24T22:41:00Z"/>
+                  </w:rPr>
+                </w:rPrChange>
+              </w:rPr>
+            </w:pPr>
+            <w:ins w:id="193" w:author="francisco javier gonzalez  garcia" w:date="2026-09-24T22:41:00Z">
+              <w:r>
+                <w:rPr>
+                  <w:sz w:val="16"/>
+                  <w:szCs w:val="16"/>
+                  <w:rPrChange w:id="194" w:author="francisco javier gonzalez  garcia" w:date="2026-09-24T22:42:00Z">
+                    <w:rPr/>
+                  </w:rPrChange>
+                </w:rPr>
+                <w:t>Motivación de uso: Organizar mejor su tiempo y medir tus avances en tiempo real y mantenerte motivada sin romper tu rutina personal.</w:t>
+              </w:r>
+            </w:ins>
+          </w:p>
+          <w:p>
+            <w:pPr>
+              <w:spacing w:line="40" w:lineRule="atLeast"/>
+              <w:rPr>
+                <w:ins w:id="195" w:author="francisco javier gonzalez  garcia" w:date="2026-09-24T22:40:00Z"/>
+              </w:rPr>
+            </w:pPr>
+          </w:p>
+        </w:tc>
+        <w:tc>
+          <w:tcPr>
+            <w:tcW w:w="3167" w:type="dxa"/>
+            <w:tcPrChange w:id="196" w:author="francisco javier gonzalez  garcia" w:date="2026-09-24T22:41:00Z">
+              <w:tcPr>
+                <w:tcW w:w="3167" w:type="dxa"/>
+              </w:tcPr>
+            </w:tcPrChange>
+          </w:tcPr>
+          <w:p>
+            <w:pPr>
+              <w:spacing w:line="40" w:lineRule="atLeast"/>
+              <w:rPr>
+                <w:ins w:id="197" w:author="francisco javier gonzalez  garcia" w:date="2026-09-24T22:43:00Z"/>
+                <w:sz w:val="16"/>
+                <w:szCs w:val="16"/>
+                <w:rPrChange w:id="198" w:author="francisco javier gonzalez  garcia" w:date="2026-09-24T22:44:00Z">
+                  <w:rPr>
+                    <w:ins w:id="199" w:author="francisco javier gonzalez  garcia" w:date="2026-09-24T22:43:00Z"/>
+                  </w:rPr>
+                </w:rPrChange>
+              </w:rPr>
+            </w:pPr>
+            <w:ins w:id="200" w:author="francisco javier gonzalez  garcia" w:date="2026-09-24T22:43:00Z">
+              <w:r>
+                <w:rPr>
+                  <w:sz w:val="16"/>
+                  <w:szCs w:val="16"/>
+                  <w:rPrChange w:id="201" w:author="francisco javier gonzalez  garcia" w:date="2026-09-24T22:44:00Z">
+                    <w:rPr/>
+                  </w:rPrChange>
+                </w:rPr>
+                <w:t>Datos Demográficos y Perfil</w:t>
+              </w:r>
+            </w:ins>
+          </w:p>
+          <w:p>
+            <w:pPr>
+              <w:spacing w:line="40" w:lineRule="atLeast"/>
+              <w:rPr>
+                <w:ins w:id="202" w:author="francisco javier gonzalez  garcia" w:date="2026-09-24T22:43:00Z"/>
+                <w:sz w:val="16"/>
+                <w:szCs w:val="16"/>
+                <w:rPrChange w:id="203" w:author="francisco javier gonzalez  garcia" w:date="2026-09-24T22:44:00Z">
+                  <w:rPr>
+                    <w:ins w:id="204" w:author="francisco javier gonzalez  garcia" w:date="2026-09-24T22:43:00Z"/>
+                  </w:rPr>
+                </w:rPrChange>
+              </w:rPr>
+            </w:pPr>
+            <w:ins w:id="205" w:author="francisco javier gonzalez  garcia" w:date="2026-09-24T22:43:00Z">
+              <w:r>
+                <w:rPr>
+                  <w:sz w:val="16"/>
+                  <w:szCs w:val="16"/>
+                  <w:rPrChange w:id="206" w:author="francisco javier gonzalez  garcia" w:date="2026-09-24T22:44:00Z">
+                    <w:rPr/>
+                  </w:rPrChange>
+                </w:rPr>
+                <w:t xml:space="preserve">Nombre ficticio: Carlos </w:t>
+              </w:r>
+            </w:ins>
+            <w:ins w:id="207" w:author="francisco javier gonzalez  garcia" w:date="2026-09-24T22:52:00Z">
+              <w:r>
+                <w:rPr>
+                  <w:sz w:val="16"/>
+                  <w:szCs w:val="16"/>
+                </w:rPr>
+                <w:t>Garibay</w:t>
+              </w:r>
+            </w:ins>
+          </w:p>
+          <w:p>
+            <w:pPr>
+              <w:spacing w:line="40" w:lineRule="atLeast"/>
+              <w:rPr>
+                <w:ins w:id="208" w:author="francisco javier gonzalez  garcia" w:date="2026-09-24T22:43:00Z"/>
+                <w:sz w:val="16"/>
+                <w:szCs w:val="16"/>
+                <w:rPrChange w:id="209" w:author="francisco javier gonzalez  garcia" w:date="2026-09-24T22:44:00Z">
+                  <w:rPr>
+                    <w:ins w:id="210" w:author="francisco javier gonzalez  garcia" w:date="2026-09-24T22:43:00Z"/>
+                  </w:rPr>
+                </w:rPrChange>
+              </w:rPr>
+            </w:pPr>
+            <w:ins w:id="211" w:author="francisco javier gonzalez  garcia" w:date="2026-09-24T22:43:00Z">
+              <w:r>
+                <w:rPr>
+                  <w:sz w:val="16"/>
+                  <w:szCs w:val="16"/>
+                  <w:rPrChange w:id="212" w:author="francisco javier gonzalez  garcia" w:date="2026-09-24T22:44:00Z">
+                    <w:rPr/>
+                  </w:rPrChange>
+                </w:rPr>
+                <w:t>Edad: 31 años</w:t>
+              </w:r>
+            </w:ins>
+          </w:p>
+          <w:p>
+            <w:pPr>
+              <w:spacing w:line="40" w:lineRule="atLeast"/>
+              <w:rPr>
+                <w:ins w:id="213" w:author="francisco javier gonzalez  garcia" w:date="2026-09-24T22:43:00Z"/>
+                <w:sz w:val="16"/>
+                <w:szCs w:val="16"/>
+                <w:rPrChange w:id="214" w:author="francisco javier gonzalez  garcia" w:date="2026-09-24T22:44:00Z">
+                  <w:rPr>
+                    <w:ins w:id="215" w:author="francisco javier gonzalez  garcia" w:date="2026-09-24T22:43:00Z"/>
+                  </w:rPr>
+                </w:rPrChange>
+              </w:rPr>
+            </w:pPr>
+            <w:ins w:id="216" w:author="francisco javier gonzalez  garcia" w:date="2026-09-24T22:43:00Z">
+              <w:r>
+                <w:rPr>
+                  <w:sz w:val="16"/>
+                  <w:szCs w:val="16"/>
+                  <w:rPrChange w:id="217" w:author="francisco javier gonzalez  garcia" w:date="2026-09-24T22:44:00Z">
+                    <w:rPr/>
+                  </w:rPrChange>
+                </w:rPr>
+                <w:t>Rol: Entrenador personal y de clases grupales</w:t>
+              </w:r>
+            </w:ins>
+          </w:p>
+          <w:p>
+            <w:pPr>
+              <w:spacing w:line="40" w:lineRule="atLeast"/>
+              <w:rPr>
+                <w:ins w:id="218" w:author="francisco javier gonzalez  garcia" w:date="2026-09-24T22:43:00Z"/>
+                <w:sz w:val="16"/>
+                <w:szCs w:val="16"/>
+                <w:rPrChange w:id="219" w:author="francisco javier gonzalez  garcia" w:date="2026-09-24T22:44:00Z">
+                  <w:rPr>
+                    <w:ins w:id="220" w:author="francisco javier gonzalez  garcia" w:date="2026-09-24T22:43:00Z"/>
+                  </w:rPr>
+                </w:rPrChange>
+              </w:rPr>
+            </w:pPr>
+            <w:ins w:id="221" w:author="francisco javier gonzalez  garcia" w:date="2026-09-24T22:43:00Z">
+              <w:r>
+                <w:rPr>
+                  <w:sz w:val="16"/>
+                  <w:szCs w:val="16"/>
+                  <w:rPrChange w:id="222" w:author="francisco javier gonzalez  garcia" w:date="2026-09-24T22:44:00Z">
+                    <w:rPr/>
+                  </w:rPrChange>
+                </w:rPr>
+                <w:t>Nivel tecnológico: Intermedio-Alto (Usa diariamente red social, apps de seguimiento deportivo, herramientas de pago digital y mensajería instantánea).</w:t>
+              </w:r>
+            </w:ins>
+          </w:p>
+          <w:p>
+            <w:pPr>
+              <w:spacing w:line="40" w:lineRule="atLeast"/>
+              <w:rPr>
+                <w:ins w:id="223" w:author="francisco javier gonzalez  garcia" w:date="2026-09-24T22:43:00Z"/>
+                <w:sz w:val="16"/>
+                <w:szCs w:val="16"/>
+                <w:rPrChange w:id="224" w:author="francisco javier gonzalez  garcia" w:date="2026-09-24T22:44:00Z">
+                  <w:rPr>
+                    <w:ins w:id="225" w:author="francisco javier gonzalez  garcia" w:date="2026-09-24T22:43:00Z"/>
+                  </w:rPr>
+                </w:rPrChange>
+              </w:rPr>
+            </w:pPr>
+            <w:ins w:id="226" w:author="francisco javier gonzalez  garcia" w:date="2026-09-24T22:43:00Z">
+              <w:r>
+                <w:rPr>
+                  <w:sz w:val="16"/>
+                  <w:szCs w:val="16"/>
+                  <w:rPrChange w:id="227" w:author="francisco javier gonzalez  garcia" w:date="2026-09-24T22:44:00Z">
+                    <w:rPr/>
+                  </w:rPrChange>
+                </w:rPr>
+                <w:t>Objetivo principal:</w:t>
+              </w:r>
+            </w:ins>
+          </w:p>
+          <w:p>
+            <w:pPr>
+              <w:pStyle w:val="Prrafodelista"/>
+              <w:numPr>
+                <w:ilvl w:val="0"/>
+                <w:numId w:val="17"/>
+              </w:numPr>
+              <w:spacing w:line="40" w:lineRule="atLeast"/>
+              <w:ind w:left="92" w:hanging="92"/>
+              <w:rPr>
+                <w:ins w:id="228" w:author="francisco javier gonzalez  garcia" w:date="2026-09-24T22:43:00Z"/>
+                <w:sz w:val="16"/>
+                <w:szCs w:val="16"/>
+                <w:rPrChange w:id="229" w:author="francisco javier gonzalez  garcia" w:date="2026-09-24T22:45:00Z">
+                  <w:rPr>
+                    <w:ins w:id="230" w:author="francisco javier gonzalez  garcia" w:date="2026-09-24T22:43:00Z"/>
+                  </w:rPr>
+                </w:rPrChange>
+              </w:rPr>
+              <w:pPrChange w:id="231" w:author="francisco javier gonzalez  garcia" w:date="2026-09-24T22:50:00Z">
+                <w:pPr>
+                  <w:spacing w:line="40" w:lineRule="atLeast"/>
+                </w:pPr>
+              </w:pPrChange>
+            </w:pPr>
+            <w:ins w:id="232" w:author="francisco javier gonzalez  garcia" w:date="2026-09-24T22:50:00Z">
+              <w:r>
+                <w:rPr>
+                  <w:sz w:val="16"/>
+                  <w:szCs w:val="16"/>
+                </w:rPr>
+                <w:t xml:space="preserve"> </w:t>
+              </w:r>
+            </w:ins>
+            <w:ins w:id="233" w:author="francisco javier gonzalez  garcia" w:date="2026-09-24T22:43:00Z">
+              <w:r>
+                <w:rPr>
+                  <w:sz w:val="16"/>
+                  <w:szCs w:val="16"/>
+                  <w:rPrChange w:id="234" w:author="francisco javier gonzalez  garcia" w:date="2026-09-24T22:45:00Z">
+                    <w:rPr/>
+                  </w:rPrChange>
+                </w:rPr>
+                <w:t>Maximizar el tiempo que pasa entrenando a sus clientes y diseñando rutinas efectivas, automatizando la gestión administrativa (asistencia, cobros, agendamiento) para hacer crecer su cartera de clientes sin saturarse.</w:t>
+              </w:r>
+            </w:ins>
+          </w:p>
+          <w:p>
+            <w:pPr>
+              <w:spacing w:line="40" w:lineRule="atLeast"/>
+              <w:rPr>
+                <w:ins w:id="235" w:author="francisco javier gonzalez  garcia" w:date="2026-09-24T22:43:00Z"/>
+                <w:sz w:val="16"/>
+                <w:szCs w:val="16"/>
+                <w:rPrChange w:id="236" w:author="francisco javier gonzalez  garcia" w:date="2026-09-24T22:44:00Z">
+                  <w:rPr>
+                    <w:ins w:id="237" w:author="francisco javier gonzalez  garcia" w:date="2026-09-24T22:43:00Z"/>
+                  </w:rPr>
+                </w:rPrChange>
+              </w:rPr>
+            </w:pPr>
+            <w:ins w:id="238" w:author="francisco javier gonzalez  garcia" w:date="2026-09-24T22:43:00Z">
+              <w:r>
+                <w:rPr>
+                  <w:sz w:val="16"/>
+                  <w:szCs w:val="16"/>
+                  <w:rPrChange w:id="239" w:author="francisco javier gonzalez  garcia" w:date="2026-09-24T22:44:00Z">
+                    <w:rPr/>
+                  </w:rPrChange>
+                </w:rPr>
+                <w:t>Frustraciones:</w:t>
+              </w:r>
+            </w:ins>
+          </w:p>
+          <w:p>
+            <w:pPr>
+              <w:pStyle w:val="Prrafodelista"/>
+              <w:numPr>
+                <w:ilvl w:val="0"/>
+                <w:numId w:val="17"/>
+              </w:numPr>
+              <w:spacing w:line="40" w:lineRule="atLeast"/>
+              <w:ind w:left="92" w:hanging="92"/>
+              <w:rPr>
+                <w:ins w:id="240" w:author="francisco javier gonzalez  garcia" w:date="2026-09-24T22:43:00Z"/>
+                <w:sz w:val="16"/>
+                <w:szCs w:val="16"/>
+                <w:rPrChange w:id="241" w:author="francisco javier gonzalez  garcia" w:date="2026-09-24T22:46:00Z">
+                  <w:rPr>
+                    <w:ins w:id="242" w:author="francisco javier gonzalez  garcia" w:date="2026-09-24T22:43:00Z"/>
+                  </w:rPr>
+                </w:rPrChange>
+              </w:rPr>
+              <w:pPrChange w:id="243" w:author="francisco javier gonzalez  garcia" w:date="2026-09-24T22:49:00Z">
+                <w:pPr>
+                  <w:spacing w:line="40" w:lineRule="atLeast"/>
+                </w:pPr>
+              </w:pPrChange>
+            </w:pPr>
+            <w:ins w:id="244" w:author="francisco javier gonzalez  garcia" w:date="2026-09-24T22:49:00Z">
+              <w:r>
+                <w:rPr>
+                  <w:sz w:val="16"/>
+                  <w:szCs w:val="16"/>
+                </w:rPr>
+                <w:t xml:space="preserve"> </w:t>
+              </w:r>
+            </w:ins>
+            <w:ins w:id="245" w:author="francisco javier gonzalez  garcia" w:date="2026-09-24T22:43:00Z">
+              <w:r>
+                <w:rPr>
+                  <w:sz w:val="16"/>
+                  <w:szCs w:val="16"/>
+                  <w:rPrChange w:id="246" w:author="francisco javier gonzalez  garcia" w:date="2026-09-24T22:46:00Z">
+                    <w:rPr/>
+                  </w:rPrChange>
+                </w:rPr>
+                <w:t>Perder tiempo en tareas repetitivas como enviar recordatorios manuales de pago o confirmar asistencia por WhatsApp.</w:t>
+              </w:r>
+            </w:ins>
+          </w:p>
+          <w:p>
+            <w:pPr>
+              <w:pStyle w:val="Prrafodelista"/>
+              <w:numPr>
+                <w:ilvl w:val="0"/>
+                <w:numId w:val="17"/>
+              </w:numPr>
+              <w:spacing w:line="40" w:lineRule="atLeast"/>
+              <w:ind w:left="92" w:hanging="92"/>
+              <w:rPr>
+                <w:ins w:id="247" w:author="francisco javier gonzalez  garcia" w:date="2026-09-24T22:43:00Z"/>
+                <w:sz w:val="16"/>
+                <w:szCs w:val="16"/>
+                <w:rPrChange w:id="248" w:author="francisco javier gonzalez  garcia" w:date="2026-09-24T22:46:00Z">
+                  <w:rPr>
+                    <w:ins w:id="249" w:author="francisco javier gonzalez  garcia" w:date="2026-09-24T22:43:00Z"/>
+                  </w:rPr>
+                </w:rPrChange>
+              </w:rPr>
+              <w:pPrChange w:id="250" w:author="francisco javier gonzalez  garcia" w:date="2026-09-24T22:49:00Z">
+                <w:pPr>
+                  <w:spacing w:line="40" w:lineRule="atLeast"/>
+                </w:pPr>
+              </w:pPrChange>
+            </w:pPr>
+            <w:ins w:id="251" w:author="francisco javier gonzalez  garcia" w:date="2026-09-24T22:49:00Z">
+              <w:r>
+                <w:rPr>
+                  <w:sz w:val="16"/>
+                  <w:szCs w:val="16"/>
+                </w:rPr>
+                <w:t xml:space="preserve"> </w:t>
+              </w:r>
+            </w:ins>
+            <w:ins w:id="252" w:author="francisco javier gonzalez  garcia" w:date="2026-09-24T22:43:00Z">
+              <w:r>
+                <w:rPr>
+                  <w:sz w:val="16"/>
+                  <w:szCs w:val="16"/>
+                  <w:rPrChange w:id="253" w:author="francisco javier gonzalez  garcia" w:date="2026-09-24T22:46:00Z">
+                    <w:rPr/>
+                  </w:rPrChange>
+                </w:rPr>
+                <w:t>Falta de seguimiento centralizado del progreso de los alumnos (registros dispersos en notas de voz, papel o cuadernos).</w:t>
+              </w:r>
+            </w:ins>
+          </w:p>
+          <w:p>
+            <w:pPr>
+              <w:pStyle w:val="Prrafodelista"/>
+              <w:numPr>
+                <w:ilvl w:val="0"/>
+                <w:numId w:val="17"/>
+              </w:numPr>
+              <w:spacing w:line="40" w:lineRule="atLeast"/>
+              <w:ind w:left="92" w:hanging="92"/>
+              <w:rPr>
+                <w:ins w:id="254" w:author="francisco javier gonzalez  garcia" w:date="2026-09-24T22:43:00Z"/>
+                <w:sz w:val="16"/>
+                <w:szCs w:val="16"/>
+                <w:rPrChange w:id="255" w:author="francisco javier gonzalez  garcia" w:date="2026-09-24T22:46:00Z">
+                  <w:rPr>
+                    <w:ins w:id="256" w:author="francisco javier gonzalez  garcia" w:date="2026-09-24T22:43:00Z"/>
+                  </w:rPr>
+                </w:rPrChange>
+              </w:rPr>
+              <w:pPrChange w:id="257" w:author="francisco javier gonzalez  garcia" w:date="2026-09-24T22:49:00Z">
+                <w:pPr>
+                  <w:spacing w:line="40" w:lineRule="atLeast"/>
+                </w:pPr>
+              </w:pPrChange>
+            </w:pPr>
+            <w:ins w:id="258" w:author="francisco javier gonzalez  garcia" w:date="2026-09-24T22:49:00Z">
+              <w:r>
+                <w:rPr>
+                  <w:sz w:val="16"/>
+                  <w:szCs w:val="16"/>
+                </w:rPr>
+                <w:t xml:space="preserve"> </w:t>
+              </w:r>
+            </w:ins>
+            <w:ins w:id="259" w:author="francisco javier gonzalez  garcia" w:date="2026-09-24T22:43:00Z">
+              <w:r>
+                <w:rPr>
+                  <w:sz w:val="16"/>
+                  <w:szCs w:val="16"/>
+                  <w:rPrChange w:id="260" w:author="francisco javier gonzalez  garcia" w:date="2026-09-24T22:46:00Z">
+                    <w:rPr/>
+                  </w:rPrChange>
+                </w:rPr>
+                <w:t>Cancelaciones de último minuto que dejan huecos en su agenda y afectan sus ingresos.</w:t>
+              </w:r>
+            </w:ins>
+          </w:p>
+          <w:p>
+            <w:pPr>
+              <w:pStyle w:val="Prrafodelista"/>
+              <w:numPr>
+                <w:ilvl w:val="0"/>
+                <w:numId w:val="17"/>
+              </w:numPr>
+              <w:spacing w:line="40" w:lineRule="atLeast"/>
+              <w:ind w:left="92" w:hanging="92"/>
+              <w:rPr>
+                <w:ins w:id="261" w:author="francisco javier gonzalez  garcia" w:date="2026-09-24T22:43:00Z"/>
+                <w:sz w:val="16"/>
+                <w:szCs w:val="16"/>
+                <w:rPrChange w:id="262" w:author="francisco javier gonzalez  garcia" w:date="2026-09-24T22:48:00Z">
+                  <w:rPr>
+                    <w:ins w:id="263" w:author="francisco javier gonzalez  garcia" w:date="2026-09-24T22:43:00Z"/>
+                  </w:rPr>
+                </w:rPrChange>
+              </w:rPr>
+              <w:pPrChange w:id="264" w:author="francisco javier gonzalez  garcia" w:date="2026-09-24T22:48:00Z">
+                <w:pPr>
+                  <w:spacing w:line="40" w:lineRule="atLeast"/>
+                </w:pPr>
+              </w:pPrChange>
+            </w:pPr>
+            <w:ins w:id="265" w:author="francisco javier gonzalez  garcia" w:date="2026-09-24T22:48:00Z">
+              <w:r>
+                <w:rPr>
+                  <w:sz w:val="16"/>
+                  <w:szCs w:val="16"/>
+                </w:rPr>
+                <w:t xml:space="preserve"> </w:t>
+              </w:r>
+            </w:ins>
+            <w:ins w:id="266" w:author="francisco javier gonzalez  garcia" w:date="2026-09-24T22:43:00Z">
+              <w:r>
+                <w:rPr>
+                  <w:sz w:val="16"/>
+                  <w:szCs w:val="16"/>
+                  <w:rPrChange w:id="267" w:author="francisco javier gonzalez  garcia" w:date="2026-09-24T22:48:00Z">
+                    <w:rPr/>
+                  </w:rPrChange>
+                </w:rPr>
+                <w:t>Plataformas complejas que requieren demasiados clics para crear o modificar una rutina de ejercicios rápida.</w:t>
+              </w:r>
+            </w:ins>
+          </w:p>
+          <w:p>
+            <w:pPr>
+              <w:spacing w:line="40" w:lineRule="atLeast"/>
+              <w:rPr>
+                <w:ins w:id="268" w:author="francisco javier gonzalez  garcia" w:date="2026-09-24T22:43:00Z"/>
+                <w:sz w:val="16"/>
+                <w:szCs w:val="16"/>
+                <w:rPrChange w:id="269" w:author="francisco javier gonzalez  garcia" w:date="2026-09-24T22:44:00Z">
+                  <w:rPr>
+                    <w:ins w:id="270" w:author="francisco javier gonzalez  garcia" w:date="2026-09-24T22:43:00Z"/>
+                  </w:rPr>
+                </w:rPrChange>
+              </w:rPr>
+            </w:pPr>
+            <w:ins w:id="271" w:author="francisco javier gonzalez  garcia" w:date="2026-09-24T22:43:00Z">
+              <w:r>
+                <w:rPr>
+                  <w:sz w:val="16"/>
+                  <w:szCs w:val="16"/>
+                  <w:rPrChange w:id="272" w:author="francisco javier gonzalez  garcia" w:date="2026-09-24T22:44:00Z">
+                    <w:rPr/>
+                  </w:rPrChange>
+                </w:rPr>
+                <w:t>Necesidades digitales:</w:t>
+              </w:r>
+            </w:ins>
+          </w:p>
+          <w:p>
+            <w:pPr>
+              <w:spacing w:line="40" w:lineRule="atLeast"/>
+              <w:ind w:left="92" w:hanging="92"/>
+              <w:rPr>
+                <w:ins w:id="273" w:author="francisco javier gonzalez  garcia" w:date="2026-09-24T22:43:00Z"/>
+                <w:sz w:val="16"/>
+                <w:szCs w:val="16"/>
+                <w:rPrChange w:id="274" w:author="francisco javier gonzalez  garcia" w:date="2026-09-24T22:44:00Z">
+                  <w:rPr>
+                    <w:ins w:id="275" w:author="francisco javier gonzalez  garcia" w:date="2026-09-24T22:43:00Z"/>
+                  </w:rPr>
+                </w:rPrChange>
+              </w:rPr>
+              <w:pPrChange w:id="276" w:author="francisco javier gonzalez  garcia" w:date="2026-09-24T22:49:00Z">
+                <w:pPr>
+                  <w:spacing w:line="40" w:lineRule="atLeast"/>
+                </w:pPr>
+              </w:pPrChange>
+            </w:pPr>
+            <w:ins w:id="277" w:author="francisco javier gonzalez  garcia" w:date="2026-09-24T22:43:00Z">
+              <w:r>
+                <w:rPr>
+                  <w:sz w:val="16"/>
+                  <w:szCs w:val="16"/>
+                  <w:rPrChange w:id="278" w:author="francisco javier gonzalez  garcia" w:date="2026-09-24T22:44:00Z">
+                    <w:rPr/>
+                  </w:rPrChange>
+                </w:rPr>
+                <w:t>•</w:t>
+              </w:r>
+            </w:ins>
+            <w:ins w:id="279" w:author="francisco javier gonzalez  garcia" w:date="2026-09-24T22:48:00Z">
+              <w:r>
+                <w:rPr>
+                  <w:sz w:val="16"/>
+                  <w:szCs w:val="16"/>
+                </w:rPr>
+                <w:t xml:space="preserve"> </w:t>
+              </w:r>
+            </w:ins>
+            <w:ins w:id="280" w:author="francisco javier gonzalez  garcia" w:date="2026-09-24T22:43:00Z">
+              <w:r>
+                <w:rPr>
+                  <w:sz w:val="16"/>
+                  <w:szCs w:val="16"/>
+                  <w:rPrChange w:id="281" w:author="francisco javier gonzalez  garcia" w:date="2026-09-24T22:44:00Z">
+                    <w:rPr/>
+                  </w:rPrChange>
+                </w:rPr>
+                <w:t>Constructor interactivo de rutinas: Interfaz ágil para asignar, duplicar y personalizar planes de entrenamiento visuales (con videos o GIFs de técnica).</w:t>
+              </w:r>
+            </w:ins>
+          </w:p>
+          <w:p>
+            <w:pPr>
+              <w:spacing w:line="40" w:lineRule="atLeast"/>
+              <w:ind w:left="92" w:hanging="92"/>
+              <w:rPr>
+                <w:ins w:id="282" w:author="francisco javier gonzalez  garcia" w:date="2026-09-24T22:43:00Z"/>
+                <w:sz w:val="16"/>
+                <w:szCs w:val="16"/>
+                <w:rPrChange w:id="283" w:author="francisco javier gonzalez  garcia" w:date="2026-09-24T22:44:00Z">
+                  <w:rPr>
+                    <w:ins w:id="284" w:author="francisco javier gonzalez  garcia" w:date="2026-09-24T22:43:00Z"/>
+                  </w:rPr>
+                </w:rPrChange>
+              </w:rPr>
+              <w:pPrChange w:id="285" w:author="francisco javier gonzalez  garcia" w:date="2026-09-24T22:49:00Z">
+                <w:pPr>
+                  <w:spacing w:line="40" w:lineRule="atLeast"/>
+                </w:pPr>
+              </w:pPrChange>
+            </w:pPr>
+            <w:ins w:id="286" w:author="francisco javier gonzalez  garcia" w:date="2026-09-24T22:43:00Z">
+              <w:r>
+                <w:rPr>
+                  <w:sz w:val="16"/>
+                  <w:szCs w:val="16"/>
+                  <w:rPrChange w:id="287" w:author="francisco javier gonzalez  garcia" w:date="2026-09-24T22:44:00Z">
+                    <w:rPr/>
+                  </w:rPrChange>
+                </w:rPr>
+                <w:t>•</w:t>
+              </w:r>
+            </w:ins>
+            <w:ins w:id="288" w:author="francisco javier gonzalez  garcia" w:date="2026-09-24T22:48:00Z">
+              <w:r>
+                <w:rPr>
+                  <w:sz w:val="16"/>
+                  <w:szCs w:val="16"/>
+                </w:rPr>
+                <w:t xml:space="preserve"> </w:t>
+              </w:r>
+            </w:ins>
+            <w:ins w:id="289" w:author="francisco javier gonzalez  garcia" w:date="2026-09-24T22:43:00Z">
+              <w:r>
+                <w:rPr>
+                  <w:sz w:val="16"/>
+                  <w:szCs w:val="16"/>
+                  <w:rPrChange w:id="290" w:author="francisco javier gonzalez  garcia" w:date="2026-09-24T22:44:00Z">
+                    <w:rPr/>
+                  </w:rPrChange>
+                </w:rPr>
+                <w:t>Calendario y agenda centralizada:</w:t>
+              </w:r>
+            </w:ins>
+            <w:ins w:id="291" w:author="francisco javier gonzalez  garcia" w:date="2026-09-24T22:49:00Z">
+              <w:r>
+                <w:rPr>
+                  <w:sz w:val="16"/>
+                  <w:szCs w:val="16"/>
+                </w:rPr>
+                <w:t xml:space="preserve"> </w:t>
+              </w:r>
+            </w:ins>
+            <w:ins w:id="292" w:author="francisco javier gonzalez  garcia" w:date="2026-09-24T22:43:00Z">
+              <w:r>
+                <w:rPr>
+                  <w:sz w:val="16"/>
+                  <w:szCs w:val="16"/>
+                  <w:rPrChange w:id="293" w:author="francisco javier gonzalez  garcia" w:date="2026-09-24T22:44:00Z">
+                    <w:rPr/>
+                  </w:rPrChange>
+                </w:rPr>
+                <w:t>Visibilidad clara de sus clases presenciales/online, estado de asistencia y cupos disponibles.</w:t>
+              </w:r>
+            </w:ins>
+          </w:p>
+          <w:p>
+            <w:pPr>
+              <w:spacing w:line="40" w:lineRule="atLeast"/>
+              <w:ind w:left="92" w:hanging="92"/>
+              <w:rPr>
+                <w:ins w:id="294" w:author="francisco javier gonzalez  garcia" w:date="2026-09-24T22:43:00Z"/>
+                <w:sz w:val="16"/>
+                <w:szCs w:val="16"/>
+                <w:rPrChange w:id="295" w:author="francisco javier gonzalez  garcia" w:date="2026-09-24T22:44:00Z">
+                  <w:rPr>
+                    <w:ins w:id="296" w:author="francisco javier gonzalez  garcia" w:date="2026-09-24T22:43:00Z"/>
+                  </w:rPr>
+                </w:rPrChange>
+              </w:rPr>
+              <w:pPrChange w:id="297" w:author="francisco javier gonzalez  garcia" w:date="2026-09-24T22:49:00Z">
+                <w:pPr>
+                  <w:spacing w:line="40" w:lineRule="atLeast"/>
+                </w:pPr>
+              </w:pPrChange>
+            </w:pPr>
+            <w:ins w:id="298" w:author="francisco javier gonzalez  garcia" w:date="2026-09-24T22:43:00Z">
+              <w:r>
+                <w:rPr>
+                  <w:sz w:val="16"/>
+                  <w:szCs w:val="16"/>
+                  <w:rPrChange w:id="299" w:author="francisco javier gonzalez  garcia" w:date="2026-09-24T22:44:00Z">
+                    <w:rPr/>
+                  </w:rPrChange>
+                </w:rPr>
+                <w:t>•</w:t>
+              </w:r>
+            </w:ins>
+            <w:ins w:id="300" w:author="francisco javier gonzalez  garcia" w:date="2026-09-24T22:48:00Z">
+              <w:r>
+                <w:rPr>
+                  <w:sz w:val="16"/>
+                  <w:szCs w:val="16"/>
+                </w:rPr>
+                <w:t xml:space="preserve"> </w:t>
+              </w:r>
+            </w:ins>
+            <w:ins w:id="301" w:author="francisco javier gonzalez  garcia" w:date="2026-09-24T22:43:00Z">
+              <w:r>
+                <w:rPr>
+                  <w:sz w:val="16"/>
+                  <w:szCs w:val="16"/>
+                  <w:rPrChange w:id="302" w:author="francisco javier gonzalez  garcia" w:date="2026-09-24T22:44:00Z">
+                    <w:rPr/>
+                  </w:rPrChange>
+                </w:rPr>
+                <w:t>Panel de progreso del usuario: Visualización gráfica del rendimiento y evolución de cada atleta o cliente.</w:t>
+              </w:r>
+            </w:ins>
+          </w:p>
+          <w:p>
+            <w:pPr>
+              <w:spacing w:line="40" w:lineRule="atLeast"/>
+              <w:ind w:left="92" w:hanging="92"/>
+              <w:rPr>
+                <w:ins w:id="303" w:author="francisco javier gonzalez  garcia" w:date="2026-09-24T22:43:00Z"/>
+                <w:sz w:val="16"/>
+                <w:szCs w:val="16"/>
+                <w:rPrChange w:id="304" w:author="francisco javier gonzalez  garcia" w:date="2026-09-24T22:44:00Z">
+                  <w:rPr>
+                    <w:ins w:id="305" w:author="francisco javier gonzalez  garcia" w:date="2026-09-24T22:43:00Z"/>
+                  </w:rPr>
+                </w:rPrChange>
+              </w:rPr>
+              <w:pPrChange w:id="306" w:author="francisco javier gonzalez  garcia" w:date="2026-09-24T23:01:00Z">
+                <w:pPr>
+                  <w:spacing w:line="40" w:lineRule="atLeast"/>
+                </w:pPr>
+              </w:pPrChange>
+            </w:pPr>
+            <w:ins w:id="307" w:author="francisco javier gonzalez  garcia" w:date="2026-09-24T22:43:00Z">
+              <w:r>
+                <w:rPr>
+                  <w:sz w:val="16"/>
+                  <w:szCs w:val="16"/>
+                  <w:rPrChange w:id="308" w:author="francisco javier gonzalez  garcia" w:date="2026-09-24T22:44:00Z">
+                    <w:rPr/>
+                  </w:rPrChange>
+                </w:rPr>
+                <w:t>•</w:t>
+              </w:r>
+            </w:ins>
+            <w:ins w:id="309" w:author="francisco javier gonzalez  garcia" w:date="2026-09-24T22:48:00Z">
+              <w:r>
+                <w:rPr>
+                  <w:sz w:val="16"/>
+                  <w:szCs w:val="16"/>
+                </w:rPr>
+                <w:t xml:space="preserve"> </w:t>
+              </w:r>
+            </w:ins>
+            <w:ins w:id="310" w:author="francisco javier gonzalez  garcia" w:date="2026-09-24T22:43:00Z">
+              <w:r>
+                <w:rPr>
+                  <w:sz w:val="16"/>
+                  <w:szCs w:val="16"/>
+                  <w:rPrChange w:id="311" w:author="francisco javier gonzalez  garcia" w:date="2026-09-24T22:44:00Z">
+                    <w:rPr/>
+                  </w:rPrChange>
+                </w:rPr>
+                <w:t>Notificaciones automáticas: Alertas para recordatorio de citas, vencimiento de membresías y registro de actividad del alumno.</w:t>
+              </w:r>
+            </w:ins>
+          </w:p>
+          <w:p>
+            <w:pPr>
+              <w:spacing w:line="40" w:lineRule="atLeast"/>
+              <w:rPr>
+                <w:ins w:id="312" w:author="francisco javier gonzalez  garcia" w:date="2026-09-24T22:40:00Z"/>
+              </w:rPr>
+            </w:pPr>
+            <w:ins w:id="313" w:author="francisco javier gonzalez  garcia" w:date="2026-09-24T22:43:00Z">
+              <w:r>
+                <w:rPr>
+                  <w:sz w:val="16"/>
+                  <w:szCs w:val="16"/>
+                  <w:rPrChange w:id="314" w:author="francisco javier gonzalez  garcia" w:date="2026-09-24T22:44:00Z">
+                    <w:rPr/>
+                  </w:rPrChange>
+                </w:rPr>
+                <w:t>Motivación de uso: Proyectar una imagen profesional y organizada que genere confianza en sus alumnos, optimizar su tiempo diario y contar con una herramienta móvil confiable que funcione sin fricción dentro del ambiente del gimnasio.</w:t>
+              </w:r>
+            </w:ins>
+          </w:p>
+        </w:tc>
+        <w:tc>
+          <w:tcPr>
+            <w:tcW w:w="3167" w:type="dxa"/>
+            <w:tcPrChange w:id="315" w:author="francisco javier gonzalez  garcia" w:date="2026-09-24T22:41:00Z">
+              <w:tcPr>
+                <w:tcW w:w="3167" w:type="dxa"/>
+              </w:tcPr>
+            </w:tcPrChange>
+          </w:tcPr>
+          <w:p>
+            <w:pPr>
+              <w:spacing w:line="40" w:lineRule="atLeast"/>
+              <w:rPr>
+                <w:ins w:id="316" w:author="francisco javier gonzalez  garcia" w:date="2026-09-24T22:52:00Z"/>
+                <w:sz w:val="16"/>
+                <w:szCs w:val="16"/>
+                <w:rPrChange w:id="317" w:author="francisco javier gonzalez  garcia" w:date="2026-09-24T22:52:00Z">
+                  <w:rPr>
+                    <w:ins w:id="318" w:author="francisco javier gonzalez  garcia" w:date="2026-09-24T22:52:00Z"/>
+                  </w:rPr>
+                </w:rPrChange>
+              </w:rPr>
+              <w:pPrChange w:id="319" w:author="francisco javier gonzalez  garcia" w:date="2026-09-24T22:52:00Z">
+                <w:pPr>
+                  <w:spacing w:line="40" w:lineRule="atLeast"/>
+                </w:pPr>
+              </w:pPrChange>
+            </w:pPr>
+            <w:ins w:id="320" w:author="francisco javier gonzalez  garcia" w:date="2026-09-24T22:52:00Z">
+              <w:r>
+                <w:rPr>
+                  <w:sz w:val="16"/>
+                  <w:szCs w:val="16"/>
+                  <w:rPrChange w:id="321" w:author="francisco javier gonzalez  garcia" w:date="2026-09-24T22:52:00Z">
+                    <w:rPr/>
+                  </w:rPrChange>
+                </w:rPr>
+                <w:t>Datos Demográficos y Perfil</w:t>
+              </w:r>
+            </w:ins>
+          </w:p>
+          <w:p>
+            <w:pPr>
+              <w:spacing w:line="40" w:lineRule="atLeast"/>
+              <w:rPr>
+                <w:ins w:id="322" w:author="francisco javier gonzalez  garcia" w:date="2026-09-24T22:52:00Z"/>
+                <w:sz w:val="16"/>
+                <w:szCs w:val="16"/>
+                <w:rPrChange w:id="323" w:author="francisco javier gonzalez  garcia" w:date="2026-09-24T22:52:00Z">
+                  <w:rPr>
+                    <w:ins w:id="324" w:author="francisco javier gonzalez  garcia" w:date="2026-09-24T22:52:00Z"/>
+                  </w:rPr>
+                </w:rPrChange>
+              </w:rPr>
+              <w:pPrChange w:id="325" w:author="francisco javier gonzalez  garcia" w:date="2026-09-24T22:52:00Z">
+                <w:pPr>
+                  <w:spacing w:line="40" w:lineRule="atLeast"/>
+                </w:pPr>
+              </w:pPrChange>
+            </w:pPr>
+            <w:ins w:id="326" w:author="francisco javier gonzalez  garcia" w:date="2026-09-24T22:52:00Z">
+              <w:r>
+                <w:rPr>
+                  <w:sz w:val="16"/>
+                  <w:szCs w:val="16"/>
+                  <w:rPrChange w:id="327" w:author="francisco javier gonzalez  garcia" w:date="2026-09-24T22:52:00Z">
+                    <w:rPr/>
+                  </w:rPrChange>
+                </w:rPr>
+                <w:t>Nombre ficticio: Valeria Ríos</w:t>
+              </w:r>
+            </w:ins>
+          </w:p>
+          <w:p>
+            <w:pPr>
+              <w:spacing w:line="40" w:lineRule="atLeast"/>
+              <w:rPr>
+                <w:ins w:id="328" w:author="francisco javier gonzalez  garcia" w:date="2026-09-24T22:52:00Z"/>
+                <w:sz w:val="16"/>
+                <w:szCs w:val="16"/>
+                <w:rPrChange w:id="329" w:author="francisco javier gonzalez  garcia" w:date="2026-09-24T22:52:00Z">
+                  <w:rPr>
+                    <w:ins w:id="330" w:author="francisco javier gonzalez  garcia" w:date="2026-09-24T22:52:00Z"/>
+                  </w:rPr>
+                </w:rPrChange>
+              </w:rPr>
+              <w:pPrChange w:id="331" w:author="francisco javier gonzalez  garcia" w:date="2026-09-24T22:52:00Z">
+                <w:pPr>
+                  <w:spacing w:line="40" w:lineRule="atLeast"/>
+                </w:pPr>
+              </w:pPrChange>
+            </w:pPr>
+            <w:ins w:id="332" w:author="francisco javier gonzalez  garcia" w:date="2026-09-24T22:52:00Z">
+              <w:r>
+                <w:rPr>
+                  <w:sz w:val="16"/>
+                  <w:szCs w:val="16"/>
+                  <w:rPrChange w:id="333" w:author="francisco javier gonzalez  garcia" w:date="2026-09-24T22:52:00Z">
+                    <w:rPr/>
+                  </w:rPrChange>
+                </w:rPr>
+                <w:t>Edad: 42 años</w:t>
+              </w:r>
+            </w:ins>
+          </w:p>
+          <w:p>
+            <w:pPr>
+              <w:spacing w:line="40" w:lineRule="atLeast"/>
+              <w:rPr>
+                <w:ins w:id="334" w:author="francisco javier gonzalez  garcia" w:date="2026-09-24T22:52:00Z"/>
+                <w:sz w:val="16"/>
+                <w:szCs w:val="16"/>
+                <w:rPrChange w:id="335" w:author="francisco javier gonzalez  garcia" w:date="2026-09-24T22:52:00Z">
+                  <w:rPr>
+                    <w:ins w:id="336" w:author="francisco javier gonzalez  garcia" w:date="2026-09-24T22:52:00Z"/>
+                  </w:rPr>
+                </w:rPrChange>
+              </w:rPr>
+              <w:pPrChange w:id="337" w:author="francisco javier gonzalez  garcia" w:date="2026-09-24T22:52:00Z">
+                <w:pPr>
+                  <w:spacing w:line="40" w:lineRule="atLeast"/>
+                </w:pPr>
+              </w:pPrChange>
+            </w:pPr>
+            <w:ins w:id="338" w:author="francisco javier gonzalez  garcia" w:date="2026-09-24T22:52:00Z">
+              <w:r>
+                <w:rPr>
+                  <w:sz w:val="16"/>
+                  <w:szCs w:val="16"/>
+                  <w:rPrChange w:id="339" w:author="francisco javier gonzalez  garcia" w:date="2026-09-24T22:52:00Z">
+                    <w:rPr/>
+                  </w:rPrChange>
+                </w:rPr>
+                <w:t>Rol: Administradora General del Gimnasio</w:t>
+              </w:r>
+            </w:ins>
+          </w:p>
+          <w:p>
+            <w:pPr>
+              <w:spacing w:line="40" w:lineRule="atLeast"/>
+              <w:rPr>
+                <w:ins w:id="340" w:author="francisco javier gonzalez  garcia" w:date="2026-09-24T22:52:00Z"/>
+                <w:sz w:val="16"/>
+                <w:szCs w:val="16"/>
+                <w:rPrChange w:id="341" w:author="francisco javier gonzalez  garcia" w:date="2026-09-24T22:52:00Z">
+                  <w:rPr>
+                    <w:ins w:id="342" w:author="francisco javier gonzalez  garcia" w:date="2026-09-24T22:52:00Z"/>
+                  </w:rPr>
+                </w:rPrChange>
+              </w:rPr>
+              <w:pPrChange w:id="343" w:author="francisco javier gonzalez  garcia" w:date="2026-09-24T22:52:00Z">
+                <w:pPr>
+                  <w:spacing w:line="40" w:lineRule="atLeast"/>
+                </w:pPr>
+              </w:pPrChange>
+            </w:pPr>
+            <w:ins w:id="344" w:author="francisco javier gonzalez  garcia" w:date="2026-09-24T22:52:00Z">
+              <w:r>
+                <w:rPr>
+                  <w:sz w:val="16"/>
+                  <w:szCs w:val="16"/>
+                  <w:rPrChange w:id="345" w:author="francisco javier gonzalez  garcia" w:date="2026-09-24T22:52:00Z">
+                    <w:rPr/>
+                  </w:rPrChange>
+                </w:rPr>
+                <w:t xml:space="preserve">Nivel tecnológico: Intermedio (Maneja </w:t>
+              </w:r>
+            </w:ins>
+            <w:ins w:id="346" w:author="francisco javier gonzalez  garcia" w:date="2026-09-24T22:56:00Z">
+              <w:r>
+                <w:rPr>
+                  <w:sz w:val="16"/>
+                  <w:szCs w:val="16"/>
+                </w:rPr>
+                <w:t>email</w:t>
+              </w:r>
+            </w:ins>
+            <w:ins w:id="347" w:author="francisco javier gonzalez  garcia" w:date="2026-09-24T22:52:00Z">
+              <w:r>
+                <w:rPr>
+                  <w:sz w:val="16"/>
+                  <w:szCs w:val="16"/>
+                  <w:rPrChange w:id="348" w:author="francisco javier gonzalez  garcia" w:date="2026-09-24T22:52:00Z">
+                    <w:rPr/>
+                  </w:rPrChange>
+                </w:rPr>
+                <w:t xml:space="preserve">, </w:t>
+              </w:r>
+            </w:ins>
+            <w:ins w:id="349" w:author="francisco javier gonzalez  garcia" w:date="2026-09-24T22:56:00Z">
+              <w:r>
+                <w:rPr>
+                  <w:sz w:val="16"/>
+                  <w:szCs w:val="16"/>
+                </w:rPr>
+                <w:t>MS-Excel</w:t>
+              </w:r>
+            </w:ins>
+            <w:ins w:id="350" w:author="francisco javier gonzalez  garcia" w:date="2026-09-24T22:52:00Z">
+              <w:r>
+                <w:rPr>
+                  <w:sz w:val="16"/>
+                  <w:szCs w:val="16"/>
+                  <w:rPrChange w:id="351" w:author="francisco javier gonzalez  garcia" w:date="2026-09-24T22:52:00Z">
+                    <w:rPr/>
+                  </w:rPrChange>
+                </w:rPr>
+                <w:t>, Punto de Venta básicos</w:t>
+              </w:r>
+            </w:ins>
+            <w:ins w:id="352" w:author="francisco javier gonzalez  garcia" w:date="2026-09-24T22:57:00Z">
+              <w:r>
+                <w:rPr>
+                  <w:sz w:val="16"/>
+                  <w:szCs w:val="16"/>
+                </w:rPr>
+                <w:t>,</w:t>
+              </w:r>
+            </w:ins>
+            <w:ins w:id="353" w:author="francisco javier gonzalez  garcia" w:date="2026-09-24T22:52:00Z">
+              <w:r>
+                <w:rPr>
+                  <w:sz w:val="16"/>
+                  <w:szCs w:val="16"/>
+                  <w:rPrChange w:id="354" w:author="francisco javier gonzalez  garcia" w:date="2026-09-24T22:52:00Z">
+                    <w:rPr/>
+                  </w:rPrChange>
+                </w:rPr>
+                <w:t xml:space="preserve"> banca en línea; prefiere interfaces limpias y directas sin jerga técnica compleja).</w:t>
+              </w:r>
+            </w:ins>
+          </w:p>
+          <w:p>
+            <w:pPr>
+              <w:spacing w:line="40" w:lineRule="atLeast"/>
+              <w:rPr>
+                <w:ins w:id="355" w:author="francisco javier gonzalez  garcia" w:date="2026-09-24T22:52:00Z"/>
+                <w:sz w:val="16"/>
+                <w:szCs w:val="16"/>
+                <w:rPrChange w:id="356" w:author="francisco javier gonzalez  garcia" w:date="2026-09-24T22:52:00Z">
+                  <w:rPr>
+                    <w:ins w:id="357" w:author="francisco javier gonzalez  garcia" w:date="2026-09-24T22:52:00Z"/>
+                  </w:rPr>
+                </w:rPrChange>
+              </w:rPr>
+              <w:pPrChange w:id="358" w:author="francisco javier gonzalez  garcia" w:date="2026-09-24T22:52:00Z">
+                <w:pPr>
+                  <w:spacing w:line="40" w:lineRule="atLeast"/>
+                </w:pPr>
+              </w:pPrChange>
+            </w:pPr>
+            <w:ins w:id="359" w:author="francisco javier gonzalez  garcia" w:date="2026-09-24T22:52:00Z">
+              <w:r>
+                <w:rPr>
+                  <w:sz w:val="16"/>
+                  <w:szCs w:val="16"/>
+                  <w:rPrChange w:id="360" w:author="francisco javier gonzalez  garcia" w:date="2026-09-24T22:52:00Z">
+                    <w:rPr/>
+                  </w:rPrChange>
+                </w:rPr>
+                <w:t>Objetivo principal:</w:t>
+              </w:r>
+            </w:ins>
+          </w:p>
+          <w:p>
+            <w:pPr>
+              <w:pStyle w:val="Prrafodelista"/>
+              <w:numPr>
+                <w:ilvl w:val="0"/>
+                <w:numId w:val="18"/>
+              </w:numPr>
+              <w:spacing w:line="40" w:lineRule="atLeast"/>
+              <w:ind w:left="193" w:hanging="193"/>
+              <w:rPr>
+                <w:ins w:id="361" w:author="francisco javier gonzalez  garcia" w:date="2026-09-24T22:52:00Z"/>
+                <w:sz w:val="16"/>
+                <w:szCs w:val="16"/>
+                <w:rPrChange w:id="362" w:author="francisco javier gonzalez  garcia" w:date="2026-09-24T22:58:00Z">
+                  <w:rPr>
+                    <w:ins w:id="363" w:author="francisco javier gonzalez  garcia" w:date="2026-09-24T22:52:00Z"/>
+                  </w:rPr>
+                </w:rPrChange>
+              </w:rPr>
+              <w:pPrChange w:id="364" w:author="francisco javier gonzalez  garcia" w:date="2026-09-24T22:58:00Z">
+                <w:pPr>
+                  <w:spacing w:line="40" w:lineRule="atLeast"/>
+                </w:pPr>
+              </w:pPrChange>
+            </w:pPr>
+            <w:ins w:id="365" w:author="francisco javier gonzalez  garcia" w:date="2026-09-24T22:52:00Z">
+              <w:r>
+                <w:rPr>
+                  <w:sz w:val="16"/>
+                  <w:szCs w:val="16"/>
+                  <w:rPrChange w:id="366" w:author="francisco javier gonzalez  garcia" w:date="2026-09-24T22:58:00Z">
+                    <w:rPr/>
+                  </w:rPrChange>
+                </w:rPr>
+                <w:t>Mantener la rentabilidad y operatividad óptima del gimnasio mediante el control eficiente de membresías, retención de clientes, supervisión del personal (entrenadores y recepción) y la toma de decisiones basada en métricas financieras claras.</w:t>
+              </w:r>
+            </w:ins>
+          </w:p>
+          <w:p>
+            <w:pPr>
+              <w:spacing w:line="40" w:lineRule="atLeast"/>
+              <w:rPr>
+                <w:ins w:id="367" w:author="francisco javier gonzalez  garcia" w:date="2026-09-24T22:52:00Z"/>
+                <w:sz w:val="16"/>
+                <w:szCs w:val="16"/>
+                <w:rPrChange w:id="368" w:author="francisco javier gonzalez  garcia" w:date="2026-09-24T22:52:00Z">
+                  <w:rPr>
+                    <w:ins w:id="369" w:author="francisco javier gonzalez  garcia" w:date="2026-09-24T22:52:00Z"/>
+                  </w:rPr>
+                </w:rPrChange>
+              </w:rPr>
+              <w:pPrChange w:id="370" w:author="francisco javier gonzalez  garcia" w:date="2026-09-24T22:52:00Z">
+                <w:pPr>
+                  <w:spacing w:line="40" w:lineRule="atLeast"/>
+                </w:pPr>
+              </w:pPrChange>
+            </w:pPr>
+            <w:ins w:id="371" w:author="francisco javier gonzalez  garcia" w:date="2026-09-24T22:52:00Z">
+              <w:r>
+                <w:rPr>
+                  <w:sz w:val="16"/>
+                  <w:szCs w:val="16"/>
+                  <w:rPrChange w:id="372" w:author="francisco javier gonzalez  garcia" w:date="2026-09-24T22:52:00Z">
+                    <w:rPr/>
+                  </w:rPrChange>
+                </w:rPr>
+                <w:t>Frustraciones:</w:t>
+              </w:r>
+            </w:ins>
+          </w:p>
+          <w:p>
+            <w:pPr>
+              <w:pStyle w:val="Prrafodelista"/>
+              <w:numPr>
+                <w:ilvl w:val="0"/>
+                <w:numId w:val="18"/>
+              </w:numPr>
+              <w:spacing w:line="40" w:lineRule="atLeast"/>
+              <w:ind w:left="193" w:hanging="142"/>
+              <w:rPr>
+                <w:ins w:id="373" w:author="francisco javier gonzalez  garcia" w:date="2026-09-24T22:52:00Z"/>
+                <w:sz w:val="16"/>
+                <w:szCs w:val="16"/>
+                <w:rPrChange w:id="374" w:author="francisco javier gonzalez  garcia" w:date="2026-09-24T22:59:00Z">
+                  <w:rPr>
+                    <w:ins w:id="375" w:author="francisco javier gonzalez  garcia" w:date="2026-09-24T22:52:00Z"/>
+                  </w:rPr>
+                </w:rPrChange>
+              </w:rPr>
+              <w:pPrChange w:id="376" w:author="francisco javier gonzalez  garcia" w:date="2026-09-24T22:59:00Z">
+                <w:pPr>
+                  <w:spacing w:line="40" w:lineRule="atLeast"/>
+                </w:pPr>
+              </w:pPrChange>
+            </w:pPr>
+            <w:ins w:id="377" w:author="francisco javier gonzalez  garcia" w:date="2026-09-24T22:52:00Z">
+              <w:r>
+                <w:rPr>
+                  <w:sz w:val="16"/>
+                  <w:szCs w:val="16"/>
+                  <w:rPrChange w:id="378" w:author="francisco javier gonzalez  garcia" w:date="2026-09-24T22:59:00Z">
+                    <w:rPr/>
+                  </w:rPrChange>
+                </w:rPr>
+                <w:t>Alta tasa de deserción de socios sin conocer los motivos reales ni tener mecanismos automatizados para reengancharlos.</w:t>
+              </w:r>
+            </w:ins>
+          </w:p>
+          <w:p>
+            <w:pPr>
+              <w:pStyle w:val="Prrafodelista"/>
+              <w:numPr>
+                <w:ilvl w:val="0"/>
+                <w:numId w:val="18"/>
+              </w:numPr>
+              <w:spacing w:line="40" w:lineRule="atLeast"/>
+              <w:ind w:left="193" w:hanging="142"/>
+              <w:rPr>
+                <w:ins w:id="379" w:author="francisco javier gonzalez  garcia" w:date="2026-09-24T22:52:00Z"/>
+                <w:sz w:val="16"/>
+                <w:szCs w:val="16"/>
+                <w:rPrChange w:id="380" w:author="francisco javier gonzalez  garcia" w:date="2026-09-24T22:59:00Z">
+                  <w:rPr>
+                    <w:ins w:id="381" w:author="francisco javier gonzalez  garcia" w:date="2026-09-24T22:52:00Z"/>
+                  </w:rPr>
+                </w:rPrChange>
+              </w:rPr>
+              <w:pPrChange w:id="382" w:author="francisco javier gonzalez  garcia" w:date="2026-09-24T22:59:00Z">
+                <w:pPr>
+                  <w:spacing w:line="40" w:lineRule="atLeast"/>
+                </w:pPr>
+              </w:pPrChange>
+            </w:pPr>
+            <w:ins w:id="383" w:author="francisco javier gonzalez  garcia" w:date="2026-09-24T22:52:00Z">
+              <w:r>
+                <w:rPr>
+                  <w:sz w:val="16"/>
+                  <w:szCs w:val="16"/>
+                  <w:rPrChange w:id="384" w:author="francisco javier gonzalez  garcia" w:date="2026-09-24T22:59:00Z">
+                    <w:rPr/>
+                  </w:rPrChange>
+                </w:rPr>
+                <w:t>Reportes financieros y de ingresos desactualizados o dispersos en múltiples archivos de Excel.</w:t>
+              </w:r>
+            </w:ins>
+          </w:p>
+          <w:p>
+            <w:pPr>
+              <w:pStyle w:val="Prrafodelista"/>
+              <w:numPr>
+                <w:ilvl w:val="0"/>
+                <w:numId w:val="18"/>
+              </w:numPr>
+              <w:spacing w:line="40" w:lineRule="atLeast"/>
+              <w:ind w:left="193" w:hanging="142"/>
+              <w:rPr>
+                <w:ins w:id="385" w:author="francisco javier gonzalez  garcia" w:date="2026-09-24T22:52:00Z"/>
+                <w:sz w:val="16"/>
+                <w:szCs w:val="16"/>
+                <w:rPrChange w:id="386" w:author="francisco javier gonzalez  garcia" w:date="2026-09-24T22:59:00Z">
+                  <w:rPr>
+                    <w:ins w:id="387" w:author="francisco javier gonzalez  garcia" w:date="2026-09-24T22:52:00Z"/>
+                  </w:rPr>
+                </w:rPrChange>
+              </w:rPr>
+              <w:pPrChange w:id="388" w:author="francisco javier gonzalez  garcia" w:date="2026-09-24T22:59:00Z">
+                <w:pPr>
+                  <w:spacing w:line="40" w:lineRule="atLeast"/>
+                </w:pPr>
+              </w:pPrChange>
+            </w:pPr>
+            <w:ins w:id="389" w:author="francisco javier gonzalez  garcia" w:date="2026-09-24T22:52:00Z">
+              <w:r>
+                <w:rPr>
+                  <w:sz w:val="16"/>
+                  <w:szCs w:val="16"/>
+                  <w:rPrChange w:id="390" w:author="francisco javier gonzalez  garcia" w:date="2026-09-24T22:59:00Z">
+                    <w:rPr/>
+                  </w:rPrChange>
+                </w:rPr>
+                <w:t>Cuellos de botella en la recepción durante horas pico debido al registro manual de entradas y cobros.</w:t>
+              </w:r>
+            </w:ins>
+          </w:p>
+          <w:p>
+            <w:pPr>
+              <w:pStyle w:val="Prrafodelista"/>
+              <w:numPr>
+                <w:ilvl w:val="0"/>
+                <w:numId w:val="18"/>
+              </w:numPr>
+              <w:spacing w:line="40" w:lineRule="atLeast"/>
+              <w:ind w:left="193" w:hanging="142"/>
+              <w:rPr>
+                <w:ins w:id="391" w:author="francisco javier gonzalez  garcia" w:date="2026-09-24T22:52:00Z"/>
+                <w:sz w:val="16"/>
+                <w:szCs w:val="16"/>
+                <w:rPrChange w:id="392" w:author="francisco javier gonzalez  garcia" w:date="2026-09-24T22:59:00Z">
+                  <w:rPr>
+                    <w:ins w:id="393" w:author="francisco javier gonzalez  garcia" w:date="2026-09-24T22:52:00Z"/>
+                  </w:rPr>
+                </w:rPrChange>
+              </w:rPr>
+              <w:pPrChange w:id="394" w:author="francisco javier gonzalez  garcia" w:date="2026-09-24T22:59:00Z">
+                <w:pPr>
+                  <w:spacing w:line="40" w:lineRule="atLeast"/>
+                </w:pPr>
+              </w:pPrChange>
+            </w:pPr>
+            <w:ins w:id="395" w:author="francisco javier gonzalez  garcia" w:date="2026-09-24T22:52:00Z">
+              <w:r>
+                <w:rPr>
+                  <w:sz w:val="16"/>
+                  <w:szCs w:val="16"/>
+                  <w:rPrChange w:id="396" w:author="francisco javier gonzalez  garcia" w:date="2026-09-24T22:59:00Z">
+                    <w:rPr/>
+                  </w:rPrChange>
+                </w:rPr>
+                <w:t>Falta de visibilidad sobre el rendimiento global de los entrenadores y la ocupación real de las clases.</w:t>
+              </w:r>
+            </w:ins>
+          </w:p>
+          <w:p>
+            <w:pPr>
+              <w:spacing w:line="40" w:lineRule="atLeast"/>
+              <w:rPr>
+                <w:ins w:id="397" w:author="francisco javier gonzalez  garcia" w:date="2026-09-24T22:52:00Z"/>
+                <w:sz w:val="16"/>
+                <w:szCs w:val="16"/>
+                <w:rPrChange w:id="398" w:author="francisco javier gonzalez  garcia" w:date="2026-09-24T22:52:00Z">
+                  <w:rPr>
+                    <w:ins w:id="399" w:author="francisco javier gonzalez  garcia" w:date="2026-09-24T22:52:00Z"/>
+                  </w:rPr>
+                </w:rPrChange>
+              </w:rPr>
+              <w:pPrChange w:id="400" w:author="francisco javier gonzalez  garcia" w:date="2026-09-24T22:52:00Z">
+                <w:pPr>
+                  <w:spacing w:line="40" w:lineRule="atLeast"/>
+                </w:pPr>
+              </w:pPrChange>
+            </w:pPr>
+            <w:ins w:id="401" w:author="francisco javier gonzalez  garcia" w:date="2026-09-24T22:52:00Z">
+              <w:r>
+                <w:rPr>
+                  <w:sz w:val="16"/>
+                  <w:szCs w:val="16"/>
+                  <w:rPrChange w:id="402" w:author="francisco javier gonzalez  garcia" w:date="2026-09-24T22:52:00Z">
+                    <w:rPr/>
+                  </w:rPrChange>
+                </w:rPr>
+                <w:t>Necesidades digitales:</w:t>
+              </w:r>
+            </w:ins>
+          </w:p>
+          <w:p>
+            <w:pPr>
+              <w:pStyle w:val="Prrafodelista"/>
+              <w:numPr>
+                <w:ilvl w:val="0"/>
+                <w:numId w:val="19"/>
+              </w:numPr>
+              <w:spacing w:line="40" w:lineRule="atLeast"/>
+              <w:ind w:left="193" w:hanging="142"/>
+              <w:rPr>
+                <w:ins w:id="403" w:author="francisco javier gonzalez  garcia" w:date="2026-09-24T22:52:00Z"/>
+                <w:sz w:val="16"/>
+                <w:szCs w:val="16"/>
+                <w:rPrChange w:id="404" w:author="francisco javier gonzalez  garcia" w:date="2026-09-24T23:00:00Z">
+                  <w:rPr>
+                    <w:ins w:id="405" w:author="francisco javier gonzalez  garcia" w:date="2026-09-24T22:52:00Z"/>
+                  </w:rPr>
+                </w:rPrChange>
+              </w:rPr>
+              <w:pPrChange w:id="406" w:author="francisco javier gonzalez  garcia" w:date="2026-09-24T23:00:00Z">
+                <w:pPr>
+                  <w:spacing w:line="40" w:lineRule="atLeast"/>
+                </w:pPr>
+              </w:pPrChange>
+            </w:pPr>
+            <w:ins w:id="407" w:author="francisco javier gonzalez  garcia" w:date="2026-09-24T22:52:00Z">
+              <w:r>
+                <w:rPr>
+                  <w:sz w:val="16"/>
+                  <w:szCs w:val="16"/>
+                  <w:rPrChange w:id="408" w:author="francisco javier gonzalez  garcia" w:date="2026-09-24T23:00:00Z">
+                    <w:rPr/>
+                  </w:rPrChange>
+                </w:rPr>
+                <w:t>Dashboard de métricas clave (KPIs): Panel principal interactivo con ingresos mensuales, tasa de churn (cancelaciones), nuevos registros y flujo de asistencia en tiempo real.</w:t>
+              </w:r>
+            </w:ins>
+          </w:p>
+          <w:p>
+            <w:pPr>
+              <w:pStyle w:val="Prrafodelista"/>
+              <w:numPr>
+                <w:ilvl w:val="0"/>
+                <w:numId w:val="19"/>
+              </w:numPr>
+              <w:spacing w:line="40" w:lineRule="atLeast"/>
+              <w:ind w:left="193" w:hanging="142"/>
+              <w:rPr>
+                <w:ins w:id="409" w:author="francisco javier gonzalez  garcia" w:date="2026-09-24T22:52:00Z"/>
+                <w:sz w:val="16"/>
+                <w:szCs w:val="16"/>
+                <w:rPrChange w:id="410" w:author="francisco javier gonzalez  garcia" w:date="2026-09-24T23:00:00Z">
+                  <w:rPr>
+                    <w:ins w:id="411" w:author="francisco javier gonzalez  garcia" w:date="2026-09-24T22:52:00Z"/>
+                  </w:rPr>
+                </w:rPrChange>
+              </w:rPr>
+              <w:pPrChange w:id="412" w:author="francisco javier gonzalez  garcia" w:date="2026-09-24T23:00:00Z">
+                <w:pPr>
+                  <w:spacing w:line="40" w:lineRule="atLeast"/>
+                </w:pPr>
+              </w:pPrChange>
+            </w:pPr>
+            <w:ins w:id="413" w:author="francisco javier gonzalez  garcia" w:date="2026-09-24T22:52:00Z">
+              <w:r>
+                <w:rPr>
+                  <w:sz w:val="16"/>
+                  <w:szCs w:val="16"/>
+                  <w:rPrChange w:id="414" w:author="francisco javier gonzalez  garcia" w:date="2026-09-24T23:00:00Z">
+                    <w:rPr/>
+                  </w:rPrChange>
+                </w:rPr>
+                <w:t>Gestión centralizada de socios y pagos: Control de estado de membresías, automatización de cobros recurrentes y emisión de alertas de morosidad.</w:t>
+              </w:r>
+            </w:ins>
+          </w:p>
+          <w:p>
+            <w:pPr>
+              <w:pStyle w:val="Prrafodelista"/>
+              <w:numPr>
+                <w:ilvl w:val="0"/>
+                <w:numId w:val="19"/>
+              </w:numPr>
+              <w:spacing w:line="40" w:lineRule="atLeast"/>
+              <w:ind w:left="193" w:hanging="142"/>
+              <w:rPr>
+                <w:ins w:id="415" w:author="francisco javier gonzalez  garcia" w:date="2026-09-24T22:52:00Z"/>
+                <w:sz w:val="16"/>
+                <w:szCs w:val="16"/>
+                <w:rPrChange w:id="416" w:author="francisco javier gonzalez  garcia" w:date="2026-09-24T23:00:00Z">
+                  <w:rPr>
+                    <w:ins w:id="417" w:author="francisco javier gonzalez  garcia" w:date="2026-09-24T22:52:00Z"/>
+                  </w:rPr>
+                </w:rPrChange>
+              </w:rPr>
+              <w:pPrChange w:id="418" w:author="francisco javier gonzalez  garcia" w:date="2026-09-24T23:00:00Z">
+                <w:pPr>
+                  <w:spacing w:line="40" w:lineRule="atLeast"/>
+                </w:pPr>
+              </w:pPrChange>
+            </w:pPr>
+            <w:ins w:id="419" w:author="francisco javier gonzalez  garcia" w:date="2026-09-24T22:52:00Z">
+              <w:r>
+                <w:rPr>
+                  <w:sz w:val="16"/>
+                  <w:szCs w:val="16"/>
+                  <w:rPrChange w:id="420" w:author="francisco javier gonzalez  garcia" w:date="2026-09-24T23:00:00Z">
+                    <w:rPr/>
+                  </w:rPrChange>
+                </w:rPr>
+                <w:t>Módulo de control de accesos e inventario: Integración rápida para validación de ingresos en puerta y catálogo de productos/suplementos vendidos en recepción.</w:t>
+              </w:r>
+            </w:ins>
+          </w:p>
+          <w:p>
+            <w:pPr>
+              <w:pStyle w:val="Prrafodelista"/>
+              <w:numPr>
+                <w:ilvl w:val="0"/>
+                <w:numId w:val="19"/>
+              </w:numPr>
+              <w:spacing w:line="40" w:lineRule="atLeast"/>
+              <w:ind w:left="193" w:hanging="142"/>
+              <w:rPr>
+                <w:ins w:id="421" w:author="francisco javier gonzalez  garcia" w:date="2026-09-24T22:52:00Z"/>
+                <w:sz w:val="16"/>
+                <w:szCs w:val="16"/>
+                <w:rPrChange w:id="422" w:author="francisco javier gonzalez  garcia" w:date="2026-09-24T23:00:00Z">
+                  <w:rPr>
+                    <w:ins w:id="423" w:author="francisco javier gonzalez  garcia" w:date="2026-09-24T22:52:00Z"/>
+                  </w:rPr>
+                </w:rPrChange>
+              </w:rPr>
+              <w:pPrChange w:id="424" w:author="francisco javier gonzalez  garcia" w:date="2026-09-24T23:00:00Z">
+                <w:pPr>
+                  <w:spacing w:line="40" w:lineRule="atLeast"/>
+                </w:pPr>
+              </w:pPrChange>
+            </w:pPr>
+            <w:ins w:id="425" w:author="francisco javier gonzalez  garcia" w:date="2026-09-24T22:52:00Z">
+              <w:r>
+                <w:rPr>
+                  <w:sz w:val="16"/>
+                  <w:szCs w:val="16"/>
+                  <w:rPrChange w:id="426" w:author="francisco javier gonzalez  garcia" w:date="2026-09-24T23:00:00Z">
+                    <w:rPr/>
+                  </w:rPrChange>
+                </w:rPr>
+                <w:t>Gestión de roles y permisos: Administración de accesos diferenciados para entrenadores, recepcionistas y personal operativo.</w:t>
+              </w:r>
+            </w:ins>
+          </w:p>
+          <w:p>
+            <w:pPr>
+              <w:spacing w:line="40" w:lineRule="atLeast"/>
+              <w:rPr>
+                <w:ins w:id="427" w:author="francisco javier gonzalez  garcia" w:date="2026-09-24T22:52:00Z"/>
+                <w:sz w:val="16"/>
+                <w:szCs w:val="16"/>
+                <w:rPrChange w:id="428" w:author="francisco javier gonzalez  garcia" w:date="2026-09-24T22:52:00Z">
+                  <w:rPr>
+                    <w:ins w:id="429" w:author="francisco javier gonzalez  garcia" w:date="2026-09-24T22:52:00Z"/>
+                  </w:rPr>
+                </w:rPrChange>
+              </w:rPr>
+              <w:pPrChange w:id="430" w:author="francisco javier gonzalez  garcia" w:date="2026-09-24T22:52:00Z">
+                <w:pPr>
+                  <w:spacing w:line="40" w:lineRule="atLeast"/>
+                </w:pPr>
+              </w:pPrChange>
+            </w:pPr>
+            <w:ins w:id="431" w:author="francisco javier gonzalez  garcia" w:date="2026-09-24T22:52:00Z">
+              <w:r>
+                <w:rPr>
+                  <w:sz w:val="16"/>
+                  <w:szCs w:val="16"/>
+                  <w:rPrChange w:id="432" w:author="francisco javier gonzalez  garcia" w:date="2026-09-24T22:52:00Z">
+                    <w:rPr/>
+                  </w:rPrChange>
+                </w:rPr>
+                <w:t>Motivación de uso:</w:t>
+              </w:r>
+            </w:ins>
+          </w:p>
+          <w:p>
+            <w:pPr>
+              <w:spacing w:line="40" w:lineRule="atLeast"/>
+              <w:rPr>
+                <w:ins w:id="433" w:author="francisco javier gonzalez  garcia" w:date="2026-09-24T22:40:00Z"/>
+              </w:rPr>
+              <w:pPrChange w:id="434" w:author="francisco javier gonzalez  garcia" w:date="2026-09-24T22:52:00Z">
+                <w:pPr>
+                  <w:spacing w:line="40" w:lineRule="atLeast"/>
+                </w:pPr>
+              </w:pPrChange>
+            </w:pPr>
+            <w:ins w:id="435" w:author="francisco javier gonzalez  garcia" w:date="2026-09-24T22:52:00Z">
+              <w:r>
+                <w:rPr>
+                  <w:sz w:val="16"/>
+                  <w:szCs w:val="16"/>
+                  <w:rPrChange w:id="436" w:author="francisco javier gonzalez  garcia" w:date="2026-09-24T22:52:00Z">
+                    <w:rPr/>
+                  </w:rPrChange>
+                </w:rPr>
+                <w:t>Tener el control total del negocio desde un solo lugar para reducir errores operativos, asegurar la estabilidad financiera del gimnasio y liberar tiempo operativo para enfocarse en la estrategia de expansión y mejora de instalaciones.</w:t>
+              </w:r>
+            </w:ins>
+          </w:p>
+        </w:tc>
+      </w:tr>
+    </w:tbl>
+    <w:p>
+      <w:pPr>
+        <w:spacing w:after="0" w:line="40" w:lineRule="atLeast"/>
+        <w:rPr>
+          <w:del w:id="437" w:author="francisco javier gonzalez  garcia" w:date="2026-09-24T22:27:00Z"/>
+        </w:rPr>
+        <w:pPrChange w:id="438" w:author="francisco javier gonzalez  garcia" w:date="2026-09-24T22:34:00Z">
+          <w:pPr>
+            <w:pStyle w:val="Ttulo1"/>
+          </w:pPr>
+        </w:pPrChange>
+      </w:pPr>
+      <w:del w:id="439" w:author="francisco javier gonzalez  garcia" w:date="2026-09-24T21:59:00Z">
+        <w:r>
+          <w:br w:type="page"/>
+        </w:r>
+      </w:del>
+    </w:p>
+    <w:p>
+      <w:pPr>
+        <w:spacing w:line="276" w:lineRule="auto"/>
+        <w:rPr>
+          <w:ins w:id="440" w:author="francisco javier gonzalez  garcia" w:date="2026-09-24T22:38:00Z"/>
+        </w:rPr>
+      </w:pPr>
+      <w:ins w:id="441" w:author="francisco javier gonzalez  garcia" w:date="2026-09-24T22:38:00Z">
+        <w:r>
+          <w:br w:type="page"/>
+        </w:r>
+      </w:ins>
+    </w:p>
+    <w:p>
+      <w:pPr>
+        <w:rPr>
+          <w:ins w:id="442" w:author="francisco javier gonzalez  garcia" w:date="2026-09-24T22:27:00Z"/>
+          <w:rPrChange w:id="443" w:author="francisco javier gonzalez  garcia" w:date="2026-09-24T22:27:00Z">
+            <w:rPr>
+              <w:ins w:id="444" w:author="francisco javier gonzalez  garcia" w:date="2026-09-24T22:27:00Z"/>
+            </w:rPr>
+          </w:rPrChange>
+        </w:rPr>
+        <w:pPrChange w:id="445" w:author="francisco javier gonzalez  garcia" w:date="2026-09-24T22:27:00Z">
+          <w:pPr/>
+        </w:pPrChange>
+      </w:pPr>
+    </w:p>
+    <w:p>
+      <w:pPr>
+        <w:pStyle w:val="Ttulo1"/>
       </w:pPr>
       <w:r>
-        <w:lastRenderedPageBreak/>
         <w:t>11. Referencias</w:t>
       </w:r>
     </w:p>
@@ -1566,7 +3864,7 @@
       <w:pPr>
         <w:spacing w:after="80"/>
         <w:rPr>
-          <w:ins w:id="65" w:author="francisco javier gonzalez  garcia" w:date="2026-09-22T22:31:00Z"/>
+          <w:ins w:id="446" w:author="francisco javier gonzalez  garcia" w:date="2026-09-22T22:31:00Z"/>
         </w:rPr>
       </w:pPr>
       <w:r>
@@ -1577,14 +3875,20 @@
       <w:pPr>
         <w:spacing w:after="80"/>
         <w:rPr>
-          <w:ins w:id="66" w:author="francisco javier gonzalez  garcia" w:date="2026-09-22T22:31:00Z"/>
+          <w:ins w:id="447" w:author="francisco javier gonzalez  garcia" w:date="2026-09-22T22:31:00Z"/>
         </w:rPr>
       </w:pPr>
     </w:p>
-    <w:customXmlInsRangeStart w:id="67" w:author="francisco javier gonzalez  garcia" w:date="2026-09-22T22:32:00Z"/>
+    <w:customXmlInsRangeStart w:id="448" w:author="francisco javier gonzalez  garcia" w:date="2026-09-22T22:32:00Z"/>
     <w:sdt>
       <w:sdtPr>
         <w:rPr>
+          <w:rFonts w:ascii="Calibri" w:eastAsiaTheme="minorEastAsia" w:hAnsi="Calibri" w:cstheme="minorBidi"/>
+          <w:b w:val="0"/>
+          <w:bCs w:val="0"/>
+          <w:color w:val="auto"/>
+          <w:sz w:val="22"/>
+          <w:szCs w:val="22"/>
           <w:lang w:val="es-ES"/>
         </w:rPr>
         <w:id w:val="682404742"/>
@@ -1595,25 +3899,19 @@
       </w:sdtPr>
       <w:sdtEndPr>
         <w:rPr>
-          <w:rFonts w:ascii="Calibri" w:eastAsiaTheme="minorEastAsia" w:hAnsi="Calibri" w:cstheme="minorBidi"/>
-          <w:b w:val="0"/>
-          <w:bCs w:val="0"/>
-          <w:color w:val="auto"/>
-          <w:sz w:val="22"/>
-          <w:szCs w:val="22"/>
           <w:lang w:val="es-MX"/>
         </w:rPr>
       </w:sdtEndPr>
       <w:sdtContent>
-        <w:customXmlInsRangeEnd w:id="67"/>
+        <w:customXmlInsRangeEnd w:id="448"/>
         <w:p>
           <w:pPr>
             <w:pStyle w:val="Ttulo1"/>
             <w:rPr>
-              <w:ins w:id="68" w:author="francisco javier gonzalez  garcia" w:date="2026-09-22T22:32:00Z"/>
+              <w:ins w:id="449" w:author="francisco javier gonzalez  garcia" w:date="2026-09-22T22:32:00Z"/>
             </w:rPr>
           </w:pPr>
-          <w:ins w:id="69" w:author="francisco javier gonzalez  garcia" w:date="2026-09-22T22:32:00Z">
+          <w:ins w:id="450" w:author="francisco javier gonzalez  garcia" w:date="2026-09-22T22:32:00Z">
             <w:r>
               <w:rPr>
                 <w:lang w:val="es-ES"/>
@@ -1622,14 +3920,15 @@
             </w:r>
           </w:ins>
         </w:p>
-        <w:customXmlInsRangeStart w:id="70" w:author="francisco javier gonzalez  garcia" w:date="2026-09-22T22:32:00Z"/>
+        <w:customXmlInsRangeStart w:id="451" w:author="francisco javier gonzalez  garcia" w:date="2026-09-22T22:32:00Z"/>
         <w:sdt>
           <w:sdtPr>
             <w:id w:val="-573587230"/>
             <w:bibliography/>
           </w:sdtPr>
+          <w:sdtEndPr/>
           <w:sdtContent>
-            <w:customXmlInsRangeEnd w:id="70"/>
+            <w:customXmlInsRangeEnd w:id="451"/>
             <w:p>
               <w:pPr>
                 <w:pStyle w:val="Bibliografa"/>
@@ -1641,7 +3940,7 @@
                   <w:lang w:val="es-ES"/>
                 </w:rPr>
               </w:pPr>
-              <w:ins w:id="71" w:author="francisco javier gonzalez  garcia" w:date="2026-09-22T22:32:00Z">
+              <w:ins w:id="452" w:author="francisco javier gonzalez  garcia" w:date="2026-09-22T22:32:00Z">
                 <w:r>
                   <w:fldChar w:fldCharType="begin"/>
                 </w:r>
@@ -1679,10 +3978,10 @@
             <w:p>
               <w:pPr>
                 <w:rPr>
-                  <w:ins w:id="72" w:author="francisco javier gonzalez  garcia" w:date="2026-09-22T22:32:00Z"/>
+                  <w:ins w:id="453" w:author="francisco javier gonzalez  garcia" w:date="2026-09-22T22:32:00Z"/>
                 </w:rPr>
               </w:pPr>
-              <w:ins w:id="73" w:author="francisco javier gonzalez  garcia" w:date="2026-09-22T22:32:00Z">
+              <w:ins w:id="454" w:author="francisco javier gonzalez  garcia" w:date="2026-09-22T22:32:00Z">
                 <w:r>
                   <w:rPr>
                     <w:b/>
@@ -1692,24 +3991,94 @@
                 </w:r>
               </w:ins>
             </w:p>
-            <w:customXmlInsRangeStart w:id="74" w:author="francisco javier gonzalez  garcia" w:date="2026-09-22T22:32:00Z"/>
+            <w:customXmlInsRangeStart w:id="455" w:author="francisco javier gonzalez  garcia" w:date="2026-09-22T22:32:00Z"/>
           </w:sdtContent>
         </w:sdt>
-        <w:customXmlInsRangeEnd w:id="74"/>
-        <w:customXmlInsRangeStart w:id="75" w:author="francisco javier gonzalez  garcia" w:date="2026-09-22T22:32:00Z"/>
+        <w:customXmlInsRangeEnd w:id="455"/>
+        <w:customXmlInsRangeStart w:id="456" w:author="francisco javier gonzalez  garcia" w:date="2026-09-22T22:32:00Z"/>
       </w:sdtContent>
     </w:sdt>
-    <w:customXmlInsRangeEnd w:id="75"/>
+    <w:customXmlInsRangeEnd w:id="456"/>
     <w:p>
       <w:pPr>
         <w:spacing w:after="80"/>
       </w:pPr>
+      <w:ins w:id="457" w:author="francisco javier gonzalez  garcia" w:date="2026-09-24T23:01:00Z">
+        <w:r>
+          <w:t>Comentarios: para el desarrollo de los p</w:t>
+        </w:r>
+      </w:ins>
+      <w:ins w:id="458" w:author="francisco javier gonzalez  garcia" w:date="2026-09-24T23:02:00Z">
+        <w:r>
+          <w:t>erfiles se usó Google Gemini Flash con la siguiente plantilla de P</w:t>
+        </w:r>
+      </w:ins>
+      <w:ins w:id="459" w:author="francisco javier gonzalez  garcia" w:date="2026-09-24T23:03:00Z">
+        <w:r>
+          <w:t xml:space="preserve">rompt; </w:t>
+        </w:r>
+        <w:r>
+          <w:t>para usuarios de un gimnasio. considera que estamos en la fase de UI / UX y requerimos definir un arquetipo para el usuario Administrador encargado del Gimnasio, que contemple los siguientes aspectos:</w:t>
+        </w:r>
+        <w:r>
+          <w:t xml:space="preserve"> </w:t>
+        </w:r>
+        <w:r>
+          <w:t>Nombre ficticio</w:t>
+        </w:r>
+        <w:r>
+          <w:t xml:space="preserve">, </w:t>
+        </w:r>
+        <w:r>
+          <w:t>Edad</w:t>
+        </w:r>
+        <w:r>
+          <w:t xml:space="preserve">, </w:t>
+        </w:r>
+        <w:r>
+          <w:t>Objetivo principal</w:t>
+        </w:r>
+        <w:r>
+          <w:t xml:space="preserve">, </w:t>
+        </w:r>
+        <w:r>
+          <w:t>Frustraciones</w:t>
+        </w:r>
+        <w:r>
+          <w:t>, N</w:t>
+        </w:r>
+        <w:r>
+          <w:t>ecesidades digitales</w:t>
+        </w:r>
+        <w:r>
+          <w:t xml:space="preserve">, </w:t>
+        </w:r>
+        <w:r>
+          <w:t>Nivel tecnológico</w:t>
+        </w:r>
+        <w:r>
+          <w:t xml:space="preserve">, </w:t>
+        </w:r>
+        <w:r>
+          <w:t>Motivación de uso.</w:t>
+        </w:r>
+      </w:ins>
+      <w:ins w:id="460" w:author="francisco javier gonzalez  garcia" w:date="2026-09-24T23:02:00Z">
+        <w:r>
+          <w:t xml:space="preserve">  </w:t>
+        </w:r>
+      </w:ins>
     </w:p>
     <w:sectPr>
       <w:pgSz w:w="12240" w:h="15840"/>
-      <w:pgMar w:top="1440" w:right="1440" w:bottom="1440" w:left="1440" w:header="720" w:footer="720" w:gutter="0"/>
+      <w:pgMar w:top="1134" w:right="1440" w:bottom="993" w:left="1440" w:header="720" w:footer="720" w:gutter="0"/>
       <w:cols w:space="720"/>
       <w:docGrid w:linePitch="360"/>
+      <w:sectPrChange w:id="461" w:author="francisco javier gonzalez  garcia" w:date="2026-09-24T22:55:00Z">
+        <w:sectPr>
+          <w:pgMar w:top="1440" w:right="1440" w:bottom="1440" w:left="1440" w:header="720" w:footer="720" w:gutter="0"/>
+        </w:sectPr>
+      </w:sectPrChange>
     </w:sectPr>
   </w:body>
 </w:document>
@@ -1885,6 +4254,1136 @@
       </w:pPr>
       <w:rPr>
         <w:rFonts w:ascii="Symbol" w:hAnsi="Symbol" w:hint="default"/>
+      </w:rPr>
+    </w:lvl>
+  </w:abstractNum>
+  <w:abstractNum w:abstractNumId="9" w15:restartNumberingAfterBreak="0">
+    <w:nsid w:val="0C8331A1"/>
+    <w:multiLevelType w:val="hybridMultilevel"/>
+    <w:tmpl w:val="593CE210"/>
+    <w:lvl w:ilvl="0" w:tplc="080A0001">
+      <w:start w:val="1"/>
+      <w:numFmt w:val="bullet"/>
+      <w:lvlText w:val=""/>
+      <w:lvlJc w:val="left"/>
+      <w:pPr>
+        <w:ind w:left="720" w:hanging="360"/>
+      </w:pPr>
+      <w:rPr>
+        <w:rFonts w:ascii="Symbol" w:hAnsi="Symbol" w:hint="default"/>
+      </w:rPr>
+    </w:lvl>
+    <w:lvl w:ilvl="1" w:tplc="080A0003" w:tentative="1">
+      <w:start w:val="1"/>
+      <w:numFmt w:val="bullet"/>
+      <w:lvlText w:val="o"/>
+      <w:lvlJc w:val="left"/>
+      <w:pPr>
+        <w:ind w:left="1440" w:hanging="360"/>
+      </w:pPr>
+      <w:rPr>
+        <w:rFonts w:ascii="Courier New" w:hAnsi="Courier New" w:cs="Courier New" w:hint="default"/>
+      </w:rPr>
+    </w:lvl>
+    <w:lvl w:ilvl="2" w:tplc="080A0005" w:tentative="1">
+      <w:start w:val="1"/>
+      <w:numFmt w:val="bullet"/>
+      <w:lvlText w:val=""/>
+      <w:lvlJc w:val="left"/>
+      <w:pPr>
+        <w:ind w:left="2160" w:hanging="360"/>
+      </w:pPr>
+      <w:rPr>
+        <w:rFonts w:ascii="Wingdings" w:hAnsi="Wingdings" w:hint="default"/>
+      </w:rPr>
+    </w:lvl>
+    <w:lvl w:ilvl="3" w:tplc="080A0001" w:tentative="1">
+      <w:start w:val="1"/>
+      <w:numFmt w:val="bullet"/>
+      <w:lvlText w:val=""/>
+      <w:lvlJc w:val="left"/>
+      <w:pPr>
+        <w:ind w:left="2880" w:hanging="360"/>
+      </w:pPr>
+      <w:rPr>
+        <w:rFonts w:ascii="Symbol" w:hAnsi="Symbol" w:hint="default"/>
+      </w:rPr>
+    </w:lvl>
+    <w:lvl w:ilvl="4" w:tplc="080A0003" w:tentative="1">
+      <w:start w:val="1"/>
+      <w:numFmt w:val="bullet"/>
+      <w:lvlText w:val="o"/>
+      <w:lvlJc w:val="left"/>
+      <w:pPr>
+        <w:ind w:left="3600" w:hanging="360"/>
+      </w:pPr>
+      <w:rPr>
+        <w:rFonts w:ascii="Courier New" w:hAnsi="Courier New" w:cs="Courier New" w:hint="default"/>
+      </w:rPr>
+    </w:lvl>
+    <w:lvl w:ilvl="5" w:tplc="080A0005" w:tentative="1">
+      <w:start w:val="1"/>
+      <w:numFmt w:val="bullet"/>
+      <w:lvlText w:val=""/>
+      <w:lvlJc w:val="left"/>
+      <w:pPr>
+        <w:ind w:left="4320" w:hanging="360"/>
+      </w:pPr>
+      <w:rPr>
+        <w:rFonts w:ascii="Wingdings" w:hAnsi="Wingdings" w:hint="default"/>
+      </w:rPr>
+    </w:lvl>
+    <w:lvl w:ilvl="6" w:tplc="080A0001" w:tentative="1">
+      <w:start w:val="1"/>
+      <w:numFmt w:val="bullet"/>
+      <w:lvlText w:val=""/>
+      <w:lvlJc w:val="left"/>
+      <w:pPr>
+        <w:ind w:left="5040" w:hanging="360"/>
+      </w:pPr>
+      <w:rPr>
+        <w:rFonts w:ascii="Symbol" w:hAnsi="Symbol" w:hint="default"/>
+      </w:rPr>
+    </w:lvl>
+    <w:lvl w:ilvl="7" w:tplc="080A0003" w:tentative="1">
+      <w:start w:val="1"/>
+      <w:numFmt w:val="bullet"/>
+      <w:lvlText w:val="o"/>
+      <w:lvlJc w:val="left"/>
+      <w:pPr>
+        <w:ind w:left="5760" w:hanging="360"/>
+      </w:pPr>
+      <w:rPr>
+        <w:rFonts w:ascii="Courier New" w:hAnsi="Courier New" w:cs="Courier New" w:hint="default"/>
+      </w:rPr>
+    </w:lvl>
+    <w:lvl w:ilvl="8" w:tplc="080A0005" w:tentative="1">
+      <w:start w:val="1"/>
+      <w:numFmt w:val="bullet"/>
+      <w:lvlText w:val=""/>
+      <w:lvlJc w:val="left"/>
+      <w:pPr>
+        <w:ind w:left="6480" w:hanging="360"/>
+      </w:pPr>
+      <w:rPr>
+        <w:rFonts w:ascii="Wingdings" w:hAnsi="Wingdings" w:hint="default"/>
+      </w:rPr>
+    </w:lvl>
+  </w:abstractNum>
+  <w:abstractNum w:abstractNumId="10" w15:restartNumberingAfterBreak="0">
+    <w:nsid w:val="0F3D3DFA"/>
+    <w:multiLevelType w:val="hybridMultilevel"/>
+    <w:tmpl w:val="D0501012"/>
+    <w:lvl w:ilvl="0" w:tplc="080A0001">
+      <w:start w:val="1"/>
+      <w:numFmt w:val="bullet"/>
+      <w:lvlText w:val=""/>
+      <w:lvlJc w:val="left"/>
+      <w:pPr>
+        <w:ind w:left="360" w:hanging="360"/>
+      </w:pPr>
+      <w:rPr>
+        <w:rFonts w:ascii="Symbol" w:hAnsi="Symbol" w:hint="default"/>
+      </w:rPr>
+    </w:lvl>
+    <w:lvl w:ilvl="1" w:tplc="080A0003" w:tentative="1">
+      <w:start w:val="1"/>
+      <w:numFmt w:val="bullet"/>
+      <w:lvlText w:val="o"/>
+      <w:lvlJc w:val="left"/>
+      <w:pPr>
+        <w:ind w:left="1080" w:hanging="360"/>
+      </w:pPr>
+      <w:rPr>
+        <w:rFonts w:ascii="Courier New" w:hAnsi="Courier New" w:cs="Courier New" w:hint="default"/>
+      </w:rPr>
+    </w:lvl>
+    <w:lvl w:ilvl="2" w:tplc="080A0005" w:tentative="1">
+      <w:start w:val="1"/>
+      <w:numFmt w:val="bullet"/>
+      <w:lvlText w:val=""/>
+      <w:lvlJc w:val="left"/>
+      <w:pPr>
+        <w:ind w:left="1800" w:hanging="360"/>
+      </w:pPr>
+      <w:rPr>
+        <w:rFonts w:ascii="Wingdings" w:hAnsi="Wingdings" w:hint="default"/>
+      </w:rPr>
+    </w:lvl>
+    <w:lvl w:ilvl="3" w:tplc="080A0001" w:tentative="1">
+      <w:start w:val="1"/>
+      <w:numFmt w:val="bullet"/>
+      <w:lvlText w:val=""/>
+      <w:lvlJc w:val="left"/>
+      <w:pPr>
+        <w:ind w:left="2520" w:hanging="360"/>
+      </w:pPr>
+      <w:rPr>
+        <w:rFonts w:ascii="Symbol" w:hAnsi="Symbol" w:hint="default"/>
+      </w:rPr>
+    </w:lvl>
+    <w:lvl w:ilvl="4" w:tplc="080A0003" w:tentative="1">
+      <w:start w:val="1"/>
+      <w:numFmt w:val="bullet"/>
+      <w:lvlText w:val="o"/>
+      <w:lvlJc w:val="left"/>
+      <w:pPr>
+        <w:ind w:left="3240" w:hanging="360"/>
+      </w:pPr>
+      <w:rPr>
+        <w:rFonts w:ascii="Courier New" w:hAnsi="Courier New" w:cs="Courier New" w:hint="default"/>
+      </w:rPr>
+    </w:lvl>
+    <w:lvl w:ilvl="5" w:tplc="080A0005" w:tentative="1">
+      <w:start w:val="1"/>
+      <w:numFmt w:val="bullet"/>
+      <w:lvlText w:val=""/>
+      <w:lvlJc w:val="left"/>
+      <w:pPr>
+        <w:ind w:left="3960" w:hanging="360"/>
+      </w:pPr>
+      <w:rPr>
+        <w:rFonts w:ascii="Wingdings" w:hAnsi="Wingdings" w:hint="default"/>
+      </w:rPr>
+    </w:lvl>
+    <w:lvl w:ilvl="6" w:tplc="080A0001" w:tentative="1">
+      <w:start w:val="1"/>
+      <w:numFmt w:val="bullet"/>
+      <w:lvlText w:val=""/>
+      <w:lvlJc w:val="left"/>
+      <w:pPr>
+        <w:ind w:left="4680" w:hanging="360"/>
+      </w:pPr>
+      <w:rPr>
+        <w:rFonts w:ascii="Symbol" w:hAnsi="Symbol" w:hint="default"/>
+      </w:rPr>
+    </w:lvl>
+    <w:lvl w:ilvl="7" w:tplc="080A0003" w:tentative="1">
+      <w:start w:val="1"/>
+      <w:numFmt w:val="bullet"/>
+      <w:lvlText w:val="o"/>
+      <w:lvlJc w:val="left"/>
+      <w:pPr>
+        <w:ind w:left="5400" w:hanging="360"/>
+      </w:pPr>
+      <w:rPr>
+        <w:rFonts w:ascii="Courier New" w:hAnsi="Courier New" w:cs="Courier New" w:hint="default"/>
+      </w:rPr>
+    </w:lvl>
+    <w:lvl w:ilvl="8" w:tplc="080A0005" w:tentative="1">
+      <w:start w:val="1"/>
+      <w:numFmt w:val="bullet"/>
+      <w:lvlText w:val=""/>
+      <w:lvlJc w:val="left"/>
+      <w:pPr>
+        <w:ind w:left="6120" w:hanging="360"/>
+      </w:pPr>
+      <w:rPr>
+        <w:rFonts w:ascii="Wingdings" w:hAnsi="Wingdings" w:hint="default"/>
+      </w:rPr>
+    </w:lvl>
+  </w:abstractNum>
+  <w:abstractNum w:abstractNumId="11" w15:restartNumberingAfterBreak="0">
+    <w:nsid w:val="210C0C5A"/>
+    <w:multiLevelType w:val="hybridMultilevel"/>
+    <w:tmpl w:val="373C6024"/>
+    <w:lvl w:ilvl="0" w:tplc="080A0001">
+      <w:start w:val="1"/>
+      <w:numFmt w:val="bullet"/>
+      <w:lvlText w:val=""/>
+      <w:lvlJc w:val="left"/>
+      <w:pPr>
+        <w:ind w:left="360" w:hanging="360"/>
+      </w:pPr>
+      <w:rPr>
+        <w:rFonts w:ascii="Symbol" w:hAnsi="Symbol" w:hint="default"/>
+      </w:rPr>
+    </w:lvl>
+    <w:lvl w:ilvl="1" w:tplc="080A0003" w:tentative="1">
+      <w:start w:val="1"/>
+      <w:numFmt w:val="bullet"/>
+      <w:lvlText w:val="o"/>
+      <w:lvlJc w:val="left"/>
+      <w:pPr>
+        <w:ind w:left="1080" w:hanging="360"/>
+      </w:pPr>
+      <w:rPr>
+        <w:rFonts w:ascii="Courier New" w:hAnsi="Courier New" w:cs="Courier New" w:hint="default"/>
+      </w:rPr>
+    </w:lvl>
+    <w:lvl w:ilvl="2" w:tplc="080A0005" w:tentative="1">
+      <w:start w:val="1"/>
+      <w:numFmt w:val="bullet"/>
+      <w:lvlText w:val=""/>
+      <w:lvlJc w:val="left"/>
+      <w:pPr>
+        <w:ind w:left="1800" w:hanging="360"/>
+      </w:pPr>
+      <w:rPr>
+        <w:rFonts w:ascii="Wingdings" w:hAnsi="Wingdings" w:hint="default"/>
+      </w:rPr>
+    </w:lvl>
+    <w:lvl w:ilvl="3" w:tplc="080A0001" w:tentative="1">
+      <w:start w:val="1"/>
+      <w:numFmt w:val="bullet"/>
+      <w:lvlText w:val=""/>
+      <w:lvlJc w:val="left"/>
+      <w:pPr>
+        <w:ind w:left="2520" w:hanging="360"/>
+      </w:pPr>
+      <w:rPr>
+        <w:rFonts w:ascii="Symbol" w:hAnsi="Symbol" w:hint="default"/>
+      </w:rPr>
+    </w:lvl>
+    <w:lvl w:ilvl="4" w:tplc="080A0003" w:tentative="1">
+      <w:start w:val="1"/>
+      <w:numFmt w:val="bullet"/>
+      <w:lvlText w:val="o"/>
+      <w:lvlJc w:val="left"/>
+      <w:pPr>
+        <w:ind w:left="3240" w:hanging="360"/>
+      </w:pPr>
+      <w:rPr>
+        <w:rFonts w:ascii="Courier New" w:hAnsi="Courier New" w:cs="Courier New" w:hint="default"/>
+      </w:rPr>
+    </w:lvl>
+    <w:lvl w:ilvl="5" w:tplc="080A0005" w:tentative="1">
+      <w:start w:val="1"/>
+      <w:numFmt w:val="bullet"/>
+      <w:lvlText w:val=""/>
+      <w:lvlJc w:val="left"/>
+      <w:pPr>
+        <w:ind w:left="3960" w:hanging="360"/>
+      </w:pPr>
+      <w:rPr>
+        <w:rFonts w:ascii="Wingdings" w:hAnsi="Wingdings" w:hint="default"/>
+      </w:rPr>
+    </w:lvl>
+    <w:lvl w:ilvl="6" w:tplc="080A0001" w:tentative="1">
+      <w:start w:val="1"/>
+      <w:numFmt w:val="bullet"/>
+      <w:lvlText w:val=""/>
+      <w:lvlJc w:val="left"/>
+      <w:pPr>
+        <w:ind w:left="4680" w:hanging="360"/>
+      </w:pPr>
+      <w:rPr>
+        <w:rFonts w:ascii="Symbol" w:hAnsi="Symbol" w:hint="default"/>
+      </w:rPr>
+    </w:lvl>
+    <w:lvl w:ilvl="7" w:tplc="080A0003" w:tentative="1">
+      <w:start w:val="1"/>
+      <w:numFmt w:val="bullet"/>
+      <w:lvlText w:val="o"/>
+      <w:lvlJc w:val="left"/>
+      <w:pPr>
+        <w:ind w:left="5400" w:hanging="360"/>
+      </w:pPr>
+      <w:rPr>
+        <w:rFonts w:ascii="Courier New" w:hAnsi="Courier New" w:cs="Courier New" w:hint="default"/>
+      </w:rPr>
+    </w:lvl>
+    <w:lvl w:ilvl="8" w:tplc="080A0005" w:tentative="1">
+      <w:start w:val="1"/>
+      <w:numFmt w:val="bullet"/>
+      <w:lvlText w:val=""/>
+      <w:lvlJc w:val="left"/>
+      <w:pPr>
+        <w:ind w:left="6120" w:hanging="360"/>
+      </w:pPr>
+      <w:rPr>
+        <w:rFonts w:ascii="Wingdings" w:hAnsi="Wingdings" w:hint="default"/>
+      </w:rPr>
+    </w:lvl>
+  </w:abstractNum>
+  <w:abstractNum w:abstractNumId="12" w15:restartNumberingAfterBreak="0">
+    <w:nsid w:val="2C9629FF"/>
+    <w:multiLevelType w:val="hybridMultilevel"/>
+    <w:tmpl w:val="A2BA5FEC"/>
+    <w:lvl w:ilvl="0" w:tplc="080A0001">
+      <w:start w:val="1"/>
+      <w:numFmt w:val="bullet"/>
+      <w:lvlText w:val=""/>
+      <w:lvlJc w:val="left"/>
+      <w:pPr>
+        <w:ind w:left="720" w:hanging="360"/>
+      </w:pPr>
+      <w:rPr>
+        <w:rFonts w:ascii="Symbol" w:hAnsi="Symbol" w:hint="default"/>
+      </w:rPr>
+    </w:lvl>
+    <w:lvl w:ilvl="1" w:tplc="080A0003" w:tentative="1">
+      <w:start w:val="1"/>
+      <w:numFmt w:val="bullet"/>
+      <w:lvlText w:val="o"/>
+      <w:lvlJc w:val="left"/>
+      <w:pPr>
+        <w:ind w:left="1440" w:hanging="360"/>
+      </w:pPr>
+      <w:rPr>
+        <w:rFonts w:ascii="Courier New" w:hAnsi="Courier New" w:cs="Courier New" w:hint="default"/>
+      </w:rPr>
+    </w:lvl>
+    <w:lvl w:ilvl="2" w:tplc="080A0005" w:tentative="1">
+      <w:start w:val="1"/>
+      <w:numFmt w:val="bullet"/>
+      <w:lvlText w:val=""/>
+      <w:lvlJc w:val="left"/>
+      <w:pPr>
+        <w:ind w:left="2160" w:hanging="360"/>
+      </w:pPr>
+      <w:rPr>
+        <w:rFonts w:ascii="Wingdings" w:hAnsi="Wingdings" w:hint="default"/>
+      </w:rPr>
+    </w:lvl>
+    <w:lvl w:ilvl="3" w:tplc="080A0001" w:tentative="1">
+      <w:start w:val="1"/>
+      <w:numFmt w:val="bullet"/>
+      <w:lvlText w:val=""/>
+      <w:lvlJc w:val="left"/>
+      <w:pPr>
+        <w:ind w:left="2880" w:hanging="360"/>
+      </w:pPr>
+      <w:rPr>
+        <w:rFonts w:ascii="Symbol" w:hAnsi="Symbol" w:hint="default"/>
+      </w:rPr>
+    </w:lvl>
+    <w:lvl w:ilvl="4" w:tplc="080A0003" w:tentative="1">
+      <w:start w:val="1"/>
+      <w:numFmt w:val="bullet"/>
+      <w:lvlText w:val="o"/>
+      <w:lvlJc w:val="left"/>
+      <w:pPr>
+        <w:ind w:left="3600" w:hanging="360"/>
+      </w:pPr>
+      <w:rPr>
+        <w:rFonts w:ascii="Courier New" w:hAnsi="Courier New" w:cs="Courier New" w:hint="default"/>
+      </w:rPr>
+    </w:lvl>
+    <w:lvl w:ilvl="5" w:tplc="080A0005" w:tentative="1">
+      <w:start w:val="1"/>
+      <w:numFmt w:val="bullet"/>
+      <w:lvlText w:val=""/>
+      <w:lvlJc w:val="left"/>
+      <w:pPr>
+        <w:ind w:left="4320" w:hanging="360"/>
+      </w:pPr>
+      <w:rPr>
+        <w:rFonts w:ascii="Wingdings" w:hAnsi="Wingdings" w:hint="default"/>
+      </w:rPr>
+    </w:lvl>
+    <w:lvl w:ilvl="6" w:tplc="080A0001" w:tentative="1">
+      <w:start w:val="1"/>
+      <w:numFmt w:val="bullet"/>
+      <w:lvlText w:val=""/>
+      <w:lvlJc w:val="left"/>
+      <w:pPr>
+        <w:ind w:left="5040" w:hanging="360"/>
+      </w:pPr>
+      <w:rPr>
+        <w:rFonts w:ascii="Symbol" w:hAnsi="Symbol" w:hint="default"/>
+      </w:rPr>
+    </w:lvl>
+    <w:lvl w:ilvl="7" w:tplc="080A0003" w:tentative="1">
+      <w:start w:val="1"/>
+      <w:numFmt w:val="bullet"/>
+      <w:lvlText w:val="o"/>
+      <w:lvlJc w:val="left"/>
+      <w:pPr>
+        <w:ind w:left="5760" w:hanging="360"/>
+      </w:pPr>
+      <w:rPr>
+        <w:rFonts w:ascii="Courier New" w:hAnsi="Courier New" w:cs="Courier New" w:hint="default"/>
+      </w:rPr>
+    </w:lvl>
+    <w:lvl w:ilvl="8" w:tplc="080A0005" w:tentative="1">
+      <w:start w:val="1"/>
+      <w:numFmt w:val="bullet"/>
+      <w:lvlText w:val=""/>
+      <w:lvlJc w:val="left"/>
+      <w:pPr>
+        <w:ind w:left="6480" w:hanging="360"/>
+      </w:pPr>
+      <w:rPr>
+        <w:rFonts w:ascii="Wingdings" w:hAnsi="Wingdings" w:hint="default"/>
+      </w:rPr>
+    </w:lvl>
+  </w:abstractNum>
+  <w:abstractNum w:abstractNumId="13" w15:restartNumberingAfterBreak="0">
+    <w:nsid w:val="34AA1A7E"/>
+    <w:multiLevelType w:val="hybridMultilevel"/>
+    <w:tmpl w:val="0E32DE72"/>
+    <w:lvl w:ilvl="0" w:tplc="080A0001">
+      <w:start w:val="1"/>
+      <w:numFmt w:val="bullet"/>
+      <w:lvlText w:val=""/>
+      <w:lvlJc w:val="left"/>
+      <w:pPr>
+        <w:ind w:left="360" w:hanging="360"/>
+      </w:pPr>
+      <w:rPr>
+        <w:rFonts w:ascii="Symbol" w:hAnsi="Symbol" w:hint="default"/>
+      </w:rPr>
+    </w:lvl>
+    <w:lvl w:ilvl="1" w:tplc="080A0003" w:tentative="1">
+      <w:start w:val="1"/>
+      <w:numFmt w:val="bullet"/>
+      <w:lvlText w:val="o"/>
+      <w:lvlJc w:val="left"/>
+      <w:pPr>
+        <w:ind w:left="1080" w:hanging="360"/>
+      </w:pPr>
+      <w:rPr>
+        <w:rFonts w:ascii="Courier New" w:hAnsi="Courier New" w:cs="Courier New" w:hint="default"/>
+      </w:rPr>
+    </w:lvl>
+    <w:lvl w:ilvl="2" w:tplc="080A0005" w:tentative="1">
+      <w:start w:val="1"/>
+      <w:numFmt w:val="bullet"/>
+      <w:lvlText w:val=""/>
+      <w:lvlJc w:val="left"/>
+      <w:pPr>
+        <w:ind w:left="1800" w:hanging="360"/>
+      </w:pPr>
+      <w:rPr>
+        <w:rFonts w:ascii="Wingdings" w:hAnsi="Wingdings" w:hint="default"/>
+      </w:rPr>
+    </w:lvl>
+    <w:lvl w:ilvl="3" w:tplc="080A0001" w:tentative="1">
+      <w:start w:val="1"/>
+      <w:numFmt w:val="bullet"/>
+      <w:lvlText w:val=""/>
+      <w:lvlJc w:val="left"/>
+      <w:pPr>
+        <w:ind w:left="2520" w:hanging="360"/>
+      </w:pPr>
+      <w:rPr>
+        <w:rFonts w:ascii="Symbol" w:hAnsi="Symbol" w:hint="default"/>
+      </w:rPr>
+    </w:lvl>
+    <w:lvl w:ilvl="4" w:tplc="080A0003" w:tentative="1">
+      <w:start w:val="1"/>
+      <w:numFmt w:val="bullet"/>
+      <w:lvlText w:val="o"/>
+      <w:lvlJc w:val="left"/>
+      <w:pPr>
+        <w:ind w:left="3240" w:hanging="360"/>
+      </w:pPr>
+      <w:rPr>
+        <w:rFonts w:ascii="Courier New" w:hAnsi="Courier New" w:cs="Courier New" w:hint="default"/>
+      </w:rPr>
+    </w:lvl>
+    <w:lvl w:ilvl="5" w:tplc="080A0005" w:tentative="1">
+      <w:start w:val="1"/>
+      <w:numFmt w:val="bullet"/>
+      <w:lvlText w:val=""/>
+      <w:lvlJc w:val="left"/>
+      <w:pPr>
+        <w:ind w:left="3960" w:hanging="360"/>
+      </w:pPr>
+      <w:rPr>
+        <w:rFonts w:ascii="Wingdings" w:hAnsi="Wingdings" w:hint="default"/>
+      </w:rPr>
+    </w:lvl>
+    <w:lvl w:ilvl="6" w:tplc="080A0001" w:tentative="1">
+      <w:start w:val="1"/>
+      <w:numFmt w:val="bullet"/>
+      <w:lvlText w:val=""/>
+      <w:lvlJc w:val="left"/>
+      <w:pPr>
+        <w:ind w:left="4680" w:hanging="360"/>
+      </w:pPr>
+      <w:rPr>
+        <w:rFonts w:ascii="Symbol" w:hAnsi="Symbol" w:hint="default"/>
+      </w:rPr>
+    </w:lvl>
+    <w:lvl w:ilvl="7" w:tplc="080A0003" w:tentative="1">
+      <w:start w:val="1"/>
+      <w:numFmt w:val="bullet"/>
+      <w:lvlText w:val="o"/>
+      <w:lvlJc w:val="left"/>
+      <w:pPr>
+        <w:ind w:left="5400" w:hanging="360"/>
+      </w:pPr>
+      <w:rPr>
+        <w:rFonts w:ascii="Courier New" w:hAnsi="Courier New" w:cs="Courier New" w:hint="default"/>
+      </w:rPr>
+    </w:lvl>
+    <w:lvl w:ilvl="8" w:tplc="080A0005" w:tentative="1">
+      <w:start w:val="1"/>
+      <w:numFmt w:val="bullet"/>
+      <w:lvlText w:val=""/>
+      <w:lvlJc w:val="left"/>
+      <w:pPr>
+        <w:ind w:left="6120" w:hanging="360"/>
+      </w:pPr>
+      <w:rPr>
+        <w:rFonts w:ascii="Wingdings" w:hAnsi="Wingdings" w:hint="default"/>
+      </w:rPr>
+    </w:lvl>
+  </w:abstractNum>
+  <w:abstractNum w:abstractNumId="14" w15:restartNumberingAfterBreak="0">
+    <w:nsid w:val="3BC64B87"/>
+    <w:multiLevelType w:val="hybridMultilevel"/>
+    <w:tmpl w:val="6756B5FC"/>
+    <w:lvl w:ilvl="0" w:tplc="080A0001">
+      <w:start w:val="1"/>
+      <w:numFmt w:val="bullet"/>
+      <w:lvlText w:val=""/>
+      <w:lvlJc w:val="left"/>
+      <w:pPr>
+        <w:ind w:left="720" w:hanging="360"/>
+      </w:pPr>
+      <w:rPr>
+        <w:rFonts w:ascii="Symbol" w:hAnsi="Symbol" w:hint="default"/>
+      </w:rPr>
+    </w:lvl>
+    <w:lvl w:ilvl="1" w:tplc="080A0003" w:tentative="1">
+      <w:start w:val="1"/>
+      <w:numFmt w:val="bullet"/>
+      <w:lvlText w:val="o"/>
+      <w:lvlJc w:val="left"/>
+      <w:pPr>
+        <w:ind w:left="1440" w:hanging="360"/>
+      </w:pPr>
+      <w:rPr>
+        <w:rFonts w:ascii="Courier New" w:hAnsi="Courier New" w:cs="Courier New" w:hint="default"/>
+      </w:rPr>
+    </w:lvl>
+    <w:lvl w:ilvl="2" w:tplc="080A0005" w:tentative="1">
+      <w:start w:val="1"/>
+      <w:numFmt w:val="bullet"/>
+      <w:lvlText w:val=""/>
+      <w:lvlJc w:val="left"/>
+      <w:pPr>
+        <w:ind w:left="2160" w:hanging="360"/>
+      </w:pPr>
+      <w:rPr>
+        <w:rFonts w:ascii="Wingdings" w:hAnsi="Wingdings" w:hint="default"/>
+      </w:rPr>
+    </w:lvl>
+    <w:lvl w:ilvl="3" w:tplc="080A0001" w:tentative="1">
+      <w:start w:val="1"/>
+      <w:numFmt w:val="bullet"/>
+      <w:lvlText w:val=""/>
+      <w:lvlJc w:val="left"/>
+      <w:pPr>
+        <w:ind w:left="2880" w:hanging="360"/>
+      </w:pPr>
+      <w:rPr>
+        <w:rFonts w:ascii="Symbol" w:hAnsi="Symbol" w:hint="default"/>
+      </w:rPr>
+    </w:lvl>
+    <w:lvl w:ilvl="4" w:tplc="080A0003" w:tentative="1">
+      <w:start w:val="1"/>
+      <w:numFmt w:val="bullet"/>
+      <w:lvlText w:val="o"/>
+      <w:lvlJc w:val="left"/>
+      <w:pPr>
+        <w:ind w:left="3600" w:hanging="360"/>
+      </w:pPr>
+      <w:rPr>
+        <w:rFonts w:ascii="Courier New" w:hAnsi="Courier New" w:cs="Courier New" w:hint="default"/>
+      </w:rPr>
+    </w:lvl>
+    <w:lvl w:ilvl="5" w:tplc="080A0005" w:tentative="1">
+      <w:start w:val="1"/>
+      <w:numFmt w:val="bullet"/>
+      <w:lvlText w:val=""/>
+      <w:lvlJc w:val="left"/>
+      <w:pPr>
+        <w:ind w:left="4320" w:hanging="360"/>
+      </w:pPr>
+      <w:rPr>
+        <w:rFonts w:ascii="Wingdings" w:hAnsi="Wingdings" w:hint="default"/>
+      </w:rPr>
+    </w:lvl>
+    <w:lvl w:ilvl="6" w:tplc="080A0001" w:tentative="1">
+      <w:start w:val="1"/>
+      <w:numFmt w:val="bullet"/>
+      <w:lvlText w:val=""/>
+      <w:lvlJc w:val="left"/>
+      <w:pPr>
+        <w:ind w:left="5040" w:hanging="360"/>
+      </w:pPr>
+      <w:rPr>
+        <w:rFonts w:ascii="Symbol" w:hAnsi="Symbol" w:hint="default"/>
+      </w:rPr>
+    </w:lvl>
+    <w:lvl w:ilvl="7" w:tplc="080A0003" w:tentative="1">
+      <w:start w:val="1"/>
+      <w:numFmt w:val="bullet"/>
+      <w:lvlText w:val="o"/>
+      <w:lvlJc w:val="left"/>
+      <w:pPr>
+        <w:ind w:left="5760" w:hanging="360"/>
+      </w:pPr>
+      <w:rPr>
+        <w:rFonts w:ascii="Courier New" w:hAnsi="Courier New" w:cs="Courier New" w:hint="default"/>
+      </w:rPr>
+    </w:lvl>
+    <w:lvl w:ilvl="8" w:tplc="080A0005" w:tentative="1">
+      <w:start w:val="1"/>
+      <w:numFmt w:val="bullet"/>
+      <w:lvlText w:val=""/>
+      <w:lvlJc w:val="left"/>
+      <w:pPr>
+        <w:ind w:left="6480" w:hanging="360"/>
+      </w:pPr>
+      <w:rPr>
+        <w:rFonts w:ascii="Wingdings" w:hAnsi="Wingdings" w:hint="default"/>
+      </w:rPr>
+    </w:lvl>
+  </w:abstractNum>
+  <w:abstractNum w:abstractNumId="15" w15:restartNumberingAfterBreak="0">
+    <w:nsid w:val="49202560"/>
+    <w:multiLevelType w:val="hybridMultilevel"/>
+    <w:tmpl w:val="E604C3B2"/>
+    <w:lvl w:ilvl="0" w:tplc="080A0001">
+      <w:start w:val="1"/>
+      <w:numFmt w:val="bullet"/>
+      <w:lvlText w:val=""/>
+      <w:lvlJc w:val="left"/>
+      <w:pPr>
+        <w:ind w:left="720" w:hanging="360"/>
+      </w:pPr>
+      <w:rPr>
+        <w:rFonts w:ascii="Symbol" w:hAnsi="Symbol" w:hint="default"/>
+      </w:rPr>
+    </w:lvl>
+    <w:lvl w:ilvl="1" w:tplc="080A0003" w:tentative="1">
+      <w:start w:val="1"/>
+      <w:numFmt w:val="bullet"/>
+      <w:lvlText w:val="o"/>
+      <w:lvlJc w:val="left"/>
+      <w:pPr>
+        <w:ind w:left="1440" w:hanging="360"/>
+      </w:pPr>
+      <w:rPr>
+        <w:rFonts w:ascii="Courier New" w:hAnsi="Courier New" w:cs="Courier New" w:hint="default"/>
+      </w:rPr>
+    </w:lvl>
+    <w:lvl w:ilvl="2" w:tplc="080A0005" w:tentative="1">
+      <w:start w:val="1"/>
+      <w:numFmt w:val="bullet"/>
+      <w:lvlText w:val=""/>
+      <w:lvlJc w:val="left"/>
+      <w:pPr>
+        <w:ind w:left="2160" w:hanging="360"/>
+      </w:pPr>
+      <w:rPr>
+        <w:rFonts w:ascii="Wingdings" w:hAnsi="Wingdings" w:hint="default"/>
+      </w:rPr>
+    </w:lvl>
+    <w:lvl w:ilvl="3" w:tplc="080A0001" w:tentative="1">
+      <w:start w:val="1"/>
+      <w:numFmt w:val="bullet"/>
+      <w:lvlText w:val=""/>
+      <w:lvlJc w:val="left"/>
+      <w:pPr>
+        <w:ind w:left="2880" w:hanging="360"/>
+      </w:pPr>
+      <w:rPr>
+        <w:rFonts w:ascii="Symbol" w:hAnsi="Symbol" w:hint="default"/>
+      </w:rPr>
+    </w:lvl>
+    <w:lvl w:ilvl="4" w:tplc="080A0003" w:tentative="1">
+      <w:start w:val="1"/>
+      <w:numFmt w:val="bullet"/>
+      <w:lvlText w:val="o"/>
+      <w:lvlJc w:val="left"/>
+      <w:pPr>
+        <w:ind w:left="3600" w:hanging="360"/>
+      </w:pPr>
+      <w:rPr>
+        <w:rFonts w:ascii="Courier New" w:hAnsi="Courier New" w:cs="Courier New" w:hint="default"/>
+      </w:rPr>
+    </w:lvl>
+    <w:lvl w:ilvl="5" w:tplc="080A0005" w:tentative="1">
+      <w:start w:val="1"/>
+      <w:numFmt w:val="bullet"/>
+      <w:lvlText w:val=""/>
+      <w:lvlJc w:val="left"/>
+      <w:pPr>
+        <w:ind w:left="4320" w:hanging="360"/>
+      </w:pPr>
+      <w:rPr>
+        <w:rFonts w:ascii="Wingdings" w:hAnsi="Wingdings" w:hint="default"/>
+      </w:rPr>
+    </w:lvl>
+    <w:lvl w:ilvl="6" w:tplc="080A0001" w:tentative="1">
+      <w:start w:val="1"/>
+      <w:numFmt w:val="bullet"/>
+      <w:lvlText w:val=""/>
+      <w:lvlJc w:val="left"/>
+      <w:pPr>
+        <w:ind w:left="5040" w:hanging="360"/>
+      </w:pPr>
+      <w:rPr>
+        <w:rFonts w:ascii="Symbol" w:hAnsi="Symbol" w:hint="default"/>
+      </w:rPr>
+    </w:lvl>
+    <w:lvl w:ilvl="7" w:tplc="080A0003" w:tentative="1">
+      <w:start w:val="1"/>
+      <w:numFmt w:val="bullet"/>
+      <w:lvlText w:val="o"/>
+      <w:lvlJc w:val="left"/>
+      <w:pPr>
+        <w:ind w:left="5760" w:hanging="360"/>
+      </w:pPr>
+      <w:rPr>
+        <w:rFonts w:ascii="Courier New" w:hAnsi="Courier New" w:cs="Courier New" w:hint="default"/>
+      </w:rPr>
+    </w:lvl>
+    <w:lvl w:ilvl="8" w:tplc="080A0005" w:tentative="1">
+      <w:start w:val="1"/>
+      <w:numFmt w:val="bullet"/>
+      <w:lvlText w:val=""/>
+      <w:lvlJc w:val="left"/>
+      <w:pPr>
+        <w:ind w:left="6480" w:hanging="360"/>
+      </w:pPr>
+      <w:rPr>
+        <w:rFonts w:ascii="Wingdings" w:hAnsi="Wingdings" w:hint="default"/>
+      </w:rPr>
+    </w:lvl>
+  </w:abstractNum>
+  <w:abstractNum w:abstractNumId="16" w15:restartNumberingAfterBreak="0">
+    <w:nsid w:val="4F75084A"/>
+    <w:multiLevelType w:val="hybridMultilevel"/>
+    <w:tmpl w:val="2624A1B0"/>
+    <w:lvl w:ilvl="0" w:tplc="080A0001">
+      <w:start w:val="1"/>
+      <w:numFmt w:val="bullet"/>
+      <w:lvlText w:val=""/>
+      <w:lvlJc w:val="left"/>
+      <w:pPr>
+        <w:ind w:left="720" w:hanging="360"/>
+      </w:pPr>
+      <w:rPr>
+        <w:rFonts w:ascii="Symbol" w:hAnsi="Symbol" w:hint="default"/>
+      </w:rPr>
+    </w:lvl>
+    <w:lvl w:ilvl="1" w:tplc="080A0003" w:tentative="1">
+      <w:start w:val="1"/>
+      <w:numFmt w:val="bullet"/>
+      <w:lvlText w:val="o"/>
+      <w:lvlJc w:val="left"/>
+      <w:pPr>
+        <w:ind w:left="1440" w:hanging="360"/>
+      </w:pPr>
+      <w:rPr>
+        <w:rFonts w:ascii="Courier New" w:hAnsi="Courier New" w:cs="Courier New" w:hint="default"/>
+      </w:rPr>
+    </w:lvl>
+    <w:lvl w:ilvl="2" w:tplc="080A0005" w:tentative="1">
+      <w:start w:val="1"/>
+      <w:numFmt w:val="bullet"/>
+      <w:lvlText w:val=""/>
+      <w:lvlJc w:val="left"/>
+      <w:pPr>
+        <w:ind w:left="2160" w:hanging="360"/>
+      </w:pPr>
+      <w:rPr>
+        <w:rFonts w:ascii="Wingdings" w:hAnsi="Wingdings" w:hint="default"/>
+      </w:rPr>
+    </w:lvl>
+    <w:lvl w:ilvl="3" w:tplc="080A0001" w:tentative="1">
+      <w:start w:val="1"/>
+      <w:numFmt w:val="bullet"/>
+      <w:lvlText w:val=""/>
+      <w:lvlJc w:val="left"/>
+      <w:pPr>
+        <w:ind w:left="2880" w:hanging="360"/>
+      </w:pPr>
+      <w:rPr>
+        <w:rFonts w:ascii="Symbol" w:hAnsi="Symbol" w:hint="default"/>
+      </w:rPr>
+    </w:lvl>
+    <w:lvl w:ilvl="4" w:tplc="080A0003" w:tentative="1">
+      <w:start w:val="1"/>
+      <w:numFmt w:val="bullet"/>
+      <w:lvlText w:val="o"/>
+      <w:lvlJc w:val="left"/>
+      <w:pPr>
+        <w:ind w:left="3600" w:hanging="360"/>
+      </w:pPr>
+      <w:rPr>
+        <w:rFonts w:ascii="Courier New" w:hAnsi="Courier New" w:cs="Courier New" w:hint="default"/>
+      </w:rPr>
+    </w:lvl>
+    <w:lvl w:ilvl="5" w:tplc="080A0005" w:tentative="1">
+      <w:start w:val="1"/>
+      <w:numFmt w:val="bullet"/>
+      <w:lvlText w:val=""/>
+      <w:lvlJc w:val="left"/>
+      <w:pPr>
+        <w:ind w:left="4320" w:hanging="360"/>
+      </w:pPr>
+      <w:rPr>
+        <w:rFonts w:ascii="Wingdings" w:hAnsi="Wingdings" w:hint="default"/>
+      </w:rPr>
+    </w:lvl>
+    <w:lvl w:ilvl="6" w:tplc="080A0001" w:tentative="1">
+      <w:start w:val="1"/>
+      <w:numFmt w:val="bullet"/>
+      <w:lvlText w:val=""/>
+      <w:lvlJc w:val="left"/>
+      <w:pPr>
+        <w:ind w:left="5040" w:hanging="360"/>
+      </w:pPr>
+      <w:rPr>
+        <w:rFonts w:ascii="Symbol" w:hAnsi="Symbol" w:hint="default"/>
+      </w:rPr>
+    </w:lvl>
+    <w:lvl w:ilvl="7" w:tplc="080A0003" w:tentative="1">
+      <w:start w:val="1"/>
+      <w:numFmt w:val="bullet"/>
+      <w:lvlText w:val="o"/>
+      <w:lvlJc w:val="left"/>
+      <w:pPr>
+        <w:ind w:left="5760" w:hanging="360"/>
+      </w:pPr>
+      <w:rPr>
+        <w:rFonts w:ascii="Courier New" w:hAnsi="Courier New" w:cs="Courier New" w:hint="default"/>
+      </w:rPr>
+    </w:lvl>
+    <w:lvl w:ilvl="8" w:tplc="080A0005" w:tentative="1">
+      <w:start w:val="1"/>
+      <w:numFmt w:val="bullet"/>
+      <w:lvlText w:val=""/>
+      <w:lvlJc w:val="left"/>
+      <w:pPr>
+        <w:ind w:left="6480" w:hanging="360"/>
+      </w:pPr>
+      <w:rPr>
+        <w:rFonts w:ascii="Wingdings" w:hAnsi="Wingdings" w:hint="default"/>
+      </w:rPr>
+    </w:lvl>
+  </w:abstractNum>
+  <w:abstractNum w:abstractNumId="17" w15:restartNumberingAfterBreak="0">
+    <w:nsid w:val="563E61EC"/>
+    <w:multiLevelType w:val="hybridMultilevel"/>
+    <w:tmpl w:val="5BBA4DEE"/>
+    <w:lvl w:ilvl="0" w:tplc="080A0001">
+      <w:start w:val="1"/>
+      <w:numFmt w:val="bullet"/>
+      <w:lvlText w:val=""/>
+      <w:lvlJc w:val="left"/>
+      <w:pPr>
+        <w:ind w:left="360" w:hanging="360"/>
+      </w:pPr>
+      <w:rPr>
+        <w:rFonts w:ascii="Symbol" w:hAnsi="Symbol" w:hint="default"/>
+      </w:rPr>
+    </w:lvl>
+    <w:lvl w:ilvl="1" w:tplc="080A0003" w:tentative="1">
+      <w:start w:val="1"/>
+      <w:numFmt w:val="bullet"/>
+      <w:lvlText w:val="o"/>
+      <w:lvlJc w:val="left"/>
+      <w:pPr>
+        <w:ind w:left="1080" w:hanging="360"/>
+      </w:pPr>
+      <w:rPr>
+        <w:rFonts w:ascii="Courier New" w:hAnsi="Courier New" w:cs="Courier New" w:hint="default"/>
+      </w:rPr>
+    </w:lvl>
+    <w:lvl w:ilvl="2" w:tplc="080A0005" w:tentative="1">
+      <w:start w:val="1"/>
+      <w:numFmt w:val="bullet"/>
+      <w:lvlText w:val=""/>
+      <w:lvlJc w:val="left"/>
+      <w:pPr>
+        <w:ind w:left="1800" w:hanging="360"/>
+      </w:pPr>
+      <w:rPr>
+        <w:rFonts w:ascii="Wingdings" w:hAnsi="Wingdings" w:hint="default"/>
+      </w:rPr>
+    </w:lvl>
+    <w:lvl w:ilvl="3" w:tplc="080A0001" w:tentative="1">
+      <w:start w:val="1"/>
+      <w:numFmt w:val="bullet"/>
+      <w:lvlText w:val=""/>
+      <w:lvlJc w:val="left"/>
+      <w:pPr>
+        <w:ind w:left="2520" w:hanging="360"/>
+      </w:pPr>
+      <w:rPr>
+        <w:rFonts w:ascii="Symbol" w:hAnsi="Symbol" w:hint="default"/>
+      </w:rPr>
+    </w:lvl>
+    <w:lvl w:ilvl="4" w:tplc="080A0003" w:tentative="1">
+      <w:start w:val="1"/>
+      <w:numFmt w:val="bullet"/>
+      <w:lvlText w:val="o"/>
+      <w:lvlJc w:val="left"/>
+      <w:pPr>
+        <w:ind w:left="3240" w:hanging="360"/>
+      </w:pPr>
+      <w:rPr>
+        <w:rFonts w:ascii="Courier New" w:hAnsi="Courier New" w:cs="Courier New" w:hint="default"/>
+      </w:rPr>
+    </w:lvl>
+    <w:lvl w:ilvl="5" w:tplc="080A0005" w:tentative="1">
+      <w:start w:val="1"/>
+      <w:numFmt w:val="bullet"/>
+      <w:lvlText w:val=""/>
+      <w:lvlJc w:val="left"/>
+      <w:pPr>
+        <w:ind w:left="3960" w:hanging="360"/>
+      </w:pPr>
+      <w:rPr>
+        <w:rFonts w:ascii="Wingdings" w:hAnsi="Wingdings" w:hint="default"/>
+      </w:rPr>
+    </w:lvl>
+    <w:lvl w:ilvl="6" w:tplc="080A0001" w:tentative="1">
+      <w:start w:val="1"/>
+      <w:numFmt w:val="bullet"/>
+      <w:lvlText w:val=""/>
+      <w:lvlJc w:val="left"/>
+      <w:pPr>
+        <w:ind w:left="4680" w:hanging="360"/>
+      </w:pPr>
+      <w:rPr>
+        <w:rFonts w:ascii="Symbol" w:hAnsi="Symbol" w:hint="default"/>
+      </w:rPr>
+    </w:lvl>
+    <w:lvl w:ilvl="7" w:tplc="080A0003" w:tentative="1">
+      <w:start w:val="1"/>
+      <w:numFmt w:val="bullet"/>
+      <w:lvlText w:val="o"/>
+      <w:lvlJc w:val="left"/>
+      <w:pPr>
+        <w:ind w:left="5400" w:hanging="360"/>
+      </w:pPr>
+      <w:rPr>
+        <w:rFonts w:ascii="Courier New" w:hAnsi="Courier New" w:cs="Courier New" w:hint="default"/>
+      </w:rPr>
+    </w:lvl>
+    <w:lvl w:ilvl="8" w:tplc="080A0005" w:tentative="1">
+      <w:start w:val="1"/>
+      <w:numFmt w:val="bullet"/>
+      <w:lvlText w:val=""/>
+      <w:lvlJc w:val="left"/>
+      <w:pPr>
+        <w:ind w:left="6120" w:hanging="360"/>
+      </w:pPr>
+      <w:rPr>
+        <w:rFonts w:ascii="Wingdings" w:hAnsi="Wingdings" w:hint="default"/>
+      </w:rPr>
+    </w:lvl>
+  </w:abstractNum>
+  <w:abstractNum w:abstractNumId="18" w15:restartNumberingAfterBreak="0">
+    <w:nsid w:val="6AD245B5"/>
+    <w:multiLevelType w:val="hybridMultilevel"/>
+    <w:tmpl w:val="32EAABAE"/>
+    <w:lvl w:ilvl="0" w:tplc="080A0001">
+      <w:start w:val="1"/>
+      <w:numFmt w:val="bullet"/>
+      <w:lvlText w:val=""/>
+      <w:lvlJc w:val="left"/>
+      <w:pPr>
+        <w:ind w:left="360" w:hanging="360"/>
+      </w:pPr>
+      <w:rPr>
+        <w:rFonts w:ascii="Symbol" w:hAnsi="Symbol" w:hint="default"/>
+      </w:rPr>
+    </w:lvl>
+    <w:lvl w:ilvl="1" w:tplc="080A0003" w:tentative="1">
+      <w:start w:val="1"/>
+      <w:numFmt w:val="bullet"/>
+      <w:lvlText w:val="o"/>
+      <w:lvlJc w:val="left"/>
+      <w:pPr>
+        <w:ind w:left="1080" w:hanging="360"/>
+      </w:pPr>
+      <w:rPr>
+        <w:rFonts w:ascii="Courier New" w:hAnsi="Courier New" w:cs="Courier New" w:hint="default"/>
+      </w:rPr>
+    </w:lvl>
+    <w:lvl w:ilvl="2" w:tplc="080A0005" w:tentative="1">
+      <w:start w:val="1"/>
+      <w:numFmt w:val="bullet"/>
+      <w:lvlText w:val=""/>
+      <w:lvlJc w:val="left"/>
+      <w:pPr>
+        <w:ind w:left="1800" w:hanging="360"/>
+      </w:pPr>
+      <w:rPr>
+        <w:rFonts w:ascii="Wingdings" w:hAnsi="Wingdings" w:hint="default"/>
+      </w:rPr>
+    </w:lvl>
+    <w:lvl w:ilvl="3" w:tplc="080A0001" w:tentative="1">
+      <w:start w:val="1"/>
+      <w:numFmt w:val="bullet"/>
+      <w:lvlText w:val=""/>
+      <w:lvlJc w:val="left"/>
+      <w:pPr>
+        <w:ind w:left="2520" w:hanging="360"/>
+      </w:pPr>
+      <w:rPr>
+        <w:rFonts w:ascii="Symbol" w:hAnsi="Symbol" w:hint="default"/>
+      </w:rPr>
+    </w:lvl>
+    <w:lvl w:ilvl="4" w:tplc="080A0003" w:tentative="1">
+      <w:start w:val="1"/>
+      <w:numFmt w:val="bullet"/>
+      <w:lvlText w:val="o"/>
+      <w:lvlJc w:val="left"/>
+      <w:pPr>
+        <w:ind w:left="3240" w:hanging="360"/>
+      </w:pPr>
+      <w:rPr>
+        <w:rFonts w:ascii="Courier New" w:hAnsi="Courier New" w:cs="Courier New" w:hint="default"/>
+      </w:rPr>
+    </w:lvl>
+    <w:lvl w:ilvl="5" w:tplc="080A0005" w:tentative="1">
+      <w:start w:val="1"/>
+      <w:numFmt w:val="bullet"/>
+      <w:lvlText w:val=""/>
+      <w:lvlJc w:val="left"/>
+      <w:pPr>
+        <w:ind w:left="3960" w:hanging="360"/>
+      </w:pPr>
+      <w:rPr>
+        <w:rFonts w:ascii="Wingdings" w:hAnsi="Wingdings" w:hint="default"/>
+      </w:rPr>
+    </w:lvl>
+    <w:lvl w:ilvl="6" w:tplc="080A0001" w:tentative="1">
+      <w:start w:val="1"/>
+      <w:numFmt w:val="bullet"/>
+      <w:lvlText w:val=""/>
+      <w:lvlJc w:val="left"/>
+      <w:pPr>
+        <w:ind w:left="4680" w:hanging="360"/>
+      </w:pPr>
+      <w:rPr>
+        <w:rFonts w:ascii="Symbol" w:hAnsi="Symbol" w:hint="default"/>
+      </w:rPr>
+    </w:lvl>
+    <w:lvl w:ilvl="7" w:tplc="080A0003" w:tentative="1">
+      <w:start w:val="1"/>
+      <w:numFmt w:val="bullet"/>
+      <w:lvlText w:val="o"/>
+      <w:lvlJc w:val="left"/>
+      <w:pPr>
+        <w:ind w:left="5400" w:hanging="360"/>
+      </w:pPr>
+      <w:rPr>
+        <w:rFonts w:ascii="Courier New" w:hAnsi="Courier New" w:cs="Courier New" w:hint="default"/>
+      </w:rPr>
+    </w:lvl>
+    <w:lvl w:ilvl="8" w:tplc="080A0005" w:tentative="1">
+      <w:start w:val="1"/>
+      <w:numFmt w:val="bullet"/>
+      <w:lvlText w:val=""/>
+      <w:lvlJc w:val="left"/>
+      <w:pPr>
+        <w:ind w:left="6120" w:hanging="360"/>
+      </w:pPr>
+      <w:rPr>
+        <w:rFonts w:ascii="Wingdings" w:hAnsi="Wingdings" w:hint="default"/>
       </w:rPr>
     </w:lvl>
   </w:abstractNum>
@@ -1914,6 +5413,36 @@
   </w:num>
   <w:num w:numId="9">
     <w:abstractNumId w:val="0"/>
+  </w:num>
+  <w:num w:numId="10">
+    <w:abstractNumId w:val="18"/>
+  </w:num>
+  <w:num w:numId="11">
+    <w:abstractNumId w:val="10"/>
+  </w:num>
+  <w:num w:numId="12">
+    <w:abstractNumId w:val="13"/>
+  </w:num>
+  <w:num w:numId="13">
+    <w:abstractNumId w:val="14"/>
+  </w:num>
+  <w:num w:numId="14">
+    <w:abstractNumId w:val="15"/>
+  </w:num>
+  <w:num w:numId="15">
+    <w:abstractNumId w:val="16"/>
+  </w:num>
+  <w:num w:numId="16">
+    <w:abstractNumId w:val="11"/>
+  </w:num>
+  <w:num w:numId="17">
+    <w:abstractNumId w:val="17"/>
+  </w:num>
+  <w:num w:numId="18">
+    <w:abstractNumId w:val="9"/>
+  </w:num>
+  <w:num w:numId="19">
+    <w:abstractNumId w:val="12"/>
   </w:num>
 </w:numbering>
 </file>
@@ -2052,6 +5581,7 @@
     <w:lsdException w:name="HTML Sample" w:semiHidden="1" w:unhideWhenUsed="1"/>
     <w:lsdException w:name="HTML Typewriter" w:semiHidden="1" w:unhideWhenUsed="1"/>
     <w:lsdException w:name="HTML Variable" w:semiHidden="1" w:unhideWhenUsed="1"/>
+    <w:lsdException w:name="Normal Table" w:semiHidden="1" w:unhideWhenUsed="1"/>
     <w:lsdException w:name="annotation subject" w:semiHidden="1" w:unhideWhenUsed="1"/>
     <w:lsdException w:name="No List" w:semiHidden="1" w:unhideWhenUsed="1"/>
     <w:lsdException w:name="Outline List 1" w:semiHidden="1" w:unhideWhenUsed="1"/>
@@ -2094,8 +5624,11 @@
     <w:lsdException w:name="Table Contemporary" w:semiHidden="1" w:unhideWhenUsed="1"/>
     <w:lsdException w:name="Table Elegant" w:semiHidden="1" w:unhideWhenUsed="1"/>
     <w:lsdException w:name="Table Professional" w:semiHidden="1" w:unhideWhenUsed="1"/>
+    <w:lsdException w:name="Table Subtle 1" w:semiHidden="1" w:unhideWhenUsed="1"/>
     <w:lsdException w:name="Table Subtle 2" w:semiHidden="1" w:unhideWhenUsed="1"/>
     <w:lsdException w:name="Table Web 1" w:semiHidden="1" w:unhideWhenUsed="1"/>
+    <w:lsdException w:name="Table Web 2" w:semiHidden="1" w:unhideWhenUsed="1"/>
+    <w:lsdException w:name="Table Web 3" w:semiHidden="1" w:unhideWhenUsed="1"/>
     <w:lsdException w:name="Balloon Text" w:semiHidden="1" w:unhideWhenUsed="1"/>
     <w:lsdException w:name="Table Grid" w:uiPriority="59"/>
     <w:lsdException w:name="Table Theme" w:semiHidden="1" w:unhideWhenUsed="1"/>

</xml_diff>